<commit_message>
Update DOCX templates for FIO formatting and commission column merge
</commit_message>
<xml_diff>
--- a/backend/Protocol-comission-template.docx
+++ b/backend/Protocol-comission-template.docx
@@ -1165,7 +1165,7 @@
                 <w:szCs w:val="22"/>
                 <w:lang w:val="en-US"/>
               </w:rPr>
-              <w:t>{name} {</w:t>
+              <w:t>{</w:t>
             </w:r>
             <w:proofErr w:type="spellStart"/>
             <w:r>
@@ -1174,7 +1174,15 @@
                 <w:szCs w:val="22"/>
                 <w:lang w:val="en-US"/>
               </w:rPr>
-              <w:t>last_name</w:t>
+              <w:t>last_</w:t>
+            </w:r>
+            <w:r>
+              <w:rPr>
+                <w:sz w:val="22"/>
+                <w:szCs w:val="22"/>
+                <w:lang w:val="en-US"/>
+              </w:rPr>
+              <w:t>name</w:t>
             </w:r>
             <w:proofErr w:type="spellEnd"/>
             <w:r>
@@ -1183,7 +1191,7 @@
                 <w:szCs w:val="22"/>
                 <w:lang w:val="en-US"/>
               </w:rPr>
-              <w:t>} {</w:t>
+              <w:t>} {name} {</w:t>
             </w:r>
             <w:proofErr w:type="spellStart"/>
             <w:r>
@@ -1512,6 +1520,7 @@
         <w:tc>
           <w:tcPr>
             <w:tcW w:w="1427" w:type="dxa"/>
+            <w:vMerge/>
             <w:tcBorders>
               <w:top w:val="single" w:sz="4" w:space="0" w:color="000000"/>
               <w:left w:val="single" w:sz="4" w:space="0" w:color="000000"/>

</xml_diff>

<commit_message>
Update Protocol-comission-template.docx table merge behavior
</commit_message>
<xml_diff>
--- a/backend/Protocol-comission-template.docx
+++ b/backend/Protocol-comission-template.docx
@@ -3550,4 +3550,3585 @@
   </a:objectDefaults>
   <a:extraClrSchemeLst/>
 </a:theme>
+</file>
+
+<file path=doc.patched.xml><?xml version="1.0" encoding="utf-8"?>
+<w:document xmlns:wpc="http://schemas.microsoft.com/office/word/2010/wordprocessingCanvas" xmlns:cx="http://schemas.microsoft.com/office/drawing/2014/chartex" xmlns:cx1="http://schemas.microsoft.com/office/drawing/2015/9/8/chartex" xmlns:cx2="http://schemas.microsoft.com/office/drawing/2015/10/21/chartex" xmlns:cx3="http://schemas.microsoft.com/office/drawing/2016/5/9/chartex" xmlns:cx4="http://schemas.microsoft.com/office/drawing/2016/5/10/chartex" xmlns:cx5="http://schemas.microsoft.com/office/drawing/2016/5/11/chartex" xmlns:cx6="http://schemas.microsoft.com/office/drawing/2016/5/12/chartex" xmlns:cx7="http://schemas.microsoft.com/office/drawing/2016/5/13/chartex" xmlns:cx8="http://schemas.microsoft.com/office/drawing/2016/5/14/chartex" xmlns:mc="http://schemas.openxmlformats.org/markup-compatibility/2006" xmlns:aink="http://schemas.microsoft.com/office/drawing/2016/ink" xmlns:am3d="http://schemas.microsoft.com/office/drawing/2017/model3d" xmlns:o="urn:schemas-microsoft-com:office:office" xmlns:oel="http://schemas.microsoft.com/office/2019/extlst" xmlns:r="http://schemas.openxmlformats.org/officeDocument/2006/relationships" xmlns:m="http://schemas.openxmlformats.org/officeDocument/2006/math" xmlns:v="urn:schemas-microsoft-com:vml" xmlns:wp14="http://schemas.microsoft.com/office/word/2010/wordprocessingDrawing" xmlns:wp="http://schemas.openxmlformats.org/drawingml/2006/wordprocessingDrawing" xmlns:w10="urn:schemas-microsoft-com:office:word" xmlns:w="http://schemas.openxmlformats.org/wordprocessingml/2006/main" xmlns:w14="http://schemas.microsoft.com/office/word/2010/wordml" xmlns:w15="http://schemas.microsoft.com/office/word/2012/wordml" xmlns:w16cex="http://schemas.microsoft.com/office/word/2018/wordml/cex" xmlns:w16cid="http://schemas.microsoft.com/office/word/2016/wordml/cid" xmlns:w16="http://schemas.microsoft.com/office/word/2018/wordml" xmlns:w16sdtdh="http://schemas.microsoft.com/office/word/2020/wordml/sdtdatahash" xmlns:w16se="http://schemas.microsoft.com/office/word/2015/wordml/symex" xmlns:wpg="http://schemas.microsoft.com/office/word/2010/wordprocessingGroup" xmlns:wpi="http://schemas.microsoft.com/office/word/2010/wordprocessingInk" xmlns:wne="http://schemas.microsoft.com/office/word/2006/wordml" xmlns:wps="http://schemas.microsoft.com/office/word/2010/wordprocessingShape" mc:Ignorable="w14 w15 w16se w16cid w16 w16cex w16sdtdh wp14">
+  <w:body>
+    <w:p>
+      <w:pPr>
+        <w:jc w:val="center"/>
+        <w:rPr>
+          <w:b/>
+          <w:bCs/>
+          <w:sz w:val="28"/>
+          <w:szCs w:val="28"/>
+          <w:lang w:val="en-US"/>
+        </w:rPr>
+      </w:pPr>
+      <w:r>
+        <w:rPr>
+          <w:b/>
+          <w:bCs/>
+          <w:sz w:val="28"/>
+          <w:szCs w:val="28"/>
+          <w:lang w:val="en-US"/>
+        </w:rPr>
+        <w:t>{</w:t>
+      </w:r>
+      <w:proofErr w:type="spellStart"/>
+      <w:r>
+        <w:rPr>
+          <w:b/>
+          <w:bCs/>
+          <w:sz w:val="28"/>
+          <w:szCs w:val="28"/>
+          <w:lang w:val="en-US"/>
+        </w:rPr>
+        <w:t>moisei_name</w:t>
+      </w:r>
+      <w:proofErr w:type="spellEnd"/>
+      <w:r>
+        <w:rPr>
+          <w:b/>
+          <w:bCs/>
+          <w:sz w:val="28"/>
+          <w:szCs w:val="28"/>
+          <w:lang w:val="en-US"/>
+        </w:rPr>
+        <w:t>}</w:t>
+      </w:r>
+    </w:p>
+    <w:p>
+      <w:pPr>
+        <w:jc w:val="center"/>
+        <w:rPr>
+          <w:b/>
+          <w:bCs/>
+          <w:sz w:val="22"/>
+          <w:szCs w:val="22"/>
+        </w:rPr>
+      </w:pPr>
+    </w:p>
+    <w:p>
+      <w:pPr>
+        <w:jc w:val="center"/>
+        <w:rPr>
+          <w:b/>
+          <w:bCs/>
+          <w:sz w:val="28"/>
+          <w:szCs w:val="28"/>
+        </w:rPr>
+      </w:pPr>
+      <w:r>
+        <w:rPr>
+          <w:b/>
+          <w:bCs/>
+          <w:sz w:val="28"/>
+          <w:szCs w:val="28"/>
+        </w:rPr>
+        <w:t xml:space="preserve">П Р О Т О К О Л    </w:t>
+      </w:r>
+      <w:proofErr w:type="gramStart"/>
+      <w:r>
+        <w:rPr>
+          <w:b/>
+          <w:bCs/>
+          <w:sz w:val="28"/>
+          <w:szCs w:val="28"/>
+        </w:rPr>
+        <w:t xml:space="preserve">№  </w:t>
+      </w:r>
+      <w:r>
+        <w:rPr>
+          <w:b/>
+          <w:bCs/>
+          <w:sz w:val="28"/>
+          <w:szCs w:val="28"/>
+        </w:rPr>
+        <w:t>{</w:t>
+      </w:r>
+      <w:proofErr w:type="gramEnd"/>
+      <w:r>
+        <w:rPr>
+          <w:b/>
+          <w:bCs/>
+          <w:sz w:val="28"/>
+          <w:szCs w:val="28"/>
+          <w:lang w:val="en-US"/>
+        </w:rPr>
+        <w:t>group</w:t>
+      </w:r>
+      <w:r>
+        <w:rPr>
+          <w:b/>
+          <w:bCs/>
+          <w:sz w:val="28"/>
+          <w:szCs w:val="28"/>
+        </w:rPr>
+        <w:t>_</w:t>
+      </w:r>
+      <w:r>
+        <w:rPr>
+          <w:b/>
+          <w:bCs/>
+          <w:sz w:val="28"/>
+          <w:szCs w:val="28"/>
+          <w:lang w:val="en-US"/>
+        </w:rPr>
+        <w:t>id</w:t>
+      </w:r>
+      <w:r>
+        <w:rPr>
+          <w:b/>
+          <w:bCs/>
+          <w:sz w:val="28"/>
+          <w:szCs w:val="28"/>
+        </w:rPr>
+        <w:t>}</w:t>
+      </w:r>
+      <w:r>
+        <w:rPr>
+          <w:b/>
+          <w:bCs/>
+          <w:sz w:val="28"/>
+          <w:szCs w:val="28"/>
+        </w:rPr>
+        <w:t xml:space="preserve">  от  </w:t>
+      </w:r>
+      <w:r>
+        <w:rPr>
+          <w:b/>
+          <w:bCs/>
+          <w:sz w:val="28"/>
+          <w:szCs w:val="28"/>
+        </w:rPr>
+        <w:t>{</w:t>
+      </w:r>
+      <w:r>
+        <w:rPr>
+          <w:b/>
+          <w:bCs/>
+          <w:sz w:val="28"/>
+          <w:szCs w:val="28"/>
+          <w:lang w:val="en-US"/>
+        </w:rPr>
+        <w:t>end</w:t>
+      </w:r>
+      <w:r>
+        <w:rPr>
+          <w:b/>
+          <w:bCs/>
+          <w:sz w:val="28"/>
+          <w:szCs w:val="28"/>
+        </w:rPr>
+        <w:t>_</w:t>
+      </w:r>
+      <w:r>
+        <w:rPr>
+          <w:b/>
+          <w:bCs/>
+          <w:sz w:val="28"/>
+          <w:szCs w:val="28"/>
+          <w:lang w:val="en-US"/>
+        </w:rPr>
+        <w:t>date</w:t>
+      </w:r>
+      <w:r>
+        <w:rPr>
+          <w:b/>
+          <w:bCs/>
+          <w:sz w:val="28"/>
+          <w:szCs w:val="28"/>
+        </w:rPr>
+        <w:t>}</w:t>
+      </w:r>
+    </w:p>
+    <w:p>
+      <w:pPr>
+        <w:jc w:val="center"/>
+        <w:rPr>
+          <w:b/>
+          <w:bCs/>
+          <w:sz w:val="28"/>
+          <w:szCs w:val="28"/>
+        </w:rPr>
+      </w:pPr>
+      <w:r>
+        <w:rPr>
+          <w:b/>
+          <w:bCs/>
+          <w:sz w:val="28"/>
+          <w:szCs w:val="28"/>
+        </w:rPr>
+        <w:t>заседания комиссии по проверке знаний</w:t>
+      </w:r>
+    </w:p>
+    <w:p>
+      <w:pPr>
+        <w:rPr>
+          <w:sz w:val="18"/>
+          <w:szCs w:val="18"/>
+        </w:rPr>
+      </w:pPr>
+    </w:p>
+    <w:p>
+      <w:r>
+        <w:t>В соответствии с приказом директора от «01» сентября 2022 г. № 10 комиссия в составе:</w:t>
+      </w:r>
+    </w:p>
+    <w:p>
+      <w:pPr>
+        <w:rPr>
+          <w:sz w:val="22"/>
+          <w:szCs w:val="22"/>
+        </w:rPr>
+      </w:pPr>
+    </w:p>
+    <w:p>
+      <w:r>
+        <w:rPr>
+          <w:b/>
+          <w:bCs/>
+        </w:rPr>
+        <w:t>Председатель комиссии:</w:t>
+      </w:r>
+      <w:r>
+        <w:tab/>
+      </w:r>
+      <w:proofErr w:type="spellStart"/>
+      <w:r>
+        <w:t>Шекшуев</w:t>
+      </w:r>
+      <w:proofErr w:type="spellEnd"/>
+      <w:r>
+        <w:t xml:space="preserve"> В.М.. - директор</w:t>
+      </w:r>
+    </w:p>
+    <w:p>
+      <w:r>
+        <w:rPr>
+          <w:b/>
+          <w:bCs/>
+        </w:rPr>
+        <w:t>Члены комиссии:</w:t>
+      </w:r>
+      <w:r>
+        <w:rPr>
+          <w:b/>
+          <w:bCs/>
+        </w:rPr>
+        <w:tab/>
+      </w:r>
+      <w:r>
+        <w:tab/>
+        <w:t>Воробьева Е.С. – заместитель директора</w:t>
+      </w:r>
+    </w:p>
+    <w:p>
+      <w:r>
+        <w:tab/>
+      </w:r>
+      <w:r>
+        <w:tab/>
+      </w:r>
+      <w:r>
+        <w:tab/>
+      </w:r>
+      <w:r>
+        <w:tab/>
+      </w:r>
+      <w:proofErr w:type="spellStart"/>
+      <w:r>
+        <w:t>Шекшуева</w:t>
+      </w:r>
+      <w:proofErr w:type="spellEnd"/>
+      <w:r>
+        <w:t xml:space="preserve"> И.Ю. – специалист учебного центра</w:t>
+      </w:r>
+    </w:p>
+    <w:p>
+      <w:pPr>
+        <w:pStyle w:val="a4"/>
+        <w:tabs>
+          <w:tab w:val="left" w:pos="2694"/>
+        </w:tabs>
+        <w:rPr>
+          <w:sz w:val="22"/>
+          <w:szCs w:val="22"/>
+        </w:rPr>
+      </w:pPr>
+    </w:p>
+    <w:p>
+      <w:pPr>
+        <w:jc w:val="both"/>
+      </w:pPr>
+      <w:r>
+        <w:t>Проведена проверка знаний по программе: - «</w:t>
+      </w:r>
+      <w:r>
+        <w:t>{</w:t>
+      </w:r>
+      <w:r>
+        <w:rPr>
+          <w:lang w:val="en-US"/>
+        </w:rPr>
+        <w:t>course</w:t>
+      </w:r>
+      <w:r>
+        <w:t>_</w:t>
+      </w:r>
+      <w:r>
+        <w:rPr>
+          <w:lang w:val="en-US"/>
+        </w:rPr>
+        <w:t>name</w:t>
+      </w:r>
+      <w:r>
+        <w:t>}</w:t>
+      </w:r>
+      <w:r>
+        <w:t xml:space="preserve">» в объеме </w:t>
+      </w:r>
+      <w:r>
+        <w:t>{</w:t>
+      </w:r>
+      <w:r>
+        <w:rPr>
+          <w:lang w:val="en-US"/>
+        </w:rPr>
+        <w:t>hours</w:t>
+      </w:r>
+      <w:r>
+        <w:t>}</w:t>
+      </w:r>
+      <w:r>
+        <w:t xml:space="preserve"> часов;</w:t>
+      </w:r>
+    </w:p>
+    <w:p>
+      <w:pPr>
+        <w:jc w:val="both"/>
+        <w:rPr>
+          <w:sz w:val="22"/>
+          <w:szCs w:val="22"/>
+        </w:rPr>
+      </w:pPr>
+      <w:r>
+        <w:rPr>
+          <w:sz w:val="22"/>
+          <w:szCs w:val="22"/>
+        </w:rPr>
+        <w:t>- - «</w:t>
+      </w:r>
+      <w:r>
+        <w:rPr>
+          <w:sz w:val="22"/>
+          <w:szCs w:val="22"/>
+        </w:rPr>
+        <w:t>{</w:t>
+      </w:r>
+      <w:r>
+        <w:rPr>
+          <w:sz w:val="22"/>
+          <w:szCs w:val="22"/>
+          <w:lang w:val="en-US"/>
+        </w:rPr>
+        <w:t>course</w:t>
+      </w:r>
+      <w:r>
+        <w:rPr>
+          <w:sz w:val="22"/>
+          <w:szCs w:val="22"/>
+        </w:rPr>
+        <w:t>_</w:t>
+      </w:r>
+      <w:r>
+        <w:rPr>
+          <w:sz w:val="22"/>
+          <w:szCs w:val="22"/>
+          <w:lang w:val="en-US"/>
+        </w:rPr>
+        <w:t>name</w:t>
+      </w:r>
+      <w:r>
+        <w:rPr>
+          <w:sz w:val="22"/>
+          <w:szCs w:val="22"/>
+        </w:rPr>
+        <w:t>}</w:t>
+      </w:r>
+      <w:r>
+        <w:rPr>
+          <w:sz w:val="22"/>
+          <w:szCs w:val="22"/>
+        </w:rPr>
+        <w:t xml:space="preserve">» в объеме </w:t>
+      </w:r>
+      <w:r>
+        <w:rPr>
+          <w:sz w:val="22"/>
+          <w:szCs w:val="22"/>
+        </w:rPr>
+        <w:t>{</w:t>
+      </w:r>
+      <w:r>
+        <w:rPr>
+          <w:sz w:val="22"/>
+          <w:szCs w:val="22"/>
+          <w:lang w:val="en-US"/>
+        </w:rPr>
+        <w:t>hours</w:t>
+      </w:r>
+      <w:r>
+        <w:rPr>
+          <w:sz w:val="22"/>
+          <w:szCs w:val="22"/>
+        </w:rPr>
+        <w:t>}</w:t>
+      </w:r>
+      <w:r>
+        <w:rPr>
+          <w:sz w:val="22"/>
+          <w:szCs w:val="22"/>
+        </w:rPr>
+        <w:t xml:space="preserve"> часов:</w:t>
+      </w:r>
+    </w:p>
+    <w:tbl>
+      <w:tblPr>
+        <w:tblStyle w:val="TableNormal"/>
+        <w:tblW w:w="15603" w:type="dxa"/>
+        <w:tblInd w:w="-289" w:type="dxa"/>
+        <w:tblBorders>
+          <w:top w:val="single" w:sz="8" w:space="0" w:color="FFFFFF"/>
+          <w:left w:val="single" w:sz="8" w:space="0" w:color="FFFFFF"/>
+          <w:bottom w:val="single" w:sz="8" w:space="0" w:color="FFFFFF"/>
+          <w:right w:val="single" w:sz="8" w:space="0" w:color="FFFFFF"/>
+          <w:insideH w:val="single" w:sz="8" w:space="0" w:color="FFFFFF"/>
+          <w:insideV w:val="single" w:sz="8" w:space="0" w:color="FFFFFF"/>
+        </w:tblBorders>
+        <w:shd w:val="clear" w:color="auto" w:fill="CED7E7"/>
+        <w:tblLayout w:type="fixed"/>
+        <w:tblLook w:val="04A0" w:firstRow="1" w:lastRow="0" w:firstColumn="1" w:lastColumn="0" w:noHBand="0" w:noVBand="1"/>
+      </w:tblPr>
+      <w:tblGrid>
+        <w:gridCol w:w="923"/>
+        <w:gridCol w:w="2918"/>
+        <w:gridCol w:w="2379"/>
+        <w:gridCol w:w="3136"/>
+        <w:gridCol w:w="842"/>
+        <w:gridCol w:w="1621"/>
+        <w:gridCol w:w="1406"/>
+        <w:gridCol w:w="951"/>
+        <w:gridCol w:w="1427"/>
+      </w:tblGrid>
+      <w:tr>
+        <w:trPr>
+          <w:trHeight w:val="1046"/>
+        </w:trPr>
+        <w:tc>
+          <w:tcPr>
+            <w:tcW w:w="923" w:type="dxa"/>
+            <w:tcBorders>
+              <w:top w:val="single" w:sz="4" w:space="0" w:color="000000"/>
+              <w:left w:val="single" w:sz="4" w:space="0" w:color="000000"/>
+              <w:bottom w:val="single" w:sz="4" w:space="0" w:color="000000"/>
+              <w:right w:val="single" w:sz="4" w:space="0" w:color="000000"/>
+            </w:tcBorders>
+            <w:shd w:val="clear" w:color="auto" w:fill="auto"/>
+            <w:tcMar>
+              <w:top w:w="80" w:type="dxa"/>
+              <w:left w:w="80" w:type="dxa"/>
+              <w:bottom w:w="80" w:type="dxa"/>
+              <w:right w:w="80" w:type="dxa"/>
+            </w:tcMar>
+            <w:vAlign w:val="center"/>
+          </w:tcPr>
+          <w:p>
+            <w:pPr>
+              <w:jc w:val="center"/>
+            </w:pPr>
+            <w:r>
+              <w:rPr>
+                <w:sz w:val="22"/>
+                <w:szCs w:val="22"/>
+              </w:rPr>
+              <w:t>№</w:t>
+            </w:r>
+          </w:p>
+        </w:tc>
+        <w:tc>
+          <w:tcPr>
+            <w:tcW w:w="2918" w:type="dxa"/>
+            <w:tcBorders>
+              <w:top w:val="single" w:sz="4" w:space="0" w:color="000000"/>
+              <w:left w:val="single" w:sz="4" w:space="0" w:color="000000"/>
+              <w:bottom w:val="single" w:sz="4" w:space="0" w:color="000000"/>
+              <w:right w:val="single" w:sz="4" w:space="0" w:color="000000"/>
+            </w:tcBorders>
+            <w:shd w:val="clear" w:color="auto" w:fill="auto"/>
+            <w:tcMar>
+              <w:top w:w="80" w:type="dxa"/>
+              <w:left w:w="80" w:type="dxa"/>
+              <w:bottom w:w="80" w:type="dxa"/>
+              <w:right w:w="80" w:type="dxa"/>
+            </w:tcMar>
+            <w:vAlign w:val="center"/>
+          </w:tcPr>
+          <w:p>
+            <w:pPr>
+              <w:jc w:val="center"/>
+            </w:pPr>
+            <w:r>
+              <w:rPr>
+                <w:sz w:val="22"/>
+                <w:szCs w:val="22"/>
+              </w:rPr>
+              <w:t>Ф.И.О.</w:t>
+            </w:r>
+          </w:p>
+        </w:tc>
+        <w:tc>
+          <w:tcPr>
+            <w:tcW w:w="2379" w:type="dxa"/>
+            <w:tcBorders>
+              <w:top w:val="single" w:sz="4" w:space="0" w:color="000000"/>
+              <w:left w:val="single" w:sz="4" w:space="0" w:color="000000"/>
+              <w:bottom w:val="single" w:sz="4" w:space="0" w:color="000000"/>
+              <w:right w:val="single" w:sz="4" w:space="0" w:color="000000"/>
+            </w:tcBorders>
+            <w:shd w:val="clear" w:color="auto" w:fill="auto"/>
+            <w:tcMar>
+              <w:top w:w="80" w:type="dxa"/>
+              <w:left w:w="80" w:type="dxa"/>
+              <w:bottom w:w="80" w:type="dxa"/>
+              <w:right w:w="80" w:type="dxa"/>
+            </w:tcMar>
+            <w:vAlign w:val="center"/>
+          </w:tcPr>
+          <w:p>
+            <w:pPr>
+              <w:jc w:val="center"/>
+            </w:pPr>
+            <w:r>
+              <w:rPr>
+                <w:sz w:val="22"/>
+                <w:szCs w:val="22"/>
+              </w:rPr>
+              <w:t>Наименование предприятия</w:t>
+            </w:r>
+          </w:p>
+        </w:tc>
+        <w:tc>
+          <w:tcPr>
+            <w:tcW w:w="3136" w:type="dxa"/>
+            <w:tcBorders>
+              <w:top w:val="single" w:sz="4" w:space="0" w:color="000000"/>
+              <w:left w:val="single" w:sz="4" w:space="0" w:color="000000"/>
+              <w:bottom w:val="single" w:sz="4" w:space="0" w:color="000000"/>
+              <w:right w:val="single" w:sz="4" w:space="0" w:color="000000"/>
+            </w:tcBorders>
+            <w:shd w:val="clear" w:color="auto" w:fill="auto"/>
+            <w:tcMar>
+              <w:top w:w="80" w:type="dxa"/>
+              <w:left w:w="80" w:type="dxa"/>
+              <w:bottom w:w="80" w:type="dxa"/>
+              <w:right w:w="80" w:type="dxa"/>
+            </w:tcMar>
+            <w:vAlign w:val="center"/>
+          </w:tcPr>
+          <w:p>
+            <w:pPr>
+              <w:jc w:val="center"/>
+            </w:pPr>
+            <w:r>
+              <w:rPr>
+                <w:sz w:val="22"/>
+                <w:szCs w:val="22"/>
+              </w:rPr>
+              <w:t>Занимаемая должность</w:t>
+            </w:r>
+          </w:p>
+        </w:tc>
+        <w:tc>
+          <w:tcPr>
+            <w:tcW w:w="842" w:type="dxa"/>
+            <w:tcBorders>
+              <w:top w:val="single" w:sz="4" w:space="0" w:color="000000"/>
+              <w:left w:val="single" w:sz="4" w:space="0" w:color="000000"/>
+              <w:bottom w:val="single" w:sz="4" w:space="0" w:color="000000"/>
+              <w:right w:val="single" w:sz="4" w:space="0" w:color="000000"/>
+            </w:tcBorders>
+          </w:tcPr>
+          <w:p>
+            <w:pPr>
+              <w:jc w:val="center"/>
+              <w:rPr>
+                <w:sz w:val="22"/>
+                <w:szCs w:val="22"/>
+              </w:rPr>
+            </w:pPr>
+          </w:p>
+          <w:p>
+            <w:pPr>
+              <w:jc w:val="center"/>
+              <w:rPr>
+                <w:sz w:val="22"/>
+                <w:szCs w:val="22"/>
+              </w:rPr>
+            </w:pPr>
+          </w:p>
+          <w:p>
+            <w:pPr>
+              <w:jc w:val="center"/>
+              <w:rPr>
+                <w:sz w:val="22"/>
+                <w:szCs w:val="22"/>
+              </w:rPr>
+            </w:pPr>
+          </w:p>
+          <w:p>
+            <w:pPr>
+              <w:jc w:val="center"/>
+              <w:rPr>
+                <w:sz w:val="22"/>
+                <w:szCs w:val="22"/>
+              </w:rPr>
+            </w:pPr>
+            <w:r>
+              <w:rPr>
+                <w:sz w:val="22"/>
+                <w:szCs w:val="22"/>
+              </w:rPr>
+              <w:t>Номер билета</w:t>
+            </w:r>
+          </w:p>
+        </w:tc>
+        <w:tc>
+          <w:tcPr>
+            <w:tcW w:w="1621" w:type="dxa"/>
+            <w:tcBorders>
+              <w:top w:val="single" w:sz="4" w:space="0" w:color="000000"/>
+              <w:left w:val="single" w:sz="4" w:space="0" w:color="000000"/>
+              <w:bottom w:val="single" w:sz="4" w:space="0" w:color="000000"/>
+              <w:right w:val="single" w:sz="4" w:space="0" w:color="000000"/>
+            </w:tcBorders>
+            <w:shd w:val="clear" w:color="auto" w:fill="auto"/>
+            <w:tcMar>
+              <w:top w:w="80" w:type="dxa"/>
+              <w:left w:w="80" w:type="dxa"/>
+              <w:bottom w:w="80" w:type="dxa"/>
+              <w:right w:w="80" w:type="dxa"/>
+            </w:tcMar>
+            <w:vAlign w:val="center"/>
+          </w:tcPr>
+          <w:p>
+            <w:pPr>
+              <w:jc w:val="center"/>
+            </w:pPr>
+            <w:r>
+              <w:rPr>
+                <w:sz w:val="22"/>
+                <w:szCs w:val="22"/>
+              </w:rPr>
+              <w:t>Результат проверки знаний</w:t>
+            </w:r>
+          </w:p>
+        </w:tc>
+        <w:tc>
+          <w:tcPr>
+            <w:tcW w:w="1406" w:type="dxa"/>
+            <w:tcBorders>
+              <w:top w:val="single" w:sz="4" w:space="0" w:color="000000"/>
+              <w:left w:val="single" w:sz="4" w:space="0" w:color="000000"/>
+              <w:bottom w:val="single" w:sz="4" w:space="0" w:color="000000"/>
+              <w:right w:val="single" w:sz="4" w:space="0" w:color="000000"/>
+            </w:tcBorders>
+            <w:shd w:val="clear" w:color="auto" w:fill="auto"/>
+            <w:tcMar>
+              <w:top w:w="80" w:type="dxa"/>
+              <w:left w:w="80" w:type="dxa"/>
+              <w:bottom w:w="80" w:type="dxa"/>
+              <w:right w:w="80" w:type="dxa"/>
+            </w:tcMar>
+            <w:vAlign w:val="center"/>
+          </w:tcPr>
+          <w:p>
+            <w:pPr>
+              <w:jc w:val="center"/>
+            </w:pPr>
+            <w:r>
+              <w:rPr>
+                <w:sz w:val="22"/>
+                <w:szCs w:val="22"/>
+              </w:rPr>
+              <w:t>Регистрационный номер записи о проверке знаний в реестре обученных лиц</w:t>
+            </w:r>
+          </w:p>
+        </w:tc>
+        <w:tc>
+          <w:tcPr>
+            <w:tcW w:w="951" w:type="dxa"/>
+            <w:tcBorders>
+              <w:top w:val="single" w:sz="4" w:space="0" w:color="000000"/>
+              <w:left w:val="single" w:sz="4" w:space="0" w:color="000000"/>
+              <w:bottom w:val="single" w:sz="4" w:space="0" w:color="000000"/>
+              <w:right w:val="single" w:sz="4" w:space="0" w:color="000000"/>
+            </w:tcBorders>
+            <w:shd w:val="clear" w:color="auto" w:fill="auto"/>
+            <w:tcMar>
+              <w:top w:w="80" w:type="dxa"/>
+              <w:left w:w="80" w:type="dxa"/>
+              <w:bottom w:w="80" w:type="dxa"/>
+              <w:right w:w="80" w:type="dxa"/>
+            </w:tcMar>
+            <w:vAlign w:val="center"/>
+          </w:tcPr>
+          <w:p>
+            <w:pPr>
+              <w:jc w:val="center"/>
+            </w:pPr>
+            <w:r>
+              <w:rPr>
+                <w:sz w:val="22"/>
+                <w:szCs w:val="22"/>
+              </w:rPr>
+              <w:t>Подпись проверяемого</w:t>
+            </w:r>
+          </w:p>
+        </w:tc>
+        <w:tc>
+          <w:tcPr>
+            <w:tcW w:w="1427" w:type="dxa"/>
+            <w:tcBorders>
+              <w:top w:val="single" w:sz="4" w:space="0" w:color="000000"/>
+              <w:left w:val="single" w:sz="4" w:space="0" w:color="000000"/>
+              <w:bottom w:val="single" w:sz="4" w:space="0" w:color="000000"/>
+              <w:right w:val="single" w:sz="4" w:space="0" w:color="000000"/>
+            </w:tcBorders>
+          </w:tcPr>
+          <w:p>
+            <w:pPr>
+              <w:jc w:val="center"/>
+              <w:rPr>
+                <w:sz w:val="22"/>
+                <w:szCs w:val="22"/>
+              </w:rPr>
+            </w:pPr>
+          </w:p>
+          <w:p>
+            <w:pPr>
+              <w:jc w:val="center"/>
+              <w:rPr>
+                <w:sz w:val="22"/>
+                <w:szCs w:val="22"/>
+              </w:rPr>
+            </w:pPr>
+          </w:p>
+          <w:p>
+            <w:pPr>
+              <w:jc w:val="center"/>
+              <w:rPr>
+                <w:sz w:val="22"/>
+                <w:szCs w:val="22"/>
+              </w:rPr>
+            </w:pPr>
+            <w:r>
+              <w:rPr>
+                <w:sz w:val="22"/>
+                <w:szCs w:val="22"/>
+              </w:rPr>
+              <w:t>Заключение экзаменационной</w:t>
+            </w:r>
+          </w:p>
+          <w:p>
+            <w:pPr>
+              <w:jc w:val="center"/>
+              <w:rPr>
+                <w:sz w:val="22"/>
+                <w:szCs w:val="22"/>
+              </w:rPr>
+            </w:pPr>
+            <w:r>
+              <w:rPr>
+                <w:sz w:val="22"/>
+                <w:szCs w:val="22"/>
+              </w:rPr>
+              <w:t>комиссии</w:t>
+            </w:r>
+          </w:p>
+          <w:p>
+            <w:pPr>
+              <w:rPr>
+                <w:sz w:val="22"/>
+                <w:szCs w:val="22"/>
+              </w:rPr>
+            </w:pPr>
+          </w:p>
+        </w:tc>
+      </w:tr>
+      <w:tr>
+        <w:trPr>
+          <w:trHeight w:val="230"/>
+        </w:trPr>
+        <w:tc>
+          <w:tcPr>
+            <w:tcW w:w="923" w:type="dxa"/>
+            <w:tcBorders>
+              <w:top w:val="single" w:sz="4" w:space="0" w:color="000000"/>
+              <w:left w:val="single" w:sz="4" w:space="0" w:color="000000"/>
+              <w:bottom w:val="single" w:sz="4" w:space="0" w:color="000000"/>
+              <w:right w:val="single" w:sz="4" w:space="0" w:color="000000"/>
+            </w:tcBorders>
+            <w:shd w:val="clear" w:color="auto" w:fill="auto"/>
+            <w:tcMar>
+              <w:top w:w="80" w:type="dxa"/>
+              <w:left w:w="80" w:type="dxa"/>
+              <w:bottom w:w="80" w:type="dxa"/>
+              <w:right w:w="80" w:type="dxa"/>
+            </w:tcMar>
+            <w:vAlign w:val="center"/>
+          </w:tcPr>
+          <w:p>
+            <w:pPr>
+              <w:jc w:val="center"/>
+            </w:pPr>
+            <w:r>
+              <w:rPr>
+                <w:sz w:val="22"/>
+                <w:szCs w:val="22"/>
+              </w:rPr>
+              <w:t>1</w:t>
+            </w:r>
+          </w:p>
+        </w:tc>
+        <w:tc>
+          <w:tcPr>
+            <w:tcW w:w="2918" w:type="dxa"/>
+            <w:tcBorders>
+              <w:top w:val="single" w:sz="4" w:space="0" w:color="000000"/>
+              <w:left w:val="single" w:sz="4" w:space="0" w:color="000000"/>
+              <w:bottom w:val="single" w:sz="4" w:space="0" w:color="000000"/>
+              <w:right w:val="single" w:sz="4" w:space="0" w:color="000000"/>
+            </w:tcBorders>
+            <w:shd w:val="clear" w:color="auto" w:fill="auto"/>
+            <w:tcMar>
+              <w:top w:w="80" w:type="dxa"/>
+              <w:left w:w="80" w:type="dxa"/>
+              <w:bottom w:w="80" w:type="dxa"/>
+              <w:right w:w="80" w:type="dxa"/>
+            </w:tcMar>
+            <w:vAlign w:val="center"/>
+          </w:tcPr>
+          <w:p>
+            <w:pPr>
+              <w:jc w:val="center"/>
+            </w:pPr>
+            <w:r>
+              <w:rPr>
+                <w:sz w:val="22"/>
+                <w:szCs w:val="22"/>
+              </w:rPr>
+              <w:t>2</w:t>
+            </w:r>
+          </w:p>
+        </w:tc>
+        <w:tc>
+          <w:tcPr>
+            <w:tcW w:w="2379" w:type="dxa"/>
+            <w:tcBorders>
+              <w:top w:val="single" w:sz="4" w:space="0" w:color="000000"/>
+              <w:left w:val="single" w:sz="4" w:space="0" w:color="000000"/>
+              <w:bottom w:val="single" w:sz="4" w:space="0" w:color="auto"/>
+              <w:right w:val="single" w:sz="4" w:space="0" w:color="000000"/>
+            </w:tcBorders>
+            <w:shd w:val="clear" w:color="auto" w:fill="auto"/>
+            <w:tcMar>
+              <w:top w:w="80" w:type="dxa"/>
+              <w:left w:w="80" w:type="dxa"/>
+              <w:bottom w:w="80" w:type="dxa"/>
+              <w:right w:w="80" w:type="dxa"/>
+            </w:tcMar>
+            <w:vAlign w:val="center"/>
+          </w:tcPr>
+          <w:p>
+            <w:pPr>
+              <w:jc w:val="center"/>
+            </w:pPr>
+            <w:r>
+              <w:rPr>
+                <w:sz w:val="22"/>
+                <w:szCs w:val="22"/>
+              </w:rPr>
+              <w:t>3</w:t>
+            </w:r>
+          </w:p>
+        </w:tc>
+        <w:tc>
+          <w:tcPr>
+            <w:tcW w:w="3136" w:type="dxa"/>
+            <w:tcBorders>
+              <w:top w:val="single" w:sz="4" w:space="0" w:color="000000"/>
+              <w:left w:val="single" w:sz="4" w:space="0" w:color="000000"/>
+              <w:bottom w:val="single" w:sz="4" w:space="0" w:color="auto"/>
+              <w:right w:val="single" w:sz="4" w:space="0" w:color="000000"/>
+            </w:tcBorders>
+            <w:shd w:val="clear" w:color="auto" w:fill="auto"/>
+            <w:tcMar>
+              <w:top w:w="80" w:type="dxa"/>
+              <w:left w:w="80" w:type="dxa"/>
+              <w:bottom w:w="80" w:type="dxa"/>
+              <w:right w:w="80" w:type="dxa"/>
+            </w:tcMar>
+            <w:vAlign w:val="center"/>
+          </w:tcPr>
+          <w:p>
+            <w:pPr>
+              <w:jc w:val="center"/>
+            </w:pPr>
+            <w:r>
+              <w:rPr>
+                <w:sz w:val="22"/>
+                <w:szCs w:val="22"/>
+              </w:rPr>
+              <w:t>4</w:t>
+            </w:r>
+          </w:p>
+        </w:tc>
+        <w:tc>
+          <w:tcPr>
+            <w:tcW w:w="842" w:type="dxa"/>
+            <w:tcBorders>
+              <w:top w:val="single" w:sz="4" w:space="0" w:color="000000"/>
+              <w:left w:val="single" w:sz="4" w:space="0" w:color="000000"/>
+              <w:bottom w:val="single" w:sz="4" w:space="0" w:color="000000"/>
+              <w:right w:val="single" w:sz="4" w:space="0" w:color="000000"/>
+            </w:tcBorders>
+          </w:tcPr>
+          <w:p>
+            <w:pPr>
+              <w:jc w:val="center"/>
+              <w:rPr>
+                <w:sz w:val="22"/>
+                <w:szCs w:val="22"/>
+              </w:rPr>
+            </w:pPr>
+            <w:r>
+              <w:rPr>
+                <w:sz w:val="22"/>
+                <w:szCs w:val="22"/>
+              </w:rPr>
+              <w:t>5</w:t>
+            </w:r>
+          </w:p>
+        </w:tc>
+        <w:tc>
+          <w:tcPr>
+            <w:tcW w:w="1621" w:type="dxa"/>
+            <w:tcBorders>
+              <w:top w:val="single" w:sz="4" w:space="0" w:color="000000"/>
+              <w:left w:val="single" w:sz="4" w:space="0" w:color="000000"/>
+              <w:bottom w:val="single" w:sz="4" w:space="0" w:color="000000"/>
+              <w:right w:val="single" w:sz="4" w:space="0" w:color="000000"/>
+            </w:tcBorders>
+            <w:shd w:val="clear" w:color="auto" w:fill="auto"/>
+            <w:tcMar>
+              <w:top w:w="80" w:type="dxa"/>
+              <w:left w:w="80" w:type="dxa"/>
+              <w:bottom w:w="80" w:type="dxa"/>
+              <w:right w:w="80" w:type="dxa"/>
+            </w:tcMar>
+            <w:vAlign w:val="center"/>
+          </w:tcPr>
+          <w:p>
+            <w:pPr>
+              <w:jc w:val="center"/>
+            </w:pPr>
+            <w:r>
+              <w:rPr>
+                <w:sz w:val="22"/>
+                <w:szCs w:val="22"/>
+              </w:rPr>
+              <w:t>6</w:t>
+            </w:r>
+          </w:p>
+        </w:tc>
+        <w:tc>
+          <w:tcPr>
+            <w:tcW w:w="1406" w:type="dxa"/>
+            <w:tcBorders>
+              <w:top w:val="single" w:sz="4" w:space="0" w:color="000000"/>
+              <w:left w:val="single" w:sz="4" w:space="0" w:color="000000"/>
+              <w:bottom w:val="single" w:sz="4" w:space="0" w:color="000000"/>
+              <w:right w:val="single" w:sz="4" w:space="0" w:color="000000"/>
+            </w:tcBorders>
+            <w:shd w:val="clear" w:color="auto" w:fill="auto"/>
+            <w:tcMar>
+              <w:top w:w="80" w:type="dxa"/>
+              <w:left w:w="80" w:type="dxa"/>
+              <w:bottom w:w="80" w:type="dxa"/>
+              <w:right w:w="80" w:type="dxa"/>
+            </w:tcMar>
+            <w:vAlign w:val="center"/>
+          </w:tcPr>
+          <w:p>
+            <w:pPr>
+              <w:jc w:val="center"/>
+            </w:pPr>
+            <w:r>
+              <w:rPr>
+                <w:sz w:val="22"/>
+                <w:szCs w:val="22"/>
+              </w:rPr>
+              <w:t>7</w:t>
+            </w:r>
+          </w:p>
+        </w:tc>
+        <w:tc>
+          <w:tcPr>
+            <w:tcW w:w="951" w:type="dxa"/>
+            <w:tcBorders>
+              <w:top w:val="single" w:sz="4" w:space="0" w:color="000000"/>
+              <w:left w:val="single" w:sz="4" w:space="0" w:color="000000"/>
+              <w:bottom w:val="single" w:sz="4" w:space="0" w:color="000000"/>
+              <w:right w:val="single" w:sz="4" w:space="0" w:color="000000"/>
+            </w:tcBorders>
+            <w:shd w:val="clear" w:color="auto" w:fill="auto"/>
+            <w:tcMar>
+              <w:top w:w="80" w:type="dxa"/>
+              <w:left w:w="80" w:type="dxa"/>
+              <w:bottom w:w="80" w:type="dxa"/>
+              <w:right w:w="80" w:type="dxa"/>
+            </w:tcMar>
+            <w:vAlign w:val="center"/>
+          </w:tcPr>
+          <w:p>
+            <w:pPr>
+              <w:jc w:val="center"/>
+              <w:rPr>
+                <w:lang w:val="en-US"/>
+              </w:rPr>
+            </w:pPr>
+            <w:r>
+              <w:rPr>
+                <w:sz w:val="22"/>
+                <w:szCs w:val="22"/>
+                <w:lang w:val="en-US"/>
+              </w:rPr>
+              <w:t>8</w:t>
+            </w:r>
+          </w:p>
+        </w:tc>
+        <w:tc>
+          <w:tcPr>
+            <w:tcW w:w="1427" w:type="dxa"/>
+            <w:tcBorders>
+              <w:top w:val="single" w:sz="4" w:space="0" w:color="000000"/>
+              <w:left w:val="single" w:sz="4" w:space="0" w:color="000000"/>
+              <w:bottom w:val="single" w:sz="4" w:space="0" w:color="000000"/>
+              <w:right w:val="single" w:sz="4" w:space="0" w:color="000000"/>
+            </w:tcBorders>
+          </w:tcPr>
+          <w:p>
+            <w:pPr>
+              <w:jc w:val="center"/>
+              <w:rPr>
+                <w:sz w:val="22"/>
+                <w:szCs w:val="22"/>
+              </w:rPr>
+            </w:pPr>
+            <w:r>
+              <w:rPr>
+                <w:sz w:val="22"/>
+                <w:szCs w:val="22"/>
+              </w:rPr>
+              <w:t>9</w:t>
+            </w:r>
+          </w:p>
+        </w:tc>
+      </w:tr>
+      <w:tr>
+        <w:trPr>
+          <w:trHeight w:val="1862"/>
+        </w:trPr>
+        <w:tc>
+          <w:tcPr>
+            <w:tcW w:w="923" w:type="dxa"/>
+            <w:tcBorders>
+              <w:top w:val="single" w:sz="4" w:space="0" w:color="000000"/>
+              <w:left w:val="single" w:sz="4" w:space="0" w:color="000000"/>
+              <w:bottom w:val="single" w:sz="4" w:space="0" w:color="000000"/>
+              <w:right w:val="single" w:sz="4" w:space="0" w:color="000000"/>
+            </w:tcBorders>
+            <w:shd w:val="clear" w:color="auto" w:fill="auto"/>
+            <w:tcMar>
+              <w:top w:w="80" w:type="dxa"/>
+              <w:left w:w="80" w:type="dxa"/>
+              <w:bottom w:w="80" w:type="dxa"/>
+              <w:right w:w="80" w:type="dxa"/>
+            </w:tcMar>
+            <w:vAlign w:val="center"/>
+          </w:tcPr>
+          <w:p>
+            <w:pPr>
+              <w:pStyle w:val="a5"/>
+              <w:numPr>
+                <w:ilvl w:val="0"/>
+                <w:numId w:val="1"/>
+              </w:numPr>
+            </w:pPr>
+            <w:r>
+              <w:rPr>
+                <w:sz w:val="22"/>
+                <w:szCs w:val="22"/>
+                <w:lang w:val="en-US"/>
+              </w:rPr>
+              <w:t>{#employee}</w:t>
+            </w:r>
+          </w:p>
+        </w:tc>
+        <w:tc>
+          <w:tcPr>
+            <w:tcW w:w="2918" w:type="dxa"/>
+            <w:tcBorders>
+              <w:top w:val="single" w:sz="4" w:space="0" w:color="000000"/>
+              <w:left w:val="single" w:sz="4" w:space="0" w:color="000000"/>
+              <w:bottom w:val="single" w:sz="4" w:space="0" w:color="000000"/>
+              <w:right w:val="single" w:sz="4" w:space="0" w:color="auto"/>
+            </w:tcBorders>
+            <w:shd w:val="clear" w:color="auto" w:fill="auto"/>
+            <w:tcMar>
+              <w:top w:w="80" w:type="dxa"/>
+              <w:left w:w="80" w:type="dxa"/>
+              <w:bottom w:w="80" w:type="dxa"/>
+              <w:right w:w="80" w:type="dxa"/>
+            </w:tcMar>
+            <w:vAlign w:val="center"/>
+          </w:tcPr>
+          <w:p>
+            <w:pPr>
+              <w:rPr>
+                <w:lang w:val="en-US"/>
+              </w:rPr>
+            </w:pPr>
+            <w:r>
+              <w:rPr>
+                <w:sz w:val="22"/>
+                <w:szCs w:val="22"/>
+                <w:lang w:val="en-US"/>
+              </w:rPr>
+              <w:t>{</w:t>
+            </w:r>
+            <w:proofErr w:type="spellStart"/>
+            <w:r>
+              <w:rPr>
+                <w:sz w:val="22"/>
+                <w:szCs w:val="22"/>
+                <w:lang w:val="en-US"/>
+              </w:rPr>
+              <w:t>last_</w:t>
+            </w:r>
+            <w:r>
+              <w:rPr>
+                <w:sz w:val="22"/>
+                <w:szCs w:val="22"/>
+                <w:lang w:val="en-US"/>
+              </w:rPr>
+              <w:t>name</w:t>
+            </w:r>
+            <w:proofErr w:type="spellEnd"/>
+            <w:r>
+              <w:rPr>
+                <w:sz w:val="22"/>
+                <w:szCs w:val="22"/>
+                <w:lang w:val="en-US"/>
+              </w:rPr>
+              <w:t>} {name} {</w:t>
+            </w:r>
+            <w:proofErr w:type="spellStart"/>
+            <w:r>
+              <w:rPr>
+                <w:sz w:val="22"/>
+                <w:szCs w:val="22"/>
+                <w:lang w:val="en-US"/>
+              </w:rPr>
+              <w:t>middle_name</w:t>
+            </w:r>
+            <w:proofErr w:type="spellEnd"/>
+            <w:r>
+              <w:rPr>
+                <w:sz w:val="22"/>
+                <w:szCs w:val="22"/>
+                <w:lang w:val="en-US"/>
+              </w:rPr>
+              <w:t>}</w:t>
+            </w:r>
+          </w:p>
+        </w:tc>
+        <w:tc>
+          <w:tcPr>
+            <w:tcW w:w="2379" w:type="dxa"/>
+            <w:tcBorders>
+              <w:top w:val="single" w:sz="4" w:space="0" w:color="auto"/>
+              <w:left w:val="single" w:sz="4" w:space="0" w:color="auto"/>
+              <w:bottom w:val="single" w:sz="4" w:space="0" w:color="auto"/>
+              <w:right w:val="single" w:sz="4" w:space="0" w:color="auto"/>
+            </w:tcBorders>
+            <w:shd w:val="clear" w:color="auto" w:fill="auto"/>
+            <w:tcMar>
+              <w:top w:w="80" w:type="dxa"/>
+              <w:left w:w="80" w:type="dxa"/>
+              <w:bottom w:w="80" w:type="dxa"/>
+              <w:right w:w="80" w:type="dxa"/>
+            </w:tcMar>
+            <w:vAlign w:val="center"/>
+          </w:tcPr>
+          <w:p>
+            <w:pPr>
+              <w:jc w:val="center"/>
+            </w:pPr>
+            <w:r>
+              <w:rPr>
+                <w:sz w:val="22"/>
+                <w:szCs w:val="22"/>
+                <w:lang w:val="en-US"/>
+              </w:rPr>
+              <w:t>{</w:t>
+            </w:r>
+            <w:proofErr w:type="spellStart"/>
+            <w:r>
+              <w:rPr>
+                <w:sz w:val="22"/>
+                <w:szCs w:val="22"/>
+                <w:lang w:val="en-US"/>
+              </w:rPr>
+              <w:t>organization_name</w:t>
+            </w:r>
+            <w:proofErr w:type="spellEnd"/>
+            <w:r>
+              <w:rPr>
+                <w:sz w:val="22"/>
+                <w:szCs w:val="22"/>
+                <w:lang w:val="en-US"/>
+              </w:rPr>
+              <w:t>}</w:t>
+            </w:r>
+          </w:p>
+        </w:tc>
+        <w:tc>
+          <w:tcPr>
+            <w:tcW w:w="3136" w:type="dxa"/>
+            <w:tcBorders>
+              <w:top w:val="single" w:sz="4" w:space="0" w:color="auto"/>
+              <w:left w:val="single" w:sz="4" w:space="0" w:color="auto"/>
+              <w:bottom w:val="single" w:sz="4" w:space="0" w:color="auto"/>
+              <w:right w:val="single" w:sz="4" w:space="0" w:color="auto"/>
+            </w:tcBorders>
+            <w:shd w:val="clear" w:color="auto" w:fill="auto"/>
+            <w:tcMar>
+              <w:top w:w="80" w:type="dxa"/>
+              <w:left w:w="80" w:type="dxa"/>
+              <w:bottom w:w="80" w:type="dxa"/>
+              <w:right w:w="80" w:type="dxa"/>
+            </w:tcMar>
+            <w:vAlign w:val="center"/>
+          </w:tcPr>
+          <w:p>
+            <w:pPr>
+              <w:jc w:val="center"/>
+            </w:pPr>
+            <w:r>
+              <w:rPr>
+                <w:sz w:val="22"/>
+                <w:szCs w:val="22"/>
+                <w:lang w:val="en-US"/>
+              </w:rPr>
+              <w:t>{grade}</w:t>
+            </w:r>
+          </w:p>
+        </w:tc>
+        <w:tc>
+          <w:tcPr>
+            <w:tcW w:w="842" w:type="dxa"/>
+            <w:tcBorders>
+              <w:top w:val="single" w:sz="4" w:space="0" w:color="000000"/>
+              <w:left w:val="single" w:sz="4" w:space="0" w:color="auto"/>
+              <w:bottom w:val="single" w:sz="4" w:space="0" w:color="000000"/>
+              <w:right w:val="single" w:sz="4" w:space="0" w:color="auto"/>
+            </w:tcBorders>
+          </w:tcPr>
+          <w:p>
+            <w:pPr>
+              <w:jc w:val="center"/>
+              <w:rPr>
+                <w:i/>
+                <w:iCs/>
+                <w:sz w:val="22"/>
+                <w:szCs w:val="22"/>
+                <w:lang w:val="en-US"/>
+              </w:rPr>
+            </w:pPr>
+          </w:p>
+          <w:p>
+            <w:pPr>
+              <w:jc w:val="center"/>
+              <w:rPr>
+                <w:i/>
+                <w:iCs/>
+                <w:sz w:val="22"/>
+                <w:szCs w:val="22"/>
+                <w:lang w:val="en-US"/>
+              </w:rPr>
+            </w:pPr>
+          </w:p>
+          <w:p>
+            <w:pPr>
+              <w:jc w:val="center"/>
+              <w:rPr>
+                <w:i/>
+                <w:iCs/>
+                <w:sz w:val="22"/>
+                <w:szCs w:val="22"/>
+                <w:lang w:val="en-US"/>
+              </w:rPr>
+            </w:pPr>
+          </w:p>
+          <w:p>
+            <w:pPr>
+              <w:jc w:val="center"/>
+              <w:rPr>
+                <w:i/>
+                <w:iCs/>
+                <w:sz w:val="22"/>
+                <w:szCs w:val="22"/>
+                <w:lang w:val="en-US"/>
+              </w:rPr>
+            </w:pPr>
+          </w:p>
+          <w:p>
+            <w:pPr>
+              <w:jc w:val="center"/>
+              <w:rPr>
+                <w:i/>
+                <w:iCs/>
+                <w:sz w:val="22"/>
+                <w:szCs w:val="22"/>
+                <w:lang w:val="en-US"/>
+              </w:rPr>
+            </w:pPr>
+          </w:p>
+          <w:p>
+            <w:pPr>
+              <w:jc w:val="center"/>
+              <w:rPr>
+                <w:i/>
+                <w:iCs/>
+                <w:sz w:val="22"/>
+                <w:szCs w:val="22"/>
+                <w:lang w:val="en-US"/>
+              </w:rPr>
+            </w:pPr>
+            <w:r>
+              <w:rPr>
+                <w:i/>
+                <w:iCs/>
+                <w:sz w:val="22"/>
+                <w:szCs w:val="22"/>
+                <w:lang w:val="en-US"/>
+              </w:rPr>
+              <w:t>{</w:t>
+            </w:r>
+            <w:proofErr w:type="spellStart"/>
+            <w:r>
+              <w:rPr>
+                <w:i/>
+                <w:iCs/>
+                <w:sz w:val="22"/>
+                <w:szCs w:val="22"/>
+                <w:lang w:val="en-US"/>
+              </w:rPr>
+              <w:t>random_number</w:t>
+            </w:r>
+            <w:proofErr w:type="spellEnd"/>
+            <w:r>
+              <w:rPr>
+                <w:i/>
+                <w:iCs/>
+                <w:sz w:val="22"/>
+                <w:szCs w:val="22"/>
+                <w:lang w:val="en-US"/>
+              </w:rPr>
+              <w:t>}</w:t>
+            </w:r>
+          </w:p>
+        </w:tc>
+        <w:tc>
+          <w:tcPr>
+            <w:tcW w:w="1621" w:type="dxa"/>
+            <w:tcBorders>
+              <w:top w:val="single" w:sz="4" w:space="0" w:color="000000"/>
+              <w:left w:val="single" w:sz="4" w:space="0" w:color="auto"/>
+              <w:bottom w:val="single" w:sz="4" w:space="0" w:color="000000"/>
+              <w:right w:val="single" w:sz="4" w:space="0" w:color="000000"/>
+            </w:tcBorders>
+            <w:shd w:val="clear" w:color="auto" w:fill="auto"/>
+            <w:tcMar>
+              <w:top w:w="80" w:type="dxa"/>
+              <w:left w:w="80" w:type="dxa"/>
+              <w:bottom w:w="80" w:type="dxa"/>
+              <w:right w:w="80" w:type="dxa"/>
+            </w:tcMar>
+            <w:vAlign w:val="center"/>
+          </w:tcPr>
+          <w:p>
+            <w:pPr>
+              <w:jc w:val="center"/>
+              <w:rPr>
+                <w:lang w:val="en-US"/>
+              </w:rPr>
+            </w:pPr>
+            <w:r>
+              <w:rPr>
+                <w:i/>
+                <w:iCs/>
+                <w:sz w:val="22"/>
+                <w:szCs w:val="22"/>
+                <w:lang w:val="en-US"/>
+              </w:rPr>
+              <w:t>{</w:t>
+            </w:r>
+            <w:r>
+              <w:rPr>
+                <w:i/>
+                <w:iCs/>
+                <w:sz w:val="22"/>
+                <w:szCs w:val="22"/>
+              </w:rPr>
+              <w:t>c</w:t>
+            </w:r>
+            <w:proofErr w:type="spellStart"/>
+            <w:r>
+              <w:rPr>
+                <w:i/>
+                <w:iCs/>
+                <w:sz w:val="22"/>
+                <w:szCs w:val="22"/>
+                <w:lang w:val="en-US"/>
+              </w:rPr>
+              <w:t>ourses_mark</w:t>
+            </w:r>
+            <w:proofErr w:type="spellEnd"/>
+            <w:r>
+              <w:rPr>
+                <w:i/>
+                <w:iCs/>
+                <w:sz w:val="22"/>
+                <w:szCs w:val="22"/>
+              </w:rPr>
+              <w:t>}</w:t>
+            </w:r>
+          </w:p>
+        </w:tc>
+        <w:tc>
+          <w:tcPr>
+            <w:tcW w:w="1406" w:type="dxa"/>
+            <w:tcBorders>
+              <w:top w:val="single" w:sz="4" w:space="0" w:color="000000"/>
+              <w:left w:val="single" w:sz="4" w:space="0" w:color="000000"/>
+              <w:bottom w:val="single" w:sz="4" w:space="0" w:color="000000"/>
+              <w:right w:val="single" w:sz="4" w:space="0" w:color="000000"/>
+            </w:tcBorders>
+            <w:shd w:val="clear" w:color="auto" w:fill="auto"/>
+            <w:tcMar>
+              <w:top w:w="80" w:type="dxa"/>
+              <w:left w:w="80" w:type="dxa"/>
+              <w:bottom w:w="80" w:type="dxa"/>
+              <w:right w:w="80" w:type="dxa"/>
+            </w:tcMar>
+            <w:vAlign w:val="center"/>
+          </w:tcPr>
+          <w:p/>
+        </w:tc>
+        <w:tc>
+          <w:tcPr>
+            <w:tcW w:w="951" w:type="dxa"/>
+            <w:tcBorders>
+              <w:top w:val="single" w:sz="4" w:space="0" w:color="000000"/>
+              <w:left w:val="single" w:sz="4" w:space="0" w:color="000000"/>
+              <w:bottom w:val="single" w:sz="4" w:space="0" w:color="000000"/>
+              <w:right w:val="single" w:sz="4" w:space="0" w:color="000000"/>
+            </w:tcBorders>
+            <w:shd w:val="clear" w:color="auto" w:fill="auto"/>
+            <w:tcMar>
+              <w:top w:w="80" w:type="dxa"/>
+              <w:left w:w="80" w:type="dxa"/>
+              <w:bottom w:w="80" w:type="dxa"/>
+              <w:right w:w="80" w:type="dxa"/>
+            </w:tcMar>
+            <w:vAlign w:val="center"/>
+          </w:tcPr>
+          <w:p/>
+        </w:tc>
+        <w:tc>
+          <w:tcPr>
+            <w:tcW w:w="1427" w:type="dxa"/>
+            <w:vMerge/>
+            <w:tcBorders>
+              <w:top w:val="single" w:sz="4" w:space="0" w:color="000000"/>
+              <w:left w:val="single" w:sz="4" w:space="0" w:color="000000"/>
+              <w:bottom w:val="single" w:sz="4" w:space="0" w:color="000000"/>
+              <w:right w:val="single" w:sz="4" w:space="0" w:color="000000"/>
+            </w:tcBorders>
+          </w:tcPr>
+          <w:p>
+            <w:pPr>
+              <w:rPr>
+                <w:sz w:val="22"/>
+                <w:szCs w:val="22"/>
+              </w:rPr>
+            </w:pPr>
+          </w:p>
+          <w:p>
+            <w:pPr>
+              <w:rPr>
+                <w:sz w:val="22"/>
+                <w:szCs w:val="22"/>
+              </w:rPr>
+            </w:pPr>
+          </w:p>
+          <w:p>
+            <w:pPr>
+              <w:rPr>
+                <w:sz w:val="22"/>
+                <w:szCs w:val="22"/>
+              </w:rPr>
+            </w:pPr>
+          </w:p>
+          <w:p>
+            <w:pPr>
+              <w:rPr>
+                <w:sz w:val="22"/>
+                <w:szCs w:val="22"/>
+              </w:rPr>
+            </w:pPr>
+          </w:p>
+          <w:p>
+            <w:pPr>
+              <w:rPr>
+                <w:sz w:val="22"/>
+                <w:szCs w:val="22"/>
+                <w:lang w:val="en-US"/>
+              </w:rPr>
+            </w:pPr>
+            <w:r>
+              <w:rPr>
+                <w:sz w:val="22"/>
+                <w:szCs w:val="22"/>
+                <w:lang w:val="en-US"/>
+              </w:rPr>
+              <w:t xml:space="preserve"> </w:t>
+            </w:r>
+            <w:r>
+              <w:rPr>
+                <w:sz w:val="22"/>
+                <w:szCs w:val="22"/>
+              </w:rPr>
+              <w:t>{</w:t>
+            </w:r>
+            <w:proofErr w:type="spellStart"/>
+            <w:r>
+              <w:rPr>
+                <w:sz w:val="22"/>
+                <w:szCs w:val="22"/>
+              </w:rPr>
+              <w:t>conclusion</w:t>
+            </w:r>
+            <w:proofErr w:type="spellEnd"/>
+            <w:r>
+              <w:rPr>
+                <w:sz w:val="22"/>
+                <w:szCs w:val="22"/>
+                <w:lang w:val="en-US"/>
+              </w:rPr>
+              <w:t>}</w:t>
+            </w:r>
+            <w:r>
+              <w:rPr>
+                <w:i/>
+                <w:iCs/>
+                <w:sz w:val="22"/>
+                <w:szCs w:val="22"/>
+                <w:lang w:val="en-US"/>
+              </w:rPr>
+              <w:t>{/employee}</w:t>
+            </w:r>
+          </w:p>
+        </w:tc>
+      </w:tr>
+    </w:tbl>
+    <w:p>
+      <w:pPr>
+        <w:widowControl w:val="0"/>
+        <w:ind w:left="324" w:hanging="324"/>
+        <w:rPr>
+          <w:sz w:val="22"/>
+          <w:szCs w:val="22"/>
+        </w:rPr>
+      </w:pPr>
+    </w:p>
+    <w:p>
+      <w:pPr>
+        <w:widowControl w:val="0"/>
+        <w:ind w:left="216" w:hanging="216"/>
+        <w:rPr>
+          <w:sz w:val="22"/>
+          <w:szCs w:val="22"/>
+        </w:rPr>
+      </w:pPr>
+    </w:p>
+    <w:p>
+      <w:pPr>
+        <w:widowControl w:val="0"/>
+        <w:ind w:left="108" w:hanging="108"/>
+        <w:rPr>
+          <w:sz w:val="22"/>
+          <w:szCs w:val="22"/>
+        </w:rPr>
+      </w:pPr>
+    </w:p>
+    <w:p>
+      <w:pPr>
+        <w:widowControl w:val="0"/>
+        <w:jc w:val="both"/>
+        <w:rPr>
+          <w:sz w:val="22"/>
+          <w:szCs w:val="22"/>
+        </w:rPr>
+      </w:pPr>
+    </w:p>
+    <w:p>
+      <w:pPr>
+        <w:tabs>
+          <w:tab w:val="left" w:pos="2220"/>
+        </w:tabs>
+        <w:rPr>
+          <w:sz w:val="18"/>
+          <w:szCs w:val="18"/>
+        </w:rPr>
+      </w:pPr>
+      <w:r>
+        <w:rPr>
+          <w:sz w:val="28"/>
+          <w:szCs w:val="28"/>
+        </w:rPr>
+        <w:tab/>
+      </w:r>
+    </w:p>
+    <w:p>
+      <w:pPr>
+        <w:ind w:left="3828"/>
+      </w:pPr>
+      <w:r>
+        <w:t>Председатель комиссии:</w:t>
+      </w:r>
+      <w:r>
+        <w:tab/>
+      </w:r>
+      <w:r>
+        <w:tab/>
+      </w:r>
+      <w:r>
+        <w:tab/>
+      </w:r>
+      <w:r>
+        <w:tab/>
+        <w:t xml:space="preserve">/ В.М. </w:t>
+      </w:r>
+      <w:proofErr w:type="spellStart"/>
+      <w:r>
+        <w:t>Шекшуев</w:t>
+      </w:r>
+      <w:proofErr w:type="spellEnd"/>
+      <w:r>
+        <w:t xml:space="preserve"> /</w:t>
+      </w:r>
+    </w:p>
+    <w:p>
+      <w:pPr>
+        <w:ind w:left="3828"/>
+        <w:rPr>
+          <w:sz w:val="12"/>
+          <w:szCs w:val="12"/>
+        </w:rPr>
+      </w:pPr>
+    </w:p>
+    <w:p>
+      <w:pPr>
+        <w:ind w:left="3828"/>
+      </w:pPr>
+      <w:r>
+        <w:t>Члены комиссии:</w:t>
+      </w:r>
+      <w:r>
+        <w:tab/>
+      </w:r>
+      <w:r>
+        <w:tab/>
+      </w:r>
+      <w:r>
+        <w:tab/>
+      </w:r>
+      <w:r>
+        <w:tab/>
+      </w:r>
+      <w:r>
+        <w:tab/>
+        <w:t>/ Е.С. Воробьева /</w:t>
+      </w:r>
+    </w:p>
+    <w:p>
+      <w:pPr>
+        <w:ind w:left="3828"/>
+        <w:rPr>
+          <w:sz w:val="12"/>
+          <w:szCs w:val="12"/>
+        </w:rPr>
+      </w:pPr>
+    </w:p>
+    <w:p>
+      <w:pPr>
+        <w:ind w:left="3828"/>
+      </w:pPr>
+      <w:r>
+        <w:tab/>
+      </w:r>
+      <w:r>
+        <w:tab/>
+      </w:r>
+      <w:r>
+        <w:tab/>
+      </w:r>
+      <w:r>
+        <w:tab/>
+      </w:r>
+      <w:r>
+        <w:tab/>
+      </w:r>
+      <w:r>
+        <w:tab/>
+      </w:r>
+      <w:r>
+        <w:tab/>
+        <w:t xml:space="preserve">/ И.Ю. </w:t>
+      </w:r>
+      <w:proofErr w:type="spellStart"/>
+      <w:r>
+        <w:t>Шекшуева</w:t>
+      </w:r>
+      <w:proofErr w:type="spellEnd"/>
+      <w:r>
+        <w:t xml:space="preserve"> /</w:t>
+      </w:r>
+    </w:p>
+    <w:sectPr>
+      <w:headerReference w:type="default" r:id="rId7"/>
+      <w:footerReference w:type="default" r:id="rId8"/>
+      <w:pgSz w:w="16840" w:h="11900" w:orient="landscape"/>
+      <w:pgMar w:top="142" w:right="536" w:bottom="0" w:left="1134" w:header="709" w:footer="709" w:gutter="0"/>
+      <w:cols w:space="720"/>
+    </w:sectPr>
+  </w:body>
+</w:document>
+</file>
+
+<file path=doc.xml><?xml version="1.0" encoding="utf-8"?>
+<w:document xmlns:wpc="http://schemas.microsoft.com/office/word/2010/wordprocessingCanvas" xmlns:cx="http://schemas.microsoft.com/office/drawing/2014/chartex" xmlns:cx1="http://schemas.microsoft.com/office/drawing/2015/9/8/chartex" xmlns:cx2="http://schemas.microsoft.com/office/drawing/2015/10/21/chartex" xmlns:cx3="http://schemas.microsoft.com/office/drawing/2016/5/9/chartex" xmlns:cx4="http://schemas.microsoft.com/office/drawing/2016/5/10/chartex" xmlns:cx5="http://schemas.microsoft.com/office/drawing/2016/5/11/chartex" xmlns:cx6="http://schemas.microsoft.com/office/drawing/2016/5/12/chartex" xmlns:cx7="http://schemas.microsoft.com/office/drawing/2016/5/13/chartex" xmlns:cx8="http://schemas.microsoft.com/office/drawing/2016/5/14/chartex" xmlns:mc="http://schemas.openxmlformats.org/markup-compatibility/2006" xmlns:aink="http://schemas.microsoft.com/office/drawing/2016/ink" xmlns:am3d="http://schemas.microsoft.com/office/drawing/2017/model3d" xmlns:o="urn:schemas-microsoft-com:office:office" xmlns:oel="http://schemas.microsoft.com/office/2019/extlst" xmlns:r="http://schemas.openxmlformats.org/officeDocument/2006/relationships" xmlns:m="http://schemas.openxmlformats.org/officeDocument/2006/math" xmlns:v="urn:schemas-microsoft-com:vml" xmlns:wp14="http://schemas.microsoft.com/office/word/2010/wordprocessingDrawing" xmlns:wp="http://schemas.openxmlformats.org/drawingml/2006/wordprocessingDrawing" xmlns:w10="urn:schemas-microsoft-com:office:word" xmlns:w="http://schemas.openxmlformats.org/wordprocessingml/2006/main" xmlns:w14="http://schemas.microsoft.com/office/word/2010/wordml" xmlns:w15="http://schemas.microsoft.com/office/word/2012/wordml" xmlns:w16cex="http://schemas.microsoft.com/office/word/2018/wordml/cex" xmlns:w16cid="http://schemas.microsoft.com/office/word/2016/wordml/cid" xmlns:w16="http://schemas.microsoft.com/office/word/2018/wordml" xmlns:w16sdtdh="http://schemas.microsoft.com/office/word/2020/wordml/sdtdatahash" xmlns:w16se="http://schemas.microsoft.com/office/word/2015/wordml/symex" xmlns:wpg="http://schemas.microsoft.com/office/word/2010/wordprocessingGroup" xmlns:wpi="http://schemas.microsoft.com/office/word/2010/wordprocessingInk" xmlns:wne="http://schemas.microsoft.com/office/word/2006/wordml" xmlns:wps="http://schemas.microsoft.com/office/word/2010/wordprocessingShape" mc:Ignorable="w14 w15 w16se w16cid w16 w16cex w16sdtdh wp14">
+  <w:body>
+    <w:p>
+      <w:pPr>
+        <w:jc w:val="center"/>
+        <w:rPr>
+          <w:b/>
+          <w:bCs/>
+          <w:sz w:val="28"/>
+          <w:szCs w:val="28"/>
+          <w:lang w:val="en-US"/>
+        </w:rPr>
+      </w:pPr>
+      <w:r>
+        <w:rPr>
+          <w:b/>
+          <w:bCs/>
+          <w:sz w:val="28"/>
+          <w:szCs w:val="28"/>
+          <w:lang w:val="en-US"/>
+        </w:rPr>
+        <w:t>{</w:t>
+      </w:r>
+      <w:proofErr w:type="spellStart"/>
+      <w:r>
+        <w:rPr>
+          <w:b/>
+          <w:bCs/>
+          <w:sz w:val="28"/>
+          <w:szCs w:val="28"/>
+          <w:lang w:val="en-US"/>
+        </w:rPr>
+        <w:t>moisei_name</w:t>
+      </w:r>
+      <w:proofErr w:type="spellEnd"/>
+      <w:r>
+        <w:rPr>
+          <w:b/>
+          <w:bCs/>
+          <w:sz w:val="28"/>
+          <w:szCs w:val="28"/>
+          <w:lang w:val="en-US"/>
+        </w:rPr>
+        <w:t>}</w:t>
+      </w:r>
+    </w:p>
+    <w:p>
+      <w:pPr>
+        <w:jc w:val="center"/>
+        <w:rPr>
+          <w:b/>
+          <w:bCs/>
+          <w:sz w:val="22"/>
+          <w:szCs w:val="22"/>
+        </w:rPr>
+      </w:pPr>
+    </w:p>
+    <w:p>
+      <w:pPr>
+        <w:jc w:val="center"/>
+        <w:rPr>
+          <w:b/>
+          <w:bCs/>
+          <w:sz w:val="28"/>
+          <w:szCs w:val="28"/>
+        </w:rPr>
+      </w:pPr>
+      <w:r>
+        <w:rPr>
+          <w:b/>
+          <w:bCs/>
+          <w:sz w:val="28"/>
+          <w:szCs w:val="28"/>
+        </w:rPr>
+        <w:t xml:space="preserve">П Р О Т О К О Л    </w:t>
+      </w:r>
+      <w:proofErr w:type="gramStart"/>
+      <w:r>
+        <w:rPr>
+          <w:b/>
+          <w:bCs/>
+          <w:sz w:val="28"/>
+          <w:szCs w:val="28"/>
+        </w:rPr>
+        <w:t xml:space="preserve">№  </w:t>
+      </w:r>
+      <w:r>
+        <w:rPr>
+          <w:b/>
+          <w:bCs/>
+          <w:sz w:val="28"/>
+          <w:szCs w:val="28"/>
+        </w:rPr>
+        <w:t>{</w:t>
+      </w:r>
+      <w:proofErr w:type="gramEnd"/>
+      <w:r>
+        <w:rPr>
+          <w:b/>
+          <w:bCs/>
+          <w:sz w:val="28"/>
+          <w:szCs w:val="28"/>
+          <w:lang w:val="en-US"/>
+        </w:rPr>
+        <w:t>group</w:t>
+      </w:r>
+      <w:r>
+        <w:rPr>
+          <w:b/>
+          <w:bCs/>
+          <w:sz w:val="28"/>
+          <w:szCs w:val="28"/>
+        </w:rPr>
+        <w:t>_</w:t>
+      </w:r>
+      <w:r>
+        <w:rPr>
+          <w:b/>
+          <w:bCs/>
+          <w:sz w:val="28"/>
+          <w:szCs w:val="28"/>
+          <w:lang w:val="en-US"/>
+        </w:rPr>
+        <w:t>id</w:t>
+      </w:r>
+      <w:r>
+        <w:rPr>
+          <w:b/>
+          <w:bCs/>
+          <w:sz w:val="28"/>
+          <w:szCs w:val="28"/>
+        </w:rPr>
+        <w:t>}</w:t>
+      </w:r>
+      <w:r>
+        <w:rPr>
+          <w:b/>
+          <w:bCs/>
+          <w:sz w:val="28"/>
+          <w:szCs w:val="28"/>
+        </w:rPr>
+        <w:t xml:space="preserve">  от  </w:t>
+      </w:r>
+      <w:r>
+        <w:rPr>
+          <w:b/>
+          <w:bCs/>
+          <w:sz w:val="28"/>
+          <w:szCs w:val="28"/>
+        </w:rPr>
+        <w:t>{</w:t>
+      </w:r>
+      <w:r>
+        <w:rPr>
+          <w:b/>
+          <w:bCs/>
+          <w:sz w:val="28"/>
+          <w:szCs w:val="28"/>
+          <w:lang w:val="en-US"/>
+        </w:rPr>
+        <w:t>end</w:t>
+      </w:r>
+      <w:r>
+        <w:rPr>
+          <w:b/>
+          <w:bCs/>
+          <w:sz w:val="28"/>
+          <w:szCs w:val="28"/>
+        </w:rPr>
+        <w:t>_</w:t>
+      </w:r>
+      <w:r>
+        <w:rPr>
+          <w:b/>
+          <w:bCs/>
+          <w:sz w:val="28"/>
+          <w:szCs w:val="28"/>
+          <w:lang w:val="en-US"/>
+        </w:rPr>
+        <w:t>date</w:t>
+      </w:r>
+      <w:r>
+        <w:rPr>
+          <w:b/>
+          <w:bCs/>
+          <w:sz w:val="28"/>
+          <w:szCs w:val="28"/>
+        </w:rPr>
+        <w:t>}</w:t>
+      </w:r>
+    </w:p>
+    <w:p>
+      <w:pPr>
+        <w:jc w:val="center"/>
+        <w:rPr>
+          <w:b/>
+          <w:bCs/>
+          <w:sz w:val="28"/>
+          <w:szCs w:val="28"/>
+        </w:rPr>
+      </w:pPr>
+      <w:r>
+        <w:rPr>
+          <w:b/>
+          <w:bCs/>
+          <w:sz w:val="28"/>
+          <w:szCs w:val="28"/>
+        </w:rPr>
+        <w:t>заседания комиссии по проверке знаний</w:t>
+      </w:r>
+    </w:p>
+    <w:p>
+      <w:pPr>
+        <w:rPr>
+          <w:sz w:val="18"/>
+          <w:szCs w:val="18"/>
+        </w:rPr>
+      </w:pPr>
+    </w:p>
+    <w:p>
+      <w:r>
+        <w:t>В соответствии с приказом директора от «01» сентября 2022 г. № 10 комиссия в составе:</w:t>
+      </w:r>
+    </w:p>
+    <w:p>
+      <w:pPr>
+        <w:rPr>
+          <w:sz w:val="22"/>
+          <w:szCs w:val="22"/>
+        </w:rPr>
+      </w:pPr>
+    </w:p>
+    <w:p>
+      <w:r>
+        <w:rPr>
+          <w:b/>
+          <w:bCs/>
+        </w:rPr>
+        <w:t>Председатель комиссии:</w:t>
+      </w:r>
+      <w:r>
+        <w:tab/>
+      </w:r>
+      <w:proofErr w:type="spellStart"/>
+      <w:r>
+        <w:t>Шекшуев</w:t>
+      </w:r>
+      <w:proofErr w:type="spellEnd"/>
+      <w:r>
+        <w:t xml:space="preserve"> В.М.. - директор</w:t>
+      </w:r>
+    </w:p>
+    <w:p>
+      <w:r>
+        <w:rPr>
+          <w:b/>
+          <w:bCs/>
+        </w:rPr>
+        <w:t>Члены комиссии:</w:t>
+      </w:r>
+      <w:r>
+        <w:rPr>
+          <w:b/>
+          <w:bCs/>
+        </w:rPr>
+        <w:tab/>
+      </w:r>
+      <w:r>
+        <w:tab/>
+        <w:t>Воробьева Е.С. – заместитель директора</w:t>
+      </w:r>
+    </w:p>
+    <w:p>
+      <w:r>
+        <w:tab/>
+      </w:r>
+      <w:r>
+        <w:tab/>
+      </w:r>
+      <w:r>
+        <w:tab/>
+      </w:r>
+      <w:r>
+        <w:tab/>
+      </w:r>
+      <w:proofErr w:type="spellStart"/>
+      <w:r>
+        <w:t>Шекшуева</w:t>
+      </w:r>
+      <w:proofErr w:type="spellEnd"/>
+      <w:r>
+        <w:t xml:space="preserve"> И.Ю. – специалист учебного центра</w:t>
+      </w:r>
+    </w:p>
+    <w:p>
+      <w:pPr>
+        <w:pStyle w:val="a4"/>
+        <w:tabs>
+          <w:tab w:val="left" w:pos="2694"/>
+        </w:tabs>
+        <w:rPr>
+          <w:sz w:val="22"/>
+          <w:szCs w:val="22"/>
+        </w:rPr>
+      </w:pPr>
+    </w:p>
+    <w:p>
+      <w:pPr>
+        <w:jc w:val="both"/>
+      </w:pPr>
+      <w:r>
+        <w:t>Проведена проверка знаний по программе: - «</w:t>
+      </w:r>
+      <w:r>
+        <w:t>{</w:t>
+      </w:r>
+      <w:r>
+        <w:rPr>
+          <w:lang w:val="en-US"/>
+        </w:rPr>
+        <w:t>course</w:t>
+      </w:r>
+      <w:r>
+        <w:t>_</w:t>
+      </w:r>
+      <w:r>
+        <w:rPr>
+          <w:lang w:val="en-US"/>
+        </w:rPr>
+        <w:t>name</w:t>
+      </w:r>
+      <w:r>
+        <w:t>}</w:t>
+      </w:r>
+      <w:r>
+        <w:t xml:space="preserve">» в объеме </w:t>
+      </w:r>
+      <w:r>
+        <w:t>{</w:t>
+      </w:r>
+      <w:r>
+        <w:rPr>
+          <w:lang w:val="en-US"/>
+        </w:rPr>
+        <w:t>hours</w:t>
+      </w:r>
+      <w:r>
+        <w:t>}</w:t>
+      </w:r>
+      <w:r>
+        <w:t xml:space="preserve"> часов;</w:t>
+      </w:r>
+    </w:p>
+    <w:p>
+      <w:pPr>
+        <w:jc w:val="both"/>
+        <w:rPr>
+          <w:sz w:val="22"/>
+          <w:szCs w:val="22"/>
+        </w:rPr>
+      </w:pPr>
+      <w:r>
+        <w:rPr>
+          <w:sz w:val="22"/>
+          <w:szCs w:val="22"/>
+        </w:rPr>
+        <w:t>- - «</w:t>
+      </w:r>
+      <w:r>
+        <w:rPr>
+          <w:sz w:val="22"/>
+          <w:szCs w:val="22"/>
+        </w:rPr>
+        <w:t>{</w:t>
+      </w:r>
+      <w:r>
+        <w:rPr>
+          <w:sz w:val="22"/>
+          <w:szCs w:val="22"/>
+          <w:lang w:val="en-US"/>
+        </w:rPr>
+        <w:t>course</w:t>
+      </w:r>
+      <w:r>
+        <w:rPr>
+          <w:sz w:val="22"/>
+          <w:szCs w:val="22"/>
+        </w:rPr>
+        <w:t>_</w:t>
+      </w:r>
+      <w:r>
+        <w:rPr>
+          <w:sz w:val="22"/>
+          <w:szCs w:val="22"/>
+          <w:lang w:val="en-US"/>
+        </w:rPr>
+        <w:t>name</w:t>
+      </w:r>
+      <w:r>
+        <w:rPr>
+          <w:sz w:val="22"/>
+          <w:szCs w:val="22"/>
+        </w:rPr>
+        <w:t>}</w:t>
+      </w:r>
+      <w:r>
+        <w:rPr>
+          <w:sz w:val="22"/>
+          <w:szCs w:val="22"/>
+        </w:rPr>
+        <w:t xml:space="preserve">» в объеме </w:t>
+      </w:r>
+      <w:r>
+        <w:rPr>
+          <w:sz w:val="22"/>
+          <w:szCs w:val="22"/>
+        </w:rPr>
+        <w:t>{</w:t>
+      </w:r>
+      <w:r>
+        <w:rPr>
+          <w:sz w:val="22"/>
+          <w:szCs w:val="22"/>
+          <w:lang w:val="en-US"/>
+        </w:rPr>
+        <w:t>hours</w:t>
+      </w:r>
+      <w:r>
+        <w:rPr>
+          <w:sz w:val="22"/>
+          <w:szCs w:val="22"/>
+        </w:rPr>
+        <w:t>}</w:t>
+      </w:r>
+      <w:r>
+        <w:rPr>
+          <w:sz w:val="22"/>
+          <w:szCs w:val="22"/>
+        </w:rPr>
+        <w:t xml:space="preserve"> часов:</w:t>
+      </w:r>
+    </w:p>
+    <w:tbl>
+      <w:tblPr>
+        <w:tblStyle w:val="TableNormal"/>
+        <w:tblW w:w="15603" w:type="dxa"/>
+        <w:tblInd w:w="-289" w:type="dxa"/>
+        <w:tblBorders>
+          <w:top w:val="single" w:sz="8" w:space="0" w:color="FFFFFF"/>
+          <w:left w:val="single" w:sz="8" w:space="0" w:color="FFFFFF"/>
+          <w:bottom w:val="single" w:sz="8" w:space="0" w:color="FFFFFF"/>
+          <w:right w:val="single" w:sz="8" w:space="0" w:color="FFFFFF"/>
+          <w:insideH w:val="single" w:sz="8" w:space="0" w:color="FFFFFF"/>
+          <w:insideV w:val="single" w:sz="8" w:space="0" w:color="FFFFFF"/>
+        </w:tblBorders>
+        <w:shd w:val="clear" w:color="auto" w:fill="CED7E7"/>
+        <w:tblLayout w:type="fixed"/>
+        <w:tblLook w:val="04A0" w:firstRow="1" w:lastRow="0" w:firstColumn="1" w:lastColumn="0" w:noHBand="0" w:noVBand="1"/>
+      </w:tblPr>
+      <w:tblGrid>
+        <w:gridCol w:w="923"/>
+        <w:gridCol w:w="2918"/>
+        <w:gridCol w:w="2379"/>
+        <w:gridCol w:w="3136"/>
+        <w:gridCol w:w="842"/>
+        <w:gridCol w:w="1621"/>
+        <w:gridCol w:w="1406"/>
+        <w:gridCol w:w="951"/>
+        <w:gridCol w:w="1427"/>
+      </w:tblGrid>
+      <w:tr>
+        <w:trPr>
+          <w:trHeight w:val="1046"/>
+        </w:trPr>
+        <w:tc>
+          <w:tcPr>
+            <w:tcW w:w="923" w:type="dxa"/>
+            <w:tcBorders>
+              <w:top w:val="single" w:sz="4" w:space="0" w:color="000000"/>
+              <w:left w:val="single" w:sz="4" w:space="0" w:color="000000"/>
+              <w:bottom w:val="single" w:sz="4" w:space="0" w:color="000000"/>
+              <w:right w:val="single" w:sz="4" w:space="0" w:color="000000"/>
+            </w:tcBorders>
+            <w:shd w:val="clear" w:color="auto" w:fill="auto"/>
+            <w:tcMar>
+              <w:top w:w="80" w:type="dxa"/>
+              <w:left w:w="80" w:type="dxa"/>
+              <w:bottom w:w="80" w:type="dxa"/>
+              <w:right w:w="80" w:type="dxa"/>
+            </w:tcMar>
+            <w:vAlign w:val="center"/>
+          </w:tcPr>
+          <w:p>
+            <w:pPr>
+              <w:jc w:val="center"/>
+            </w:pPr>
+            <w:r>
+              <w:rPr>
+                <w:sz w:val="22"/>
+                <w:szCs w:val="22"/>
+              </w:rPr>
+              <w:t>№</w:t>
+            </w:r>
+          </w:p>
+        </w:tc>
+        <w:tc>
+          <w:tcPr>
+            <w:tcW w:w="2918" w:type="dxa"/>
+            <w:tcBorders>
+              <w:top w:val="single" w:sz="4" w:space="0" w:color="000000"/>
+              <w:left w:val="single" w:sz="4" w:space="0" w:color="000000"/>
+              <w:bottom w:val="single" w:sz="4" w:space="0" w:color="000000"/>
+              <w:right w:val="single" w:sz="4" w:space="0" w:color="000000"/>
+            </w:tcBorders>
+            <w:shd w:val="clear" w:color="auto" w:fill="auto"/>
+            <w:tcMar>
+              <w:top w:w="80" w:type="dxa"/>
+              <w:left w:w="80" w:type="dxa"/>
+              <w:bottom w:w="80" w:type="dxa"/>
+              <w:right w:w="80" w:type="dxa"/>
+            </w:tcMar>
+            <w:vAlign w:val="center"/>
+          </w:tcPr>
+          <w:p>
+            <w:pPr>
+              <w:jc w:val="center"/>
+            </w:pPr>
+            <w:r>
+              <w:rPr>
+                <w:sz w:val="22"/>
+                <w:szCs w:val="22"/>
+              </w:rPr>
+              <w:t>Ф.И.О.</w:t>
+            </w:r>
+          </w:p>
+        </w:tc>
+        <w:tc>
+          <w:tcPr>
+            <w:tcW w:w="2379" w:type="dxa"/>
+            <w:tcBorders>
+              <w:top w:val="single" w:sz="4" w:space="0" w:color="000000"/>
+              <w:left w:val="single" w:sz="4" w:space="0" w:color="000000"/>
+              <w:bottom w:val="single" w:sz="4" w:space="0" w:color="000000"/>
+              <w:right w:val="single" w:sz="4" w:space="0" w:color="000000"/>
+            </w:tcBorders>
+            <w:shd w:val="clear" w:color="auto" w:fill="auto"/>
+            <w:tcMar>
+              <w:top w:w="80" w:type="dxa"/>
+              <w:left w:w="80" w:type="dxa"/>
+              <w:bottom w:w="80" w:type="dxa"/>
+              <w:right w:w="80" w:type="dxa"/>
+            </w:tcMar>
+            <w:vAlign w:val="center"/>
+          </w:tcPr>
+          <w:p>
+            <w:pPr>
+              <w:jc w:val="center"/>
+            </w:pPr>
+            <w:r>
+              <w:rPr>
+                <w:sz w:val="22"/>
+                <w:szCs w:val="22"/>
+              </w:rPr>
+              <w:t>Наименование предприятия</w:t>
+            </w:r>
+          </w:p>
+        </w:tc>
+        <w:tc>
+          <w:tcPr>
+            <w:tcW w:w="3136" w:type="dxa"/>
+            <w:tcBorders>
+              <w:top w:val="single" w:sz="4" w:space="0" w:color="000000"/>
+              <w:left w:val="single" w:sz="4" w:space="0" w:color="000000"/>
+              <w:bottom w:val="single" w:sz="4" w:space="0" w:color="000000"/>
+              <w:right w:val="single" w:sz="4" w:space="0" w:color="000000"/>
+            </w:tcBorders>
+            <w:shd w:val="clear" w:color="auto" w:fill="auto"/>
+            <w:tcMar>
+              <w:top w:w="80" w:type="dxa"/>
+              <w:left w:w="80" w:type="dxa"/>
+              <w:bottom w:w="80" w:type="dxa"/>
+              <w:right w:w="80" w:type="dxa"/>
+            </w:tcMar>
+            <w:vAlign w:val="center"/>
+          </w:tcPr>
+          <w:p>
+            <w:pPr>
+              <w:jc w:val="center"/>
+            </w:pPr>
+            <w:r>
+              <w:rPr>
+                <w:sz w:val="22"/>
+                <w:szCs w:val="22"/>
+              </w:rPr>
+              <w:t>Занимаемая должность</w:t>
+            </w:r>
+          </w:p>
+        </w:tc>
+        <w:tc>
+          <w:tcPr>
+            <w:tcW w:w="842" w:type="dxa"/>
+            <w:tcBorders>
+              <w:top w:val="single" w:sz="4" w:space="0" w:color="000000"/>
+              <w:left w:val="single" w:sz="4" w:space="0" w:color="000000"/>
+              <w:bottom w:val="single" w:sz="4" w:space="0" w:color="000000"/>
+              <w:right w:val="single" w:sz="4" w:space="0" w:color="000000"/>
+            </w:tcBorders>
+          </w:tcPr>
+          <w:p>
+            <w:pPr>
+              <w:jc w:val="center"/>
+              <w:rPr>
+                <w:sz w:val="22"/>
+                <w:szCs w:val="22"/>
+              </w:rPr>
+            </w:pPr>
+          </w:p>
+          <w:p>
+            <w:pPr>
+              <w:jc w:val="center"/>
+              <w:rPr>
+                <w:sz w:val="22"/>
+                <w:szCs w:val="22"/>
+              </w:rPr>
+            </w:pPr>
+          </w:p>
+          <w:p>
+            <w:pPr>
+              <w:jc w:val="center"/>
+              <w:rPr>
+                <w:sz w:val="22"/>
+                <w:szCs w:val="22"/>
+              </w:rPr>
+            </w:pPr>
+          </w:p>
+          <w:p>
+            <w:pPr>
+              <w:jc w:val="center"/>
+              <w:rPr>
+                <w:sz w:val="22"/>
+                <w:szCs w:val="22"/>
+              </w:rPr>
+            </w:pPr>
+            <w:r>
+              <w:rPr>
+                <w:sz w:val="22"/>
+                <w:szCs w:val="22"/>
+              </w:rPr>
+              <w:t>Номер билета</w:t>
+            </w:r>
+          </w:p>
+        </w:tc>
+        <w:tc>
+          <w:tcPr>
+            <w:tcW w:w="1621" w:type="dxa"/>
+            <w:tcBorders>
+              <w:top w:val="single" w:sz="4" w:space="0" w:color="000000"/>
+              <w:left w:val="single" w:sz="4" w:space="0" w:color="000000"/>
+              <w:bottom w:val="single" w:sz="4" w:space="0" w:color="000000"/>
+              <w:right w:val="single" w:sz="4" w:space="0" w:color="000000"/>
+            </w:tcBorders>
+            <w:shd w:val="clear" w:color="auto" w:fill="auto"/>
+            <w:tcMar>
+              <w:top w:w="80" w:type="dxa"/>
+              <w:left w:w="80" w:type="dxa"/>
+              <w:bottom w:w="80" w:type="dxa"/>
+              <w:right w:w="80" w:type="dxa"/>
+            </w:tcMar>
+            <w:vAlign w:val="center"/>
+          </w:tcPr>
+          <w:p>
+            <w:pPr>
+              <w:jc w:val="center"/>
+            </w:pPr>
+            <w:r>
+              <w:rPr>
+                <w:sz w:val="22"/>
+                <w:szCs w:val="22"/>
+              </w:rPr>
+              <w:t>Результат проверки знаний</w:t>
+            </w:r>
+          </w:p>
+        </w:tc>
+        <w:tc>
+          <w:tcPr>
+            <w:tcW w:w="1406" w:type="dxa"/>
+            <w:tcBorders>
+              <w:top w:val="single" w:sz="4" w:space="0" w:color="000000"/>
+              <w:left w:val="single" w:sz="4" w:space="0" w:color="000000"/>
+              <w:bottom w:val="single" w:sz="4" w:space="0" w:color="000000"/>
+              <w:right w:val="single" w:sz="4" w:space="0" w:color="000000"/>
+            </w:tcBorders>
+            <w:shd w:val="clear" w:color="auto" w:fill="auto"/>
+            <w:tcMar>
+              <w:top w:w="80" w:type="dxa"/>
+              <w:left w:w="80" w:type="dxa"/>
+              <w:bottom w:w="80" w:type="dxa"/>
+              <w:right w:w="80" w:type="dxa"/>
+            </w:tcMar>
+            <w:vAlign w:val="center"/>
+          </w:tcPr>
+          <w:p>
+            <w:pPr>
+              <w:jc w:val="center"/>
+            </w:pPr>
+            <w:r>
+              <w:rPr>
+                <w:sz w:val="22"/>
+                <w:szCs w:val="22"/>
+              </w:rPr>
+              <w:t>Регистрационный номер записи о проверке знаний в реестре обученных лиц</w:t>
+            </w:r>
+          </w:p>
+        </w:tc>
+        <w:tc>
+          <w:tcPr>
+            <w:tcW w:w="951" w:type="dxa"/>
+            <w:tcBorders>
+              <w:top w:val="single" w:sz="4" w:space="0" w:color="000000"/>
+              <w:left w:val="single" w:sz="4" w:space="0" w:color="000000"/>
+              <w:bottom w:val="single" w:sz="4" w:space="0" w:color="000000"/>
+              <w:right w:val="single" w:sz="4" w:space="0" w:color="000000"/>
+            </w:tcBorders>
+            <w:shd w:val="clear" w:color="auto" w:fill="auto"/>
+            <w:tcMar>
+              <w:top w:w="80" w:type="dxa"/>
+              <w:left w:w="80" w:type="dxa"/>
+              <w:bottom w:w="80" w:type="dxa"/>
+              <w:right w:w="80" w:type="dxa"/>
+            </w:tcMar>
+            <w:vAlign w:val="center"/>
+          </w:tcPr>
+          <w:p>
+            <w:pPr>
+              <w:jc w:val="center"/>
+            </w:pPr>
+            <w:r>
+              <w:rPr>
+                <w:sz w:val="22"/>
+                <w:szCs w:val="22"/>
+              </w:rPr>
+              <w:t>Подпись проверяемого</w:t>
+            </w:r>
+          </w:p>
+        </w:tc>
+        <w:tc>
+          <w:tcPr>
+            <w:tcW w:w="1427" w:type="dxa"/>
+            <w:tcBorders>
+              <w:top w:val="single" w:sz="4" w:space="0" w:color="000000"/>
+              <w:left w:val="single" w:sz="4" w:space="0" w:color="000000"/>
+              <w:bottom w:val="single" w:sz="4" w:space="0" w:color="000000"/>
+              <w:right w:val="single" w:sz="4" w:space="0" w:color="000000"/>
+            </w:tcBorders>
+          </w:tcPr>
+          <w:p>
+            <w:pPr>
+              <w:jc w:val="center"/>
+              <w:rPr>
+                <w:sz w:val="22"/>
+                <w:szCs w:val="22"/>
+              </w:rPr>
+            </w:pPr>
+          </w:p>
+          <w:p>
+            <w:pPr>
+              <w:jc w:val="center"/>
+              <w:rPr>
+                <w:sz w:val="22"/>
+                <w:szCs w:val="22"/>
+              </w:rPr>
+            </w:pPr>
+          </w:p>
+          <w:p>
+            <w:pPr>
+              <w:jc w:val="center"/>
+              <w:rPr>
+                <w:sz w:val="22"/>
+                <w:szCs w:val="22"/>
+              </w:rPr>
+            </w:pPr>
+            <w:r>
+              <w:rPr>
+                <w:sz w:val="22"/>
+                <w:szCs w:val="22"/>
+              </w:rPr>
+              <w:t>Заключение экзаменационной</w:t>
+            </w:r>
+          </w:p>
+          <w:p>
+            <w:pPr>
+              <w:jc w:val="center"/>
+              <w:rPr>
+                <w:sz w:val="22"/>
+                <w:szCs w:val="22"/>
+              </w:rPr>
+            </w:pPr>
+            <w:r>
+              <w:rPr>
+                <w:sz w:val="22"/>
+                <w:szCs w:val="22"/>
+              </w:rPr>
+              <w:t>комиссии</w:t>
+            </w:r>
+          </w:p>
+          <w:p>
+            <w:pPr>
+              <w:rPr>
+                <w:sz w:val="22"/>
+                <w:szCs w:val="22"/>
+              </w:rPr>
+            </w:pPr>
+          </w:p>
+        </w:tc>
+      </w:tr>
+      <w:tr>
+        <w:trPr>
+          <w:trHeight w:val="230"/>
+        </w:trPr>
+        <w:tc>
+          <w:tcPr>
+            <w:tcW w:w="923" w:type="dxa"/>
+            <w:tcBorders>
+              <w:top w:val="single" w:sz="4" w:space="0" w:color="000000"/>
+              <w:left w:val="single" w:sz="4" w:space="0" w:color="000000"/>
+              <w:bottom w:val="single" w:sz="4" w:space="0" w:color="000000"/>
+              <w:right w:val="single" w:sz="4" w:space="0" w:color="000000"/>
+            </w:tcBorders>
+            <w:shd w:val="clear" w:color="auto" w:fill="auto"/>
+            <w:tcMar>
+              <w:top w:w="80" w:type="dxa"/>
+              <w:left w:w="80" w:type="dxa"/>
+              <w:bottom w:w="80" w:type="dxa"/>
+              <w:right w:w="80" w:type="dxa"/>
+            </w:tcMar>
+            <w:vAlign w:val="center"/>
+          </w:tcPr>
+          <w:p>
+            <w:pPr>
+              <w:jc w:val="center"/>
+            </w:pPr>
+            <w:r>
+              <w:rPr>
+                <w:sz w:val="22"/>
+                <w:szCs w:val="22"/>
+              </w:rPr>
+              <w:t>1</w:t>
+            </w:r>
+          </w:p>
+        </w:tc>
+        <w:tc>
+          <w:tcPr>
+            <w:tcW w:w="2918" w:type="dxa"/>
+            <w:tcBorders>
+              <w:top w:val="single" w:sz="4" w:space="0" w:color="000000"/>
+              <w:left w:val="single" w:sz="4" w:space="0" w:color="000000"/>
+              <w:bottom w:val="single" w:sz="4" w:space="0" w:color="000000"/>
+              <w:right w:val="single" w:sz="4" w:space="0" w:color="000000"/>
+            </w:tcBorders>
+            <w:shd w:val="clear" w:color="auto" w:fill="auto"/>
+            <w:tcMar>
+              <w:top w:w="80" w:type="dxa"/>
+              <w:left w:w="80" w:type="dxa"/>
+              <w:bottom w:w="80" w:type="dxa"/>
+              <w:right w:w="80" w:type="dxa"/>
+            </w:tcMar>
+            <w:vAlign w:val="center"/>
+          </w:tcPr>
+          <w:p>
+            <w:pPr>
+              <w:jc w:val="center"/>
+            </w:pPr>
+            <w:r>
+              <w:rPr>
+                <w:sz w:val="22"/>
+                <w:szCs w:val="22"/>
+              </w:rPr>
+              <w:t>2</w:t>
+            </w:r>
+          </w:p>
+        </w:tc>
+        <w:tc>
+          <w:tcPr>
+            <w:tcW w:w="2379" w:type="dxa"/>
+            <w:tcBorders>
+              <w:top w:val="single" w:sz="4" w:space="0" w:color="000000"/>
+              <w:left w:val="single" w:sz="4" w:space="0" w:color="000000"/>
+              <w:bottom w:val="single" w:sz="4" w:space="0" w:color="auto"/>
+              <w:right w:val="single" w:sz="4" w:space="0" w:color="000000"/>
+            </w:tcBorders>
+            <w:shd w:val="clear" w:color="auto" w:fill="auto"/>
+            <w:tcMar>
+              <w:top w:w="80" w:type="dxa"/>
+              <w:left w:w="80" w:type="dxa"/>
+              <w:bottom w:w="80" w:type="dxa"/>
+              <w:right w:w="80" w:type="dxa"/>
+            </w:tcMar>
+            <w:vAlign w:val="center"/>
+          </w:tcPr>
+          <w:p>
+            <w:pPr>
+              <w:jc w:val="center"/>
+            </w:pPr>
+            <w:r>
+              <w:rPr>
+                <w:sz w:val="22"/>
+                <w:szCs w:val="22"/>
+              </w:rPr>
+              <w:t>3</w:t>
+            </w:r>
+          </w:p>
+        </w:tc>
+        <w:tc>
+          <w:tcPr>
+            <w:tcW w:w="3136" w:type="dxa"/>
+            <w:tcBorders>
+              <w:top w:val="single" w:sz="4" w:space="0" w:color="000000"/>
+              <w:left w:val="single" w:sz="4" w:space="0" w:color="000000"/>
+              <w:bottom w:val="single" w:sz="4" w:space="0" w:color="auto"/>
+              <w:right w:val="single" w:sz="4" w:space="0" w:color="000000"/>
+            </w:tcBorders>
+            <w:shd w:val="clear" w:color="auto" w:fill="auto"/>
+            <w:tcMar>
+              <w:top w:w="80" w:type="dxa"/>
+              <w:left w:w="80" w:type="dxa"/>
+              <w:bottom w:w="80" w:type="dxa"/>
+              <w:right w:w="80" w:type="dxa"/>
+            </w:tcMar>
+            <w:vAlign w:val="center"/>
+          </w:tcPr>
+          <w:p>
+            <w:pPr>
+              <w:jc w:val="center"/>
+            </w:pPr>
+            <w:r>
+              <w:rPr>
+                <w:sz w:val="22"/>
+                <w:szCs w:val="22"/>
+              </w:rPr>
+              <w:t>4</w:t>
+            </w:r>
+          </w:p>
+        </w:tc>
+        <w:tc>
+          <w:tcPr>
+            <w:tcW w:w="842" w:type="dxa"/>
+            <w:tcBorders>
+              <w:top w:val="single" w:sz="4" w:space="0" w:color="000000"/>
+              <w:left w:val="single" w:sz="4" w:space="0" w:color="000000"/>
+              <w:bottom w:val="single" w:sz="4" w:space="0" w:color="000000"/>
+              <w:right w:val="single" w:sz="4" w:space="0" w:color="000000"/>
+            </w:tcBorders>
+          </w:tcPr>
+          <w:p>
+            <w:pPr>
+              <w:jc w:val="center"/>
+              <w:rPr>
+                <w:sz w:val="22"/>
+                <w:szCs w:val="22"/>
+              </w:rPr>
+            </w:pPr>
+            <w:r>
+              <w:rPr>
+                <w:sz w:val="22"/>
+                <w:szCs w:val="22"/>
+              </w:rPr>
+              <w:t>5</w:t>
+            </w:r>
+          </w:p>
+        </w:tc>
+        <w:tc>
+          <w:tcPr>
+            <w:tcW w:w="1621" w:type="dxa"/>
+            <w:tcBorders>
+              <w:top w:val="single" w:sz="4" w:space="0" w:color="000000"/>
+              <w:left w:val="single" w:sz="4" w:space="0" w:color="000000"/>
+              <w:bottom w:val="single" w:sz="4" w:space="0" w:color="000000"/>
+              <w:right w:val="single" w:sz="4" w:space="0" w:color="000000"/>
+            </w:tcBorders>
+            <w:shd w:val="clear" w:color="auto" w:fill="auto"/>
+            <w:tcMar>
+              <w:top w:w="80" w:type="dxa"/>
+              <w:left w:w="80" w:type="dxa"/>
+              <w:bottom w:w="80" w:type="dxa"/>
+              <w:right w:w="80" w:type="dxa"/>
+            </w:tcMar>
+            <w:vAlign w:val="center"/>
+          </w:tcPr>
+          <w:p>
+            <w:pPr>
+              <w:jc w:val="center"/>
+            </w:pPr>
+            <w:r>
+              <w:rPr>
+                <w:sz w:val="22"/>
+                <w:szCs w:val="22"/>
+              </w:rPr>
+              <w:t>6</w:t>
+            </w:r>
+          </w:p>
+        </w:tc>
+        <w:tc>
+          <w:tcPr>
+            <w:tcW w:w="1406" w:type="dxa"/>
+            <w:tcBorders>
+              <w:top w:val="single" w:sz="4" w:space="0" w:color="000000"/>
+              <w:left w:val="single" w:sz="4" w:space="0" w:color="000000"/>
+              <w:bottom w:val="single" w:sz="4" w:space="0" w:color="000000"/>
+              <w:right w:val="single" w:sz="4" w:space="0" w:color="000000"/>
+            </w:tcBorders>
+            <w:shd w:val="clear" w:color="auto" w:fill="auto"/>
+            <w:tcMar>
+              <w:top w:w="80" w:type="dxa"/>
+              <w:left w:w="80" w:type="dxa"/>
+              <w:bottom w:w="80" w:type="dxa"/>
+              <w:right w:w="80" w:type="dxa"/>
+            </w:tcMar>
+            <w:vAlign w:val="center"/>
+          </w:tcPr>
+          <w:p>
+            <w:pPr>
+              <w:jc w:val="center"/>
+            </w:pPr>
+            <w:r>
+              <w:rPr>
+                <w:sz w:val="22"/>
+                <w:szCs w:val="22"/>
+              </w:rPr>
+              <w:t>7</w:t>
+            </w:r>
+          </w:p>
+        </w:tc>
+        <w:tc>
+          <w:tcPr>
+            <w:tcW w:w="951" w:type="dxa"/>
+            <w:tcBorders>
+              <w:top w:val="single" w:sz="4" w:space="0" w:color="000000"/>
+              <w:left w:val="single" w:sz="4" w:space="0" w:color="000000"/>
+              <w:bottom w:val="single" w:sz="4" w:space="0" w:color="000000"/>
+              <w:right w:val="single" w:sz="4" w:space="0" w:color="000000"/>
+            </w:tcBorders>
+            <w:shd w:val="clear" w:color="auto" w:fill="auto"/>
+            <w:tcMar>
+              <w:top w:w="80" w:type="dxa"/>
+              <w:left w:w="80" w:type="dxa"/>
+              <w:bottom w:w="80" w:type="dxa"/>
+              <w:right w:w="80" w:type="dxa"/>
+            </w:tcMar>
+            <w:vAlign w:val="center"/>
+          </w:tcPr>
+          <w:p>
+            <w:pPr>
+              <w:jc w:val="center"/>
+              <w:rPr>
+                <w:lang w:val="en-US"/>
+              </w:rPr>
+            </w:pPr>
+            <w:r>
+              <w:rPr>
+                <w:sz w:val="22"/>
+                <w:szCs w:val="22"/>
+                <w:lang w:val="en-US"/>
+              </w:rPr>
+              <w:t>8</w:t>
+            </w:r>
+          </w:p>
+        </w:tc>
+        <w:tc>
+          <w:tcPr>
+            <w:tcW w:w="1427" w:type="dxa"/>
+            <w:tcBorders>
+              <w:top w:val="single" w:sz="4" w:space="0" w:color="000000"/>
+              <w:left w:val="single" w:sz="4" w:space="0" w:color="000000"/>
+              <w:bottom w:val="single" w:sz="4" w:space="0" w:color="000000"/>
+              <w:right w:val="single" w:sz="4" w:space="0" w:color="000000"/>
+            </w:tcBorders>
+          </w:tcPr>
+          <w:p>
+            <w:pPr>
+              <w:jc w:val="center"/>
+              <w:rPr>
+                <w:sz w:val="22"/>
+                <w:szCs w:val="22"/>
+              </w:rPr>
+            </w:pPr>
+            <w:r>
+              <w:rPr>
+                <w:sz w:val="22"/>
+                <w:szCs w:val="22"/>
+              </w:rPr>
+              <w:t>9</w:t>
+            </w:r>
+          </w:p>
+        </w:tc>
+      </w:tr>
+      <w:tr>
+        <w:trPr>
+          <w:trHeight w:val="1862"/>
+        </w:trPr>
+        <w:tc>
+          <w:tcPr>
+            <w:tcW w:w="923" w:type="dxa"/>
+            <w:tcBorders>
+              <w:top w:val="single" w:sz="4" w:space="0" w:color="000000"/>
+              <w:left w:val="single" w:sz="4" w:space="0" w:color="000000"/>
+              <w:bottom w:val="single" w:sz="4" w:space="0" w:color="000000"/>
+              <w:right w:val="single" w:sz="4" w:space="0" w:color="000000"/>
+            </w:tcBorders>
+            <w:shd w:val="clear" w:color="auto" w:fill="auto"/>
+            <w:tcMar>
+              <w:top w:w="80" w:type="dxa"/>
+              <w:left w:w="80" w:type="dxa"/>
+              <w:bottom w:w="80" w:type="dxa"/>
+              <w:right w:w="80" w:type="dxa"/>
+            </w:tcMar>
+            <w:vAlign w:val="center"/>
+          </w:tcPr>
+          <w:p>
+            <w:pPr>
+              <w:pStyle w:val="a5"/>
+              <w:numPr>
+                <w:ilvl w:val="0"/>
+                <w:numId w:val="1"/>
+              </w:numPr>
+            </w:pPr>
+            <w:r>
+              <w:rPr>
+                <w:sz w:val="22"/>
+                <w:szCs w:val="22"/>
+                <w:lang w:val="en-US"/>
+              </w:rPr>
+              <w:t>{#employee}</w:t>
+            </w:r>
+          </w:p>
+        </w:tc>
+        <w:tc>
+          <w:tcPr>
+            <w:tcW w:w="2918" w:type="dxa"/>
+            <w:tcBorders>
+              <w:top w:val="single" w:sz="4" w:space="0" w:color="000000"/>
+              <w:left w:val="single" w:sz="4" w:space="0" w:color="000000"/>
+              <w:bottom w:val="single" w:sz="4" w:space="0" w:color="000000"/>
+              <w:right w:val="single" w:sz="4" w:space="0" w:color="auto"/>
+            </w:tcBorders>
+            <w:shd w:val="clear" w:color="auto" w:fill="auto"/>
+            <w:tcMar>
+              <w:top w:w="80" w:type="dxa"/>
+              <w:left w:w="80" w:type="dxa"/>
+              <w:bottom w:w="80" w:type="dxa"/>
+              <w:right w:w="80" w:type="dxa"/>
+            </w:tcMar>
+            <w:vAlign w:val="center"/>
+          </w:tcPr>
+          <w:p>
+            <w:pPr>
+              <w:rPr>
+                <w:lang w:val="en-US"/>
+              </w:rPr>
+            </w:pPr>
+            <w:r>
+              <w:rPr>
+                <w:sz w:val="22"/>
+                <w:szCs w:val="22"/>
+                <w:lang w:val="en-US"/>
+              </w:rPr>
+              <w:t>{</w:t>
+            </w:r>
+            <w:proofErr w:type="spellStart"/>
+            <w:r>
+              <w:rPr>
+                <w:sz w:val="22"/>
+                <w:szCs w:val="22"/>
+                <w:lang w:val="en-US"/>
+              </w:rPr>
+              <w:t>last_</w:t>
+            </w:r>
+            <w:r>
+              <w:rPr>
+                <w:sz w:val="22"/>
+                <w:szCs w:val="22"/>
+                <w:lang w:val="en-US"/>
+              </w:rPr>
+              <w:t>name</w:t>
+            </w:r>
+            <w:proofErr w:type="spellEnd"/>
+            <w:r>
+              <w:rPr>
+                <w:sz w:val="22"/>
+                <w:szCs w:val="22"/>
+                <w:lang w:val="en-US"/>
+              </w:rPr>
+              <w:t>} {name} {</w:t>
+            </w:r>
+            <w:proofErr w:type="spellStart"/>
+            <w:r>
+              <w:rPr>
+                <w:sz w:val="22"/>
+                <w:szCs w:val="22"/>
+                <w:lang w:val="en-US"/>
+              </w:rPr>
+              <w:t>middle_name</w:t>
+            </w:r>
+            <w:proofErr w:type="spellEnd"/>
+            <w:r>
+              <w:rPr>
+                <w:sz w:val="22"/>
+                <w:szCs w:val="22"/>
+                <w:lang w:val="en-US"/>
+              </w:rPr>
+              <w:t>}</w:t>
+            </w:r>
+          </w:p>
+        </w:tc>
+        <w:tc>
+          <w:tcPr>
+            <w:tcW w:w="2379" w:type="dxa"/>
+            <w:tcBorders>
+              <w:top w:val="single" w:sz="4" w:space="0" w:color="auto"/>
+              <w:left w:val="single" w:sz="4" w:space="0" w:color="auto"/>
+              <w:bottom w:val="single" w:sz="4" w:space="0" w:color="auto"/>
+              <w:right w:val="single" w:sz="4" w:space="0" w:color="auto"/>
+            </w:tcBorders>
+            <w:shd w:val="clear" w:color="auto" w:fill="auto"/>
+            <w:tcMar>
+              <w:top w:w="80" w:type="dxa"/>
+              <w:left w:w="80" w:type="dxa"/>
+              <w:bottom w:w="80" w:type="dxa"/>
+              <w:right w:w="80" w:type="dxa"/>
+            </w:tcMar>
+            <w:vAlign w:val="center"/>
+            <w:vMerge/>
+          </w:tcPr>
+          <w:p>
+            <w:pPr>
+              <w:jc w:val="center"/>
+            </w:pPr>
+            <w:r>
+              <w:rPr>
+                <w:sz w:val="22"/>
+                <w:szCs w:val="22"/>
+                <w:lang w:val="en-US"/>
+              </w:rPr>
+              <w:t>{</w:t>
+            </w:r>
+            <w:proofErr w:type="spellStart"/>
+            <w:r>
+              <w:rPr>
+                <w:sz w:val="22"/>
+                <w:szCs w:val="22"/>
+                <w:lang w:val="en-US"/>
+              </w:rPr>
+              <w:t>organization_name</w:t>
+            </w:r>
+            <w:proofErr w:type="spellEnd"/>
+            <w:r>
+              <w:rPr>
+                <w:sz w:val="22"/>
+                <w:szCs w:val="22"/>
+                <w:lang w:val="en-US"/>
+              </w:rPr>
+              <w:t>}</w:t>
+            </w:r>
+          </w:p>
+        </w:tc>
+        <w:tc>
+          <w:tcPr>
+            <w:tcW w:w="3136" w:type="dxa"/>
+            <w:tcBorders>
+              <w:top w:val="single" w:sz="4" w:space="0" w:color="auto"/>
+              <w:left w:val="single" w:sz="4" w:space="0" w:color="auto"/>
+              <w:bottom w:val="single" w:sz="4" w:space="0" w:color="auto"/>
+              <w:right w:val="single" w:sz="4" w:space="0" w:color="auto"/>
+            </w:tcBorders>
+            <w:shd w:val="clear" w:color="auto" w:fill="auto"/>
+            <w:tcMar>
+              <w:top w:w="80" w:type="dxa"/>
+              <w:left w:w="80" w:type="dxa"/>
+              <w:bottom w:w="80" w:type="dxa"/>
+              <w:right w:w="80" w:type="dxa"/>
+            </w:tcMar>
+            <w:vAlign w:val="center"/>
+          </w:tcPr>
+          <w:p>
+            <w:pPr>
+              <w:jc w:val="center"/>
+            </w:pPr>
+            <w:r>
+              <w:rPr>
+                <w:sz w:val="22"/>
+                <w:szCs w:val="22"/>
+                <w:lang w:val="en-US"/>
+              </w:rPr>
+              <w:t>{grade}</w:t>
+            </w:r>
+          </w:p>
+        </w:tc>
+        <w:tc>
+          <w:tcPr>
+            <w:tcW w:w="842" w:type="dxa"/>
+            <w:tcBorders>
+              <w:top w:val="single" w:sz="4" w:space="0" w:color="000000"/>
+              <w:left w:val="single" w:sz="4" w:space="0" w:color="auto"/>
+              <w:bottom w:val="single" w:sz="4" w:space="0" w:color="000000"/>
+              <w:right w:val="single" w:sz="4" w:space="0" w:color="auto"/>
+            </w:tcBorders>
+          </w:tcPr>
+          <w:p>
+            <w:pPr>
+              <w:jc w:val="center"/>
+              <w:rPr>
+                <w:i/>
+                <w:iCs/>
+                <w:sz w:val="22"/>
+                <w:szCs w:val="22"/>
+                <w:lang w:val="en-US"/>
+              </w:rPr>
+            </w:pPr>
+          </w:p>
+          <w:p>
+            <w:pPr>
+              <w:jc w:val="center"/>
+              <w:rPr>
+                <w:i/>
+                <w:iCs/>
+                <w:sz w:val="22"/>
+                <w:szCs w:val="22"/>
+                <w:lang w:val="en-US"/>
+              </w:rPr>
+            </w:pPr>
+          </w:p>
+          <w:p>
+            <w:pPr>
+              <w:jc w:val="center"/>
+              <w:rPr>
+                <w:i/>
+                <w:iCs/>
+                <w:sz w:val="22"/>
+                <w:szCs w:val="22"/>
+                <w:lang w:val="en-US"/>
+              </w:rPr>
+            </w:pPr>
+          </w:p>
+          <w:p>
+            <w:pPr>
+              <w:jc w:val="center"/>
+              <w:rPr>
+                <w:i/>
+                <w:iCs/>
+                <w:sz w:val="22"/>
+                <w:szCs w:val="22"/>
+                <w:lang w:val="en-US"/>
+              </w:rPr>
+            </w:pPr>
+          </w:p>
+          <w:p>
+            <w:pPr>
+              <w:jc w:val="center"/>
+              <w:rPr>
+                <w:i/>
+                <w:iCs/>
+                <w:sz w:val="22"/>
+                <w:szCs w:val="22"/>
+                <w:lang w:val="en-US"/>
+              </w:rPr>
+            </w:pPr>
+          </w:p>
+          <w:p>
+            <w:pPr>
+              <w:jc w:val="center"/>
+              <w:rPr>
+                <w:i/>
+                <w:iCs/>
+                <w:sz w:val="22"/>
+                <w:szCs w:val="22"/>
+                <w:lang w:val="en-US"/>
+              </w:rPr>
+            </w:pPr>
+            <w:r>
+              <w:rPr>
+                <w:i/>
+                <w:iCs/>
+                <w:sz w:val="22"/>
+                <w:szCs w:val="22"/>
+                <w:lang w:val="en-US"/>
+              </w:rPr>
+              <w:t>{</w:t>
+            </w:r>
+            <w:proofErr w:type="spellStart"/>
+            <w:r>
+              <w:rPr>
+                <w:i/>
+                <w:iCs/>
+                <w:sz w:val="22"/>
+                <w:szCs w:val="22"/>
+                <w:lang w:val="en-US"/>
+              </w:rPr>
+              <w:t>random_number</w:t>
+            </w:r>
+            <w:proofErr w:type="spellEnd"/>
+            <w:r>
+              <w:rPr>
+                <w:i/>
+                <w:iCs/>
+                <w:sz w:val="22"/>
+                <w:szCs w:val="22"/>
+                <w:lang w:val="en-US"/>
+              </w:rPr>
+              <w:t>}</w:t>
+            </w:r>
+          </w:p>
+        </w:tc>
+        <w:tc>
+          <w:tcPr>
+            <w:tcW w:w="1621" w:type="dxa"/>
+            <w:tcBorders>
+              <w:top w:val="single" w:sz="4" w:space="0" w:color="000000"/>
+              <w:left w:val="single" w:sz="4" w:space="0" w:color="auto"/>
+              <w:bottom w:val="single" w:sz="4" w:space="0" w:color="000000"/>
+              <w:right w:val="single" w:sz="4" w:space="0" w:color="000000"/>
+            </w:tcBorders>
+            <w:shd w:val="clear" w:color="auto" w:fill="auto"/>
+            <w:tcMar>
+              <w:top w:w="80" w:type="dxa"/>
+              <w:left w:w="80" w:type="dxa"/>
+              <w:bottom w:w="80" w:type="dxa"/>
+              <w:right w:w="80" w:type="dxa"/>
+            </w:tcMar>
+            <w:vAlign w:val="center"/>
+          </w:tcPr>
+          <w:p>
+            <w:pPr>
+              <w:jc w:val="center"/>
+              <w:rPr>
+                <w:lang w:val="en-US"/>
+              </w:rPr>
+            </w:pPr>
+            <w:r>
+              <w:rPr>
+                <w:i/>
+                <w:iCs/>
+                <w:sz w:val="22"/>
+                <w:szCs w:val="22"/>
+                <w:lang w:val="en-US"/>
+              </w:rPr>
+              <w:t>{</w:t>
+            </w:r>
+            <w:r>
+              <w:rPr>
+                <w:i/>
+                <w:iCs/>
+                <w:sz w:val="22"/>
+                <w:szCs w:val="22"/>
+              </w:rPr>
+              <w:t>c</w:t>
+            </w:r>
+            <w:proofErr w:type="spellStart"/>
+            <w:r>
+              <w:rPr>
+                <w:i/>
+                <w:iCs/>
+                <w:sz w:val="22"/>
+                <w:szCs w:val="22"/>
+                <w:lang w:val="en-US"/>
+              </w:rPr>
+              <w:t>ourses_mark</w:t>
+            </w:r>
+            <w:proofErr w:type="spellEnd"/>
+            <w:r>
+              <w:rPr>
+                <w:i/>
+                <w:iCs/>
+                <w:sz w:val="22"/>
+                <w:szCs w:val="22"/>
+              </w:rPr>
+              <w:t>}</w:t>
+            </w:r>
+          </w:p>
+        </w:tc>
+        <w:tc>
+          <w:tcPr>
+            <w:tcW w:w="1406" w:type="dxa"/>
+            <w:tcBorders>
+              <w:top w:val="single" w:sz="4" w:space="0" w:color="000000"/>
+              <w:left w:val="single" w:sz="4" w:space="0" w:color="000000"/>
+              <w:bottom w:val="single" w:sz="4" w:space="0" w:color="000000"/>
+              <w:right w:val="single" w:sz="4" w:space="0" w:color="000000"/>
+            </w:tcBorders>
+            <w:shd w:val="clear" w:color="auto" w:fill="auto"/>
+            <w:tcMar>
+              <w:top w:w="80" w:type="dxa"/>
+              <w:left w:w="80" w:type="dxa"/>
+              <w:bottom w:w="80" w:type="dxa"/>
+              <w:right w:w="80" w:type="dxa"/>
+            </w:tcMar>
+            <w:vAlign w:val="center"/>
+          </w:tcPr>
+          <w:p/>
+        </w:tc>
+        <w:tc>
+          <w:tcPr>
+            <w:tcW w:w="951" w:type="dxa"/>
+            <w:tcBorders>
+              <w:top w:val="single" w:sz="4" w:space="0" w:color="000000"/>
+              <w:left w:val="single" w:sz="4" w:space="0" w:color="000000"/>
+              <w:bottom w:val="single" w:sz="4" w:space="0" w:color="000000"/>
+              <w:right w:val="single" w:sz="4" w:space="0" w:color="000000"/>
+            </w:tcBorders>
+            <w:shd w:val="clear" w:color="auto" w:fill="auto"/>
+            <w:tcMar>
+              <w:top w:w="80" w:type="dxa"/>
+              <w:left w:w="80" w:type="dxa"/>
+              <w:bottom w:w="80" w:type="dxa"/>
+              <w:right w:w="80" w:type="dxa"/>
+            </w:tcMar>
+            <w:vAlign w:val="center"/>
+          </w:tcPr>
+          <w:p/>
+        </w:tc>
+        <w:tc>
+          <w:tcPr>
+            <w:tcW w:w="1427" w:type="dxa"/>
+            <w:vMerge/>
+            <w:tcBorders>
+              <w:top w:val="single" w:sz="4" w:space="0" w:color="000000"/>
+              <w:left w:val="single" w:sz="4" w:space="0" w:color="000000"/>
+              <w:bottom w:val="single" w:sz="4" w:space="0" w:color="000000"/>
+              <w:right w:val="single" w:sz="4" w:space="0" w:color="000000"/>
+            </w:tcBorders>
+          </w:tcPr>
+          <w:p>
+            <w:pPr>
+              <w:rPr>
+                <w:sz w:val="22"/>
+                <w:szCs w:val="22"/>
+              </w:rPr>
+            </w:pPr>
+          </w:p>
+          <w:p>
+            <w:pPr>
+              <w:rPr>
+                <w:sz w:val="22"/>
+                <w:szCs w:val="22"/>
+              </w:rPr>
+            </w:pPr>
+          </w:p>
+          <w:p>
+            <w:pPr>
+              <w:rPr>
+                <w:sz w:val="22"/>
+                <w:szCs w:val="22"/>
+              </w:rPr>
+            </w:pPr>
+          </w:p>
+          <w:p>
+            <w:pPr>
+              <w:rPr>
+                <w:sz w:val="22"/>
+                <w:szCs w:val="22"/>
+              </w:rPr>
+            </w:pPr>
+          </w:p>
+          <w:p>
+            <w:pPr>
+              <w:rPr>
+                <w:sz w:val="22"/>
+                <w:szCs w:val="22"/>
+                <w:lang w:val="en-US"/>
+              </w:rPr>
+            </w:pPr>
+            <w:r>
+              <w:rPr>
+                <w:sz w:val="22"/>
+                <w:szCs w:val="22"/>
+                <w:lang w:val="en-US"/>
+              </w:rPr>
+              <w:t xml:space="preserve"> </w:t>
+            </w:r>
+            <w:r>
+              <w:rPr>
+                <w:sz w:val="22"/>
+                <w:szCs w:val="22"/>
+              </w:rPr>
+              <w:t>{</w:t>
+            </w:r>
+            <w:proofErr w:type="spellStart"/>
+            <w:r>
+              <w:rPr>
+                <w:sz w:val="22"/>
+                <w:szCs w:val="22"/>
+              </w:rPr>
+              <w:t>conclusion</w:t>
+            </w:r>
+            <w:proofErr w:type="spellEnd"/>
+            <w:r>
+              <w:rPr>
+                <w:sz w:val="22"/>
+                <w:szCs w:val="22"/>
+                <w:lang w:val="en-US"/>
+              </w:rPr>
+              <w:t>}</w:t>
+            </w:r>
+            <w:r>
+              <w:rPr>
+                <w:i/>
+                <w:iCs/>
+                <w:sz w:val="22"/>
+                <w:szCs w:val="22"/>
+                <w:lang w:val="en-US"/>
+              </w:rPr>
+              <w:t>{/employee}</w:t>
+            </w:r>
+          </w:p>
+        </w:tc>
+      </w:tr>
+    </w:tbl>
+    <w:p>
+      <w:pPr>
+        <w:widowControl w:val="0"/>
+        <w:ind w:left="324" w:hanging="324"/>
+        <w:rPr>
+          <w:sz w:val="22"/>
+          <w:szCs w:val="22"/>
+        </w:rPr>
+      </w:pPr>
+    </w:p>
+    <w:p>
+      <w:pPr>
+        <w:widowControl w:val="0"/>
+        <w:ind w:left="216" w:hanging="216"/>
+        <w:rPr>
+          <w:sz w:val="22"/>
+          <w:szCs w:val="22"/>
+        </w:rPr>
+      </w:pPr>
+    </w:p>
+    <w:p>
+      <w:pPr>
+        <w:widowControl w:val="0"/>
+        <w:ind w:left="108" w:hanging="108"/>
+        <w:rPr>
+          <w:sz w:val="22"/>
+          <w:szCs w:val="22"/>
+        </w:rPr>
+      </w:pPr>
+    </w:p>
+    <w:p>
+      <w:pPr>
+        <w:widowControl w:val="0"/>
+        <w:jc w:val="both"/>
+        <w:rPr>
+          <w:sz w:val="22"/>
+          <w:szCs w:val="22"/>
+        </w:rPr>
+      </w:pPr>
+    </w:p>
+    <w:p>
+      <w:pPr>
+        <w:tabs>
+          <w:tab w:val="left" w:pos="2220"/>
+        </w:tabs>
+        <w:rPr>
+          <w:sz w:val="18"/>
+          <w:szCs w:val="18"/>
+        </w:rPr>
+      </w:pPr>
+      <w:r>
+        <w:rPr>
+          <w:sz w:val="28"/>
+          <w:szCs w:val="28"/>
+        </w:rPr>
+        <w:tab/>
+      </w:r>
+    </w:p>
+    <w:p>
+      <w:pPr>
+        <w:ind w:left="3828"/>
+      </w:pPr>
+      <w:r>
+        <w:t>Председатель комиссии:</w:t>
+      </w:r>
+      <w:r>
+        <w:tab/>
+      </w:r>
+      <w:r>
+        <w:tab/>
+      </w:r>
+      <w:r>
+        <w:tab/>
+      </w:r>
+      <w:r>
+        <w:tab/>
+        <w:t xml:space="preserve">/ В.М. </w:t>
+      </w:r>
+      <w:proofErr w:type="spellStart"/>
+      <w:r>
+        <w:t>Шекшуев</w:t>
+      </w:r>
+      <w:proofErr w:type="spellEnd"/>
+      <w:r>
+        <w:t xml:space="preserve"> /</w:t>
+      </w:r>
+    </w:p>
+    <w:p>
+      <w:pPr>
+        <w:ind w:left="3828"/>
+        <w:rPr>
+          <w:sz w:val="12"/>
+          <w:szCs w:val="12"/>
+        </w:rPr>
+      </w:pPr>
+    </w:p>
+    <w:p>
+      <w:pPr>
+        <w:ind w:left="3828"/>
+      </w:pPr>
+      <w:r>
+        <w:t>Члены комиссии:</w:t>
+      </w:r>
+      <w:r>
+        <w:tab/>
+      </w:r>
+      <w:r>
+        <w:tab/>
+      </w:r>
+      <w:r>
+        <w:tab/>
+      </w:r>
+      <w:r>
+        <w:tab/>
+      </w:r>
+      <w:r>
+        <w:tab/>
+        <w:t>/ Е.С. Воробьева /</w:t>
+      </w:r>
+    </w:p>
+    <w:p>
+      <w:pPr>
+        <w:ind w:left="3828"/>
+        <w:rPr>
+          <w:sz w:val="12"/>
+          <w:szCs w:val="12"/>
+        </w:rPr>
+      </w:pPr>
+    </w:p>
+    <w:p>
+      <w:pPr>
+        <w:ind w:left="3828"/>
+      </w:pPr>
+      <w:r>
+        <w:tab/>
+      </w:r>
+      <w:r>
+        <w:tab/>
+      </w:r>
+      <w:r>
+        <w:tab/>
+      </w:r>
+      <w:r>
+        <w:tab/>
+      </w:r>
+      <w:r>
+        <w:tab/>
+      </w:r>
+      <w:r>
+        <w:tab/>
+      </w:r>
+      <w:r>
+        <w:tab/>
+        <w:t xml:space="preserve">/ И.Ю. </w:t>
+      </w:r>
+      <w:proofErr w:type="spellStart"/>
+      <w:r>
+        <w:t>Шекшуева</w:t>
+      </w:r>
+      <w:proofErr w:type="spellEnd"/>
+      <w:r>
+        <w:t xml:space="preserve"> /</w:t>
+      </w:r>
+    </w:p>
+    <w:sectPr>
+      <w:headerReference w:type="default" r:id="rId7"/>
+      <w:footerReference w:type="default" r:id="rId8"/>
+      <w:pgSz w:w="16840" w:h="11900" w:orient="landscape"/>
+      <w:pgMar w:top="142" w:right="536" w:bottom="0" w:left="1134" w:header="709" w:footer="709" w:gutter="0"/>
+      <w:cols w:space="720"/>
+    </w:sectPr>
+  </w:body>
+</w:document>
 </file>
</xml_diff>

<commit_message>
Harden commission DOCX merge logic and remove template vMerge
</commit_message>
<xml_diff>
--- a/backend/Protocol-comission-template.docx
+++ b/backend/Protocol-comission-template.docx
@@ -1520,7 +1520,6 @@
         <w:tc>
           <w:tcPr>
             <w:tcW w:w="1427" w:type="dxa"/>
-            <w:vMerge/>
             <w:tcBorders>
               <w:top w:val="single" w:sz="4" w:space="0" w:color="000000"/>
               <w:left w:val="single" w:sz="4" w:space="0" w:color="000000"/>
@@ -3550,4 +3549,1794 @@
   </a:objectDefaults>
   <a:extraClrSchemeLst/>
 </a:theme>
+</file>
+
+<file path=document.orig.xml><?xml version="1.0" encoding="utf-8"?>
+<w:document xmlns:wpc="http://schemas.microsoft.com/office/word/2010/wordprocessingCanvas" xmlns:cx="http://schemas.microsoft.com/office/drawing/2014/chartex" xmlns:cx1="http://schemas.microsoft.com/office/drawing/2015/9/8/chartex" xmlns:cx2="http://schemas.microsoft.com/office/drawing/2015/10/21/chartex" xmlns:cx3="http://schemas.microsoft.com/office/drawing/2016/5/9/chartex" xmlns:cx4="http://schemas.microsoft.com/office/drawing/2016/5/10/chartex" xmlns:cx5="http://schemas.microsoft.com/office/drawing/2016/5/11/chartex" xmlns:cx6="http://schemas.microsoft.com/office/drawing/2016/5/12/chartex" xmlns:cx7="http://schemas.microsoft.com/office/drawing/2016/5/13/chartex" xmlns:cx8="http://schemas.microsoft.com/office/drawing/2016/5/14/chartex" xmlns:mc="http://schemas.openxmlformats.org/markup-compatibility/2006" xmlns:aink="http://schemas.microsoft.com/office/drawing/2016/ink" xmlns:am3d="http://schemas.microsoft.com/office/drawing/2017/model3d" xmlns:o="urn:schemas-microsoft-com:office:office" xmlns:oel="http://schemas.microsoft.com/office/2019/extlst" xmlns:r="http://schemas.openxmlformats.org/officeDocument/2006/relationships" xmlns:m="http://schemas.openxmlformats.org/officeDocument/2006/math" xmlns:v="urn:schemas-microsoft-com:vml" xmlns:wp14="http://schemas.microsoft.com/office/word/2010/wordprocessingDrawing" xmlns:wp="http://schemas.openxmlformats.org/drawingml/2006/wordprocessingDrawing" xmlns:w10="urn:schemas-microsoft-com:office:word" xmlns:w="http://schemas.openxmlformats.org/wordprocessingml/2006/main" xmlns:w14="http://schemas.microsoft.com/office/word/2010/wordml" xmlns:w15="http://schemas.microsoft.com/office/word/2012/wordml" xmlns:w16cex="http://schemas.microsoft.com/office/word/2018/wordml/cex" xmlns:w16cid="http://schemas.microsoft.com/office/word/2016/wordml/cid" xmlns:w16="http://schemas.microsoft.com/office/word/2018/wordml" xmlns:w16sdtdh="http://schemas.microsoft.com/office/word/2020/wordml/sdtdatahash" xmlns:w16se="http://schemas.microsoft.com/office/word/2015/wordml/symex" xmlns:wpg="http://schemas.microsoft.com/office/word/2010/wordprocessingGroup" xmlns:wpi="http://schemas.microsoft.com/office/word/2010/wordprocessingInk" xmlns:wne="http://schemas.microsoft.com/office/word/2006/wordml" xmlns:wps="http://schemas.microsoft.com/office/word/2010/wordprocessingShape" mc:Ignorable="w14 w15 w16se w16cid w16 w16cex w16sdtdh wp14">
+  <w:body>
+    <w:p>
+      <w:pPr>
+        <w:jc w:val="center"/>
+        <w:rPr>
+          <w:b/>
+          <w:bCs/>
+          <w:sz w:val="28"/>
+          <w:szCs w:val="28"/>
+          <w:lang w:val="en-US"/>
+        </w:rPr>
+      </w:pPr>
+      <w:r>
+        <w:rPr>
+          <w:b/>
+          <w:bCs/>
+          <w:sz w:val="28"/>
+          <w:szCs w:val="28"/>
+          <w:lang w:val="en-US"/>
+        </w:rPr>
+        <w:t>{</w:t>
+      </w:r>
+      <w:proofErr w:type="spellStart"/>
+      <w:r>
+        <w:rPr>
+          <w:b/>
+          <w:bCs/>
+          <w:sz w:val="28"/>
+          <w:szCs w:val="28"/>
+          <w:lang w:val="en-US"/>
+        </w:rPr>
+        <w:t>moisei_name</w:t>
+      </w:r>
+      <w:proofErr w:type="spellEnd"/>
+      <w:r>
+        <w:rPr>
+          <w:b/>
+          <w:bCs/>
+          <w:sz w:val="28"/>
+          <w:szCs w:val="28"/>
+          <w:lang w:val="en-US"/>
+        </w:rPr>
+        <w:t>}</w:t>
+      </w:r>
+    </w:p>
+    <w:p>
+      <w:pPr>
+        <w:jc w:val="center"/>
+        <w:rPr>
+          <w:b/>
+          <w:bCs/>
+          <w:sz w:val="22"/>
+          <w:szCs w:val="22"/>
+        </w:rPr>
+      </w:pPr>
+    </w:p>
+    <w:p>
+      <w:pPr>
+        <w:jc w:val="center"/>
+        <w:rPr>
+          <w:b/>
+          <w:bCs/>
+          <w:sz w:val="28"/>
+          <w:szCs w:val="28"/>
+        </w:rPr>
+      </w:pPr>
+      <w:r>
+        <w:rPr>
+          <w:b/>
+          <w:bCs/>
+          <w:sz w:val="28"/>
+          <w:szCs w:val="28"/>
+        </w:rPr>
+        <w:t xml:space="preserve">П Р О Т О К О Л    </w:t>
+      </w:r>
+      <w:proofErr w:type="gramStart"/>
+      <w:r>
+        <w:rPr>
+          <w:b/>
+          <w:bCs/>
+          <w:sz w:val="28"/>
+          <w:szCs w:val="28"/>
+        </w:rPr>
+        <w:t xml:space="preserve">№  </w:t>
+      </w:r>
+      <w:r>
+        <w:rPr>
+          <w:b/>
+          <w:bCs/>
+          <w:sz w:val="28"/>
+          <w:szCs w:val="28"/>
+        </w:rPr>
+        <w:t>{</w:t>
+      </w:r>
+      <w:proofErr w:type="gramEnd"/>
+      <w:r>
+        <w:rPr>
+          <w:b/>
+          <w:bCs/>
+          <w:sz w:val="28"/>
+          <w:szCs w:val="28"/>
+          <w:lang w:val="en-US"/>
+        </w:rPr>
+        <w:t>group</w:t>
+      </w:r>
+      <w:r>
+        <w:rPr>
+          <w:b/>
+          <w:bCs/>
+          <w:sz w:val="28"/>
+          <w:szCs w:val="28"/>
+        </w:rPr>
+        <w:t>_</w:t>
+      </w:r>
+      <w:r>
+        <w:rPr>
+          <w:b/>
+          <w:bCs/>
+          <w:sz w:val="28"/>
+          <w:szCs w:val="28"/>
+          <w:lang w:val="en-US"/>
+        </w:rPr>
+        <w:t>id</w:t>
+      </w:r>
+      <w:r>
+        <w:rPr>
+          <w:b/>
+          <w:bCs/>
+          <w:sz w:val="28"/>
+          <w:szCs w:val="28"/>
+        </w:rPr>
+        <w:t>}</w:t>
+      </w:r>
+      <w:r>
+        <w:rPr>
+          <w:b/>
+          <w:bCs/>
+          <w:sz w:val="28"/>
+          <w:szCs w:val="28"/>
+        </w:rPr>
+        <w:t xml:space="preserve">  от  </w:t>
+      </w:r>
+      <w:r>
+        <w:rPr>
+          <w:b/>
+          <w:bCs/>
+          <w:sz w:val="28"/>
+          <w:szCs w:val="28"/>
+        </w:rPr>
+        <w:t>{</w:t>
+      </w:r>
+      <w:r>
+        <w:rPr>
+          <w:b/>
+          <w:bCs/>
+          <w:sz w:val="28"/>
+          <w:szCs w:val="28"/>
+          <w:lang w:val="en-US"/>
+        </w:rPr>
+        <w:t>end</w:t>
+      </w:r>
+      <w:r>
+        <w:rPr>
+          <w:b/>
+          <w:bCs/>
+          <w:sz w:val="28"/>
+          <w:szCs w:val="28"/>
+        </w:rPr>
+        <w:t>_</w:t>
+      </w:r>
+      <w:r>
+        <w:rPr>
+          <w:b/>
+          <w:bCs/>
+          <w:sz w:val="28"/>
+          <w:szCs w:val="28"/>
+          <w:lang w:val="en-US"/>
+        </w:rPr>
+        <w:t>date</w:t>
+      </w:r>
+      <w:r>
+        <w:rPr>
+          <w:b/>
+          <w:bCs/>
+          <w:sz w:val="28"/>
+          <w:szCs w:val="28"/>
+        </w:rPr>
+        <w:t>}</w:t>
+      </w:r>
+    </w:p>
+    <w:p>
+      <w:pPr>
+        <w:jc w:val="center"/>
+        <w:rPr>
+          <w:b/>
+          <w:bCs/>
+          <w:sz w:val="28"/>
+          <w:szCs w:val="28"/>
+        </w:rPr>
+      </w:pPr>
+      <w:r>
+        <w:rPr>
+          <w:b/>
+          <w:bCs/>
+          <w:sz w:val="28"/>
+          <w:szCs w:val="28"/>
+        </w:rPr>
+        <w:t>заседания комиссии по проверке знаний</w:t>
+      </w:r>
+    </w:p>
+    <w:p>
+      <w:pPr>
+        <w:rPr>
+          <w:sz w:val="18"/>
+          <w:szCs w:val="18"/>
+        </w:rPr>
+      </w:pPr>
+    </w:p>
+    <w:p>
+      <w:r>
+        <w:t>В соответствии с приказом директора от «01» сентября 2022 г. № 10 комиссия в составе:</w:t>
+      </w:r>
+    </w:p>
+    <w:p>
+      <w:pPr>
+        <w:rPr>
+          <w:sz w:val="22"/>
+          <w:szCs w:val="22"/>
+        </w:rPr>
+      </w:pPr>
+    </w:p>
+    <w:p>
+      <w:r>
+        <w:rPr>
+          <w:b/>
+          <w:bCs/>
+        </w:rPr>
+        <w:t>Председатель комиссии:</w:t>
+      </w:r>
+      <w:r>
+        <w:tab/>
+      </w:r>
+      <w:proofErr w:type="spellStart"/>
+      <w:r>
+        <w:t>Шекшуев</w:t>
+      </w:r>
+      <w:proofErr w:type="spellEnd"/>
+      <w:r>
+        <w:t xml:space="preserve"> В.М.. - директор</w:t>
+      </w:r>
+    </w:p>
+    <w:p>
+      <w:r>
+        <w:rPr>
+          <w:b/>
+          <w:bCs/>
+        </w:rPr>
+        <w:t>Члены комиссии:</w:t>
+      </w:r>
+      <w:r>
+        <w:rPr>
+          <w:b/>
+          <w:bCs/>
+        </w:rPr>
+        <w:tab/>
+      </w:r>
+      <w:r>
+        <w:tab/>
+        <w:t>Воробьева Е.С. – заместитель директора</w:t>
+      </w:r>
+    </w:p>
+    <w:p>
+      <w:r>
+        <w:tab/>
+      </w:r>
+      <w:r>
+        <w:tab/>
+      </w:r>
+      <w:r>
+        <w:tab/>
+      </w:r>
+      <w:r>
+        <w:tab/>
+      </w:r>
+      <w:proofErr w:type="spellStart"/>
+      <w:r>
+        <w:t>Шекшуева</w:t>
+      </w:r>
+      <w:proofErr w:type="spellEnd"/>
+      <w:r>
+        <w:t xml:space="preserve"> И.Ю. – специалист учебного центра</w:t>
+      </w:r>
+    </w:p>
+    <w:p>
+      <w:pPr>
+        <w:pStyle w:val="a4"/>
+        <w:tabs>
+          <w:tab w:val="left" w:pos="2694"/>
+        </w:tabs>
+        <w:rPr>
+          <w:sz w:val="22"/>
+          <w:szCs w:val="22"/>
+        </w:rPr>
+      </w:pPr>
+    </w:p>
+    <w:p>
+      <w:pPr>
+        <w:jc w:val="both"/>
+      </w:pPr>
+      <w:r>
+        <w:t>Проведена проверка знаний по программе: - «</w:t>
+      </w:r>
+      <w:r>
+        <w:t>{</w:t>
+      </w:r>
+      <w:r>
+        <w:rPr>
+          <w:lang w:val="en-US"/>
+        </w:rPr>
+        <w:t>course</w:t>
+      </w:r>
+      <w:r>
+        <w:t>_</w:t>
+      </w:r>
+      <w:r>
+        <w:rPr>
+          <w:lang w:val="en-US"/>
+        </w:rPr>
+        <w:t>name</w:t>
+      </w:r>
+      <w:r>
+        <w:t>}</w:t>
+      </w:r>
+      <w:r>
+        <w:t xml:space="preserve">» в объеме </w:t>
+      </w:r>
+      <w:r>
+        <w:t>{</w:t>
+      </w:r>
+      <w:r>
+        <w:rPr>
+          <w:lang w:val="en-US"/>
+        </w:rPr>
+        <w:t>hours</w:t>
+      </w:r>
+      <w:r>
+        <w:t>}</w:t>
+      </w:r>
+      <w:r>
+        <w:t xml:space="preserve"> часов;</w:t>
+      </w:r>
+    </w:p>
+    <w:p>
+      <w:pPr>
+        <w:jc w:val="both"/>
+        <w:rPr>
+          <w:sz w:val="22"/>
+          <w:szCs w:val="22"/>
+        </w:rPr>
+      </w:pPr>
+      <w:r>
+        <w:rPr>
+          <w:sz w:val="22"/>
+          <w:szCs w:val="22"/>
+        </w:rPr>
+        <w:t>- - «</w:t>
+      </w:r>
+      <w:r>
+        <w:rPr>
+          <w:sz w:val="22"/>
+          <w:szCs w:val="22"/>
+        </w:rPr>
+        <w:t>{</w:t>
+      </w:r>
+      <w:r>
+        <w:rPr>
+          <w:sz w:val="22"/>
+          <w:szCs w:val="22"/>
+          <w:lang w:val="en-US"/>
+        </w:rPr>
+        <w:t>course</w:t>
+      </w:r>
+      <w:r>
+        <w:rPr>
+          <w:sz w:val="22"/>
+          <w:szCs w:val="22"/>
+        </w:rPr>
+        <w:t>_</w:t>
+      </w:r>
+      <w:r>
+        <w:rPr>
+          <w:sz w:val="22"/>
+          <w:szCs w:val="22"/>
+          <w:lang w:val="en-US"/>
+        </w:rPr>
+        <w:t>name</w:t>
+      </w:r>
+      <w:r>
+        <w:rPr>
+          <w:sz w:val="22"/>
+          <w:szCs w:val="22"/>
+        </w:rPr>
+        <w:t>}</w:t>
+      </w:r>
+      <w:r>
+        <w:rPr>
+          <w:sz w:val="22"/>
+          <w:szCs w:val="22"/>
+        </w:rPr>
+        <w:t xml:space="preserve">» в объеме </w:t>
+      </w:r>
+      <w:r>
+        <w:rPr>
+          <w:sz w:val="22"/>
+          <w:szCs w:val="22"/>
+        </w:rPr>
+        <w:t>{</w:t>
+      </w:r>
+      <w:r>
+        <w:rPr>
+          <w:sz w:val="22"/>
+          <w:szCs w:val="22"/>
+          <w:lang w:val="en-US"/>
+        </w:rPr>
+        <w:t>hours</w:t>
+      </w:r>
+      <w:r>
+        <w:rPr>
+          <w:sz w:val="22"/>
+          <w:szCs w:val="22"/>
+        </w:rPr>
+        <w:t>}</w:t>
+      </w:r>
+      <w:r>
+        <w:rPr>
+          <w:sz w:val="22"/>
+          <w:szCs w:val="22"/>
+        </w:rPr>
+        <w:t xml:space="preserve"> часов:</w:t>
+      </w:r>
+    </w:p>
+    <w:tbl>
+      <w:tblPr>
+        <w:tblStyle w:val="TableNormal"/>
+        <w:tblW w:w="15603" w:type="dxa"/>
+        <w:tblInd w:w="-289" w:type="dxa"/>
+        <w:tblBorders>
+          <w:top w:val="single" w:sz="8" w:space="0" w:color="FFFFFF"/>
+          <w:left w:val="single" w:sz="8" w:space="0" w:color="FFFFFF"/>
+          <w:bottom w:val="single" w:sz="8" w:space="0" w:color="FFFFFF"/>
+          <w:right w:val="single" w:sz="8" w:space="0" w:color="FFFFFF"/>
+          <w:insideH w:val="single" w:sz="8" w:space="0" w:color="FFFFFF"/>
+          <w:insideV w:val="single" w:sz="8" w:space="0" w:color="FFFFFF"/>
+        </w:tblBorders>
+        <w:shd w:val="clear" w:color="auto" w:fill="CED7E7"/>
+        <w:tblLayout w:type="fixed"/>
+        <w:tblLook w:val="04A0" w:firstRow="1" w:lastRow="0" w:firstColumn="1" w:lastColumn="0" w:noHBand="0" w:noVBand="1"/>
+      </w:tblPr>
+      <w:tblGrid>
+        <w:gridCol w:w="923"/>
+        <w:gridCol w:w="2918"/>
+        <w:gridCol w:w="2379"/>
+        <w:gridCol w:w="3136"/>
+        <w:gridCol w:w="842"/>
+        <w:gridCol w:w="1621"/>
+        <w:gridCol w:w="1406"/>
+        <w:gridCol w:w="951"/>
+        <w:gridCol w:w="1427"/>
+      </w:tblGrid>
+      <w:tr>
+        <w:trPr>
+          <w:trHeight w:val="1046"/>
+        </w:trPr>
+        <w:tc>
+          <w:tcPr>
+            <w:tcW w:w="923" w:type="dxa"/>
+            <w:tcBorders>
+              <w:top w:val="single" w:sz="4" w:space="0" w:color="000000"/>
+              <w:left w:val="single" w:sz="4" w:space="0" w:color="000000"/>
+              <w:bottom w:val="single" w:sz="4" w:space="0" w:color="000000"/>
+              <w:right w:val="single" w:sz="4" w:space="0" w:color="000000"/>
+            </w:tcBorders>
+            <w:shd w:val="clear" w:color="auto" w:fill="auto"/>
+            <w:tcMar>
+              <w:top w:w="80" w:type="dxa"/>
+              <w:left w:w="80" w:type="dxa"/>
+              <w:bottom w:w="80" w:type="dxa"/>
+              <w:right w:w="80" w:type="dxa"/>
+            </w:tcMar>
+            <w:vAlign w:val="center"/>
+          </w:tcPr>
+          <w:p>
+            <w:pPr>
+              <w:jc w:val="center"/>
+            </w:pPr>
+            <w:r>
+              <w:rPr>
+                <w:sz w:val="22"/>
+                <w:szCs w:val="22"/>
+              </w:rPr>
+              <w:t>№</w:t>
+            </w:r>
+          </w:p>
+        </w:tc>
+        <w:tc>
+          <w:tcPr>
+            <w:tcW w:w="2918" w:type="dxa"/>
+            <w:tcBorders>
+              <w:top w:val="single" w:sz="4" w:space="0" w:color="000000"/>
+              <w:left w:val="single" w:sz="4" w:space="0" w:color="000000"/>
+              <w:bottom w:val="single" w:sz="4" w:space="0" w:color="000000"/>
+              <w:right w:val="single" w:sz="4" w:space="0" w:color="000000"/>
+            </w:tcBorders>
+            <w:shd w:val="clear" w:color="auto" w:fill="auto"/>
+            <w:tcMar>
+              <w:top w:w="80" w:type="dxa"/>
+              <w:left w:w="80" w:type="dxa"/>
+              <w:bottom w:w="80" w:type="dxa"/>
+              <w:right w:w="80" w:type="dxa"/>
+            </w:tcMar>
+            <w:vAlign w:val="center"/>
+          </w:tcPr>
+          <w:p>
+            <w:pPr>
+              <w:jc w:val="center"/>
+            </w:pPr>
+            <w:r>
+              <w:rPr>
+                <w:sz w:val="22"/>
+                <w:szCs w:val="22"/>
+              </w:rPr>
+              <w:t>Ф.И.О.</w:t>
+            </w:r>
+          </w:p>
+        </w:tc>
+        <w:tc>
+          <w:tcPr>
+            <w:tcW w:w="2379" w:type="dxa"/>
+            <w:tcBorders>
+              <w:top w:val="single" w:sz="4" w:space="0" w:color="000000"/>
+              <w:left w:val="single" w:sz="4" w:space="0" w:color="000000"/>
+              <w:bottom w:val="single" w:sz="4" w:space="0" w:color="000000"/>
+              <w:right w:val="single" w:sz="4" w:space="0" w:color="000000"/>
+            </w:tcBorders>
+            <w:shd w:val="clear" w:color="auto" w:fill="auto"/>
+            <w:tcMar>
+              <w:top w:w="80" w:type="dxa"/>
+              <w:left w:w="80" w:type="dxa"/>
+              <w:bottom w:w="80" w:type="dxa"/>
+              <w:right w:w="80" w:type="dxa"/>
+            </w:tcMar>
+            <w:vAlign w:val="center"/>
+          </w:tcPr>
+          <w:p>
+            <w:pPr>
+              <w:jc w:val="center"/>
+            </w:pPr>
+            <w:r>
+              <w:rPr>
+                <w:sz w:val="22"/>
+                <w:szCs w:val="22"/>
+              </w:rPr>
+              <w:t>Наименование предприятия</w:t>
+            </w:r>
+          </w:p>
+        </w:tc>
+        <w:tc>
+          <w:tcPr>
+            <w:tcW w:w="3136" w:type="dxa"/>
+            <w:tcBorders>
+              <w:top w:val="single" w:sz="4" w:space="0" w:color="000000"/>
+              <w:left w:val="single" w:sz="4" w:space="0" w:color="000000"/>
+              <w:bottom w:val="single" w:sz="4" w:space="0" w:color="000000"/>
+              <w:right w:val="single" w:sz="4" w:space="0" w:color="000000"/>
+            </w:tcBorders>
+            <w:shd w:val="clear" w:color="auto" w:fill="auto"/>
+            <w:tcMar>
+              <w:top w:w="80" w:type="dxa"/>
+              <w:left w:w="80" w:type="dxa"/>
+              <w:bottom w:w="80" w:type="dxa"/>
+              <w:right w:w="80" w:type="dxa"/>
+            </w:tcMar>
+            <w:vAlign w:val="center"/>
+          </w:tcPr>
+          <w:p>
+            <w:pPr>
+              <w:jc w:val="center"/>
+            </w:pPr>
+            <w:r>
+              <w:rPr>
+                <w:sz w:val="22"/>
+                <w:szCs w:val="22"/>
+              </w:rPr>
+              <w:t>Занимаемая должность</w:t>
+            </w:r>
+          </w:p>
+        </w:tc>
+        <w:tc>
+          <w:tcPr>
+            <w:tcW w:w="842" w:type="dxa"/>
+            <w:tcBorders>
+              <w:top w:val="single" w:sz="4" w:space="0" w:color="000000"/>
+              <w:left w:val="single" w:sz="4" w:space="0" w:color="000000"/>
+              <w:bottom w:val="single" w:sz="4" w:space="0" w:color="000000"/>
+              <w:right w:val="single" w:sz="4" w:space="0" w:color="000000"/>
+            </w:tcBorders>
+          </w:tcPr>
+          <w:p>
+            <w:pPr>
+              <w:jc w:val="center"/>
+              <w:rPr>
+                <w:sz w:val="22"/>
+                <w:szCs w:val="22"/>
+              </w:rPr>
+            </w:pPr>
+          </w:p>
+          <w:p>
+            <w:pPr>
+              <w:jc w:val="center"/>
+              <w:rPr>
+                <w:sz w:val="22"/>
+                <w:szCs w:val="22"/>
+              </w:rPr>
+            </w:pPr>
+          </w:p>
+          <w:p>
+            <w:pPr>
+              <w:jc w:val="center"/>
+              <w:rPr>
+                <w:sz w:val="22"/>
+                <w:szCs w:val="22"/>
+              </w:rPr>
+            </w:pPr>
+          </w:p>
+          <w:p>
+            <w:pPr>
+              <w:jc w:val="center"/>
+              <w:rPr>
+                <w:sz w:val="22"/>
+                <w:szCs w:val="22"/>
+              </w:rPr>
+            </w:pPr>
+            <w:r>
+              <w:rPr>
+                <w:sz w:val="22"/>
+                <w:szCs w:val="22"/>
+              </w:rPr>
+              <w:t>Номер билета</w:t>
+            </w:r>
+          </w:p>
+        </w:tc>
+        <w:tc>
+          <w:tcPr>
+            <w:tcW w:w="1621" w:type="dxa"/>
+            <w:tcBorders>
+              <w:top w:val="single" w:sz="4" w:space="0" w:color="000000"/>
+              <w:left w:val="single" w:sz="4" w:space="0" w:color="000000"/>
+              <w:bottom w:val="single" w:sz="4" w:space="0" w:color="000000"/>
+              <w:right w:val="single" w:sz="4" w:space="0" w:color="000000"/>
+            </w:tcBorders>
+            <w:shd w:val="clear" w:color="auto" w:fill="auto"/>
+            <w:tcMar>
+              <w:top w:w="80" w:type="dxa"/>
+              <w:left w:w="80" w:type="dxa"/>
+              <w:bottom w:w="80" w:type="dxa"/>
+              <w:right w:w="80" w:type="dxa"/>
+            </w:tcMar>
+            <w:vAlign w:val="center"/>
+          </w:tcPr>
+          <w:p>
+            <w:pPr>
+              <w:jc w:val="center"/>
+            </w:pPr>
+            <w:r>
+              <w:rPr>
+                <w:sz w:val="22"/>
+                <w:szCs w:val="22"/>
+              </w:rPr>
+              <w:t>Результат проверки знаний</w:t>
+            </w:r>
+          </w:p>
+        </w:tc>
+        <w:tc>
+          <w:tcPr>
+            <w:tcW w:w="1406" w:type="dxa"/>
+            <w:tcBorders>
+              <w:top w:val="single" w:sz="4" w:space="0" w:color="000000"/>
+              <w:left w:val="single" w:sz="4" w:space="0" w:color="000000"/>
+              <w:bottom w:val="single" w:sz="4" w:space="0" w:color="000000"/>
+              <w:right w:val="single" w:sz="4" w:space="0" w:color="000000"/>
+            </w:tcBorders>
+            <w:shd w:val="clear" w:color="auto" w:fill="auto"/>
+            <w:tcMar>
+              <w:top w:w="80" w:type="dxa"/>
+              <w:left w:w="80" w:type="dxa"/>
+              <w:bottom w:w="80" w:type="dxa"/>
+              <w:right w:w="80" w:type="dxa"/>
+            </w:tcMar>
+            <w:vAlign w:val="center"/>
+          </w:tcPr>
+          <w:p>
+            <w:pPr>
+              <w:jc w:val="center"/>
+            </w:pPr>
+            <w:r>
+              <w:rPr>
+                <w:sz w:val="22"/>
+                <w:szCs w:val="22"/>
+              </w:rPr>
+              <w:t>Регистрационный номер записи о проверке знаний в реестре обученных лиц</w:t>
+            </w:r>
+          </w:p>
+        </w:tc>
+        <w:tc>
+          <w:tcPr>
+            <w:tcW w:w="951" w:type="dxa"/>
+            <w:tcBorders>
+              <w:top w:val="single" w:sz="4" w:space="0" w:color="000000"/>
+              <w:left w:val="single" w:sz="4" w:space="0" w:color="000000"/>
+              <w:bottom w:val="single" w:sz="4" w:space="0" w:color="000000"/>
+              <w:right w:val="single" w:sz="4" w:space="0" w:color="000000"/>
+            </w:tcBorders>
+            <w:shd w:val="clear" w:color="auto" w:fill="auto"/>
+            <w:tcMar>
+              <w:top w:w="80" w:type="dxa"/>
+              <w:left w:w="80" w:type="dxa"/>
+              <w:bottom w:w="80" w:type="dxa"/>
+              <w:right w:w="80" w:type="dxa"/>
+            </w:tcMar>
+            <w:vAlign w:val="center"/>
+          </w:tcPr>
+          <w:p>
+            <w:pPr>
+              <w:jc w:val="center"/>
+            </w:pPr>
+            <w:r>
+              <w:rPr>
+                <w:sz w:val="22"/>
+                <w:szCs w:val="22"/>
+              </w:rPr>
+              <w:t>Подпись проверяемого</w:t>
+            </w:r>
+          </w:p>
+        </w:tc>
+        <w:tc>
+          <w:tcPr>
+            <w:tcW w:w="1427" w:type="dxa"/>
+            <w:tcBorders>
+              <w:top w:val="single" w:sz="4" w:space="0" w:color="000000"/>
+              <w:left w:val="single" w:sz="4" w:space="0" w:color="000000"/>
+              <w:bottom w:val="single" w:sz="4" w:space="0" w:color="000000"/>
+              <w:right w:val="single" w:sz="4" w:space="0" w:color="000000"/>
+            </w:tcBorders>
+          </w:tcPr>
+          <w:p>
+            <w:pPr>
+              <w:jc w:val="center"/>
+              <w:rPr>
+                <w:sz w:val="22"/>
+                <w:szCs w:val="22"/>
+              </w:rPr>
+            </w:pPr>
+          </w:p>
+          <w:p>
+            <w:pPr>
+              <w:jc w:val="center"/>
+              <w:rPr>
+                <w:sz w:val="22"/>
+                <w:szCs w:val="22"/>
+              </w:rPr>
+            </w:pPr>
+          </w:p>
+          <w:p>
+            <w:pPr>
+              <w:jc w:val="center"/>
+              <w:rPr>
+                <w:sz w:val="22"/>
+                <w:szCs w:val="22"/>
+              </w:rPr>
+            </w:pPr>
+            <w:r>
+              <w:rPr>
+                <w:sz w:val="22"/>
+                <w:szCs w:val="22"/>
+              </w:rPr>
+              <w:t>Заключение экзаменационной</w:t>
+            </w:r>
+          </w:p>
+          <w:p>
+            <w:pPr>
+              <w:jc w:val="center"/>
+              <w:rPr>
+                <w:sz w:val="22"/>
+                <w:szCs w:val="22"/>
+              </w:rPr>
+            </w:pPr>
+            <w:r>
+              <w:rPr>
+                <w:sz w:val="22"/>
+                <w:szCs w:val="22"/>
+              </w:rPr>
+              <w:t>комиссии</w:t>
+            </w:r>
+          </w:p>
+          <w:p>
+            <w:pPr>
+              <w:rPr>
+                <w:sz w:val="22"/>
+                <w:szCs w:val="22"/>
+              </w:rPr>
+            </w:pPr>
+          </w:p>
+        </w:tc>
+      </w:tr>
+      <w:tr>
+        <w:trPr>
+          <w:trHeight w:val="230"/>
+        </w:trPr>
+        <w:tc>
+          <w:tcPr>
+            <w:tcW w:w="923" w:type="dxa"/>
+            <w:tcBorders>
+              <w:top w:val="single" w:sz="4" w:space="0" w:color="000000"/>
+              <w:left w:val="single" w:sz="4" w:space="0" w:color="000000"/>
+              <w:bottom w:val="single" w:sz="4" w:space="0" w:color="000000"/>
+              <w:right w:val="single" w:sz="4" w:space="0" w:color="000000"/>
+            </w:tcBorders>
+            <w:shd w:val="clear" w:color="auto" w:fill="auto"/>
+            <w:tcMar>
+              <w:top w:w="80" w:type="dxa"/>
+              <w:left w:w="80" w:type="dxa"/>
+              <w:bottom w:w="80" w:type="dxa"/>
+              <w:right w:w="80" w:type="dxa"/>
+            </w:tcMar>
+            <w:vAlign w:val="center"/>
+          </w:tcPr>
+          <w:p>
+            <w:pPr>
+              <w:jc w:val="center"/>
+            </w:pPr>
+            <w:r>
+              <w:rPr>
+                <w:sz w:val="22"/>
+                <w:szCs w:val="22"/>
+              </w:rPr>
+              <w:t>1</w:t>
+            </w:r>
+          </w:p>
+        </w:tc>
+        <w:tc>
+          <w:tcPr>
+            <w:tcW w:w="2918" w:type="dxa"/>
+            <w:tcBorders>
+              <w:top w:val="single" w:sz="4" w:space="0" w:color="000000"/>
+              <w:left w:val="single" w:sz="4" w:space="0" w:color="000000"/>
+              <w:bottom w:val="single" w:sz="4" w:space="0" w:color="000000"/>
+              <w:right w:val="single" w:sz="4" w:space="0" w:color="000000"/>
+            </w:tcBorders>
+            <w:shd w:val="clear" w:color="auto" w:fill="auto"/>
+            <w:tcMar>
+              <w:top w:w="80" w:type="dxa"/>
+              <w:left w:w="80" w:type="dxa"/>
+              <w:bottom w:w="80" w:type="dxa"/>
+              <w:right w:w="80" w:type="dxa"/>
+            </w:tcMar>
+            <w:vAlign w:val="center"/>
+          </w:tcPr>
+          <w:p>
+            <w:pPr>
+              <w:jc w:val="center"/>
+            </w:pPr>
+            <w:r>
+              <w:rPr>
+                <w:sz w:val="22"/>
+                <w:szCs w:val="22"/>
+              </w:rPr>
+              <w:t>2</w:t>
+            </w:r>
+          </w:p>
+        </w:tc>
+        <w:tc>
+          <w:tcPr>
+            <w:tcW w:w="2379" w:type="dxa"/>
+            <w:tcBorders>
+              <w:top w:val="single" w:sz="4" w:space="0" w:color="000000"/>
+              <w:left w:val="single" w:sz="4" w:space="0" w:color="000000"/>
+              <w:bottom w:val="single" w:sz="4" w:space="0" w:color="auto"/>
+              <w:right w:val="single" w:sz="4" w:space="0" w:color="000000"/>
+            </w:tcBorders>
+            <w:shd w:val="clear" w:color="auto" w:fill="auto"/>
+            <w:tcMar>
+              <w:top w:w="80" w:type="dxa"/>
+              <w:left w:w="80" w:type="dxa"/>
+              <w:bottom w:w="80" w:type="dxa"/>
+              <w:right w:w="80" w:type="dxa"/>
+            </w:tcMar>
+            <w:vAlign w:val="center"/>
+          </w:tcPr>
+          <w:p>
+            <w:pPr>
+              <w:jc w:val="center"/>
+            </w:pPr>
+            <w:r>
+              <w:rPr>
+                <w:sz w:val="22"/>
+                <w:szCs w:val="22"/>
+              </w:rPr>
+              <w:t>3</w:t>
+            </w:r>
+          </w:p>
+        </w:tc>
+        <w:tc>
+          <w:tcPr>
+            <w:tcW w:w="3136" w:type="dxa"/>
+            <w:tcBorders>
+              <w:top w:val="single" w:sz="4" w:space="0" w:color="000000"/>
+              <w:left w:val="single" w:sz="4" w:space="0" w:color="000000"/>
+              <w:bottom w:val="single" w:sz="4" w:space="0" w:color="auto"/>
+              <w:right w:val="single" w:sz="4" w:space="0" w:color="000000"/>
+            </w:tcBorders>
+            <w:shd w:val="clear" w:color="auto" w:fill="auto"/>
+            <w:tcMar>
+              <w:top w:w="80" w:type="dxa"/>
+              <w:left w:w="80" w:type="dxa"/>
+              <w:bottom w:w="80" w:type="dxa"/>
+              <w:right w:w="80" w:type="dxa"/>
+            </w:tcMar>
+            <w:vAlign w:val="center"/>
+          </w:tcPr>
+          <w:p>
+            <w:pPr>
+              <w:jc w:val="center"/>
+            </w:pPr>
+            <w:r>
+              <w:rPr>
+                <w:sz w:val="22"/>
+                <w:szCs w:val="22"/>
+              </w:rPr>
+              <w:t>4</w:t>
+            </w:r>
+          </w:p>
+        </w:tc>
+        <w:tc>
+          <w:tcPr>
+            <w:tcW w:w="842" w:type="dxa"/>
+            <w:tcBorders>
+              <w:top w:val="single" w:sz="4" w:space="0" w:color="000000"/>
+              <w:left w:val="single" w:sz="4" w:space="0" w:color="000000"/>
+              <w:bottom w:val="single" w:sz="4" w:space="0" w:color="000000"/>
+              <w:right w:val="single" w:sz="4" w:space="0" w:color="000000"/>
+            </w:tcBorders>
+          </w:tcPr>
+          <w:p>
+            <w:pPr>
+              <w:jc w:val="center"/>
+              <w:rPr>
+                <w:sz w:val="22"/>
+                <w:szCs w:val="22"/>
+              </w:rPr>
+            </w:pPr>
+            <w:r>
+              <w:rPr>
+                <w:sz w:val="22"/>
+                <w:szCs w:val="22"/>
+              </w:rPr>
+              <w:t>5</w:t>
+            </w:r>
+          </w:p>
+        </w:tc>
+        <w:tc>
+          <w:tcPr>
+            <w:tcW w:w="1621" w:type="dxa"/>
+            <w:tcBorders>
+              <w:top w:val="single" w:sz="4" w:space="0" w:color="000000"/>
+              <w:left w:val="single" w:sz="4" w:space="0" w:color="000000"/>
+              <w:bottom w:val="single" w:sz="4" w:space="0" w:color="000000"/>
+              <w:right w:val="single" w:sz="4" w:space="0" w:color="000000"/>
+            </w:tcBorders>
+            <w:shd w:val="clear" w:color="auto" w:fill="auto"/>
+            <w:tcMar>
+              <w:top w:w="80" w:type="dxa"/>
+              <w:left w:w="80" w:type="dxa"/>
+              <w:bottom w:w="80" w:type="dxa"/>
+              <w:right w:w="80" w:type="dxa"/>
+            </w:tcMar>
+            <w:vAlign w:val="center"/>
+          </w:tcPr>
+          <w:p>
+            <w:pPr>
+              <w:jc w:val="center"/>
+            </w:pPr>
+            <w:r>
+              <w:rPr>
+                <w:sz w:val="22"/>
+                <w:szCs w:val="22"/>
+              </w:rPr>
+              <w:t>6</w:t>
+            </w:r>
+          </w:p>
+        </w:tc>
+        <w:tc>
+          <w:tcPr>
+            <w:tcW w:w="1406" w:type="dxa"/>
+            <w:tcBorders>
+              <w:top w:val="single" w:sz="4" w:space="0" w:color="000000"/>
+              <w:left w:val="single" w:sz="4" w:space="0" w:color="000000"/>
+              <w:bottom w:val="single" w:sz="4" w:space="0" w:color="000000"/>
+              <w:right w:val="single" w:sz="4" w:space="0" w:color="000000"/>
+            </w:tcBorders>
+            <w:shd w:val="clear" w:color="auto" w:fill="auto"/>
+            <w:tcMar>
+              <w:top w:w="80" w:type="dxa"/>
+              <w:left w:w="80" w:type="dxa"/>
+              <w:bottom w:w="80" w:type="dxa"/>
+              <w:right w:w="80" w:type="dxa"/>
+            </w:tcMar>
+            <w:vAlign w:val="center"/>
+          </w:tcPr>
+          <w:p>
+            <w:pPr>
+              <w:jc w:val="center"/>
+            </w:pPr>
+            <w:r>
+              <w:rPr>
+                <w:sz w:val="22"/>
+                <w:szCs w:val="22"/>
+              </w:rPr>
+              <w:t>7</w:t>
+            </w:r>
+          </w:p>
+        </w:tc>
+        <w:tc>
+          <w:tcPr>
+            <w:tcW w:w="951" w:type="dxa"/>
+            <w:tcBorders>
+              <w:top w:val="single" w:sz="4" w:space="0" w:color="000000"/>
+              <w:left w:val="single" w:sz="4" w:space="0" w:color="000000"/>
+              <w:bottom w:val="single" w:sz="4" w:space="0" w:color="000000"/>
+              <w:right w:val="single" w:sz="4" w:space="0" w:color="000000"/>
+            </w:tcBorders>
+            <w:shd w:val="clear" w:color="auto" w:fill="auto"/>
+            <w:tcMar>
+              <w:top w:w="80" w:type="dxa"/>
+              <w:left w:w="80" w:type="dxa"/>
+              <w:bottom w:w="80" w:type="dxa"/>
+              <w:right w:w="80" w:type="dxa"/>
+            </w:tcMar>
+            <w:vAlign w:val="center"/>
+          </w:tcPr>
+          <w:p>
+            <w:pPr>
+              <w:jc w:val="center"/>
+              <w:rPr>
+                <w:lang w:val="en-US"/>
+              </w:rPr>
+            </w:pPr>
+            <w:r>
+              <w:rPr>
+                <w:sz w:val="22"/>
+                <w:szCs w:val="22"/>
+                <w:lang w:val="en-US"/>
+              </w:rPr>
+              <w:t>8</w:t>
+            </w:r>
+          </w:p>
+        </w:tc>
+        <w:tc>
+          <w:tcPr>
+            <w:tcW w:w="1427" w:type="dxa"/>
+            <w:tcBorders>
+              <w:top w:val="single" w:sz="4" w:space="0" w:color="000000"/>
+              <w:left w:val="single" w:sz="4" w:space="0" w:color="000000"/>
+              <w:bottom w:val="single" w:sz="4" w:space="0" w:color="000000"/>
+              <w:right w:val="single" w:sz="4" w:space="0" w:color="000000"/>
+            </w:tcBorders>
+          </w:tcPr>
+          <w:p>
+            <w:pPr>
+              <w:jc w:val="center"/>
+              <w:rPr>
+                <w:sz w:val="22"/>
+                <w:szCs w:val="22"/>
+              </w:rPr>
+            </w:pPr>
+            <w:r>
+              <w:rPr>
+                <w:sz w:val="22"/>
+                <w:szCs w:val="22"/>
+              </w:rPr>
+              <w:t>9</w:t>
+            </w:r>
+          </w:p>
+        </w:tc>
+      </w:tr>
+      <w:tr>
+        <w:trPr>
+          <w:trHeight w:val="1862"/>
+        </w:trPr>
+        <w:tc>
+          <w:tcPr>
+            <w:tcW w:w="923" w:type="dxa"/>
+            <w:tcBorders>
+              <w:top w:val="single" w:sz="4" w:space="0" w:color="000000"/>
+              <w:left w:val="single" w:sz="4" w:space="0" w:color="000000"/>
+              <w:bottom w:val="single" w:sz="4" w:space="0" w:color="000000"/>
+              <w:right w:val="single" w:sz="4" w:space="0" w:color="000000"/>
+            </w:tcBorders>
+            <w:shd w:val="clear" w:color="auto" w:fill="auto"/>
+            <w:tcMar>
+              <w:top w:w="80" w:type="dxa"/>
+              <w:left w:w="80" w:type="dxa"/>
+              <w:bottom w:w="80" w:type="dxa"/>
+              <w:right w:w="80" w:type="dxa"/>
+            </w:tcMar>
+            <w:vAlign w:val="center"/>
+          </w:tcPr>
+          <w:p>
+            <w:pPr>
+              <w:pStyle w:val="a5"/>
+              <w:numPr>
+                <w:ilvl w:val="0"/>
+                <w:numId w:val="1"/>
+              </w:numPr>
+            </w:pPr>
+            <w:r>
+              <w:rPr>
+                <w:sz w:val="22"/>
+                <w:szCs w:val="22"/>
+                <w:lang w:val="en-US"/>
+              </w:rPr>
+              <w:t>{#employee}</w:t>
+            </w:r>
+          </w:p>
+        </w:tc>
+        <w:tc>
+          <w:tcPr>
+            <w:tcW w:w="2918" w:type="dxa"/>
+            <w:tcBorders>
+              <w:top w:val="single" w:sz="4" w:space="0" w:color="000000"/>
+              <w:left w:val="single" w:sz="4" w:space="0" w:color="000000"/>
+              <w:bottom w:val="single" w:sz="4" w:space="0" w:color="000000"/>
+              <w:right w:val="single" w:sz="4" w:space="0" w:color="auto"/>
+            </w:tcBorders>
+            <w:shd w:val="clear" w:color="auto" w:fill="auto"/>
+            <w:tcMar>
+              <w:top w:w="80" w:type="dxa"/>
+              <w:left w:w="80" w:type="dxa"/>
+              <w:bottom w:w="80" w:type="dxa"/>
+              <w:right w:w="80" w:type="dxa"/>
+            </w:tcMar>
+            <w:vAlign w:val="center"/>
+          </w:tcPr>
+          <w:p>
+            <w:pPr>
+              <w:rPr>
+                <w:lang w:val="en-US"/>
+              </w:rPr>
+            </w:pPr>
+            <w:r>
+              <w:rPr>
+                <w:sz w:val="22"/>
+                <w:szCs w:val="22"/>
+                <w:lang w:val="en-US"/>
+              </w:rPr>
+              <w:t>{</w:t>
+            </w:r>
+            <w:proofErr w:type="spellStart"/>
+            <w:r>
+              <w:rPr>
+                <w:sz w:val="22"/>
+                <w:szCs w:val="22"/>
+                <w:lang w:val="en-US"/>
+              </w:rPr>
+              <w:t>last_</w:t>
+            </w:r>
+            <w:r>
+              <w:rPr>
+                <w:sz w:val="22"/>
+                <w:szCs w:val="22"/>
+                <w:lang w:val="en-US"/>
+              </w:rPr>
+              <w:t>name</w:t>
+            </w:r>
+            <w:proofErr w:type="spellEnd"/>
+            <w:r>
+              <w:rPr>
+                <w:sz w:val="22"/>
+                <w:szCs w:val="22"/>
+                <w:lang w:val="en-US"/>
+              </w:rPr>
+              <w:t>} {name} {</w:t>
+            </w:r>
+            <w:proofErr w:type="spellStart"/>
+            <w:r>
+              <w:rPr>
+                <w:sz w:val="22"/>
+                <w:szCs w:val="22"/>
+                <w:lang w:val="en-US"/>
+              </w:rPr>
+              <w:t>middle_name</w:t>
+            </w:r>
+            <w:proofErr w:type="spellEnd"/>
+            <w:r>
+              <w:rPr>
+                <w:sz w:val="22"/>
+                <w:szCs w:val="22"/>
+                <w:lang w:val="en-US"/>
+              </w:rPr>
+              <w:t>}</w:t>
+            </w:r>
+          </w:p>
+        </w:tc>
+        <w:tc>
+          <w:tcPr>
+            <w:tcW w:w="2379" w:type="dxa"/>
+            <w:tcBorders>
+              <w:top w:val="single" w:sz="4" w:space="0" w:color="auto"/>
+              <w:left w:val="single" w:sz="4" w:space="0" w:color="auto"/>
+              <w:bottom w:val="single" w:sz="4" w:space="0" w:color="auto"/>
+              <w:right w:val="single" w:sz="4" w:space="0" w:color="auto"/>
+            </w:tcBorders>
+            <w:shd w:val="clear" w:color="auto" w:fill="auto"/>
+            <w:tcMar>
+              <w:top w:w="80" w:type="dxa"/>
+              <w:left w:w="80" w:type="dxa"/>
+              <w:bottom w:w="80" w:type="dxa"/>
+              <w:right w:w="80" w:type="dxa"/>
+            </w:tcMar>
+            <w:vAlign w:val="center"/>
+          </w:tcPr>
+          <w:p>
+            <w:pPr>
+              <w:jc w:val="center"/>
+            </w:pPr>
+            <w:r>
+              <w:rPr>
+                <w:sz w:val="22"/>
+                <w:szCs w:val="22"/>
+                <w:lang w:val="en-US"/>
+              </w:rPr>
+              <w:t>{</w:t>
+            </w:r>
+            <w:proofErr w:type="spellStart"/>
+            <w:r>
+              <w:rPr>
+                <w:sz w:val="22"/>
+                <w:szCs w:val="22"/>
+                <w:lang w:val="en-US"/>
+              </w:rPr>
+              <w:t>organization_name</w:t>
+            </w:r>
+            <w:proofErr w:type="spellEnd"/>
+            <w:r>
+              <w:rPr>
+                <w:sz w:val="22"/>
+                <w:szCs w:val="22"/>
+                <w:lang w:val="en-US"/>
+              </w:rPr>
+              <w:t>}</w:t>
+            </w:r>
+          </w:p>
+        </w:tc>
+        <w:tc>
+          <w:tcPr>
+            <w:tcW w:w="3136" w:type="dxa"/>
+            <w:tcBorders>
+              <w:top w:val="single" w:sz="4" w:space="0" w:color="auto"/>
+              <w:left w:val="single" w:sz="4" w:space="0" w:color="auto"/>
+              <w:bottom w:val="single" w:sz="4" w:space="0" w:color="auto"/>
+              <w:right w:val="single" w:sz="4" w:space="0" w:color="auto"/>
+            </w:tcBorders>
+            <w:shd w:val="clear" w:color="auto" w:fill="auto"/>
+            <w:tcMar>
+              <w:top w:w="80" w:type="dxa"/>
+              <w:left w:w="80" w:type="dxa"/>
+              <w:bottom w:w="80" w:type="dxa"/>
+              <w:right w:w="80" w:type="dxa"/>
+            </w:tcMar>
+            <w:vAlign w:val="center"/>
+          </w:tcPr>
+          <w:p>
+            <w:pPr>
+              <w:jc w:val="center"/>
+            </w:pPr>
+            <w:r>
+              <w:rPr>
+                <w:sz w:val="22"/>
+                <w:szCs w:val="22"/>
+                <w:lang w:val="en-US"/>
+              </w:rPr>
+              <w:t>{grade}</w:t>
+            </w:r>
+          </w:p>
+        </w:tc>
+        <w:tc>
+          <w:tcPr>
+            <w:tcW w:w="842" w:type="dxa"/>
+            <w:tcBorders>
+              <w:top w:val="single" w:sz="4" w:space="0" w:color="000000"/>
+              <w:left w:val="single" w:sz="4" w:space="0" w:color="auto"/>
+              <w:bottom w:val="single" w:sz="4" w:space="0" w:color="000000"/>
+              <w:right w:val="single" w:sz="4" w:space="0" w:color="auto"/>
+            </w:tcBorders>
+          </w:tcPr>
+          <w:p>
+            <w:pPr>
+              <w:jc w:val="center"/>
+              <w:rPr>
+                <w:i/>
+                <w:iCs/>
+                <w:sz w:val="22"/>
+                <w:szCs w:val="22"/>
+                <w:lang w:val="en-US"/>
+              </w:rPr>
+            </w:pPr>
+          </w:p>
+          <w:p>
+            <w:pPr>
+              <w:jc w:val="center"/>
+              <w:rPr>
+                <w:i/>
+                <w:iCs/>
+                <w:sz w:val="22"/>
+                <w:szCs w:val="22"/>
+                <w:lang w:val="en-US"/>
+              </w:rPr>
+            </w:pPr>
+          </w:p>
+          <w:p>
+            <w:pPr>
+              <w:jc w:val="center"/>
+              <w:rPr>
+                <w:i/>
+                <w:iCs/>
+                <w:sz w:val="22"/>
+                <w:szCs w:val="22"/>
+                <w:lang w:val="en-US"/>
+              </w:rPr>
+            </w:pPr>
+          </w:p>
+          <w:p>
+            <w:pPr>
+              <w:jc w:val="center"/>
+              <w:rPr>
+                <w:i/>
+                <w:iCs/>
+                <w:sz w:val="22"/>
+                <w:szCs w:val="22"/>
+                <w:lang w:val="en-US"/>
+              </w:rPr>
+            </w:pPr>
+          </w:p>
+          <w:p>
+            <w:pPr>
+              <w:jc w:val="center"/>
+              <w:rPr>
+                <w:i/>
+                <w:iCs/>
+                <w:sz w:val="22"/>
+                <w:szCs w:val="22"/>
+                <w:lang w:val="en-US"/>
+              </w:rPr>
+            </w:pPr>
+          </w:p>
+          <w:p>
+            <w:pPr>
+              <w:jc w:val="center"/>
+              <w:rPr>
+                <w:i/>
+                <w:iCs/>
+                <w:sz w:val="22"/>
+                <w:szCs w:val="22"/>
+                <w:lang w:val="en-US"/>
+              </w:rPr>
+            </w:pPr>
+            <w:r>
+              <w:rPr>
+                <w:i/>
+                <w:iCs/>
+                <w:sz w:val="22"/>
+                <w:szCs w:val="22"/>
+                <w:lang w:val="en-US"/>
+              </w:rPr>
+              <w:t>{</w:t>
+            </w:r>
+            <w:proofErr w:type="spellStart"/>
+            <w:r>
+              <w:rPr>
+                <w:i/>
+                <w:iCs/>
+                <w:sz w:val="22"/>
+                <w:szCs w:val="22"/>
+                <w:lang w:val="en-US"/>
+              </w:rPr>
+              <w:t>random_number</w:t>
+            </w:r>
+            <w:proofErr w:type="spellEnd"/>
+            <w:r>
+              <w:rPr>
+                <w:i/>
+                <w:iCs/>
+                <w:sz w:val="22"/>
+                <w:szCs w:val="22"/>
+                <w:lang w:val="en-US"/>
+              </w:rPr>
+              <w:t>}</w:t>
+            </w:r>
+          </w:p>
+        </w:tc>
+        <w:tc>
+          <w:tcPr>
+            <w:tcW w:w="1621" w:type="dxa"/>
+            <w:tcBorders>
+              <w:top w:val="single" w:sz="4" w:space="0" w:color="000000"/>
+              <w:left w:val="single" w:sz="4" w:space="0" w:color="auto"/>
+              <w:bottom w:val="single" w:sz="4" w:space="0" w:color="000000"/>
+              <w:right w:val="single" w:sz="4" w:space="0" w:color="000000"/>
+            </w:tcBorders>
+            <w:shd w:val="clear" w:color="auto" w:fill="auto"/>
+            <w:tcMar>
+              <w:top w:w="80" w:type="dxa"/>
+              <w:left w:w="80" w:type="dxa"/>
+              <w:bottom w:w="80" w:type="dxa"/>
+              <w:right w:w="80" w:type="dxa"/>
+            </w:tcMar>
+            <w:vAlign w:val="center"/>
+          </w:tcPr>
+          <w:p>
+            <w:pPr>
+              <w:jc w:val="center"/>
+              <w:rPr>
+                <w:lang w:val="en-US"/>
+              </w:rPr>
+            </w:pPr>
+            <w:r>
+              <w:rPr>
+                <w:i/>
+                <w:iCs/>
+                <w:sz w:val="22"/>
+                <w:szCs w:val="22"/>
+                <w:lang w:val="en-US"/>
+              </w:rPr>
+              <w:t>{</w:t>
+            </w:r>
+            <w:r>
+              <w:rPr>
+                <w:i/>
+                <w:iCs/>
+                <w:sz w:val="22"/>
+                <w:szCs w:val="22"/>
+              </w:rPr>
+              <w:t>c</w:t>
+            </w:r>
+            <w:proofErr w:type="spellStart"/>
+            <w:r>
+              <w:rPr>
+                <w:i/>
+                <w:iCs/>
+                <w:sz w:val="22"/>
+                <w:szCs w:val="22"/>
+                <w:lang w:val="en-US"/>
+              </w:rPr>
+              <w:t>ourses_mark</w:t>
+            </w:r>
+            <w:proofErr w:type="spellEnd"/>
+            <w:r>
+              <w:rPr>
+                <w:i/>
+                <w:iCs/>
+                <w:sz w:val="22"/>
+                <w:szCs w:val="22"/>
+              </w:rPr>
+              <w:t>}</w:t>
+            </w:r>
+          </w:p>
+        </w:tc>
+        <w:tc>
+          <w:tcPr>
+            <w:tcW w:w="1406" w:type="dxa"/>
+            <w:tcBorders>
+              <w:top w:val="single" w:sz="4" w:space="0" w:color="000000"/>
+              <w:left w:val="single" w:sz="4" w:space="0" w:color="000000"/>
+              <w:bottom w:val="single" w:sz="4" w:space="0" w:color="000000"/>
+              <w:right w:val="single" w:sz="4" w:space="0" w:color="000000"/>
+            </w:tcBorders>
+            <w:shd w:val="clear" w:color="auto" w:fill="auto"/>
+            <w:tcMar>
+              <w:top w:w="80" w:type="dxa"/>
+              <w:left w:w="80" w:type="dxa"/>
+              <w:bottom w:w="80" w:type="dxa"/>
+              <w:right w:w="80" w:type="dxa"/>
+            </w:tcMar>
+            <w:vAlign w:val="center"/>
+          </w:tcPr>
+          <w:p/>
+        </w:tc>
+        <w:tc>
+          <w:tcPr>
+            <w:tcW w:w="951" w:type="dxa"/>
+            <w:tcBorders>
+              <w:top w:val="single" w:sz="4" w:space="0" w:color="000000"/>
+              <w:left w:val="single" w:sz="4" w:space="0" w:color="000000"/>
+              <w:bottom w:val="single" w:sz="4" w:space="0" w:color="000000"/>
+              <w:right w:val="single" w:sz="4" w:space="0" w:color="000000"/>
+            </w:tcBorders>
+            <w:shd w:val="clear" w:color="auto" w:fill="auto"/>
+            <w:tcMar>
+              <w:top w:w="80" w:type="dxa"/>
+              <w:left w:w="80" w:type="dxa"/>
+              <w:bottom w:w="80" w:type="dxa"/>
+              <w:right w:w="80" w:type="dxa"/>
+            </w:tcMar>
+            <w:vAlign w:val="center"/>
+          </w:tcPr>
+          <w:p/>
+        </w:tc>
+        <w:tc>
+          <w:tcPr>
+            <w:tcW w:w="1427" w:type="dxa"/>
+            <w:vMerge/>
+            <w:tcBorders>
+              <w:top w:val="single" w:sz="4" w:space="0" w:color="000000"/>
+              <w:left w:val="single" w:sz="4" w:space="0" w:color="000000"/>
+              <w:bottom w:val="single" w:sz="4" w:space="0" w:color="000000"/>
+              <w:right w:val="single" w:sz="4" w:space="0" w:color="000000"/>
+            </w:tcBorders>
+          </w:tcPr>
+          <w:p>
+            <w:pPr>
+              <w:rPr>
+                <w:sz w:val="22"/>
+                <w:szCs w:val="22"/>
+              </w:rPr>
+            </w:pPr>
+          </w:p>
+          <w:p>
+            <w:pPr>
+              <w:rPr>
+                <w:sz w:val="22"/>
+                <w:szCs w:val="22"/>
+              </w:rPr>
+            </w:pPr>
+          </w:p>
+          <w:p>
+            <w:pPr>
+              <w:rPr>
+                <w:sz w:val="22"/>
+                <w:szCs w:val="22"/>
+              </w:rPr>
+            </w:pPr>
+          </w:p>
+          <w:p>
+            <w:pPr>
+              <w:rPr>
+                <w:sz w:val="22"/>
+                <w:szCs w:val="22"/>
+              </w:rPr>
+            </w:pPr>
+          </w:p>
+          <w:p>
+            <w:pPr>
+              <w:rPr>
+                <w:sz w:val="22"/>
+                <w:szCs w:val="22"/>
+                <w:lang w:val="en-US"/>
+              </w:rPr>
+            </w:pPr>
+            <w:r>
+              <w:rPr>
+                <w:sz w:val="22"/>
+                <w:szCs w:val="22"/>
+                <w:lang w:val="en-US"/>
+              </w:rPr>
+              <w:t xml:space="preserve"> </w:t>
+            </w:r>
+            <w:r>
+              <w:rPr>
+                <w:sz w:val="22"/>
+                <w:szCs w:val="22"/>
+              </w:rPr>
+              <w:t>{</w:t>
+            </w:r>
+            <w:proofErr w:type="spellStart"/>
+            <w:r>
+              <w:rPr>
+                <w:sz w:val="22"/>
+                <w:szCs w:val="22"/>
+              </w:rPr>
+              <w:t>conclusion</w:t>
+            </w:r>
+            <w:proofErr w:type="spellEnd"/>
+            <w:r>
+              <w:rPr>
+                <w:sz w:val="22"/>
+                <w:szCs w:val="22"/>
+                <w:lang w:val="en-US"/>
+              </w:rPr>
+              <w:t>}</w:t>
+            </w:r>
+            <w:r>
+              <w:rPr>
+                <w:i/>
+                <w:iCs/>
+                <w:sz w:val="22"/>
+                <w:szCs w:val="22"/>
+                <w:lang w:val="en-US"/>
+              </w:rPr>
+              <w:t>{/employee}</w:t>
+            </w:r>
+          </w:p>
+        </w:tc>
+      </w:tr>
+    </w:tbl>
+    <w:p>
+      <w:pPr>
+        <w:widowControl w:val="0"/>
+        <w:ind w:left="324" w:hanging="324"/>
+        <w:rPr>
+          <w:sz w:val="22"/>
+          <w:szCs w:val="22"/>
+        </w:rPr>
+      </w:pPr>
+    </w:p>
+    <w:p>
+      <w:pPr>
+        <w:widowControl w:val="0"/>
+        <w:ind w:left="216" w:hanging="216"/>
+        <w:rPr>
+          <w:sz w:val="22"/>
+          <w:szCs w:val="22"/>
+        </w:rPr>
+      </w:pPr>
+    </w:p>
+    <w:p>
+      <w:pPr>
+        <w:widowControl w:val="0"/>
+        <w:ind w:left="108" w:hanging="108"/>
+        <w:rPr>
+          <w:sz w:val="22"/>
+          <w:szCs w:val="22"/>
+        </w:rPr>
+      </w:pPr>
+    </w:p>
+    <w:p>
+      <w:pPr>
+        <w:widowControl w:val="0"/>
+        <w:jc w:val="both"/>
+        <w:rPr>
+          <w:sz w:val="22"/>
+          <w:szCs w:val="22"/>
+        </w:rPr>
+      </w:pPr>
+    </w:p>
+    <w:p>
+      <w:pPr>
+        <w:tabs>
+          <w:tab w:val="left" w:pos="2220"/>
+        </w:tabs>
+        <w:rPr>
+          <w:sz w:val="18"/>
+          <w:szCs w:val="18"/>
+        </w:rPr>
+      </w:pPr>
+      <w:r>
+        <w:rPr>
+          <w:sz w:val="28"/>
+          <w:szCs w:val="28"/>
+        </w:rPr>
+        <w:tab/>
+      </w:r>
+    </w:p>
+    <w:p>
+      <w:pPr>
+        <w:ind w:left="3828"/>
+      </w:pPr>
+      <w:r>
+        <w:t>Председатель комиссии:</w:t>
+      </w:r>
+      <w:r>
+        <w:tab/>
+      </w:r>
+      <w:r>
+        <w:tab/>
+      </w:r>
+      <w:r>
+        <w:tab/>
+      </w:r>
+      <w:r>
+        <w:tab/>
+        <w:t xml:space="preserve">/ В.М. </w:t>
+      </w:r>
+      <w:proofErr w:type="spellStart"/>
+      <w:r>
+        <w:t>Шекшуев</w:t>
+      </w:r>
+      <w:proofErr w:type="spellEnd"/>
+      <w:r>
+        <w:t xml:space="preserve"> /</w:t>
+      </w:r>
+    </w:p>
+    <w:p>
+      <w:pPr>
+        <w:ind w:left="3828"/>
+        <w:rPr>
+          <w:sz w:val="12"/>
+          <w:szCs w:val="12"/>
+        </w:rPr>
+      </w:pPr>
+    </w:p>
+    <w:p>
+      <w:pPr>
+        <w:ind w:left="3828"/>
+      </w:pPr>
+      <w:r>
+        <w:t>Члены комиссии:</w:t>
+      </w:r>
+      <w:r>
+        <w:tab/>
+      </w:r>
+      <w:r>
+        <w:tab/>
+      </w:r>
+      <w:r>
+        <w:tab/>
+      </w:r>
+      <w:r>
+        <w:tab/>
+      </w:r>
+      <w:r>
+        <w:tab/>
+        <w:t>/ Е.С. Воробьева /</w:t>
+      </w:r>
+    </w:p>
+    <w:p>
+      <w:pPr>
+        <w:ind w:left="3828"/>
+        <w:rPr>
+          <w:sz w:val="12"/>
+          <w:szCs w:val="12"/>
+        </w:rPr>
+      </w:pPr>
+    </w:p>
+    <w:p>
+      <w:pPr>
+        <w:ind w:left="3828"/>
+      </w:pPr>
+      <w:r>
+        <w:tab/>
+      </w:r>
+      <w:r>
+        <w:tab/>
+      </w:r>
+      <w:r>
+        <w:tab/>
+      </w:r>
+      <w:r>
+        <w:tab/>
+      </w:r>
+      <w:r>
+        <w:tab/>
+      </w:r>
+      <w:r>
+        <w:tab/>
+      </w:r>
+      <w:r>
+        <w:tab/>
+        <w:t xml:space="preserve">/ И.Ю. </w:t>
+      </w:r>
+      <w:proofErr w:type="spellStart"/>
+      <w:r>
+        <w:t>Шекшуева</w:t>
+      </w:r>
+      <w:proofErr w:type="spellEnd"/>
+      <w:r>
+        <w:t xml:space="preserve"> /</w:t>
+      </w:r>
+    </w:p>
+    <w:sectPr>
+      <w:headerReference w:type="default" r:id="rId7"/>
+      <w:footerReference w:type="default" r:id="rId8"/>
+      <w:pgSz w:w="16840" w:h="11900" w:orient="landscape"/>
+      <w:pgMar w:top="142" w:right="536" w:bottom="0" w:left="1134" w:header="709" w:footer="709" w:gutter="0"/>
+      <w:cols w:space="720"/>
+    </w:sectPr>
+  </w:body>
+</w:document>
 </file>
</xml_diff>

<commit_message>
Remove stray entries from commission DOCX template
</commit_message>
<xml_diff>
--- a/backend/Protocol-comission-template.docx
+++ b/backend/Protocol-comission-template.docx
@@ -3549,1794 +3549,4 @@
   </a:objectDefaults>
   <a:extraClrSchemeLst/>
 </a:theme>
-</file>
-
-<file path=document.orig.xml><?xml version="1.0" encoding="utf-8"?>
-<w:document xmlns:wpc="http://schemas.microsoft.com/office/word/2010/wordprocessingCanvas" xmlns:cx="http://schemas.microsoft.com/office/drawing/2014/chartex" xmlns:cx1="http://schemas.microsoft.com/office/drawing/2015/9/8/chartex" xmlns:cx2="http://schemas.microsoft.com/office/drawing/2015/10/21/chartex" xmlns:cx3="http://schemas.microsoft.com/office/drawing/2016/5/9/chartex" xmlns:cx4="http://schemas.microsoft.com/office/drawing/2016/5/10/chartex" xmlns:cx5="http://schemas.microsoft.com/office/drawing/2016/5/11/chartex" xmlns:cx6="http://schemas.microsoft.com/office/drawing/2016/5/12/chartex" xmlns:cx7="http://schemas.microsoft.com/office/drawing/2016/5/13/chartex" xmlns:cx8="http://schemas.microsoft.com/office/drawing/2016/5/14/chartex" xmlns:mc="http://schemas.openxmlformats.org/markup-compatibility/2006" xmlns:aink="http://schemas.microsoft.com/office/drawing/2016/ink" xmlns:am3d="http://schemas.microsoft.com/office/drawing/2017/model3d" xmlns:o="urn:schemas-microsoft-com:office:office" xmlns:oel="http://schemas.microsoft.com/office/2019/extlst" xmlns:r="http://schemas.openxmlformats.org/officeDocument/2006/relationships" xmlns:m="http://schemas.openxmlformats.org/officeDocument/2006/math" xmlns:v="urn:schemas-microsoft-com:vml" xmlns:wp14="http://schemas.microsoft.com/office/word/2010/wordprocessingDrawing" xmlns:wp="http://schemas.openxmlformats.org/drawingml/2006/wordprocessingDrawing" xmlns:w10="urn:schemas-microsoft-com:office:word" xmlns:w="http://schemas.openxmlformats.org/wordprocessingml/2006/main" xmlns:w14="http://schemas.microsoft.com/office/word/2010/wordml" xmlns:w15="http://schemas.microsoft.com/office/word/2012/wordml" xmlns:w16cex="http://schemas.microsoft.com/office/word/2018/wordml/cex" xmlns:w16cid="http://schemas.microsoft.com/office/word/2016/wordml/cid" xmlns:w16="http://schemas.microsoft.com/office/word/2018/wordml" xmlns:w16sdtdh="http://schemas.microsoft.com/office/word/2020/wordml/sdtdatahash" xmlns:w16se="http://schemas.microsoft.com/office/word/2015/wordml/symex" xmlns:wpg="http://schemas.microsoft.com/office/word/2010/wordprocessingGroup" xmlns:wpi="http://schemas.microsoft.com/office/word/2010/wordprocessingInk" xmlns:wne="http://schemas.microsoft.com/office/word/2006/wordml" xmlns:wps="http://schemas.microsoft.com/office/word/2010/wordprocessingShape" mc:Ignorable="w14 w15 w16se w16cid w16 w16cex w16sdtdh wp14">
-  <w:body>
-    <w:p>
-      <w:pPr>
-        <w:jc w:val="center"/>
-        <w:rPr>
-          <w:b/>
-          <w:bCs/>
-          <w:sz w:val="28"/>
-          <w:szCs w:val="28"/>
-          <w:lang w:val="en-US"/>
-        </w:rPr>
-      </w:pPr>
-      <w:r>
-        <w:rPr>
-          <w:b/>
-          <w:bCs/>
-          <w:sz w:val="28"/>
-          <w:szCs w:val="28"/>
-          <w:lang w:val="en-US"/>
-        </w:rPr>
-        <w:t>{</w:t>
-      </w:r>
-      <w:proofErr w:type="spellStart"/>
-      <w:r>
-        <w:rPr>
-          <w:b/>
-          <w:bCs/>
-          <w:sz w:val="28"/>
-          <w:szCs w:val="28"/>
-          <w:lang w:val="en-US"/>
-        </w:rPr>
-        <w:t>moisei_name</w:t>
-      </w:r>
-      <w:proofErr w:type="spellEnd"/>
-      <w:r>
-        <w:rPr>
-          <w:b/>
-          <w:bCs/>
-          <w:sz w:val="28"/>
-          <w:szCs w:val="28"/>
-          <w:lang w:val="en-US"/>
-        </w:rPr>
-        <w:t>}</w:t>
-      </w:r>
-    </w:p>
-    <w:p>
-      <w:pPr>
-        <w:jc w:val="center"/>
-        <w:rPr>
-          <w:b/>
-          <w:bCs/>
-          <w:sz w:val="22"/>
-          <w:szCs w:val="22"/>
-        </w:rPr>
-      </w:pPr>
-    </w:p>
-    <w:p>
-      <w:pPr>
-        <w:jc w:val="center"/>
-        <w:rPr>
-          <w:b/>
-          <w:bCs/>
-          <w:sz w:val="28"/>
-          <w:szCs w:val="28"/>
-        </w:rPr>
-      </w:pPr>
-      <w:r>
-        <w:rPr>
-          <w:b/>
-          <w:bCs/>
-          <w:sz w:val="28"/>
-          <w:szCs w:val="28"/>
-        </w:rPr>
-        <w:t xml:space="preserve">П Р О Т О К О Л    </w:t>
-      </w:r>
-      <w:proofErr w:type="gramStart"/>
-      <w:r>
-        <w:rPr>
-          <w:b/>
-          <w:bCs/>
-          <w:sz w:val="28"/>
-          <w:szCs w:val="28"/>
-        </w:rPr>
-        <w:t xml:space="preserve">№  </w:t>
-      </w:r>
-      <w:r>
-        <w:rPr>
-          <w:b/>
-          <w:bCs/>
-          <w:sz w:val="28"/>
-          <w:szCs w:val="28"/>
-        </w:rPr>
-        <w:t>{</w:t>
-      </w:r>
-      <w:proofErr w:type="gramEnd"/>
-      <w:r>
-        <w:rPr>
-          <w:b/>
-          <w:bCs/>
-          <w:sz w:val="28"/>
-          <w:szCs w:val="28"/>
-          <w:lang w:val="en-US"/>
-        </w:rPr>
-        <w:t>group</w:t>
-      </w:r>
-      <w:r>
-        <w:rPr>
-          <w:b/>
-          <w:bCs/>
-          <w:sz w:val="28"/>
-          <w:szCs w:val="28"/>
-        </w:rPr>
-        <w:t>_</w:t>
-      </w:r>
-      <w:r>
-        <w:rPr>
-          <w:b/>
-          <w:bCs/>
-          <w:sz w:val="28"/>
-          <w:szCs w:val="28"/>
-          <w:lang w:val="en-US"/>
-        </w:rPr>
-        <w:t>id</w:t>
-      </w:r>
-      <w:r>
-        <w:rPr>
-          <w:b/>
-          <w:bCs/>
-          <w:sz w:val="28"/>
-          <w:szCs w:val="28"/>
-        </w:rPr>
-        <w:t>}</w:t>
-      </w:r>
-      <w:r>
-        <w:rPr>
-          <w:b/>
-          <w:bCs/>
-          <w:sz w:val="28"/>
-          <w:szCs w:val="28"/>
-        </w:rPr>
-        <w:t xml:space="preserve">  от  </w:t>
-      </w:r>
-      <w:r>
-        <w:rPr>
-          <w:b/>
-          <w:bCs/>
-          <w:sz w:val="28"/>
-          <w:szCs w:val="28"/>
-        </w:rPr>
-        <w:t>{</w:t>
-      </w:r>
-      <w:r>
-        <w:rPr>
-          <w:b/>
-          <w:bCs/>
-          <w:sz w:val="28"/>
-          <w:szCs w:val="28"/>
-          <w:lang w:val="en-US"/>
-        </w:rPr>
-        <w:t>end</w:t>
-      </w:r>
-      <w:r>
-        <w:rPr>
-          <w:b/>
-          <w:bCs/>
-          <w:sz w:val="28"/>
-          <w:szCs w:val="28"/>
-        </w:rPr>
-        <w:t>_</w:t>
-      </w:r>
-      <w:r>
-        <w:rPr>
-          <w:b/>
-          <w:bCs/>
-          <w:sz w:val="28"/>
-          <w:szCs w:val="28"/>
-          <w:lang w:val="en-US"/>
-        </w:rPr>
-        <w:t>date</w:t>
-      </w:r>
-      <w:r>
-        <w:rPr>
-          <w:b/>
-          <w:bCs/>
-          <w:sz w:val="28"/>
-          <w:szCs w:val="28"/>
-        </w:rPr>
-        <w:t>}</w:t>
-      </w:r>
-    </w:p>
-    <w:p>
-      <w:pPr>
-        <w:jc w:val="center"/>
-        <w:rPr>
-          <w:b/>
-          <w:bCs/>
-          <w:sz w:val="28"/>
-          <w:szCs w:val="28"/>
-        </w:rPr>
-      </w:pPr>
-      <w:r>
-        <w:rPr>
-          <w:b/>
-          <w:bCs/>
-          <w:sz w:val="28"/>
-          <w:szCs w:val="28"/>
-        </w:rPr>
-        <w:t>заседания комиссии по проверке знаний</w:t>
-      </w:r>
-    </w:p>
-    <w:p>
-      <w:pPr>
-        <w:rPr>
-          <w:sz w:val="18"/>
-          <w:szCs w:val="18"/>
-        </w:rPr>
-      </w:pPr>
-    </w:p>
-    <w:p>
-      <w:r>
-        <w:t>В соответствии с приказом директора от «01» сентября 2022 г. № 10 комиссия в составе:</w:t>
-      </w:r>
-    </w:p>
-    <w:p>
-      <w:pPr>
-        <w:rPr>
-          <w:sz w:val="22"/>
-          <w:szCs w:val="22"/>
-        </w:rPr>
-      </w:pPr>
-    </w:p>
-    <w:p>
-      <w:r>
-        <w:rPr>
-          <w:b/>
-          <w:bCs/>
-        </w:rPr>
-        <w:t>Председатель комиссии:</w:t>
-      </w:r>
-      <w:r>
-        <w:tab/>
-      </w:r>
-      <w:proofErr w:type="spellStart"/>
-      <w:r>
-        <w:t>Шекшуев</w:t>
-      </w:r>
-      <w:proofErr w:type="spellEnd"/>
-      <w:r>
-        <w:t xml:space="preserve"> В.М.. - директор</w:t>
-      </w:r>
-    </w:p>
-    <w:p>
-      <w:r>
-        <w:rPr>
-          <w:b/>
-          <w:bCs/>
-        </w:rPr>
-        <w:t>Члены комиссии:</w:t>
-      </w:r>
-      <w:r>
-        <w:rPr>
-          <w:b/>
-          <w:bCs/>
-        </w:rPr>
-        <w:tab/>
-      </w:r>
-      <w:r>
-        <w:tab/>
-        <w:t>Воробьева Е.С. – заместитель директора</w:t>
-      </w:r>
-    </w:p>
-    <w:p>
-      <w:r>
-        <w:tab/>
-      </w:r>
-      <w:r>
-        <w:tab/>
-      </w:r>
-      <w:r>
-        <w:tab/>
-      </w:r>
-      <w:r>
-        <w:tab/>
-      </w:r>
-      <w:proofErr w:type="spellStart"/>
-      <w:r>
-        <w:t>Шекшуева</w:t>
-      </w:r>
-      <w:proofErr w:type="spellEnd"/>
-      <w:r>
-        <w:t xml:space="preserve"> И.Ю. – специалист учебного центра</w:t>
-      </w:r>
-    </w:p>
-    <w:p>
-      <w:pPr>
-        <w:pStyle w:val="a4"/>
-        <w:tabs>
-          <w:tab w:val="left" w:pos="2694"/>
-        </w:tabs>
-        <w:rPr>
-          <w:sz w:val="22"/>
-          <w:szCs w:val="22"/>
-        </w:rPr>
-      </w:pPr>
-    </w:p>
-    <w:p>
-      <w:pPr>
-        <w:jc w:val="both"/>
-      </w:pPr>
-      <w:r>
-        <w:t>Проведена проверка знаний по программе: - «</w:t>
-      </w:r>
-      <w:r>
-        <w:t>{</w:t>
-      </w:r>
-      <w:r>
-        <w:rPr>
-          <w:lang w:val="en-US"/>
-        </w:rPr>
-        <w:t>course</w:t>
-      </w:r>
-      <w:r>
-        <w:t>_</w:t>
-      </w:r>
-      <w:r>
-        <w:rPr>
-          <w:lang w:val="en-US"/>
-        </w:rPr>
-        <w:t>name</w:t>
-      </w:r>
-      <w:r>
-        <w:t>}</w:t>
-      </w:r>
-      <w:r>
-        <w:t xml:space="preserve">» в объеме </w:t>
-      </w:r>
-      <w:r>
-        <w:t>{</w:t>
-      </w:r>
-      <w:r>
-        <w:rPr>
-          <w:lang w:val="en-US"/>
-        </w:rPr>
-        <w:t>hours</w:t>
-      </w:r>
-      <w:r>
-        <w:t>}</w:t>
-      </w:r>
-      <w:r>
-        <w:t xml:space="preserve"> часов;</w:t>
-      </w:r>
-    </w:p>
-    <w:p>
-      <w:pPr>
-        <w:jc w:val="both"/>
-        <w:rPr>
-          <w:sz w:val="22"/>
-          <w:szCs w:val="22"/>
-        </w:rPr>
-      </w:pPr>
-      <w:r>
-        <w:rPr>
-          <w:sz w:val="22"/>
-          <w:szCs w:val="22"/>
-        </w:rPr>
-        <w:t>- - «</w:t>
-      </w:r>
-      <w:r>
-        <w:rPr>
-          <w:sz w:val="22"/>
-          <w:szCs w:val="22"/>
-        </w:rPr>
-        <w:t>{</w:t>
-      </w:r>
-      <w:r>
-        <w:rPr>
-          <w:sz w:val="22"/>
-          <w:szCs w:val="22"/>
-          <w:lang w:val="en-US"/>
-        </w:rPr>
-        <w:t>course</w:t>
-      </w:r>
-      <w:r>
-        <w:rPr>
-          <w:sz w:val="22"/>
-          <w:szCs w:val="22"/>
-        </w:rPr>
-        <w:t>_</w:t>
-      </w:r>
-      <w:r>
-        <w:rPr>
-          <w:sz w:val="22"/>
-          <w:szCs w:val="22"/>
-          <w:lang w:val="en-US"/>
-        </w:rPr>
-        <w:t>name</w:t>
-      </w:r>
-      <w:r>
-        <w:rPr>
-          <w:sz w:val="22"/>
-          <w:szCs w:val="22"/>
-        </w:rPr>
-        <w:t>}</w:t>
-      </w:r>
-      <w:r>
-        <w:rPr>
-          <w:sz w:val="22"/>
-          <w:szCs w:val="22"/>
-        </w:rPr>
-        <w:t xml:space="preserve">» в объеме </w:t>
-      </w:r>
-      <w:r>
-        <w:rPr>
-          <w:sz w:val="22"/>
-          <w:szCs w:val="22"/>
-        </w:rPr>
-        <w:t>{</w:t>
-      </w:r>
-      <w:r>
-        <w:rPr>
-          <w:sz w:val="22"/>
-          <w:szCs w:val="22"/>
-          <w:lang w:val="en-US"/>
-        </w:rPr>
-        <w:t>hours</w:t>
-      </w:r>
-      <w:r>
-        <w:rPr>
-          <w:sz w:val="22"/>
-          <w:szCs w:val="22"/>
-        </w:rPr>
-        <w:t>}</w:t>
-      </w:r>
-      <w:r>
-        <w:rPr>
-          <w:sz w:val="22"/>
-          <w:szCs w:val="22"/>
-        </w:rPr>
-        <w:t xml:space="preserve"> часов:</w:t>
-      </w:r>
-    </w:p>
-    <w:tbl>
-      <w:tblPr>
-        <w:tblStyle w:val="TableNormal"/>
-        <w:tblW w:w="15603" w:type="dxa"/>
-        <w:tblInd w:w="-289" w:type="dxa"/>
-        <w:tblBorders>
-          <w:top w:val="single" w:sz="8" w:space="0" w:color="FFFFFF"/>
-          <w:left w:val="single" w:sz="8" w:space="0" w:color="FFFFFF"/>
-          <w:bottom w:val="single" w:sz="8" w:space="0" w:color="FFFFFF"/>
-          <w:right w:val="single" w:sz="8" w:space="0" w:color="FFFFFF"/>
-          <w:insideH w:val="single" w:sz="8" w:space="0" w:color="FFFFFF"/>
-          <w:insideV w:val="single" w:sz="8" w:space="0" w:color="FFFFFF"/>
-        </w:tblBorders>
-        <w:shd w:val="clear" w:color="auto" w:fill="CED7E7"/>
-        <w:tblLayout w:type="fixed"/>
-        <w:tblLook w:val="04A0" w:firstRow="1" w:lastRow="0" w:firstColumn="1" w:lastColumn="0" w:noHBand="0" w:noVBand="1"/>
-      </w:tblPr>
-      <w:tblGrid>
-        <w:gridCol w:w="923"/>
-        <w:gridCol w:w="2918"/>
-        <w:gridCol w:w="2379"/>
-        <w:gridCol w:w="3136"/>
-        <w:gridCol w:w="842"/>
-        <w:gridCol w:w="1621"/>
-        <w:gridCol w:w="1406"/>
-        <w:gridCol w:w="951"/>
-        <w:gridCol w:w="1427"/>
-      </w:tblGrid>
-      <w:tr>
-        <w:trPr>
-          <w:trHeight w:val="1046"/>
-        </w:trPr>
-        <w:tc>
-          <w:tcPr>
-            <w:tcW w:w="923" w:type="dxa"/>
-            <w:tcBorders>
-              <w:top w:val="single" w:sz="4" w:space="0" w:color="000000"/>
-              <w:left w:val="single" w:sz="4" w:space="0" w:color="000000"/>
-              <w:bottom w:val="single" w:sz="4" w:space="0" w:color="000000"/>
-              <w:right w:val="single" w:sz="4" w:space="0" w:color="000000"/>
-            </w:tcBorders>
-            <w:shd w:val="clear" w:color="auto" w:fill="auto"/>
-            <w:tcMar>
-              <w:top w:w="80" w:type="dxa"/>
-              <w:left w:w="80" w:type="dxa"/>
-              <w:bottom w:w="80" w:type="dxa"/>
-              <w:right w:w="80" w:type="dxa"/>
-            </w:tcMar>
-            <w:vAlign w:val="center"/>
-          </w:tcPr>
-          <w:p>
-            <w:pPr>
-              <w:jc w:val="center"/>
-            </w:pPr>
-            <w:r>
-              <w:rPr>
-                <w:sz w:val="22"/>
-                <w:szCs w:val="22"/>
-              </w:rPr>
-              <w:t>№</w:t>
-            </w:r>
-          </w:p>
-        </w:tc>
-        <w:tc>
-          <w:tcPr>
-            <w:tcW w:w="2918" w:type="dxa"/>
-            <w:tcBorders>
-              <w:top w:val="single" w:sz="4" w:space="0" w:color="000000"/>
-              <w:left w:val="single" w:sz="4" w:space="0" w:color="000000"/>
-              <w:bottom w:val="single" w:sz="4" w:space="0" w:color="000000"/>
-              <w:right w:val="single" w:sz="4" w:space="0" w:color="000000"/>
-            </w:tcBorders>
-            <w:shd w:val="clear" w:color="auto" w:fill="auto"/>
-            <w:tcMar>
-              <w:top w:w="80" w:type="dxa"/>
-              <w:left w:w="80" w:type="dxa"/>
-              <w:bottom w:w="80" w:type="dxa"/>
-              <w:right w:w="80" w:type="dxa"/>
-            </w:tcMar>
-            <w:vAlign w:val="center"/>
-          </w:tcPr>
-          <w:p>
-            <w:pPr>
-              <w:jc w:val="center"/>
-            </w:pPr>
-            <w:r>
-              <w:rPr>
-                <w:sz w:val="22"/>
-                <w:szCs w:val="22"/>
-              </w:rPr>
-              <w:t>Ф.И.О.</w:t>
-            </w:r>
-          </w:p>
-        </w:tc>
-        <w:tc>
-          <w:tcPr>
-            <w:tcW w:w="2379" w:type="dxa"/>
-            <w:tcBorders>
-              <w:top w:val="single" w:sz="4" w:space="0" w:color="000000"/>
-              <w:left w:val="single" w:sz="4" w:space="0" w:color="000000"/>
-              <w:bottom w:val="single" w:sz="4" w:space="0" w:color="000000"/>
-              <w:right w:val="single" w:sz="4" w:space="0" w:color="000000"/>
-            </w:tcBorders>
-            <w:shd w:val="clear" w:color="auto" w:fill="auto"/>
-            <w:tcMar>
-              <w:top w:w="80" w:type="dxa"/>
-              <w:left w:w="80" w:type="dxa"/>
-              <w:bottom w:w="80" w:type="dxa"/>
-              <w:right w:w="80" w:type="dxa"/>
-            </w:tcMar>
-            <w:vAlign w:val="center"/>
-          </w:tcPr>
-          <w:p>
-            <w:pPr>
-              <w:jc w:val="center"/>
-            </w:pPr>
-            <w:r>
-              <w:rPr>
-                <w:sz w:val="22"/>
-                <w:szCs w:val="22"/>
-              </w:rPr>
-              <w:t>Наименование предприятия</w:t>
-            </w:r>
-          </w:p>
-        </w:tc>
-        <w:tc>
-          <w:tcPr>
-            <w:tcW w:w="3136" w:type="dxa"/>
-            <w:tcBorders>
-              <w:top w:val="single" w:sz="4" w:space="0" w:color="000000"/>
-              <w:left w:val="single" w:sz="4" w:space="0" w:color="000000"/>
-              <w:bottom w:val="single" w:sz="4" w:space="0" w:color="000000"/>
-              <w:right w:val="single" w:sz="4" w:space="0" w:color="000000"/>
-            </w:tcBorders>
-            <w:shd w:val="clear" w:color="auto" w:fill="auto"/>
-            <w:tcMar>
-              <w:top w:w="80" w:type="dxa"/>
-              <w:left w:w="80" w:type="dxa"/>
-              <w:bottom w:w="80" w:type="dxa"/>
-              <w:right w:w="80" w:type="dxa"/>
-            </w:tcMar>
-            <w:vAlign w:val="center"/>
-          </w:tcPr>
-          <w:p>
-            <w:pPr>
-              <w:jc w:val="center"/>
-            </w:pPr>
-            <w:r>
-              <w:rPr>
-                <w:sz w:val="22"/>
-                <w:szCs w:val="22"/>
-              </w:rPr>
-              <w:t>Занимаемая должность</w:t>
-            </w:r>
-          </w:p>
-        </w:tc>
-        <w:tc>
-          <w:tcPr>
-            <w:tcW w:w="842" w:type="dxa"/>
-            <w:tcBorders>
-              <w:top w:val="single" w:sz="4" w:space="0" w:color="000000"/>
-              <w:left w:val="single" w:sz="4" w:space="0" w:color="000000"/>
-              <w:bottom w:val="single" w:sz="4" w:space="0" w:color="000000"/>
-              <w:right w:val="single" w:sz="4" w:space="0" w:color="000000"/>
-            </w:tcBorders>
-          </w:tcPr>
-          <w:p>
-            <w:pPr>
-              <w:jc w:val="center"/>
-              <w:rPr>
-                <w:sz w:val="22"/>
-                <w:szCs w:val="22"/>
-              </w:rPr>
-            </w:pPr>
-          </w:p>
-          <w:p>
-            <w:pPr>
-              <w:jc w:val="center"/>
-              <w:rPr>
-                <w:sz w:val="22"/>
-                <w:szCs w:val="22"/>
-              </w:rPr>
-            </w:pPr>
-          </w:p>
-          <w:p>
-            <w:pPr>
-              <w:jc w:val="center"/>
-              <w:rPr>
-                <w:sz w:val="22"/>
-                <w:szCs w:val="22"/>
-              </w:rPr>
-            </w:pPr>
-          </w:p>
-          <w:p>
-            <w:pPr>
-              <w:jc w:val="center"/>
-              <w:rPr>
-                <w:sz w:val="22"/>
-                <w:szCs w:val="22"/>
-              </w:rPr>
-            </w:pPr>
-            <w:r>
-              <w:rPr>
-                <w:sz w:val="22"/>
-                <w:szCs w:val="22"/>
-              </w:rPr>
-              <w:t>Номер билета</w:t>
-            </w:r>
-          </w:p>
-        </w:tc>
-        <w:tc>
-          <w:tcPr>
-            <w:tcW w:w="1621" w:type="dxa"/>
-            <w:tcBorders>
-              <w:top w:val="single" w:sz="4" w:space="0" w:color="000000"/>
-              <w:left w:val="single" w:sz="4" w:space="0" w:color="000000"/>
-              <w:bottom w:val="single" w:sz="4" w:space="0" w:color="000000"/>
-              <w:right w:val="single" w:sz="4" w:space="0" w:color="000000"/>
-            </w:tcBorders>
-            <w:shd w:val="clear" w:color="auto" w:fill="auto"/>
-            <w:tcMar>
-              <w:top w:w="80" w:type="dxa"/>
-              <w:left w:w="80" w:type="dxa"/>
-              <w:bottom w:w="80" w:type="dxa"/>
-              <w:right w:w="80" w:type="dxa"/>
-            </w:tcMar>
-            <w:vAlign w:val="center"/>
-          </w:tcPr>
-          <w:p>
-            <w:pPr>
-              <w:jc w:val="center"/>
-            </w:pPr>
-            <w:r>
-              <w:rPr>
-                <w:sz w:val="22"/>
-                <w:szCs w:val="22"/>
-              </w:rPr>
-              <w:t>Результат проверки знаний</w:t>
-            </w:r>
-          </w:p>
-        </w:tc>
-        <w:tc>
-          <w:tcPr>
-            <w:tcW w:w="1406" w:type="dxa"/>
-            <w:tcBorders>
-              <w:top w:val="single" w:sz="4" w:space="0" w:color="000000"/>
-              <w:left w:val="single" w:sz="4" w:space="0" w:color="000000"/>
-              <w:bottom w:val="single" w:sz="4" w:space="0" w:color="000000"/>
-              <w:right w:val="single" w:sz="4" w:space="0" w:color="000000"/>
-            </w:tcBorders>
-            <w:shd w:val="clear" w:color="auto" w:fill="auto"/>
-            <w:tcMar>
-              <w:top w:w="80" w:type="dxa"/>
-              <w:left w:w="80" w:type="dxa"/>
-              <w:bottom w:w="80" w:type="dxa"/>
-              <w:right w:w="80" w:type="dxa"/>
-            </w:tcMar>
-            <w:vAlign w:val="center"/>
-          </w:tcPr>
-          <w:p>
-            <w:pPr>
-              <w:jc w:val="center"/>
-            </w:pPr>
-            <w:r>
-              <w:rPr>
-                <w:sz w:val="22"/>
-                <w:szCs w:val="22"/>
-              </w:rPr>
-              <w:t>Регистрационный номер записи о проверке знаний в реестре обученных лиц</w:t>
-            </w:r>
-          </w:p>
-        </w:tc>
-        <w:tc>
-          <w:tcPr>
-            <w:tcW w:w="951" w:type="dxa"/>
-            <w:tcBorders>
-              <w:top w:val="single" w:sz="4" w:space="0" w:color="000000"/>
-              <w:left w:val="single" w:sz="4" w:space="0" w:color="000000"/>
-              <w:bottom w:val="single" w:sz="4" w:space="0" w:color="000000"/>
-              <w:right w:val="single" w:sz="4" w:space="0" w:color="000000"/>
-            </w:tcBorders>
-            <w:shd w:val="clear" w:color="auto" w:fill="auto"/>
-            <w:tcMar>
-              <w:top w:w="80" w:type="dxa"/>
-              <w:left w:w="80" w:type="dxa"/>
-              <w:bottom w:w="80" w:type="dxa"/>
-              <w:right w:w="80" w:type="dxa"/>
-            </w:tcMar>
-            <w:vAlign w:val="center"/>
-          </w:tcPr>
-          <w:p>
-            <w:pPr>
-              <w:jc w:val="center"/>
-            </w:pPr>
-            <w:r>
-              <w:rPr>
-                <w:sz w:val="22"/>
-                <w:szCs w:val="22"/>
-              </w:rPr>
-              <w:t>Подпись проверяемого</w:t>
-            </w:r>
-          </w:p>
-        </w:tc>
-        <w:tc>
-          <w:tcPr>
-            <w:tcW w:w="1427" w:type="dxa"/>
-            <w:tcBorders>
-              <w:top w:val="single" w:sz="4" w:space="0" w:color="000000"/>
-              <w:left w:val="single" w:sz="4" w:space="0" w:color="000000"/>
-              <w:bottom w:val="single" w:sz="4" w:space="0" w:color="000000"/>
-              <w:right w:val="single" w:sz="4" w:space="0" w:color="000000"/>
-            </w:tcBorders>
-          </w:tcPr>
-          <w:p>
-            <w:pPr>
-              <w:jc w:val="center"/>
-              <w:rPr>
-                <w:sz w:val="22"/>
-                <w:szCs w:val="22"/>
-              </w:rPr>
-            </w:pPr>
-          </w:p>
-          <w:p>
-            <w:pPr>
-              <w:jc w:val="center"/>
-              <w:rPr>
-                <w:sz w:val="22"/>
-                <w:szCs w:val="22"/>
-              </w:rPr>
-            </w:pPr>
-          </w:p>
-          <w:p>
-            <w:pPr>
-              <w:jc w:val="center"/>
-              <w:rPr>
-                <w:sz w:val="22"/>
-                <w:szCs w:val="22"/>
-              </w:rPr>
-            </w:pPr>
-            <w:r>
-              <w:rPr>
-                <w:sz w:val="22"/>
-                <w:szCs w:val="22"/>
-              </w:rPr>
-              <w:t>Заключение экзаменационной</w:t>
-            </w:r>
-          </w:p>
-          <w:p>
-            <w:pPr>
-              <w:jc w:val="center"/>
-              <w:rPr>
-                <w:sz w:val="22"/>
-                <w:szCs w:val="22"/>
-              </w:rPr>
-            </w:pPr>
-            <w:r>
-              <w:rPr>
-                <w:sz w:val="22"/>
-                <w:szCs w:val="22"/>
-              </w:rPr>
-              <w:t>комиссии</w:t>
-            </w:r>
-          </w:p>
-          <w:p>
-            <w:pPr>
-              <w:rPr>
-                <w:sz w:val="22"/>
-                <w:szCs w:val="22"/>
-              </w:rPr>
-            </w:pPr>
-          </w:p>
-        </w:tc>
-      </w:tr>
-      <w:tr>
-        <w:trPr>
-          <w:trHeight w:val="230"/>
-        </w:trPr>
-        <w:tc>
-          <w:tcPr>
-            <w:tcW w:w="923" w:type="dxa"/>
-            <w:tcBorders>
-              <w:top w:val="single" w:sz="4" w:space="0" w:color="000000"/>
-              <w:left w:val="single" w:sz="4" w:space="0" w:color="000000"/>
-              <w:bottom w:val="single" w:sz="4" w:space="0" w:color="000000"/>
-              <w:right w:val="single" w:sz="4" w:space="0" w:color="000000"/>
-            </w:tcBorders>
-            <w:shd w:val="clear" w:color="auto" w:fill="auto"/>
-            <w:tcMar>
-              <w:top w:w="80" w:type="dxa"/>
-              <w:left w:w="80" w:type="dxa"/>
-              <w:bottom w:w="80" w:type="dxa"/>
-              <w:right w:w="80" w:type="dxa"/>
-            </w:tcMar>
-            <w:vAlign w:val="center"/>
-          </w:tcPr>
-          <w:p>
-            <w:pPr>
-              <w:jc w:val="center"/>
-            </w:pPr>
-            <w:r>
-              <w:rPr>
-                <w:sz w:val="22"/>
-                <w:szCs w:val="22"/>
-              </w:rPr>
-              <w:t>1</w:t>
-            </w:r>
-          </w:p>
-        </w:tc>
-        <w:tc>
-          <w:tcPr>
-            <w:tcW w:w="2918" w:type="dxa"/>
-            <w:tcBorders>
-              <w:top w:val="single" w:sz="4" w:space="0" w:color="000000"/>
-              <w:left w:val="single" w:sz="4" w:space="0" w:color="000000"/>
-              <w:bottom w:val="single" w:sz="4" w:space="0" w:color="000000"/>
-              <w:right w:val="single" w:sz="4" w:space="0" w:color="000000"/>
-            </w:tcBorders>
-            <w:shd w:val="clear" w:color="auto" w:fill="auto"/>
-            <w:tcMar>
-              <w:top w:w="80" w:type="dxa"/>
-              <w:left w:w="80" w:type="dxa"/>
-              <w:bottom w:w="80" w:type="dxa"/>
-              <w:right w:w="80" w:type="dxa"/>
-            </w:tcMar>
-            <w:vAlign w:val="center"/>
-          </w:tcPr>
-          <w:p>
-            <w:pPr>
-              <w:jc w:val="center"/>
-            </w:pPr>
-            <w:r>
-              <w:rPr>
-                <w:sz w:val="22"/>
-                <w:szCs w:val="22"/>
-              </w:rPr>
-              <w:t>2</w:t>
-            </w:r>
-          </w:p>
-        </w:tc>
-        <w:tc>
-          <w:tcPr>
-            <w:tcW w:w="2379" w:type="dxa"/>
-            <w:tcBorders>
-              <w:top w:val="single" w:sz="4" w:space="0" w:color="000000"/>
-              <w:left w:val="single" w:sz="4" w:space="0" w:color="000000"/>
-              <w:bottom w:val="single" w:sz="4" w:space="0" w:color="auto"/>
-              <w:right w:val="single" w:sz="4" w:space="0" w:color="000000"/>
-            </w:tcBorders>
-            <w:shd w:val="clear" w:color="auto" w:fill="auto"/>
-            <w:tcMar>
-              <w:top w:w="80" w:type="dxa"/>
-              <w:left w:w="80" w:type="dxa"/>
-              <w:bottom w:w="80" w:type="dxa"/>
-              <w:right w:w="80" w:type="dxa"/>
-            </w:tcMar>
-            <w:vAlign w:val="center"/>
-          </w:tcPr>
-          <w:p>
-            <w:pPr>
-              <w:jc w:val="center"/>
-            </w:pPr>
-            <w:r>
-              <w:rPr>
-                <w:sz w:val="22"/>
-                <w:szCs w:val="22"/>
-              </w:rPr>
-              <w:t>3</w:t>
-            </w:r>
-          </w:p>
-        </w:tc>
-        <w:tc>
-          <w:tcPr>
-            <w:tcW w:w="3136" w:type="dxa"/>
-            <w:tcBorders>
-              <w:top w:val="single" w:sz="4" w:space="0" w:color="000000"/>
-              <w:left w:val="single" w:sz="4" w:space="0" w:color="000000"/>
-              <w:bottom w:val="single" w:sz="4" w:space="0" w:color="auto"/>
-              <w:right w:val="single" w:sz="4" w:space="0" w:color="000000"/>
-            </w:tcBorders>
-            <w:shd w:val="clear" w:color="auto" w:fill="auto"/>
-            <w:tcMar>
-              <w:top w:w="80" w:type="dxa"/>
-              <w:left w:w="80" w:type="dxa"/>
-              <w:bottom w:w="80" w:type="dxa"/>
-              <w:right w:w="80" w:type="dxa"/>
-            </w:tcMar>
-            <w:vAlign w:val="center"/>
-          </w:tcPr>
-          <w:p>
-            <w:pPr>
-              <w:jc w:val="center"/>
-            </w:pPr>
-            <w:r>
-              <w:rPr>
-                <w:sz w:val="22"/>
-                <w:szCs w:val="22"/>
-              </w:rPr>
-              <w:t>4</w:t>
-            </w:r>
-          </w:p>
-        </w:tc>
-        <w:tc>
-          <w:tcPr>
-            <w:tcW w:w="842" w:type="dxa"/>
-            <w:tcBorders>
-              <w:top w:val="single" w:sz="4" w:space="0" w:color="000000"/>
-              <w:left w:val="single" w:sz="4" w:space="0" w:color="000000"/>
-              <w:bottom w:val="single" w:sz="4" w:space="0" w:color="000000"/>
-              <w:right w:val="single" w:sz="4" w:space="0" w:color="000000"/>
-            </w:tcBorders>
-          </w:tcPr>
-          <w:p>
-            <w:pPr>
-              <w:jc w:val="center"/>
-              <w:rPr>
-                <w:sz w:val="22"/>
-                <w:szCs w:val="22"/>
-              </w:rPr>
-            </w:pPr>
-            <w:r>
-              <w:rPr>
-                <w:sz w:val="22"/>
-                <w:szCs w:val="22"/>
-              </w:rPr>
-              <w:t>5</w:t>
-            </w:r>
-          </w:p>
-        </w:tc>
-        <w:tc>
-          <w:tcPr>
-            <w:tcW w:w="1621" w:type="dxa"/>
-            <w:tcBorders>
-              <w:top w:val="single" w:sz="4" w:space="0" w:color="000000"/>
-              <w:left w:val="single" w:sz="4" w:space="0" w:color="000000"/>
-              <w:bottom w:val="single" w:sz="4" w:space="0" w:color="000000"/>
-              <w:right w:val="single" w:sz="4" w:space="0" w:color="000000"/>
-            </w:tcBorders>
-            <w:shd w:val="clear" w:color="auto" w:fill="auto"/>
-            <w:tcMar>
-              <w:top w:w="80" w:type="dxa"/>
-              <w:left w:w="80" w:type="dxa"/>
-              <w:bottom w:w="80" w:type="dxa"/>
-              <w:right w:w="80" w:type="dxa"/>
-            </w:tcMar>
-            <w:vAlign w:val="center"/>
-          </w:tcPr>
-          <w:p>
-            <w:pPr>
-              <w:jc w:val="center"/>
-            </w:pPr>
-            <w:r>
-              <w:rPr>
-                <w:sz w:val="22"/>
-                <w:szCs w:val="22"/>
-              </w:rPr>
-              <w:t>6</w:t>
-            </w:r>
-          </w:p>
-        </w:tc>
-        <w:tc>
-          <w:tcPr>
-            <w:tcW w:w="1406" w:type="dxa"/>
-            <w:tcBorders>
-              <w:top w:val="single" w:sz="4" w:space="0" w:color="000000"/>
-              <w:left w:val="single" w:sz="4" w:space="0" w:color="000000"/>
-              <w:bottom w:val="single" w:sz="4" w:space="0" w:color="000000"/>
-              <w:right w:val="single" w:sz="4" w:space="0" w:color="000000"/>
-            </w:tcBorders>
-            <w:shd w:val="clear" w:color="auto" w:fill="auto"/>
-            <w:tcMar>
-              <w:top w:w="80" w:type="dxa"/>
-              <w:left w:w="80" w:type="dxa"/>
-              <w:bottom w:w="80" w:type="dxa"/>
-              <w:right w:w="80" w:type="dxa"/>
-            </w:tcMar>
-            <w:vAlign w:val="center"/>
-          </w:tcPr>
-          <w:p>
-            <w:pPr>
-              <w:jc w:val="center"/>
-            </w:pPr>
-            <w:r>
-              <w:rPr>
-                <w:sz w:val="22"/>
-                <w:szCs w:val="22"/>
-              </w:rPr>
-              <w:t>7</w:t>
-            </w:r>
-          </w:p>
-        </w:tc>
-        <w:tc>
-          <w:tcPr>
-            <w:tcW w:w="951" w:type="dxa"/>
-            <w:tcBorders>
-              <w:top w:val="single" w:sz="4" w:space="0" w:color="000000"/>
-              <w:left w:val="single" w:sz="4" w:space="0" w:color="000000"/>
-              <w:bottom w:val="single" w:sz="4" w:space="0" w:color="000000"/>
-              <w:right w:val="single" w:sz="4" w:space="0" w:color="000000"/>
-            </w:tcBorders>
-            <w:shd w:val="clear" w:color="auto" w:fill="auto"/>
-            <w:tcMar>
-              <w:top w:w="80" w:type="dxa"/>
-              <w:left w:w="80" w:type="dxa"/>
-              <w:bottom w:w="80" w:type="dxa"/>
-              <w:right w:w="80" w:type="dxa"/>
-            </w:tcMar>
-            <w:vAlign w:val="center"/>
-          </w:tcPr>
-          <w:p>
-            <w:pPr>
-              <w:jc w:val="center"/>
-              <w:rPr>
-                <w:lang w:val="en-US"/>
-              </w:rPr>
-            </w:pPr>
-            <w:r>
-              <w:rPr>
-                <w:sz w:val="22"/>
-                <w:szCs w:val="22"/>
-                <w:lang w:val="en-US"/>
-              </w:rPr>
-              <w:t>8</w:t>
-            </w:r>
-          </w:p>
-        </w:tc>
-        <w:tc>
-          <w:tcPr>
-            <w:tcW w:w="1427" w:type="dxa"/>
-            <w:tcBorders>
-              <w:top w:val="single" w:sz="4" w:space="0" w:color="000000"/>
-              <w:left w:val="single" w:sz="4" w:space="0" w:color="000000"/>
-              <w:bottom w:val="single" w:sz="4" w:space="0" w:color="000000"/>
-              <w:right w:val="single" w:sz="4" w:space="0" w:color="000000"/>
-            </w:tcBorders>
-          </w:tcPr>
-          <w:p>
-            <w:pPr>
-              <w:jc w:val="center"/>
-              <w:rPr>
-                <w:sz w:val="22"/>
-                <w:szCs w:val="22"/>
-              </w:rPr>
-            </w:pPr>
-            <w:r>
-              <w:rPr>
-                <w:sz w:val="22"/>
-                <w:szCs w:val="22"/>
-              </w:rPr>
-              <w:t>9</w:t>
-            </w:r>
-          </w:p>
-        </w:tc>
-      </w:tr>
-      <w:tr>
-        <w:trPr>
-          <w:trHeight w:val="1862"/>
-        </w:trPr>
-        <w:tc>
-          <w:tcPr>
-            <w:tcW w:w="923" w:type="dxa"/>
-            <w:tcBorders>
-              <w:top w:val="single" w:sz="4" w:space="0" w:color="000000"/>
-              <w:left w:val="single" w:sz="4" w:space="0" w:color="000000"/>
-              <w:bottom w:val="single" w:sz="4" w:space="0" w:color="000000"/>
-              <w:right w:val="single" w:sz="4" w:space="0" w:color="000000"/>
-            </w:tcBorders>
-            <w:shd w:val="clear" w:color="auto" w:fill="auto"/>
-            <w:tcMar>
-              <w:top w:w="80" w:type="dxa"/>
-              <w:left w:w="80" w:type="dxa"/>
-              <w:bottom w:w="80" w:type="dxa"/>
-              <w:right w:w="80" w:type="dxa"/>
-            </w:tcMar>
-            <w:vAlign w:val="center"/>
-          </w:tcPr>
-          <w:p>
-            <w:pPr>
-              <w:pStyle w:val="a5"/>
-              <w:numPr>
-                <w:ilvl w:val="0"/>
-                <w:numId w:val="1"/>
-              </w:numPr>
-            </w:pPr>
-            <w:r>
-              <w:rPr>
-                <w:sz w:val="22"/>
-                <w:szCs w:val="22"/>
-                <w:lang w:val="en-US"/>
-              </w:rPr>
-              <w:t>{#employee}</w:t>
-            </w:r>
-          </w:p>
-        </w:tc>
-        <w:tc>
-          <w:tcPr>
-            <w:tcW w:w="2918" w:type="dxa"/>
-            <w:tcBorders>
-              <w:top w:val="single" w:sz="4" w:space="0" w:color="000000"/>
-              <w:left w:val="single" w:sz="4" w:space="0" w:color="000000"/>
-              <w:bottom w:val="single" w:sz="4" w:space="0" w:color="000000"/>
-              <w:right w:val="single" w:sz="4" w:space="0" w:color="auto"/>
-            </w:tcBorders>
-            <w:shd w:val="clear" w:color="auto" w:fill="auto"/>
-            <w:tcMar>
-              <w:top w:w="80" w:type="dxa"/>
-              <w:left w:w="80" w:type="dxa"/>
-              <w:bottom w:w="80" w:type="dxa"/>
-              <w:right w:w="80" w:type="dxa"/>
-            </w:tcMar>
-            <w:vAlign w:val="center"/>
-          </w:tcPr>
-          <w:p>
-            <w:pPr>
-              <w:rPr>
-                <w:lang w:val="en-US"/>
-              </w:rPr>
-            </w:pPr>
-            <w:r>
-              <w:rPr>
-                <w:sz w:val="22"/>
-                <w:szCs w:val="22"/>
-                <w:lang w:val="en-US"/>
-              </w:rPr>
-              <w:t>{</w:t>
-            </w:r>
-            <w:proofErr w:type="spellStart"/>
-            <w:r>
-              <w:rPr>
-                <w:sz w:val="22"/>
-                <w:szCs w:val="22"/>
-                <w:lang w:val="en-US"/>
-              </w:rPr>
-              <w:t>last_</w:t>
-            </w:r>
-            <w:r>
-              <w:rPr>
-                <w:sz w:val="22"/>
-                <w:szCs w:val="22"/>
-                <w:lang w:val="en-US"/>
-              </w:rPr>
-              <w:t>name</w:t>
-            </w:r>
-            <w:proofErr w:type="spellEnd"/>
-            <w:r>
-              <w:rPr>
-                <w:sz w:val="22"/>
-                <w:szCs w:val="22"/>
-                <w:lang w:val="en-US"/>
-              </w:rPr>
-              <w:t>} {name} {</w:t>
-            </w:r>
-            <w:proofErr w:type="spellStart"/>
-            <w:r>
-              <w:rPr>
-                <w:sz w:val="22"/>
-                <w:szCs w:val="22"/>
-                <w:lang w:val="en-US"/>
-              </w:rPr>
-              <w:t>middle_name</w:t>
-            </w:r>
-            <w:proofErr w:type="spellEnd"/>
-            <w:r>
-              <w:rPr>
-                <w:sz w:val="22"/>
-                <w:szCs w:val="22"/>
-                <w:lang w:val="en-US"/>
-              </w:rPr>
-              <w:t>}</w:t>
-            </w:r>
-          </w:p>
-        </w:tc>
-        <w:tc>
-          <w:tcPr>
-            <w:tcW w:w="2379" w:type="dxa"/>
-            <w:tcBorders>
-              <w:top w:val="single" w:sz="4" w:space="0" w:color="auto"/>
-              <w:left w:val="single" w:sz="4" w:space="0" w:color="auto"/>
-              <w:bottom w:val="single" w:sz="4" w:space="0" w:color="auto"/>
-              <w:right w:val="single" w:sz="4" w:space="0" w:color="auto"/>
-            </w:tcBorders>
-            <w:shd w:val="clear" w:color="auto" w:fill="auto"/>
-            <w:tcMar>
-              <w:top w:w="80" w:type="dxa"/>
-              <w:left w:w="80" w:type="dxa"/>
-              <w:bottom w:w="80" w:type="dxa"/>
-              <w:right w:w="80" w:type="dxa"/>
-            </w:tcMar>
-            <w:vAlign w:val="center"/>
-          </w:tcPr>
-          <w:p>
-            <w:pPr>
-              <w:jc w:val="center"/>
-            </w:pPr>
-            <w:r>
-              <w:rPr>
-                <w:sz w:val="22"/>
-                <w:szCs w:val="22"/>
-                <w:lang w:val="en-US"/>
-              </w:rPr>
-              <w:t>{</w:t>
-            </w:r>
-            <w:proofErr w:type="spellStart"/>
-            <w:r>
-              <w:rPr>
-                <w:sz w:val="22"/>
-                <w:szCs w:val="22"/>
-                <w:lang w:val="en-US"/>
-              </w:rPr>
-              <w:t>organization_name</w:t>
-            </w:r>
-            <w:proofErr w:type="spellEnd"/>
-            <w:r>
-              <w:rPr>
-                <w:sz w:val="22"/>
-                <w:szCs w:val="22"/>
-                <w:lang w:val="en-US"/>
-              </w:rPr>
-              <w:t>}</w:t>
-            </w:r>
-          </w:p>
-        </w:tc>
-        <w:tc>
-          <w:tcPr>
-            <w:tcW w:w="3136" w:type="dxa"/>
-            <w:tcBorders>
-              <w:top w:val="single" w:sz="4" w:space="0" w:color="auto"/>
-              <w:left w:val="single" w:sz="4" w:space="0" w:color="auto"/>
-              <w:bottom w:val="single" w:sz="4" w:space="0" w:color="auto"/>
-              <w:right w:val="single" w:sz="4" w:space="0" w:color="auto"/>
-            </w:tcBorders>
-            <w:shd w:val="clear" w:color="auto" w:fill="auto"/>
-            <w:tcMar>
-              <w:top w:w="80" w:type="dxa"/>
-              <w:left w:w="80" w:type="dxa"/>
-              <w:bottom w:w="80" w:type="dxa"/>
-              <w:right w:w="80" w:type="dxa"/>
-            </w:tcMar>
-            <w:vAlign w:val="center"/>
-          </w:tcPr>
-          <w:p>
-            <w:pPr>
-              <w:jc w:val="center"/>
-            </w:pPr>
-            <w:r>
-              <w:rPr>
-                <w:sz w:val="22"/>
-                <w:szCs w:val="22"/>
-                <w:lang w:val="en-US"/>
-              </w:rPr>
-              <w:t>{grade}</w:t>
-            </w:r>
-          </w:p>
-        </w:tc>
-        <w:tc>
-          <w:tcPr>
-            <w:tcW w:w="842" w:type="dxa"/>
-            <w:tcBorders>
-              <w:top w:val="single" w:sz="4" w:space="0" w:color="000000"/>
-              <w:left w:val="single" w:sz="4" w:space="0" w:color="auto"/>
-              <w:bottom w:val="single" w:sz="4" w:space="0" w:color="000000"/>
-              <w:right w:val="single" w:sz="4" w:space="0" w:color="auto"/>
-            </w:tcBorders>
-          </w:tcPr>
-          <w:p>
-            <w:pPr>
-              <w:jc w:val="center"/>
-              <w:rPr>
-                <w:i/>
-                <w:iCs/>
-                <w:sz w:val="22"/>
-                <w:szCs w:val="22"/>
-                <w:lang w:val="en-US"/>
-              </w:rPr>
-            </w:pPr>
-          </w:p>
-          <w:p>
-            <w:pPr>
-              <w:jc w:val="center"/>
-              <w:rPr>
-                <w:i/>
-                <w:iCs/>
-                <w:sz w:val="22"/>
-                <w:szCs w:val="22"/>
-                <w:lang w:val="en-US"/>
-              </w:rPr>
-            </w:pPr>
-          </w:p>
-          <w:p>
-            <w:pPr>
-              <w:jc w:val="center"/>
-              <w:rPr>
-                <w:i/>
-                <w:iCs/>
-                <w:sz w:val="22"/>
-                <w:szCs w:val="22"/>
-                <w:lang w:val="en-US"/>
-              </w:rPr>
-            </w:pPr>
-          </w:p>
-          <w:p>
-            <w:pPr>
-              <w:jc w:val="center"/>
-              <w:rPr>
-                <w:i/>
-                <w:iCs/>
-                <w:sz w:val="22"/>
-                <w:szCs w:val="22"/>
-                <w:lang w:val="en-US"/>
-              </w:rPr>
-            </w:pPr>
-          </w:p>
-          <w:p>
-            <w:pPr>
-              <w:jc w:val="center"/>
-              <w:rPr>
-                <w:i/>
-                <w:iCs/>
-                <w:sz w:val="22"/>
-                <w:szCs w:val="22"/>
-                <w:lang w:val="en-US"/>
-              </w:rPr>
-            </w:pPr>
-          </w:p>
-          <w:p>
-            <w:pPr>
-              <w:jc w:val="center"/>
-              <w:rPr>
-                <w:i/>
-                <w:iCs/>
-                <w:sz w:val="22"/>
-                <w:szCs w:val="22"/>
-                <w:lang w:val="en-US"/>
-              </w:rPr>
-            </w:pPr>
-            <w:r>
-              <w:rPr>
-                <w:i/>
-                <w:iCs/>
-                <w:sz w:val="22"/>
-                <w:szCs w:val="22"/>
-                <w:lang w:val="en-US"/>
-              </w:rPr>
-              <w:t>{</w:t>
-            </w:r>
-            <w:proofErr w:type="spellStart"/>
-            <w:r>
-              <w:rPr>
-                <w:i/>
-                <w:iCs/>
-                <w:sz w:val="22"/>
-                <w:szCs w:val="22"/>
-                <w:lang w:val="en-US"/>
-              </w:rPr>
-              <w:t>random_number</w:t>
-            </w:r>
-            <w:proofErr w:type="spellEnd"/>
-            <w:r>
-              <w:rPr>
-                <w:i/>
-                <w:iCs/>
-                <w:sz w:val="22"/>
-                <w:szCs w:val="22"/>
-                <w:lang w:val="en-US"/>
-              </w:rPr>
-              <w:t>}</w:t>
-            </w:r>
-          </w:p>
-        </w:tc>
-        <w:tc>
-          <w:tcPr>
-            <w:tcW w:w="1621" w:type="dxa"/>
-            <w:tcBorders>
-              <w:top w:val="single" w:sz="4" w:space="0" w:color="000000"/>
-              <w:left w:val="single" w:sz="4" w:space="0" w:color="auto"/>
-              <w:bottom w:val="single" w:sz="4" w:space="0" w:color="000000"/>
-              <w:right w:val="single" w:sz="4" w:space="0" w:color="000000"/>
-            </w:tcBorders>
-            <w:shd w:val="clear" w:color="auto" w:fill="auto"/>
-            <w:tcMar>
-              <w:top w:w="80" w:type="dxa"/>
-              <w:left w:w="80" w:type="dxa"/>
-              <w:bottom w:w="80" w:type="dxa"/>
-              <w:right w:w="80" w:type="dxa"/>
-            </w:tcMar>
-            <w:vAlign w:val="center"/>
-          </w:tcPr>
-          <w:p>
-            <w:pPr>
-              <w:jc w:val="center"/>
-              <w:rPr>
-                <w:lang w:val="en-US"/>
-              </w:rPr>
-            </w:pPr>
-            <w:r>
-              <w:rPr>
-                <w:i/>
-                <w:iCs/>
-                <w:sz w:val="22"/>
-                <w:szCs w:val="22"/>
-                <w:lang w:val="en-US"/>
-              </w:rPr>
-              <w:t>{</w:t>
-            </w:r>
-            <w:r>
-              <w:rPr>
-                <w:i/>
-                <w:iCs/>
-                <w:sz w:val="22"/>
-                <w:szCs w:val="22"/>
-              </w:rPr>
-              <w:t>c</w:t>
-            </w:r>
-            <w:proofErr w:type="spellStart"/>
-            <w:r>
-              <w:rPr>
-                <w:i/>
-                <w:iCs/>
-                <w:sz w:val="22"/>
-                <w:szCs w:val="22"/>
-                <w:lang w:val="en-US"/>
-              </w:rPr>
-              <w:t>ourses_mark</w:t>
-            </w:r>
-            <w:proofErr w:type="spellEnd"/>
-            <w:r>
-              <w:rPr>
-                <w:i/>
-                <w:iCs/>
-                <w:sz w:val="22"/>
-                <w:szCs w:val="22"/>
-              </w:rPr>
-              <w:t>}</w:t>
-            </w:r>
-          </w:p>
-        </w:tc>
-        <w:tc>
-          <w:tcPr>
-            <w:tcW w:w="1406" w:type="dxa"/>
-            <w:tcBorders>
-              <w:top w:val="single" w:sz="4" w:space="0" w:color="000000"/>
-              <w:left w:val="single" w:sz="4" w:space="0" w:color="000000"/>
-              <w:bottom w:val="single" w:sz="4" w:space="0" w:color="000000"/>
-              <w:right w:val="single" w:sz="4" w:space="0" w:color="000000"/>
-            </w:tcBorders>
-            <w:shd w:val="clear" w:color="auto" w:fill="auto"/>
-            <w:tcMar>
-              <w:top w:w="80" w:type="dxa"/>
-              <w:left w:w="80" w:type="dxa"/>
-              <w:bottom w:w="80" w:type="dxa"/>
-              <w:right w:w="80" w:type="dxa"/>
-            </w:tcMar>
-            <w:vAlign w:val="center"/>
-          </w:tcPr>
-          <w:p/>
-        </w:tc>
-        <w:tc>
-          <w:tcPr>
-            <w:tcW w:w="951" w:type="dxa"/>
-            <w:tcBorders>
-              <w:top w:val="single" w:sz="4" w:space="0" w:color="000000"/>
-              <w:left w:val="single" w:sz="4" w:space="0" w:color="000000"/>
-              <w:bottom w:val="single" w:sz="4" w:space="0" w:color="000000"/>
-              <w:right w:val="single" w:sz="4" w:space="0" w:color="000000"/>
-            </w:tcBorders>
-            <w:shd w:val="clear" w:color="auto" w:fill="auto"/>
-            <w:tcMar>
-              <w:top w:w="80" w:type="dxa"/>
-              <w:left w:w="80" w:type="dxa"/>
-              <w:bottom w:w="80" w:type="dxa"/>
-              <w:right w:w="80" w:type="dxa"/>
-            </w:tcMar>
-            <w:vAlign w:val="center"/>
-          </w:tcPr>
-          <w:p/>
-        </w:tc>
-        <w:tc>
-          <w:tcPr>
-            <w:tcW w:w="1427" w:type="dxa"/>
-            <w:vMerge/>
-            <w:tcBorders>
-              <w:top w:val="single" w:sz="4" w:space="0" w:color="000000"/>
-              <w:left w:val="single" w:sz="4" w:space="0" w:color="000000"/>
-              <w:bottom w:val="single" w:sz="4" w:space="0" w:color="000000"/>
-              <w:right w:val="single" w:sz="4" w:space="0" w:color="000000"/>
-            </w:tcBorders>
-          </w:tcPr>
-          <w:p>
-            <w:pPr>
-              <w:rPr>
-                <w:sz w:val="22"/>
-                <w:szCs w:val="22"/>
-              </w:rPr>
-            </w:pPr>
-          </w:p>
-          <w:p>
-            <w:pPr>
-              <w:rPr>
-                <w:sz w:val="22"/>
-                <w:szCs w:val="22"/>
-              </w:rPr>
-            </w:pPr>
-          </w:p>
-          <w:p>
-            <w:pPr>
-              <w:rPr>
-                <w:sz w:val="22"/>
-                <w:szCs w:val="22"/>
-              </w:rPr>
-            </w:pPr>
-          </w:p>
-          <w:p>
-            <w:pPr>
-              <w:rPr>
-                <w:sz w:val="22"/>
-                <w:szCs w:val="22"/>
-              </w:rPr>
-            </w:pPr>
-          </w:p>
-          <w:p>
-            <w:pPr>
-              <w:rPr>
-                <w:sz w:val="22"/>
-                <w:szCs w:val="22"/>
-                <w:lang w:val="en-US"/>
-              </w:rPr>
-            </w:pPr>
-            <w:r>
-              <w:rPr>
-                <w:sz w:val="22"/>
-                <w:szCs w:val="22"/>
-                <w:lang w:val="en-US"/>
-              </w:rPr>
-              <w:t xml:space="preserve"> </w:t>
-            </w:r>
-            <w:r>
-              <w:rPr>
-                <w:sz w:val="22"/>
-                <w:szCs w:val="22"/>
-              </w:rPr>
-              <w:t>{</w:t>
-            </w:r>
-            <w:proofErr w:type="spellStart"/>
-            <w:r>
-              <w:rPr>
-                <w:sz w:val="22"/>
-                <w:szCs w:val="22"/>
-              </w:rPr>
-              <w:t>conclusion</w:t>
-            </w:r>
-            <w:proofErr w:type="spellEnd"/>
-            <w:r>
-              <w:rPr>
-                <w:sz w:val="22"/>
-                <w:szCs w:val="22"/>
-                <w:lang w:val="en-US"/>
-              </w:rPr>
-              <w:t>}</w:t>
-            </w:r>
-            <w:r>
-              <w:rPr>
-                <w:i/>
-                <w:iCs/>
-                <w:sz w:val="22"/>
-                <w:szCs w:val="22"/>
-                <w:lang w:val="en-US"/>
-              </w:rPr>
-              <w:t>{/employee}</w:t>
-            </w:r>
-          </w:p>
-        </w:tc>
-      </w:tr>
-    </w:tbl>
-    <w:p>
-      <w:pPr>
-        <w:widowControl w:val="0"/>
-        <w:ind w:left="324" w:hanging="324"/>
-        <w:rPr>
-          <w:sz w:val="22"/>
-          <w:szCs w:val="22"/>
-        </w:rPr>
-      </w:pPr>
-    </w:p>
-    <w:p>
-      <w:pPr>
-        <w:widowControl w:val="0"/>
-        <w:ind w:left="216" w:hanging="216"/>
-        <w:rPr>
-          <w:sz w:val="22"/>
-          <w:szCs w:val="22"/>
-        </w:rPr>
-      </w:pPr>
-    </w:p>
-    <w:p>
-      <w:pPr>
-        <w:widowControl w:val="0"/>
-        <w:ind w:left="108" w:hanging="108"/>
-        <w:rPr>
-          <w:sz w:val="22"/>
-          <w:szCs w:val="22"/>
-        </w:rPr>
-      </w:pPr>
-    </w:p>
-    <w:p>
-      <w:pPr>
-        <w:widowControl w:val="0"/>
-        <w:jc w:val="both"/>
-        <w:rPr>
-          <w:sz w:val="22"/>
-          <w:szCs w:val="22"/>
-        </w:rPr>
-      </w:pPr>
-    </w:p>
-    <w:p>
-      <w:pPr>
-        <w:tabs>
-          <w:tab w:val="left" w:pos="2220"/>
-        </w:tabs>
-        <w:rPr>
-          <w:sz w:val="18"/>
-          <w:szCs w:val="18"/>
-        </w:rPr>
-      </w:pPr>
-      <w:r>
-        <w:rPr>
-          <w:sz w:val="28"/>
-          <w:szCs w:val="28"/>
-        </w:rPr>
-        <w:tab/>
-      </w:r>
-    </w:p>
-    <w:p>
-      <w:pPr>
-        <w:ind w:left="3828"/>
-      </w:pPr>
-      <w:r>
-        <w:t>Председатель комиссии:</w:t>
-      </w:r>
-      <w:r>
-        <w:tab/>
-      </w:r>
-      <w:r>
-        <w:tab/>
-      </w:r>
-      <w:r>
-        <w:tab/>
-      </w:r>
-      <w:r>
-        <w:tab/>
-        <w:t xml:space="preserve">/ В.М. </w:t>
-      </w:r>
-      <w:proofErr w:type="spellStart"/>
-      <w:r>
-        <w:t>Шекшуев</w:t>
-      </w:r>
-      <w:proofErr w:type="spellEnd"/>
-      <w:r>
-        <w:t xml:space="preserve"> /</w:t>
-      </w:r>
-    </w:p>
-    <w:p>
-      <w:pPr>
-        <w:ind w:left="3828"/>
-        <w:rPr>
-          <w:sz w:val="12"/>
-          <w:szCs w:val="12"/>
-        </w:rPr>
-      </w:pPr>
-    </w:p>
-    <w:p>
-      <w:pPr>
-        <w:ind w:left="3828"/>
-      </w:pPr>
-      <w:r>
-        <w:t>Члены комиссии:</w:t>
-      </w:r>
-      <w:r>
-        <w:tab/>
-      </w:r>
-      <w:r>
-        <w:tab/>
-      </w:r>
-      <w:r>
-        <w:tab/>
-      </w:r>
-      <w:r>
-        <w:tab/>
-      </w:r>
-      <w:r>
-        <w:tab/>
-        <w:t>/ Е.С. Воробьева /</w:t>
-      </w:r>
-    </w:p>
-    <w:p>
-      <w:pPr>
-        <w:ind w:left="3828"/>
-        <w:rPr>
-          <w:sz w:val="12"/>
-          <w:szCs w:val="12"/>
-        </w:rPr>
-      </w:pPr>
-    </w:p>
-    <w:p>
-      <w:pPr>
-        <w:ind w:left="3828"/>
-      </w:pPr>
-      <w:r>
-        <w:tab/>
-      </w:r>
-      <w:r>
-        <w:tab/>
-      </w:r>
-      <w:r>
-        <w:tab/>
-      </w:r>
-      <w:r>
-        <w:tab/>
-      </w:r>
-      <w:r>
-        <w:tab/>
-      </w:r>
-      <w:r>
-        <w:tab/>
-      </w:r>
-      <w:r>
-        <w:tab/>
-        <w:t xml:space="preserve">/ И.Ю. </w:t>
-      </w:r>
-      <w:proofErr w:type="spellStart"/>
-      <w:r>
-        <w:t>Шекшуева</w:t>
-      </w:r>
-      <w:proofErr w:type="spellEnd"/>
-      <w:r>
-        <w:t xml:space="preserve"> /</w:t>
-      </w:r>
-    </w:p>
-    <w:sectPr>
-      <w:headerReference w:type="default" r:id="rId7"/>
-      <w:footerReference w:type="default" r:id="rId8"/>
-      <w:pgSz w:w="16840" w:h="11900" w:orient="landscape"/>
-      <w:pgMar w:top="142" w:right="536" w:bottom="0" w:left="1134" w:header="709" w:footer="709" w:gutter="0"/>
-      <w:cols w:space="720"/>
-    </w:sectPr>
-  </w:body>
-</w:document>
 </file>
</xml_diff>

<commit_message>
Revert "Remove stray entries from commission DOCX template"
This reverts commit 17565adfbffd763c5670d271ecd7a0ffb32cc5d0.
</commit_message>
<xml_diff>
--- a/backend/Protocol-comission-template.docx
+++ b/backend/Protocol-comission-template.docx
@@ -3549,4 +3549,1794 @@
   </a:objectDefaults>
   <a:extraClrSchemeLst/>
 </a:theme>
+</file>
+
+<file path=document.orig.xml><?xml version="1.0" encoding="utf-8"?>
+<w:document xmlns:wpc="http://schemas.microsoft.com/office/word/2010/wordprocessingCanvas" xmlns:cx="http://schemas.microsoft.com/office/drawing/2014/chartex" xmlns:cx1="http://schemas.microsoft.com/office/drawing/2015/9/8/chartex" xmlns:cx2="http://schemas.microsoft.com/office/drawing/2015/10/21/chartex" xmlns:cx3="http://schemas.microsoft.com/office/drawing/2016/5/9/chartex" xmlns:cx4="http://schemas.microsoft.com/office/drawing/2016/5/10/chartex" xmlns:cx5="http://schemas.microsoft.com/office/drawing/2016/5/11/chartex" xmlns:cx6="http://schemas.microsoft.com/office/drawing/2016/5/12/chartex" xmlns:cx7="http://schemas.microsoft.com/office/drawing/2016/5/13/chartex" xmlns:cx8="http://schemas.microsoft.com/office/drawing/2016/5/14/chartex" xmlns:mc="http://schemas.openxmlformats.org/markup-compatibility/2006" xmlns:aink="http://schemas.microsoft.com/office/drawing/2016/ink" xmlns:am3d="http://schemas.microsoft.com/office/drawing/2017/model3d" xmlns:o="urn:schemas-microsoft-com:office:office" xmlns:oel="http://schemas.microsoft.com/office/2019/extlst" xmlns:r="http://schemas.openxmlformats.org/officeDocument/2006/relationships" xmlns:m="http://schemas.openxmlformats.org/officeDocument/2006/math" xmlns:v="urn:schemas-microsoft-com:vml" xmlns:wp14="http://schemas.microsoft.com/office/word/2010/wordprocessingDrawing" xmlns:wp="http://schemas.openxmlformats.org/drawingml/2006/wordprocessingDrawing" xmlns:w10="urn:schemas-microsoft-com:office:word" xmlns:w="http://schemas.openxmlformats.org/wordprocessingml/2006/main" xmlns:w14="http://schemas.microsoft.com/office/word/2010/wordml" xmlns:w15="http://schemas.microsoft.com/office/word/2012/wordml" xmlns:w16cex="http://schemas.microsoft.com/office/word/2018/wordml/cex" xmlns:w16cid="http://schemas.microsoft.com/office/word/2016/wordml/cid" xmlns:w16="http://schemas.microsoft.com/office/word/2018/wordml" xmlns:w16sdtdh="http://schemas.microsoft.com/office/word/2020/wordml/sdtdatahash" xmlns:w16se="http://schemas.microsoft.com/office/word/2015/wordml/symex" xmlns:wpg="http://schemas.microsoft.com/office/word/2010/wordprocessingGroup" xmlns:wpi="http://schemas.microsoft.com/office/word/2010/wordprocessingInk" xmlns:wne="http://schemas.microsoft.com/office/word/2006/wordml" xmlns:wps="http://schemas.microsoft.com/office/word/2010/wordprocessingShape" mc:Ignorable="w14 w15 w16se w16cid w16 w16cex w16sdtdh wp14">
+  <w:body>
+    <w:p>
+      <w:pPr>
+        <w:jc w:val="center"/>
+        <w:rPr>
+          <w:b/>
+          <w:bCs/>
+          <w:sz w:val="28"/>
+          <w:szCs w:val="28"/>
+          <w:lang w:val="en-US"/>
+        </w:rPr>
+      </w:pPr>
+      <w:r>
+        <w:rPr>
+          <w:b/>
+          <w:bCs/>
+          <w:sz w:val="28"/>
+          <w:szCs w:val="28"/>
+          <w:lang w:val="en-US"/>
+        </w:rPr>
+        <w:t>{</w:t>
+      </w:r>
+      <w:proofErr w:type="spellStart"/>
+      <w:r>
+        <w:rPr>
+          <w:b/>
+          <w:bCs/>
+          <w:sz w:val="28"/>
+          <w:szCs w:val="28"/>
+          <w:lang w:val="en-US"/>
+        </w:rPr>
+        <w:t>moisei_name</w:t>
+      </w:r>
+      <w:proofErr w:type="spellEnd"/>
+      <w:r>
+        <w:rPr>
+          <w:b/>
+          <w:bCs/>
+          <w:sz w:val="28"/>
+          <w:szCs w:val="28"/>
+          <w:lang w:val="en-US"/>
+        </w:rPr>
+        <w:t>}</w:t>
+      </w:r>
+    </w:p>
+    <w:p>
+      <w:pPr>
+        <w:jc w:val="center"/>
+        <w:rPr>
+          <w:b/>
+          <w:bCs/>
+          <w:sz w:val="22"/>
+          <w:szCs w:val="22"/>
+        </w:rPr>
+      </w:pPr>
+    </w:p>
+    <w:p>
+      <w:pPr>
+        <w:jc w:val="center"/>
+        <w:rPr>
+          <w:b/>
+          <w:bCs/>
+          <w:sz w:val="28"/>
+          <w:szCs w:val="28"/>
+        </w:rPr>
+      </w:pPr>
+      <w:r>
+        <w:rPr>
+          <w:b/>
+          <w:bCs/>
+          <w:sz w:val="28"/>
+          <w:szCs w:val="28"/>
+        </w:rPr>
+        <w:t xml:space="preserve">П Р О Т О К О Л    </w:t>
+      </w:r>
+      <w:proofErr w:type="gramStart"/>
+      <w:r>
+        <w:rPr>
+          <w:b/>
+          <w:bCs/>
+          <w:sz w:val="28"/>
+          <w:szCs w:val="28"/>
+        </w:rPr>
+        <w:t xml:space="preserve">№  </w:t>
+      </w:r>
+      <w:r>
+        <w:rPr>
+          <w:b/>
+          <w:bCs/>
+          <w:sz w:val="28"/>
+          <w:szCs w:val="28"/>
+        </w:rPr>
+        <w:t>{</w:t>
+      </w:r>
+      <w:proofErr w:type="gramEnd"/>
+      <w:r>
+        <w:rPr>
+          <w:b/>
+          <w:bCs/>
+          <w:sz w:val="28"/>
+          <w:szCs w:val="28"/>
+          <w:lang w:val="en-US"/>
+        </w:rPr>
+        <w:t>group</w:t>
+      </w:r>
+      <w:r>
+        <w:rPr>
+          <w:b/>
+          <w:bCs/>
+          <w:sz w:val="28"/>
+          <w:szCs w:val="28"/>
+        </w:rPr>
+        <w:t>_</w:t>
+      </w:r>
+      <w:r>
+        <w:rPr>
+          <w:b/>
+          <w:bCs/>
+          <w:sz w:val="28"/>
+          <w:szCs w:val="28"/>
+          <w:lang w:val="en-US"/>
+        </w:rPr>
+        <w:t>id</w:t>
+      </w:r>
+      <w:r>
+        <w:rPr>
+          <w:b/>
+          <w:bCs/>
+          <w:sz w:val="28"/>
+          <w:szCs w:val="28"/>
+        </w:rPr>
+        <w:t>}</w:t>
+      </w:r>
+      <w:r>
+        <w:rPr>
+          <w:b/>
+          <w:bCs/>
+          <w:sz w:val="28"/>
+          <w:szCs w:val="28"/>
+        </w:rPr>
+        <w:t xml:space="preserve">  от  </w:t>
+      </w:r>
+      <w:r>
+        <w:rPr>
+          <w:b/>
+          <w:bCs/>
+          <w:sz w:val="28"/>
+          <w:szCs w:val="28"/>
+        </w:rPr>
+        <w:t>{</w:t>
+      </w:r>
+      <w:r>
+        <w:rPr>
+          <w:b/>
+          <w:bCs/>
+          <w:sz w:val="28"/>
+          <w:szCs w:val="28"/>
+          <w:lang w:val="en-US"/>
+        </w:rPr>
+        <w:t>end</w:t>
+      </w:r>
+      <w:r>
+        <w:rPr>
+          <w:b/>
+          <w:bCs/>
+          <w:sz w:val="28"/>
+          <w:szCs w:val="28"/>
+        </w:rPr>
+        <w:t>_</w:t>
+      </w:r>
+      <w:r>
+        <w:rPr>
+          <w:b/>
+          <w:bCs/>
+          <w:sz w:val="28"/>
+          <w:szCs w:val="28"/>
+          <w:lang w:val="en-US"/>
+        </w:rPr>
+        <w:t>date</w:t>
+      </w:r>
+      <w:r>
+        <w:rPr>
+          <w:b/>
+          <w:bCs/>
+          <w:sz w:val="28"/>
+          <w:szCs w:val="28"/>
+        </w:rPr>
+        <w:t>}</w:t>
+      </w:r>
+    </w:p>
+    <w:p>
+      <w:pPr>
+        <w:jc w:val="center"/>
+        <w:rPr>
+          <w:b/>
+          <w:bCs/>
+          <w:sz w:val="28"/>
+          <w:szCs w:val="28"/>
+        </w:rPr>
+      </w:pPr>
+      <w:r>
+        <w:rPr>
+          <w:b/>
+          <w:bCs/>
+          <w:sz w:val="28"/>
+          <w:szCs w:val="28"/>
+        </w:rPr>
+        <w:t>заседания комиссии по проверке знаний</w:t>
+      </w:r>
+    </w:p>
+    <w:p>
+      <w:pPr>
+        <w:rPr>
+          <w:sz w:val="18"/>
+          <w:szCs w:val="18"/>
+        </w:rPr>
+      </w:pPr>
+    </w:p>
+    <w:p>
+      <w:r>
+        <w:t>В соответствии с приказом директора от «01» сентября 2022 г. № 10 комиссия в составе:</w:t>
+      </w:r>
+    </w:p>
+    <w:p>
+      <w:pPr>
+        <w:rPr>
+          <w:sz w:val="22"/>
+          <w:szCs w:val="22"/>
+        </w:rPr>
+      </w:pPr>
+    </w:p>
+    <w:p>
+      <w:r>
+        <w:rPr>
+          <w:b/>
+          <w:bCs/>
+        </w:rPr>
+        <w:t>Председатель комиссии:</w:t>
+      </w:r>
+      <w:r>
+        <w:tab/>
+      </w:r>
+      <w:proofErr w:type="spellStart"/>
+      <w:r>
+        <w:t>Шекшуев</w:t>
+      </w:r>
+      <w:proofErr w:type="spellEnd"/>
+      <w:r>
+        <w:t xml:space="preserve"> В.М.. - директор</w:t>
+      </w:r>
+    </w:p>
+    <w:p>
+      <w:r>
+        <w:rPr>
+          <w:b/>
+          <w:bCs/>
+        </w:rPr>
+        <w:t>Члены комиссии:</w:t>
+      </w:r>
+      <w:r>
+        <w:rPr>
+          <w:b/>
+          <w:bCs/>
+        </w:rPr>
+        <w:tab/>
+      </w:r>
+      <w:r>
+        <w:tab/>
+        <w:t>Воробьева Е.С. – заместитель директора</w:t>
+      </w:r>
+    </w:p>
+    <w:p>
+      <w:r>
+        <w:tab/>
+      </w:r>
+      <w:r>
+        <w:tab/>
+      </w:r>
+      <w:r>
+        <w:tab/>
+      </w:r>
+      <w:r>
+        <w:tab/>
+      </w:r>
+      <w:proofErr w:type="spellStart"/>
+      <w:r>
+        <w:t>Шекшуева</w:t>
+      </w:r>
+      <w:proofErr w:type="spellEnd"/>
+      <w:r>
+        <w:t xml:space="preserve"> И.Ю. – специалист учебного центра</w:t>
+      </w:r>
+    </w:p>
+    <w:p>
+      <w:pPr>
+        <w:pStyle w:val="a4"/>
+        <w:tabs>
+          <w:tab w:val="left" w:pos="2694"/>
+        </w:tabs>
+        <w:rPr>
+          <w:sz w:val="22"/>
+          <w:szCs w:val="22"/>
+        </w:rPr>
+      </w:pPr>
+    </w:p>
+    <w:p>
+      <w:pPr>
+        <w:jc w:val="both"/>
+      </w:pPr>
+      <w:r>
+        <w:t>Проведена проверка знаний по программе: - «</w:t>
+      </w:r>
+      <w:r>
+        <w:t>{</w:t>
+      </w:r>
+      <w:r>
+        <w:rPr>
+          <w:lang w:val="en-US"/>
+        </w:rPr>
+        <w:t>course</w:t>
+      </w:r>
+      <w:r>
+        <w:t>_</w:t>
+      </w:r>
+      <w:r>
+        <w:rPr>
+          <w:lang w:val="en-US"/>
+        </w:rPr>
+        <w:t>name</w:t>
+      </w:r>
+      <w:r>
+        <w:t>}</w:t>
+      </w:r>
+      <w:r>
+        <w:t xml:space="preserve">» в объеме </w:t>
+      </w:r>
+      <w:r>
+        <w:t>{</w:t>
+      </w:r>
+      <w:r>
+        <w:rPr>
+          <w:lang w:val="en-US"/>
+        </w:rPr>
+        <w:t>hours</w:t>
+      </w:r>
+      <w:r>
+        <w:t>}</w:t>
+      </w:r>
+      <w:r>
+        <w:t xml:space="preserve"> часов;</w:t>
+      </w:r>
+    </w:p>
+    <w:p>
+      <w:pPr>
+        <w:jc w:val="both"/>
+        <w:rPr>
+          <w:sz w:val="22"/>
+          <w:szCs w:val="22"/>
+        </w:rPr>
+      </w:pPr>
+      <w:r>
+        <w:rPr>
+          <w:sz w:val="22"/>
+          <w:szCs w:val="22"/>
+        </w:rPr>
+        <w:t>- - «</w:t>
+      </w:r>
+      <w:r>
+        <w:rPr>
+          <w:sz w:val="22"/>
+          <w:szCs w:val="22"/>
+        </w:rPr>
+        <w:t>{</w:t>
+      </w:r>
+      <w:r>
+        <w:rPr>
+          <w:sz w:val="22"/>
+          <w:szCs w:val="22"/>
+          <w:lang w:val="en-US"/>
+        </w:rPr>
+        <w:t>course</w:t>
+      </w:r>
+      <w:r>
+        <w:rPr>
+          <w:sz w:val="22"/>
+          <w:szCs w:val="22"/>
+        </w:rPr>
+        <w:t>_</w:t>
+      </w:r>
+      <w:r>
+        <w:rPr>
+          <w:sz w:val="22"/>
+          <w:szCs w:val="22"/>
+          <w:lang w:val="en-US"/>
+        </w:rPr>
+        <w:t>name</w:t>
+      </w:r>
+      <w:r>
+        <w:rPr>
+          <w:sz w:val="22"/>
+          <w:szCs w:val="22"/>
+        </w:rPr>
+        <w:t>}</w:t>
+      </w:r>
+      <w:r>
+        <w:rPr>
+          <w:sz w:val="22"/>
+          <w:szCs w:val="22"/>
+        </w:rPr>
+        <w:t xml:space="preserve">» в объеме </w:t>
+      </w:r>
+      <w:r>
+        <w:rPr>
+          <w:sz w:val="22"/>
+          <w:szCs w:val="22"/>
+        </w:rPr>
+        <w:t>{</w:t>
+      </w:r>
+      <w:r>
+        <w:rPr>
+          <w:sz w:val="22"/>
+          <w:szCs w:val="22"/>
+          <w:lang w:val="en-US"/>
+        </w:rPr>
+        <w:t>hours</w:t>
+      </w:r>
+      <w:r>
+        <w:rPr>
+          <w:sz w:val="22"/>
+          <w:szCs w:val="22"/>
+        </w:rPr>
+        <w:t>}</w:t>
+      </w:r>
+      <w:r>
+        <w:rPr>
+          <w:sz w:val="22"/>
+          <w:szCs w:val="22"/>
+        </w:rPr>
+        <w:t xml:space="preserve"> часов:</w:t>
+      </w:r>
+    </w:p>
+    <w:tbl>
+      <w:tblPr>
+        <w:tblStyle w:val="TableNormal"/>
+        <w:tblW w:w="15603" w:type="dxa"/>
+        <w:tblInd w:w="-289" w:type="dxa"/>
+        <w:tblBorders>
+          <w:top w:val="single" w:sz="8" w:space="0" w:color="FFFFFF"/>
+          <w:left w:val="single" w:sz="8" w:space="0" w:color="FFFFFF"/>
+          <w:bottom w:val="single" w:sz="8" w:space="0" w:color="FFFFFF"/>
+          <w:right w:val="single" w:sz="8" w:space="0" w:color="FFFFFF"/>
+          <w:insideH w:val="single" w:sz="8" w:space="0" w:color="FFFFFF"/>
+          <w:insideV w:val="single" w:sz="8" w:space="0" w:color="FFFFFF"/>
+        </w:tblBorders>
+        <w:shd w:val="clear" w:color="auto" w:fill="CED7E7"/>
+        <w:tblLayout w:type="fixed"/>
+        <w:tblLook w:val="04A0" w:firstRow="1" w:lastRow="0" w:firstColumn="1" w:lastColumn="0" w:noHBand="0" w:noVBand="1"/>
+      </w:tblPr>
+      <w:tblGrid>
+        <w:gridCol w:w="923"/>
+        <w:gridCol w:w="2918"/>
+        <w:gridCol w:w="2379"/>
+        <w:gridCol w:w="3136"/>
+        <w:gridCol w:w="842"/>
+        <w:gridCol w:w="1621"/>
+        <w:gridCol w:w="1406"/>
+        <w:gridCol w:w="951"/>
+        <w:gridCol w:w="1427"/>
+      </w:tblGrid>
+      <w:tr>
+        <w:trPr>
+          <w:trHeight w:val="1046"/>
+        </w:trPr>
+        <w:tc>
+          <w:tcPr>
+            <w:tcW w:w="923" w:type="dxa"/>
+            <w:tcBorders>
+              <w:top w:val="single" w:sz="4" w:space="0" w:color="000000"/>
+              <w:left w:val="single" w:sz="4" w:space="0" w:color="000000"/>
+              <w:bottom w:val="single" w:sz="4" w:space="0" w:color="000000"/>
+              <w:right w:val="single" w:sz="4" w:space="0" w:color="000000"/>
+            </w:tcBorders>
+            <w:shd w:val="clear" w:color="auto" w:fill="auto"/>
+            <w:tcMar>
+              <w:top w:w="80" w:type="dxa"/>
+              <w:left w:w="80" w:type="dxa"/>
+              <w:bottom w:w="80" w:type="dxa"/>
+              <w:right w:w="80" w:type="dxa"/>
+            </w:tcMar>
+            <w:vAlign w:val="center"/>
+          </w:tcPr>
+          <w:p>
+            <w:pPr>
+              <w:jc w:val="center"/>
+            </w:pPr>
+            <w:r>
+              <w:rPr>
+                <w:sz w:val="22"/>
+                <w:szCs w:val="22"/>
+              </w:rPr>
+              <w:t>№</w:t>
+            </w:r>
+          </w:p>
+        </w:tc>
+        <w:tc>
+          <w:tcPr>
+            <w:tcW w:w="2918" w:type="dxa"/>
+            <w:tcBorders>
+              <w:top w:val="single" w:sz="4" w:space="0" w:color="000000"/>
+              <w:left w:val="single" w:sz="4" w:space="0" w:color="000000"/>
+              <w:bottom w:val="single" w:sz="4" w:space="0" w:color="000000"/>
+              <w:right w:val="single" w:sz="4" w:space="0" w:color="000000"/>
+            </w:tcBorders>
+            <w:shd w:val="clear" w:color="auto" w:fill="auto"/>
+            <w:tcMar>
+              <w:top w:w="80" w:type="dxa"/>
+              <w:left w:w="80" w:type="dxa"/>
+              <w:bottom w:w="80" w:type="dxa"/>
+              <w:right w:w="80" w:type="dxa"/>
+            </w:tcMar>
+            <w:vAlign w:val="center"/>
+          </w:tcPr>
+          <w:p>
+            <w:pPr>
+              <w:jc w:val="center"/>
+            </w:pPr>
+            <w:r>
+              <w:rPr>
+                <w:sz w:val="22"/>
+                <w:szCs w:val="22"/>
+              </w:rPr>
+              <w:t>Ф.И.О.</w:t>
+            </w:r>
+          </w:p>
+        </w:tc>
+        <w:tc>
+          <w:tcPr>
+            <w:tcW w:w="2379" w:type="dxa"/>
+            <w:tcBorders>
+              <w:top w:val="single" w:sz="4" w:space="0" w:color="000000"/>
+              <w:left w:val="single" w:sz="4" w:space="0" w:color="000000"/>
+              <w:bottom w:val="single" w:sz="4" w:space="0" w:color="000000"/>
+              <w:right w:val="single" w:sz="4" w:space="0" w:color="000000"/>
+            </w:tcBorders>
+            <w:shd w:val="clear" w:color="auto" w:fill="auto"/>
+            <w:tcMar>
+              <w:top w:w="80" w:type="dxa"/>
+              <w:left w:w="80" w:type="dxa"/>
+              <w:bottom w:w="80" w:type="dxa"/>
+              <w:right w:w="80" w:type="dxa"/>
+            </w:tcMar>
+            <w:vAlign w:val="center"/>
+          </w:tcPr>
+          <w:p>
+            <w:pPr>
+              <w:jc w:val="center"/>
+            </w:pPr>
+            <w:r>
+              <w:rPr>
+                <w:sz w:val="22"/>
+                <w:szCs w:val="22"/>
+              </w:rPr>
+              <w:t>Наименование предприятия</w:t>
+            </w:r>
+          </w:p>
+        </w:tc>
+        <w:tc>
+          <w:tcPr>
+            <w:tcW w:w="3136" w:type="dxa"/>
+            <w:tcBorders>
+              <w:top w:val="single" w:sz="4" w:space="0" w:color="000000"/>
+              <w:left w:val="single" w:sz="4" w:space="0" w:color="000000"/>
+              <w:bottom w:val="single" w:sz="4" w:space="0" w:color="000000"/>
+              <w:right w:val="single" w:sz="4" w:space="0" w:color="000000"/>
+            </w:tcBorders>
+            <w:shd w:val="clear" w:color="auto" w:fill="auto"/>
+            <w:tcMar>
+              <w:top w:w="80" w:type="dxa"/>
+              <w:left w:w="80" w:type="dxa"/>
+              <w:bottom w:w="80" w:type="dxa"/>
+              <w:right w:w="80" w:type="dxa"/>
+            </w:tcMar>
+            <w:vAlign w:val="center"/>
+          </w:tcPr>
+          <w:p>
+            <w:pPr>
+              <w:jc w:val="center"/>
+            </w:pPr>
+            <w:r>
+              <w:rPr>
+                <w:sz w:val="22"/>
+                <w:szCs w:val="22"/>
+              </w:rPr>
+              <w:t>Занимаемая должность</w:t>
+            </w:r>
+          </w:p>
+        </w:tc>
+        <w:tc>
+          <w:tcPr>
+            <w:tcW w:w="842" w:type="dxa"/>
+            <w:tcBorders>
+              <w:top w:val="single" w:sz="4" w:space="0" w:color="000000"/>
+              <w:left w:val="single" w:sz="4" w:space="0" w:color="000000"/>
+              <w:bottom w:val="single" w:sz="4" w:space="0" w:color="000000"/>
+              <w:right w:val="single" w:sz="4" w:space="0" w:color="000000"/>
+            </w:tcBorders>
+          </w:tcPr>
+          <w:p>
+            <w:pPr>
+              <w:jc w:val="center"/>
+              <w:rPr>
+                <w:sz w:val="22"/>
+                <w:szCs w:val="22"/>
+              </w:rPr>
+            </w:pPr>
+          </w:p>
+          <w:p>
+            <w:pPr>
+              <w:jc w:val="center"/>
+              <w:rPr>
+                <w:sz w:val="22"/>
+                <w:szCs w:val="22"/>
+              </w:rPr>
+            </w:pPr>
+          </w:p>
+          <w:p>
+            <w:pPr>
+              <w:jc w:val="center"/>
+              <w:rPr>
+                <w:sz w:val="22"/>
+                <w:szCs w:val="22"/>
+              </w:rPr>
+            </w:pPr>
+          </w:p>
+          <w:p>
+            <w:pPr>
+              <w:jc w:val="center"/>
+              <w:rPr>
+                <w:sz w:val="22"/>
+                <w:szCs w:val="22"/>
+              </w:rPr>
+            </w:pPr>
+            <w:r>
+              <w:rPr>
+                <w:sz w:val="22"/>
+                <w:szCs w:val="22"/>
+              </w:rPr>
+              <w:t>Номер билета</w:t>
+            </w:r>
+          </w:p>
+        </w:tc>
+        <w:tc>
+          <w:tcPr>
+            <w:tcW w:w="1621" w:type="dxa"/>
+            <w:tcBorders>
+              <w:top w:val="single" w:sz="4" w:space="0" w:color="000000"/>
+              <w:left w:val="single" w:sz="4" w:space="0" w:color="000000"/>
+              <w:bottom w:val="single" w:sz="4" w:space="0" w:color="000000"/>
+              <w:right w:val="single" w:sz="4" w:space="0" w:color="000000"/>
+            </w:tcBorders>
+            <w:shd w:val="clear" w:color="auto" w:fill="auto"/>
+            <w:tcMar>
+              <w:top w:w="80" w:type="dxa"/>
+              <w:left w:w="80" w:type="dxa"/>
+              <w:bottom w:w="80" w:type="dxa"/>
+              <w:right w:w="80" w:type="dxa"/>
+            </w:tcMar>
+            <w:vAlign w:val="center"/>
+          </w:tcPr>
+          <w:p>
+            <w:pPr>
+              <w:jc w:val="center"/>
+            </w:pPr>
+            <w:r>
+              <w:rPr>
+                <w:sz w:val="22"/>
+                <w:szCs w:val="22"/>
+              </w:rPr>
+              <w:t>Результат проверки знаний</w:t>
+            </w:r>
+          </w:p>
+        </w:tc>
+        <w:tc>
+          <w:tcPr>
+            <w:tcW w:w="1406" w:type="dxa"/>
+            <w:tcBorders>
+              <w:top w:val="single" w:sz="4" w:space="0" w:color="000000"/>
+              <w:left w:val="single" w:sz="4" w:space="0" w:color="000000"/>
+              <w:bottom w:val="single" w:sz="4" w:space="0" w:color="000000"/>
+              <w:right w:val="single" w:sz="4" w:space="0" w:color="000000"/>
+            </w:tcBorders>
+            <w:shd w:val="clear" w:color="auto" w:fill="auto"/>
+            <w:tcMar>
+              <w:top w:w="80" w:type="dxa"/>
+              <w:left w:w="80" w:type="dxa"/>
+              <w:bottom w:w="80" w:type="dxa"/>
+              <w:right w:w="80" w:type="dxa"/>
+            </w:tcMar>
+            <w:vAlign w:val="center"/>
+          </w:tcPr>
+          <w:p>
+            <w:pPr>
+              <w:jc w:val="center"/>
+            </w:pPr>
+            <w:r>
+              <w:rPr>
+                <w:sz w:val="22"/>
+                <w:szCs w:val="22"/>
+              </w:rPr>
+              <w:t>Регистрационный номер записи о проверке знаний в реестре обученных лиц</w:t>
+            </w:r>
+          </w:p>
+        </w:tc>
+        <w:tc>
+          <w:tcPr>
+            <w:tcW w:w="951" w:type="dxa"/>
+            <w:tcBorders>
+              <w:top w:val="single" w:sz="4" w:space="0" w:color="000000"/>
+              <w:left w:val="single" w:sz="4" w:space="0" w:color="000000"/>
+              <w:bottom w:val="single" w:sz="4" w:space="0" w:color="000000"/>
+              <w:right w:val="single" w:sz="4" w:space="0" w:color="000000"/>
+            </w:tcBorders>
+            <w:shd w:val="clear" w:color="auto" w:fill="auto"/>
+            <w:tcMar>
+              <w:top w:w="80" w:type="dxa"/>
+              <w:left w:w="80" w:type="dxa"/>
+              <w:bottom w:w="80" w:type="dxa"/>
+              <w:right w:w="80" w:type="dxa"/>
+            </w:tcMar>
+            <w:vAlign w:val="center"/>
+          </w:tcPr>
+          <w:p>
+            <w:pPr>
+              <w:jc w:val="center"/>
+            </w:pPr>
+            <w:r>
+              <w:rPr>
+                <w:sz w:val="22"/>
+                <w:szCs w:val="22"/>
+              </w:rPr>
+              <w:t>Подпись проверяемого</w:t>
+            </w:r>
+          </w:p>
+        </w:tc>
+        <w:tc>
+          <w:tcPr>
+            <w:tcW w:w="1427" w:type="dxa"/>
+            <w:tcBorders>
+              <w:top w:val="single" w:sz="4" w:space="0" w:color="000000"/>
+              <w:left w:val="single" w:sz="4" w:space="0" w:color="000000"/>
+              <w:bottom w:val="single" w:sz="4" w:space="0" w:color="000000"/>
+              <w:right w:val="single" w:sz="4" w:space="0" w:color="000000"/>
+            </w:tcBorders>
+          </w:tcPr>
+          <w:p>
+            <w:pPr>
+              <w:jc w:val="center"/>
+              <w:rPr>
+                <w:sz w:val="22"/>
+                <w:szCs w:val="22"/>
+              </w:rPr>
+            </w:pPr>
+          </w:p>
+          <w:p>
+            <w:pPr>
+              <w:jc w:val="center"/>
+              <w:rPr>
+                <w:sz w:val="22"/>
+                <w:szCs w:val="22"/>
+              </w:rPr>
+            </w:pPr>
+          </w:p>
+          <w:p>
+            <w:pPr>
+              <w:jc w:val="center"/>
+              <w:rPr>
+                <w:sz w:val="22"/>
+                <w:szCs w:val="22"/>
+              </w:rPr>
+            </w:pPr>
+            <w:r>
+              <w:rPr>
+                <w:sz w:val="22"/>
+                <w:szCs w:val="22"/>
+              </w:rPr>
+              <w:t>Заключение экзаменационной</w:t>
+            </w:r>
+          </w:p>
+          <w:p>
+            <w:pPr>
+              <w:jc w:val="center"/>
+              <w:rPr>
+                <w:sz w:val="22"/>
+                <w:szCs w:val="22"/>
+              </w:rPr>
+            </w:pPr>
+            <w:r>
+              <w:rPr>
+                <w:sz w:val="22"/>
+                <w:szCs w:val="22"/>
+              </w:rPr>
+              <w:t>комиссии</w:t>
+            </w:r>
+          </w:p>
+          <w:p>
+            <w:pPr>
+              <w:rPr>
+                <w:sz w:val="22"/>
+                <w:szCs w:val="22"/>
+              </w:rPr>
+            </w:pPr>
+          </w:p>
+        </w:tc>
+      </w:tr>
+      <w:tr>
+        <w:trPr>
+          <w:trHeight w:val="230"/>
+        </w:trPr>
+        <w:tc>
+          <w:tcPr>
+            <w:tcW w:w="923" w:type="dxa"/>
+            <w:tcBorders>
+              <w:top w:val="single" w:sz="4" w:space="0" w:color="000000"/>
+              <w:left w:val="single" w:sz="4" w:space="0" w:color="000000"/>
+              <w:bottom w:val="single" w:sz="4" w:space="0" w:color="000000"/>
+              <w:right w:val="single" w:sz="4" w:space="0" w:color="000000"/>
+            </w:tcBorders>
+            <w:shd w:val="clear" w:color="auto" w:fill="auto"/>
+            <w:tcMar>
+              <w:top w:w="80" w:type="dxa"/>
+              <w:left w:w="80" w:type="dxa"/>
+              <w:bottom w:w="80" w:type="dxa"/>
+              <w:right w:w="80" w:type="dxa"/>
+            </w:tcMar>
+            <w:vAlign w:val="center"/>
+          </w:tcPr>
+          <w:p>
+            <w:pPr>
+              <w:jc w:val="center"/>
+            </w:pPr>
+            <w:r>
+              <w:rPr>
+                <w:sz w:val="22"/>
+                <w:szCs w:val="22"/>
+              </w:rPr>
+              <w:t>1</w:t>
+            </w:r>
+          </w:p>
+        </w:tc>
+        <w:tc>
+          <w:tcPr>
+            <w:tcW w:w="2918" w:type="dxa"/>
+            <w:tcBorders>
+              <w:top w:val="single" w:sz="4" w:space="0" w:color="000000"/>
+              <w:left w:val="single" w:sz="4" w:space="0" w:color="000000"/>
+              <w:bottom w:val="single" w:sz="4" w:space="0" w:color="000000"/>
+              <w:right w:val="single" w:sz="4" w:space="0" w:color="000000"/>
+            </w:tcBorders>
+            <w:shd w:val="clear" w:color="auto" w:fill="auto"/>
+            <w:tcMar>
+              <w:top w:w="80" w:type="dxa"/>
+              <w:left w:w="80" w:type="dxa"/>
+              <w:bottom w:w="80" w:type="dxa"/>
+              <w:right w:w="80" w:type="dxa"/>
+            </w:tcMar>
+            <w:vAlign w:val="center"/>
+          </w:tcPr>
+          <w:p>
+            <w:pPr>
+              <w:jc w:val="center"/>
+            </w:pPr>
+            <w:r>
+              <w:rPr>
+                <w:sz w:val="22"/>
+                <w:szCs w:val="22"/>
+              </w:rPr>
+              <w:t>2</w:t>
+            </w:r>
+          </w:p>
+        </w:tc>
+        <w:tc>
+          <w:tcPr>
+            <w:tcW w:w="2379" w:type="dxa"/>
+            <w:tcBorders>
+              <w:top w:val="single" w:sz="4" w:space="0" w:color="000000"/>
+              <w:left w:val="single" w:sz="4" w:space="0" w:color="000000"/>
+              <w:bottom w:val="single" w:sz="4" w:space="0" w:color="auto"/>
+              <w:right w:val="single" w:sz="4" w:space="0" w:color="000000"/>
+            </w:tcBorders>
+            <w:shd w:val="clear" w:color="auto" w:fill="auto"/>
+            <w:tcMar>
+              <w:top w:w="80" w:type="dxa"/>
+              <w:left w:w="80" w:type="dxa"/>
+              <w:bottom w:w="80" w:type="dxa"/>
+              <w:right w:w="80" w:type="dxa"/>
+            </w:tcMar>
+            <w:vAlign w:val="center"/>
+          </w:tcPr>
+          <w:p>
+            <w:pPr>
+              <w:jc w:val="center"/>
+            </w:pPr>
+            <w:r>
+              <w:rPr>
+                <w:sz w:val="22"/>
+                <w:szCs w:val="22"/>
+              </w:rPr>
+              <w:t>3</w:t>
+            </w:r>
+          </w:p>
+        </w:tc>
+        <w:tc>
+          <w:tcPr>
+            <w:tcW w:w="3136" w:type="dxa"/>
+            <w:tcBorders>
+              <w:top w:val="single" w:sz="4" w:space="0" w:color="000000"/>
+              <w:left w:val="single" w:sz="4" w:space="0" w:color="000000"/>
+              <w:bottom w:val="single" w:sz="4" w:space="0" w:color="auto"/>
+              <w:right w:val="single" w:sz="4" w:space="0" w:color="000000"/>
+            </w:tcBorders>
+            <w:shd w:val="clear" w:color="auto" w:fill="auto"/>
+            <w:tcMar>
+              <w:top w:w="80" w:type="dxa"/>
+              <w:left w:w="80" w:type="dxa"/>
+              <w:bottom w:w="80" w:type="dxa"/>
+              <w:right w:w="80" w:type="dxa"/>
+            </w:tcMar>
+            <w:vAlign w:val="center"/>
+          </w:tcPr>
+          <w:p>
+            <w:pPr>
+              <w:jc w:val="center"/>
+            </w:pPr>
+            <w:r>
+              <w:rPr>
+                <w:sz w:val="22"/>
+                <w:szCs w:val="22"/>
+              </w:rPr>
+              <w:t>4</w:t>
+            </w:r>
+          </w:p>
+        </w:tc>
+        <w:tc>
+          <w:tcPr>
+            <w:tcW w:w="842" w:type="dxa"/>
+            <w:tcBorders>
+              <w:top w:val="single" w:sz="4" w:space="0" w:color="000000"/>
+              <w:left w:val="single" w:sz="4" w:space="0" w:color="000000"/>
+              <w:bottom w:val="single" w:sz="4" w:space="0" w:color="000000"/>
+              <w:right w:val="single" w:sz="4" w:space="0" w:color="000000"/>
+            </w:tcBorders>
+          </w:tcPr>
+          <w:p>
+            <w:pPr>
+              <w:jc w:val="center"/>
+              <w:rPr>
+                <w:sz w:val="22"/>
+                <w:szCs w:val="22"/>
+              </w:rPr>
+            </w:pPr>
+            <w:r>
+              <w:rPr>
+                <w:sz w:val="22"/>
+                <w:szCs w:val="22"/>
+              </w:rPr>
+              <w:t>5</w:t>
+            </w:r>
+          </w:p>
+        </w:tc>
+        <w:tc>
+          <w:tcPr>
+            <w:tcW w:w="1621" w:type="dxa"/>
+            <w:tcBorders>
+              <w:top w:val="single" w:sz="4" w:space="0" w:color="000000"/>
+              <w:left w:val="single" w:sz="4" w:space="0" w:color="000000"/>
+              <w:bottom w:val="single" w:sz="4" w:space="0" w:color="000000"/>
+              <w:right w:val="single" w:sz="4" w:space="0" w:color="000000"/>
+            </w:tcBorders>
+            <w:shd w:val="clear" w:color="auto" w:fill="auto"/>
+            <w:tcMar>
+              <w:top w:w="80" w:type="dxa"/>
+              <w:left w:w="80" w:type="dxa"/>
+              <w:bottom w:w="80" w:type="dxa"/>
+              <w:right w:w="80" w:type="dxa"/>
+            </w:tcMar>
+            <w:vAlign w:val="center"/>
+          </w:tcPr>
+          <w:p>
+            <w:pPr>
+              <w:jc w:val="center"/>
+            </w:pPr>
+            <w:r>
+              <w:rPr>
+                <w:sz w:val="22"/>
+                <w:szCs w:val="22"/>
+              </w:rPr>
+              <w:t>6</w:t>
+            </w:r>
+          </w:p>
+        </w:tc>
+        <w:tc>
+          <w:tcPr>
+            <w:tcW w:w="1406" w:type="dxa"/>
+            <w:tcBorders>
+              <w:top w:val="single" w:sz="4" w:space="0" w:color="000000"/>
+              <w:left w:val="single" w:sz="4" w:space="0" w:color="000000"/>
+              <w:bottom w:val="single" w:sz="4" w:space="0" w:color="000000"/>
+              <w:right w:val="single" w:sz="4" w:space="0" w:color="000000"/>
+            </w:tcBorders>
+            <w:shd w:val="clear" w:color="auto" w:fill="auto"/>
+            <w:tcMar>
+              <w:top w:w="80" w:type="dxa"/>
+              <w:left w:w="80" w:type="dxa"/>
+              <w:bottom w:w="80" w:type="dxa"/>
+              <w:right w:w="80" w:type="dxa"/>
+            </w:tcMar>
+            <w:vAlign w:val="center"/>
+          </w:tcPr>
+          <w:p>
+            <w:pPr>
+              <w:jc w:val="center"/>
+            </w:pPr>
+            <w:r>
+              <w:rPr>
+                <w:sz w:val="22"/>
+                <w:szCs w:val="22"/>
+              </w:rPr>
+              <w:t>7</w:t>
+            </w:r>
+          </w:p>
+        </w:tc>
+        <w:tc>
+          <w:tcPr>
+            <w:tcW w:w="951" w:type="dxa"/>
+            <w:tcBorders>
+              <w:top w:val="single" w:sz="4" w:space="0" w:color="000000"/>
+              <w:left w:val="single" w:sz="4" w:space="0" w:color="000000"/>
+              <w:bottom w:val="single" w:sz="4" w:space="0" w:color="000000"/>
+              <w:right w:val="single" w:sz="4" w:space="0" w:color="000000"/>
+            </w:tcBorders>
+            <w:shd w:val="clear" w:color="auto" w:fill="auto"/>
+            <w:tcMar>
+              <w:top w:w="80" w:type="dxa"/>
+              <w:left w:w="80" w:type="dxa"/>
+              <w:bottom w:w="80" w:type="dxa"/>
+              <w:right w:w="80" w:type="dxa"/>
+            </w:tcMar>
+            <w:vAlign w:val="center"/>
+          </w:tcPr>
+          <w:p>
+            <w:pPr>
+              <w:jc w:val="center"/>
+              <w:rPr>
+                <w:lang w:val="en-US"/>
+              </w:rPr>
+            </w:pPr>
+            <w:r>
+              <w:rPr>
+                <w:sz w:val="22"/>
+                <w:szCs w:val="22"/>
+                <w:lang w:val="en-US"/>
+              </w:rPr>
+              <w:t>8</w:t>
+            </w:r>
+          </w:p>
+        </w:tc>
+        <w:tc>
+          <w:tcPr>
+            <w:tcW w:w="1427" w:type="dxa"/>
+            <w:tcBorders>
+              <w:top w:val="single" w:sz="4" w:space="0" w:color="000000"/>
+              <w:left w:val="single" w:sz="4" w:space="0" w:color="000000"/>
+              <w:bottom w:val="single" w:sz="4" w:space="0" w:color="000000"/>
+              <w:right w:val="single" w:sz="4" w:space="0" w:color="000000"/>
+            </w:tcBorders>
+          </w:tcPr>
+          <w:p>
+            <w:pPr>
+              <w:jc w:val="center"/>
+              <w:rPr>
+                <w:sz w:val="22"/>
+                <w:szCs w:val="22"/>
+              </w:rPr>
+            </w:pPr>
+            <w:r>
+              <w:rPr>
+                <w:sz w:val="22"/>
+                <w:szCs w:val="22"/>
+              </w:rPr>
+              <w:t>9</w:t>
+            </w:r>
+          </w:p>
+        </w:tc>
+      </w:tr>
+      <w:tr>
+        <w:trPr>
+          <w:trHeight w:val="1862"/>
+        </w:trPr>
+        <w:tc>
+          <w:tcPr>
+            <w:tcW w:w="923" w:type="dxa"/>
+            <w:tcBorders>
+              <w:top w:val="single" w:sz="4" w:space="0" w:color="000000"/>
+              <w:left w:val="single" w:sz="4" w:space="0" w:color="000000"/>
+              <w:bottom w:val="single" w:sz="4" w:space="0" w:color="000000"/>
+              <w:right w:val="single" w:sz="4" w:space="0" w:color="000000"/>
+            </w:tcBorders>
+            <w:shd w:val="clear" w:color="auto" w:fill="auto"/>
+            <w:tcMar>
+              <w:top w:w="80" w:type="dxa"/>
+              <w:left w:w="80" w:type="dxa"/>
+              <w:bottom w:w="80" w:type="dxa"/>
+              <w:right w:w="80" w:type="dxa"/>
+            </w:tcMar>
+            <w:vAlign w:val="center"/>
+          </w:tcPr>
+          <w:p>
+            <w:pPr>
+              <w:pStyle w:val="a5"/>
+              <w:numPr>
+                <w:ilvl w:val="0"/>
+                <w:numId w:val="1"/>
+              </w:numPr>
+            </w:pPr>
+            <w:r>
+              <w:rPr>
+                <w:sz w:val="22"/>
+                <w:szCs w:val="22"/>
+                <w:lang w:val="en-US"/>
+              </w:rPr>
+              <w:t>{#employee}</w:t>
+            </w:r>
+          </w:p>
+        </w:tc>
+        <w:tc>
+          <w:tcPr>
+            <w:tcW w:w="2918" w:type="dxa"/>
+            <w:tcBorders>
+              <w:top w:val="single" w:sz="4" w:space="0" w:color="000000"/>
+              <w:left w:val="single" w:sz="4" w:space="0" w:color="000000"/>
+              <w:bottom w:val="single" w:sz="4" w:space="0" w:color="000000"/>
+              <w:right w:val="single" w:sz="4" w:space="0" w:color="auto"/>
+            </w:tcBorders>
+            <w:shd w:val="clear" w:color="auto" w:fill="auto"/>
+            <w:tcMar>
+              <w:top w:w="80" w:type="dxa"/>
+              <w:left w:w="80" w:type="dxa"/>
+              <w:bottom w:w="80" w:type="dxa"/>
+              <w:right w:w="80" w:type="dxa"/>
+            </w:tcMar>
+            <w:vAlign w:val="center"/>
+          </w:tcPr>
+          <w:p>
+            <w:pPr>
+              <w:rPr>
+                <w:lang w:val="en-US"/>
+              </w:rPr>
+            </w:pPr>
+            <w:r>
+              <w:rPr>
+                <w:sz w:val="22"/>
+                <w:szCs w:val="22"/>
+                <w:lang w:val="en-US"/>
+              </w:rPr>
+              <w:t>{</w:t>
+            </w:r>
+            <w:proofErr w:type="spellStart"/>
+            <w:r>
+              <w:rPr>
+                <w:sz w:val="22"/>
+                <w:szCs w:val="22"/>
+                <w:lang w:val="en-US"/>
+              </w:rPr>
+              <w:t>last_</w:t>
+            </w:r>
+            <w:r>
+              <w:rPr>
+                <w:sz w:val="22"/>
+                <w:szCs w:val="22"/>
+                <w:lang w:val="en-US"/>
+              </w:rPr>
+              <w:t>name</w:t>
+            </w:r>
+            <w:proofErr w:type="spellEnd"/>
+            <w:r>
+              <w:rPr>
+                <w:sz w:val="22"/>
+                <w:szCs w:val="22"/>
+                <w:lang w:val="en-US"/>
+              </w:rPr>
+              <w:t>} {name} {</w:t>
+            </w:r>
+            <w:proofErr w:type="spellStart"/>
+            <w:r>
+              <w:rPr>
+                <w:sz w:val="22"/>
+                <w:szCs w:val="22"/>
+                <w:lang w:val="en-US"/>
+              </w:rPr>
+              <w:t>middle_name</w:t>
+            </w:r>
+            <w:proofErr w:type="spellEnd"/>
+            <w:r>
+              <w:rPr>
+                <w:sz w:val="22"/>
+                <w:szCs w:val="22"/>
+                <w:lang w:val="en-US"/>
+              </w:rPr>
+              <w:t>}</w:t>
+            </w:r>
+          </w:p>
+        </w:tc>
+        <w:tc>
+          <w:tcPr>
+            <w:tcW w:w="2379" w:type="dxa"/>
+            <w:tcBorders>
+              <w:top w:val="single" w:sz="4" w:space="0" w:color="auto"/>
+              <w:left w:val="single" w:sz="4" w:space="0" w:color="auto"/>
+              <w:bottom w:val="single" w:sz="4" w:space="0" w:color="auto"/>
+              <w:right w:val="single" w:sz="4" w:space="0" w:color="auto"/>
+            </w:tcBorders>
+            <w:shd w:val="clear" w:color="auto" w:fill="auto"/>
+            <w:tcMar>
+              <w:top w:w="80" w:type="dxa"/>
+              <w:left w:w="80" w:type="dxa"/>
+              <w:bottom w:w="80" w:type="dxa"/>
+              <w:right w:w="80" w:type="dxa"/>
+            </w:tcMar>
+            <w:vAlign w:val="center"/>
+          </w:tcPr>
+          <w:p>
+            <w:pPr>
+              <w:jc w:val="center"/>
+            </w:pPr>
+            <w:r>
+              <w:rPr>
+                <w:sz w:val="22"/>
+                <w:szCs w:val="22"/>
+                <w:lang w:val="en-US"/>
+              </w:rPr>
+              <w:t>{</w:t>
+            </w:r>
+            <w:proofErr w:type="spellStart"/>
+            <w:r>
+              <w:rPr>
+                <w:sz w:val="22"/>
+                <w:szCs w:val="22"/>
+                <w:lang w:val="en-US"/>
+              </w:rPr>
+              <w:t>organization_name</w:t>
+            </w:r>
+            <w:proofErr w:type="spellEnd"/>
+            <w:r>
+              <w:rPr>
+                <w:sz w:val="22"/>
+                <w:szCs w:val="22"/>
+                <w:lang w:val="en-US"/>
+              </w:rPr>
+              <w:t>}</w:t>
+            </w:r>
+          </w:p>
+        </w:tc>
+        <w:tc>
+          <w:tcPr>
+            <w:tcW w:w="3136" w:type="dxa"/>
+            <w:tcBorders>
+              <w:top w:val="single" w:sz="4" w:space="0" w:color="auto"/>
+              <w:left w:val="single" w:sz="4" w:space="0" w:color="auto"/>
+              <w:bottom w:val="single" w:sz="4" w:space="0" w:color="auto"/>
+              <w:right w:val="single" w:sz="4" w:space="0" w:color="auto"/>
+            </w:tcBorders>
+            <w:shd w:val="clear" w:color="auto" w:fill="auto"/>
+            <w:tcMar>
+              <w:top w:w="80" w:type="dxa"/>
+              <w:left w:w="80" w:type="dxa"/>
+              <w:bottom w:w="80" w:type="dxa"/>
+              <w:right w:w="80" w:type="dxa"/>
+            </w:tcMar>
+            <w:vAlign w:val="center"/>
+          </w:tcPr>
+          <w:p>
+            <w:pPr>
+              <w:jc w:val="center"/>
+            </w:pPr>
+            <w:r>
+              <w:rPr>
+                <w:sz w:val="22"/>
+                <w:szCs w:val="22"/>
+                <w:lang w:val="en-US"/>
+              </w:rPr>
+              <w:t>{grade}</w:t>
+            </w:r>
+          </w:p>
+        </w:tc>
+        <w:tc>
+          <w:tcPr>
+            <w:tcW w:w="842" w:type="dxa"/>
+            <w:tcBorders>
+              <w:top w:val="single" w:sz="4" w:space="0" w:color="000000"/>
+              <w:left w:val="single" w:sz="4" w:space="0" w:color="auto"/>
+              <w:bottom w:val="single" w:sz="4" w:space="0" w:color="000000"/>
+              <w:right w:val="single" w:sz="4" w:space="0" w:color="auto"/>
+            </w:tcBorders>
+          </w:tcPr>
+          <w:p>
+            <w:pPr>
+              <w:jc w:val="center"/>
+              <w:rPr>
+                <w:i/>
+                <w:iCs/>
+                <w:sz w:val="22"/>
+                <w:szCs w:val="22"/>
+                <w:lang w:val="en-US"/>
+              </w:rPr>
+            </w:pPr>
+          </w:p>
+          <w:p>
+            <w:pPr>
+              <w:jc w:val="center"/>
+              <w:rPr>
+                <w:i/>
+                <w:iCs/>
+                <w:sz w:val="22"/>
+                <w:szCs w:val="22"/>
+                <w:lang w:val="en-US"/>
+              </w:rPr>
+            </w:pPr>
+          </w:p>
+          <w:p>
+            <w:pPr>
+              <w:jc w:val="center"/>
+              <w:rPr>
+                <w:i/>
+                <w:iCs/>
+                <w:sz w:val="22"/>
+                <w:szCs w:val="22"/>
+                <w:lang w:val="en-US"/>
+              </w:rPr>
+            </w:pPr>
+          </w:p>
+          <w:p>
+            <w:pPr>
+              <w:jc w:val="center"/>
+              <w:rPr>
+                <w:i/>
+                <w:iCs/>
+                <w:sz w:val="22"/>
+                <w:szCs w:val="22"/>
+                <w:lang w:val="en-US"/>
+              </w:rPr>
+            </w:pPr>
+          </w:p>
+          <w:p>
+            <w:pPr>
+              <w:jc w:val="center"/>
+              <w:rPr>
+                <w:i/>
+                <w:iCs/>
+                <w:sz w:val="22"/>
+                <w:szCs w:val="22"/>
+                <w:lang w:val="en-US"/>
+              </w:rPr>
+            </w:pPr>
+          </w:p>
+          <w:p>
+            <w:pPr>
+              <w:jc w:val="center"/>
+              <w:rPr>
+                <w:i/>
+                <w:iCs/>
+                <w:sz w:val="22"/>
+                <w:szCs w:val="22"/>
+                <w:lang w:val="en-US"/>
+              </w:rPr>
+            </w:pPr>
+            <w:r>
+              <w:rPr>
+                <w:i/>
+                <w:iCs/>
+                <w:sz w:val="22"/>
+                <w:szCs w:val="22"/>
+                <w:lang w:val="en-US"/>
+              </w:rPr>
+              <w:t>{</w:t>
+            </w:r>
+            <w:proofErr w:type="spellStart"/>
+            <w:r>
+              <w:rPr>
+                <w:i/>
+                <w:iCs/>
+                <w:sz w:val="22"/>
+                <w:szCs w:val="22"/>
+                <w:lang w:val="en-US"/>
+              </w:rPr>
+              <w:t>random_number</w:t>
+            </w:r>
+            <w:proofErr w:type="spellEnd"/>
+            <w:r>
+              <w:rPr>
+                <w:i/>
+                <w:iCs/>
+                <w:sz w:val="22"/>
+                <w:szCs w:val="22"/>
+                <w:lang w:val="en-US"/>
+              </w:rPr>
+              <w:t>}</w:t>
+            </w:r>
+          </w:p>
+        </w:tc>
+        <w:tc>
+          <w:tcPr>
+            <w:tcW w:w="1621" w:type="dxa"/>
+            <w:tcBorders>
+              <w:top w:val="single" w:sz="4" w:space="0" w:color="000000"/>
+              <w:left w:val="single" w:sz="4" w:space="0" w:color="auto"/>
+              <w:bottom w:val="single" w:sz="4" w:space="0" w:color="000000"/>
+              <w:right w:val="single" w:sz="4" w:space="0" w:color="000000"/>
+            </w:tcBorders>
+            <w:shd w:val="clear" w:color="auto" w:fill="auto"/>
+            <w:tcMar>
+              <w:top w:w="80" w:type="dxa"/>
+              <w:left w:w="80" w:type="dxa"/>
+              <w:bottom w:w="80" w:type="dxa"/>
+              <w:right w:w="80" w:type="dxa"/>
+            </w:tcMar>
+            <w:vAlign w:val="center"/>
+          </w:tcPr>
+          <w:p>
+            <w:pPr>
+              <w:jc w:val="center"/>
+              <w:rPr>
+                <w:lang w:val="en-US"/>
+              </w:rPr>
+            </w:pPr>
+            <w:r>
+              <w:rPr>
+                <w:i/>
+                <w:iCs/>
+                <w:sz w:val="22"/>
+                <w:szCs w:val="22"/>
+                <w:lang w:val="en-US"/>
+              </w:rPr>
+              <w:t>{</w:t>
+            </w:r>
+            <w:r>
+              <w:rPr>
+                <w:i/>
+                <w:iCs/>
+                <w:sz w:val="22"/>
+                <w:szCs w:val="22"/>
+              </w:rPr>
+              <w:t>c</w:t>
+            </w:r>
+            <w:proofErr w:type="spellStart"/>
+            <w:r>
+              <w:rPr>
+                <w:i/>
+                <w:iCs/>
+                <w:sz w:val="22"/>
+                <w:szCs w:val="22"/>
+                <w:lang w:val="en-US"/>
+              </w:rPr>
+              <w:t>ourses_mark</w:t>
+            </w:r>
+            <w:proofErr w:type="spellEnd"/>
+            <w:r>
+              <w:rPr>
+                <w:i/>
+                <w:iCs/>
+                <w:sz w:val="22"/>
+                <w:szCs w:val="22"/>
+              </w:rPr>
+              <w:t>}</w:t>
+            </w:r>
+          </w:p>
+        </w:tc>
+        <w:tc>
+          <w:tcPr>
+            <w:tcW w:w="1406" w:type="dxa"/>
+            <w:tcBorders>
+              <w:top w:val="single" w:sz="4" w:space="0" w:color="000000"/>
+              <w:left w:val="single" w:sz="4" w:space="0" w:color="000000"/>
+              <w:bottom w:val="single" w:sz="4" w:space="0" w:color="000000"/>
+              <w:right w:val="single" w:sz="4" w:space="0" w:color="000000"/>
+            </w:tcBorders>
+            <w:shd w:val="clear" w:color="auto" w:fill="auto"/>
+            <w:tcMar>
+              <w:top w:w="80" w:type="dxa"/>
+              <w:left w:w="80" w:type="dxa"/>
+              <w:bottom w:w="80" w:type="dxa"/>
+              <w:right w:w="80" w:type="dxa"/>
+            </w:tcMar>
+            <w:vAlign w:val="center"/>
+          </w:tcPr>
+          <w:p/>
+        </w:tc>
+        <w:tc>
+          <w:tcPr>
+            <w:tcW w:w="951" w:type="dxa"/>
+            <w:tcBorders>
+              <w:top w:val="single" w:sz="4" w:space="0" w:color="000000"/>
+              <w:left w:val="single" w:sz="4" w:space="0" w:color="000000"/>
+              <w:bottom w:val="single" w:sz="4" w:space="0" w:color="000000"/>
+              <w:right w:val="single" w:sz="4" w:space="0" w:color="000000"/>
+            </w:tcBorders>
+            <w:shd w:val="clear" w:color="auto" w:fill="auto"/>
+            <w:tcMar>
+              <w:top w:w="80" w:type="dxa"/>
+              <w:left w:w="80" w:type="dxa"/>
+              <w:bottom w:w="80" w:type="dxa"/>
+              <w:right w:w="80" w:type="dxa"/>
+            </w:tcMar>
+            <w:vAlign w:val="center"/>
+          </w:tcPr>
+          <w:p/>
+        </w:tc>
+        <w:tc>
+          <w:tcPr>
+            <w:tcW w:w="1427" w:type="dxa"/>
+            <w:vMerge/>
+            <w:tcBorders>
+              <w:top w:val="single" w:sz="4" w:space="0" w:color="000000"/>
+              <w:left w:val="single" w:sz="4" w:space="0" w:color="000000"/>
+              <w:bottom w:val="single" w:sz="4" w:space="0" w:color="000000"/>
+              <w:right w:val="single" w:sz="4" w:space="0" w:color="000000"/>
+            </w:tcBorders>
+          </w:tcPr>
+          <w:p>
+            <w:pPr>
+              <w:rPr>
+                <w:sz w:val="22"/>
+                <w:szCs w:val="22"/>
+              </w:rPr>
+            </w:pPr>
+          </w:p>
+          <w:p>
+            <w:pPr>
+              <w:rPr>
+                <w:sz w:val="22"/>
+                <w:szCs w:val="22"/>
+              </w:rPr>
+            </w:pPr>
+          </w:p>
+          <w:p>
+            <w:pPr>
+              <w:rPr>
+                <w:sz w:val="22"/>
+                <w:szCs w:val="22"/>
+              </w:rPr>
+            </w:pPr>
+          </w:p>
+          <w:p>
+            <w:pPr>
+              <w:rPr>
+                <w:sz w:val="22"/>
+                <w:szCs w:val="22"/>
+              </w:rPr>
+            </w:pPr>
+          </w:p>
+          <w:p>
+            <w:pPr>
+              <w:rPr>
+                <w:sz w:val="22"/>
+                <w:szCs w:val="22"/>
+                <w:lang w:val="en-US"/>
+              </w:rPr>
+            </w:pPr>
+            <w:r>
+              <w:rPr>
+                <w:sz w:val="22"/>
+                <w:szCs w:val="22"/>
+                <w:lang w:val="en-US"/>
+              </w:rPr>
+              <w:t xml:space="preserve"> </w:t>
+            </w:r>
+            <w:r>
+              <w:rPr>
+                <w:sz w:val="22"/>
+                <w:szCs w:val="22"/>
+              </w:rPr>
+              <w:t>{</w:t>
+            </w:r>
+            <w:proofErr w:type="spellStart"/>
+            <w:r>
+              <w:rPr>
+                <w:sz w:val="22"/>
+                <w:szCs w:val="22"/>
+              </w:rPr>
+              <w:t>conclusion</w:t>
+            </w:r>
+            <w:proofErr w:type="spellEnd"/>
+            <w:r>
+              <w:rPr>
+                <w:sz w:val="22"/>
+                <w:szCs w:val="22"/>
+                <w:lang w:val="en-US"/>
+              </w:rPr>
+              <w:t>}</w:t>
+            </w:r>
+            <w:r>
+              <w:rPr>
+                <w:i/>
+                <w:iCs/>
+                <w:sz w:val="22"/>
+                <w:szCs w:val="22"/>
+                <w:lang w:val="en-US"/>
+              </w:rPr>
+              <w:t>{/employee}</w:t>
+            </w:r>
+          </w:p>
+        </w:tc>
+      </w:tr>
+    </w:tbl>
+    <w:p>
+      <w:pPr>
+        <w:widowControl w:val="0"/>
+        <w:ind w:left="324" w:hanging="324"/>
+        <w:rPr>
+          <w:sz w:val="22"/>
+          <w:szCs w:val="22"/>
+        </w:rPr>
+      </w:pPr>
+    </w:p>
+    <w:p>
+      <w:pPr>
+        <w:widowControl w:val="0"/>
+        <w:ind w:left="216" w:hanging="216"/>
+        <w:rPr>
+          <w:sz w:val="22"/>
+          <w:szCs w:val="22"/>
+        </w:rPr>
+      </w:pPr>
+    </w:p>
+    <w:p>
+      <w:pPr>
+        <w:widowControl w:val="0"/>
+        <w:ind w:left="108" w:hanging="108"/>
+        <w:rPr>
+          <w:sz w:val="22"/>
+          <w:szCs w:val="22"/>
+        </w:rPr>
+      </w:pPr>
+    </w:p>
+    <w:p>
+      <w:pPr>
+        <w:widowControl w:val="0"/>
+        <w:jc w:val="both"/>
+        <w:rPr>
+          <w:sz w:val="22"/>
+          <w:szCs w:val="22"/>
+        </w:rPr>
+      </w:pPr>
+    </w:p>
+    <w:p>
+      <w:pPr>
+        <w:tabs>
+          <w:tab w:val="left" w:pos="2220"/>
+        </w:tabs>
+        <w:rPr>
+          <w:sz w:val="18"/>
+          <w:szCs w:val="18"/>
+        </w:rPr>
+      </w:pPr>
+      <w:r>
+        <w:rPr>
+          <w:sz w:val="28"/>
+          <w:szCs w:val="28"/>
+        </w:rPr>
+        <w:tab/>
+      </w:r>
+    </w:p>
+    <w:p>
+      <w:pPr>
+        <w:ind w:left="3828"/>
+      </w:pPr>
+      <w:r>
+        <w:t>Председатель комиссии:</w:t>
+      </w:r>
+      <w:r>
+        <w:tab/>
+      </w:r>
+      <w:r>
+        <w:tab/>
+      </w:r>
+      <w:r>
+        <w:tab/>
+      </w:r>
+      <w:r>
+        <w:tab/>
+        <w:t xml:space="preserve">/ В.М. </w:t>
+      </w:r>
+      <w:proofErr w:type="spellStart"/>
+      <w:r>
+        <w:t>Шекшуев</w:t>
+      </w:r>
+      <w:proofErr w:type="spellEnd"/>
+      <w:r>
+        <w:t xml:space="preserve"> /</w:t>
+      </w:r>
+    </w:p>
+    <w:p>
+      <w:pPr>
+        <w:ind w:left="3828"/>
+        <w:rPr>
+          <w:sz w:val="12"/>
+          <w:szCs w:val="12"/>
+        </w:rPr>
+      </w:pPr>
+    </w:p>
+    <w:p>
+      <w:pPr>
+        <w:ind w:left="3828"/>
+      </w:pPr>
+      <w:r>
+        <w:t>Члены комиссии:</w:t>
+      </w:r>
+      <w:r>
+        <w:tab/>
+      </w:r>
+      <w:r>
+        <w:tab/>
+      </w:r>
+      <w:r>
+        <w:tab/>
+      </w:r>
+      <w:r>
+        <w:tab/>
+      </w:r>
+      <w:r>
+        <w:tab/>
+        <w:t>/ Е.С. Воробьева /</w:t>
+      </w:r>
+    </w:p>
+    <w:p>
+      <w:pPr>
+        <w:ind w:left="3828"/>
+        <w:rPr>
+          <w:sz w:val="12"/>
+          <w:szCs w:val="12"/>
+        </w:rPr>
+      </w:pPr>
+    </w:p>
+    <w:p>
+      <w:pPr>
+        <w:ind w:left="3828"/>
+      </w:pPr>
+      <w:r>
+        <w:tab/>
+      </w:r>
+      <w:r>
+        <w:tab/>
+      </w:r>
+      <w:r>
+        <w:tab/>
+      </w:r>
+      <w:r>
+        <w:tab/>
+      </w:r>
+      <w:r>
+        <w:tab/>
+      </w:r>
+      <w:r>
+        <w:tab/>
+      </w:r>
+      <w:r>
+        <w:tab/>
+        <w:t xml:space="preserve">/ И.Ю. </w:t>
+      </w:r>
+      <w:proofErr w:type="spellStart"/>
+      <w:r>
+        <w:t>Шекшуева</w:t>
+      </w:r>
+      <w:proofErr w:type="spellEnd"/>
+      <w:r>
+        <w:t xml:space="preserve"> /</w:t>
+      </w:r>
+    </w:p>
+    <w:sectPr>
+      <w:headerReference w:type="default" r:id="rId7"/>
+      <w:footerReference w:type="default" r:id="rId8"/>
+      <w:pgSz w:w="16840" w:h="11900" w:orient="landscape"/>
+      <w:pgMar w:top="142" w:right="536" w:bottom="0" w:left="1134" w:header="709" w:footer="709" w:gutter="0"/>
+      <w:cols w:space="720"/>
+    </w:sectPr>
+  </w:body>
+</w:document>
 </file>
</xml_diff>

<commit_message>
Revert "Harden commission DOCX merge logic and remove template vMerge"
This reverts commit 986114bce3e0da98f3118d1ddc869a7b8426d8a2.
</commit_message>
<xml_diff>
--- a/backend/Protocol-comission-template.docx
+++ b/backend/Protocol-comission-template.docx
@@ -1520,6 +1520,7 @@
         <w:tc>
           <w:tcPr>
             <w:tcW w:w="1427" w:type="dxa"/>
+            <w:vMerge/>
             <w:tcBorders>
               <w:top w:val="single" w:sz="4" w:space="0" w:color="000000"/>
               <w:left w:val="single" w:sz="4" w:space="0" w:color="000000"/>
@@ -3549,1794 +3550,4 @@
   </a:objectDefaults>
   <a:extraClrSchemeLst/>
 </a:theme>
-</file>
-
-<file path=document.orig.xml><?xml version="1.0" encoding="utf-8"?>
-<w:document xmlns:wpc="http://schemas.microsoft.com/office/word/2010/wordprocessingCanvas" xmlns:cx="http://schemas.microsoft.com/office/drawing/2014/chartex" xmlns:cx1="http://schemas.microsoft.com/office/drawing/2015/9/8/chartex" xmlns:cx2="http://schemas.microsoft.com/office/drawing/2015/10/21/chartex" xmlns:cx3="http://schemas.microsoft.com/office/drawing/2016/5/9/chartex" xmlns:cx4="http://schemas.microsoft.com/office/drawing/2016/5/10/chartex" xmlns:cx5="http://schemas.microsoft.com/office/drawing/2016/5/11/chartex" xmlns:cx6="http://schemas.microsoft.com/office/drawing/2016/5/12/chartex" xmlns:cx7="http://schemas.microsoft.com/office/drawing/2016/5/13/chartex" xmlns:cx8="http://schemas.microsoft.com/office/drawing/2016/5/14/chartex" xmlns:mc="http://schemas.openxmlformats.org/markup-compatibility/2006" xmlns:aink="http://schemas.microsoft.com/office/drawing/2016/ink" xmlns:am3d="http://schemas.microsoft.com/office/drawing/2017/model3d" xmlns:o="urn:schemas-microsoft-com:office:office" xmlns:oel="http://schemas.microsoft.com/office/2019/extlst" xmlns:r="http://schemas.openxmlformats.org/officeDocument/2006/relationships" xmlns:m="http://schemas.openxmlformats.org/officeDocument/2006/math" xmlns:v="urn:schemas-microsoft-com:vml" xmlns:wp14="http://schemas.microsoft.com/office/word/2010/wordprocessingDrawing" xmlns:wp="http://schemas.openxmlformats.org/drawingml/2006/wordprocessingDrawing" xmlns:w10="urn:schemas-microsoft-com:office:word" xmlns:w="http://schemas.openxmlformats.org/wordprocessingml/2006/main" xmlns:w14="http://schemas.microsoft.com/office/word/2010/wordml" xmlns:w15="http://schemas.microsoft.com/office/word/2012/wordml" xmlns:w16cex="http://schemas.microsoft.com/office/word/2018/wordml/cex" xmlns:w16cid="http://schemas.microsoft.com/office/word/2016/wordml/cid" xmlns:w16="http://schemas.microsoft.com/office/word/2018/wordml" xmlns:w16sdtdh="http://schemas.microsoft.com/office/word/2020/wordml/sdtdatahash" xmlns:w16se="http://schemas.microsoft.com/office/word/2015/wordml/symex" xmlns:wpg="http://schemas.microsoft.com/office/word/2010/wordprocessingGroup" xmlns:wpi="http://schemas.microsoft.com/office/word/2010/wordprocessingInk" xmlns:wne="http://schemas.microsoft.com/office/word/2006/wordml" xmlns:wps="http://schemas.microsoft.com/office/word/2010/wordprocessingShape" mc:Ignorable="w14 w15 w16se w16cid w16 w16cex w16sdtdh wp14">
-  <w:body>
-    <w:p>
-      <w:pPr>
-        <w:jc w:val="center"/>
-        <w:rPr>
-          <w:b/>
-          <w:bCs/>
-          <w:sz w:val="28"/>
-          <w:szCs w:val="28"/>
-          <w:lang w:val="en-US"/>
-        </w:rPr>
-      </w:pPr>
-      <w:r>
-        <w:rPr>
-          <w:b/>
-          <w:bCs/>
-          <w:sz w:val="28"/>
-          <w:szCs w:val="28"/>
-          <w:lang w:val="en-US"/>
-        </w:rPr>
-        <w:t>{</w:t>
-      </w:r>
-      <w:proofErr w:type="spellStart"/>
-      <w:r>
-        <w:rPr>
-          <w:b/>
-          <w:bCs/>
-          <w:sz w:val="28"/>
-          <w:szCs w:val="28"/>
-          <w:lang w:val="en-US"/>
-        </w:rPr>
-        <w:t>moisei_name</w:t>
-      </w:r>
-      <w:proofErr w:type="spellEnd"/>
-      <w:r>
-        <w:rPr>
-          <w:b/>
-          <w:bCs/>
-          <w:sz w:val="28"/>
-          <w:szCs w:val="28"/>
-          <w:lang w:val="en-US"/>
-        </w:rPr>
-        <w:t>}</w:t>
-      </w:r>
-    </w:p>
-    <w:p>
-      <w:pPr>
-        <w:jc w:val="center"/>
-        <w:rPr>
-          <w:b/>
-          <w:bCs/>
-          <w:sz w:val="22"/>
-          <w:szCs w:val="22"/>
-        </w:rPr>
-      </w:pPr>
-    </w:p>
-    <w:p>
-      <w:pPr>
-        <w:jc w:val="center"/>
-        <w:rPr>
-          <w:b/>
-          <w:bCs/>
-          <w:sz w:val="28"/>
-          <w:szCs w:val="28"/>
-        </w:rPr>
-      </w:pPr>
-      <w:r>
-        <w:rPr>
-          <w:b/>
-          <w:bCs/>
-          <w:sz w:val="28"/>
-          <w:szCs w:val="28"/>
-        </w:rPr>
-        <w:t xml:space="preserve">П Р О Т О К О Л    </w:t>
-      </w:r>
-      <w:proofErr w:type="gramStart"/>
-      <w:r>
-        <w:rPr>
-          <w:b/>
-          <w:bCs/>
-          <w:sz w:val="28"/>
-          <w:szCs w:val="28"/>
-        </w:rPr>
-        <w:t xml:space="preserve">№  </w:t>
-      </w:r>
-      <w:r>
-        <w:rPr>
-          <w:b/>
-          <w:bCs/>
-          <w:sz w:val="28"/>
-          <w:szCs w:val="28"/>
-        </w:rPr>
-        <w:t>{</w:t>
-      </w:r>
-      <w:proofErr w:type="gramEnd"/>
-      <w:r>
-        <w:rPr>
-          <w:b/>
-          <w:bCs/>
-          <w:sz w:val="28"/>
-          <w:szCs w:val="28"/>
-          <w:lang w:val="en-US"/>
-        </w:rPr>
-        <w:t>group</w:t>
-      </w:r>
-      <w:r>
-        <w:rPr>
-          <w:b/>
-          <w:bCs/>
-          <w:sz w:val="28"/>
-          <w:szCs w:val="28"/>
-        </w:rPr>
-        <w:t>_</w:t>
-      </w:r>
-      <w:r>
-        <w:rPr>
-          <w:b/>
-          <w:bCs/>
-          <w:sz w:val="28"/>
-          <w:szCs w:val="28"/>
-          <w:lang w:val="en-US"/>
-        </w:rPr>
-        <w:t>id</w:t>
-      </w:r>
-      <w:r>
-        <w:rPr>
-          <w:b/>
-          <w:bCs/>
-          <w:sz w:val="28"/>
-          <w:szCs w:val="28"/>
-        </w:rPr>
-        <w:t>}</w:t>
-      </w:r>
-      <w:r>
-        <w:rPr>
-          <w:b/>
-          <w:bCs/>
-          <w:sz w:val="28"/>
-          <w:szCs w:val="28"/>
-        </w:rPr>
-        <w:t xml:space="preserve">  от  </w:t>
-      </w:r>
-      <w:r>
-        <w:rPr>
-          <w:b/>
-          <w:bCs/>
-          <w:sz w:val="28"/>
-          <w:szCs w:val="28"/>
-        </w:rPr>
-        <w:t>{</w:t>
-      </w:r>
-      <w:r>
-        <w:rPr>
-          <w:b/>
-          <w:bCs/>
-          <w:sz w:val="28"/>
-          <w:szCs w:val="28"/>
-          <w:lang w:val="en-US"/>
-        </w:rPr>
-        <w:t>end</w:t>
-      </w:r>
-      <w:r>
-        <w:rPr>
-          <w:b/>
-          <w:bCs/>
-          <w:sz w:val="28"/>
-          <w:szCs w:val="28"/>
-        </w:rPr>
-        <w:t>_</w:t>
-      </w:r>
-      <w:r>
-        <w:rPr>
-          <w:b/>
-          <w:bCs/>
-          <w:sz w:val="28"/>
-          <w:szCs w:val="28"/>
-          <w:lang w:val="en-US"/>
-        </w:rPr>
-        <w:t>date</w:t>
-      </w:r>
-      <w:r>
-        <w:rPr>
-          <w:b/>
-          <w:bCs/>
-          <w:sz w:val="28"/>
-          <w:szCs w:val="28"/>
-        </w:rPr>
-        <w:t>}</w:t>
-      </w:r>
-    </w:p>
-    <w:p>
-      <w:pPr>
-        <w:jc w:val="center"/>
-        <w:rPr>
-          <w:b/>
-          <w:bCs/>
-          <w:sz w:val="28"/>
-          <w:szCs w:val="28"/>
-        </w:rPr>
-      </w:pPr>
-      <w:r>
-        <w:rPr>
-          <w:b/>
-          <w:bCs/>
-          <w:sz w:val="28"/>
-          <w:szCs w:val="28"/>
-        </w:rPr>
-        <w:t>заседания комиссии по проверке знаний</w:t>
-      </w:r>
-    </w:p>
-    <w:p>
-      <w:pPr>
-        <w:rPr>
-          <w:sz w:val="18"/>
-          <w:szCs w:val="18"/>
-        </w:rPr>
-      </w:pPr>
-    </w:p>
-    <w:p>
-      <w:r>
-        <w:t>В соответствии с приказом директора от «01» сентября 2022 г. № 10 комиссия в составе:</w:t>
-      </w:r>
-    </w:p>
-    <w:p>
-      <w:pPr>
-        <w:rPr>
-          <w:sz w:val="22"/>
-          <w:szCs w:val="22"/>
-        </w:rPr>
-      </w:pPr>
-    </w:p>
-    <w:p>
-      <w:r>
-        <w:rPr>
-          <w:b/>
-          <w:bCs/>
-        </w:rPr>
-        <w:t>Председатель комиссии:</w:t>
-      </w:r>
-      <w:r>
-        <w:tab/>
-      </w:r>
-      <w:proofErr w:type="spellStart"/>
-      <w:r>
-        <w:t>Шекшуев</w:t>
-      </w:r>
-      <w:proofErr w:type="spellEnd"/>
-      <w:r>
-        <w:t xml:space="preserve"> В.М.. - директор</w:t>
-      </w:r>
-    </w:p>
-    <w:p>
-      <w:r>
-        <w:rPr>
-          <w:b/>
-          <w:bCs/>
-        </w:rPr>
-        <w:t>Члены комиссии:</w:t>
-      </w:r>
-      <w:r>
-        <w:rPr>
-          <w:b/>
-          <w:bCs/>
-        </w:rPr>
-        <w:tab/>
-      </w:r>
-      <w:r>
-        <w:tab/>
-        <w:t>Воробьева Е.С. – заместитель директора</w:t>
-      </w:r>
-    </w:p>
-    <w:p>
-      <w:r>
-        <w:tab/>
-      </w:r>
-      <w:r>
-        <w:tab/>
-      </w:r>
-      <w:r>
-        <w:tab/>
-      </w:r>
-      <w:r>
-        <w:tab/>
-      </w:r>
-      <w:proofErr w:type="spellStart"/>
-      <w:r>
-        <w:t>Шекшуева</w:t>
-      </w:r>
-      <w:proofErr w:type="spellEnd"/>
-      <w:r>
-        <w:t xml:space="preserve"> И.Ю. – специалист учебного центра</w:t>
-      </w:r>
-    </w:p>
-    <w:p>
-      <w:pPr>
-        <w:pStyle w:val="a4"/>
-        <w:tabs>
-          <w:tab w:val="left" w:pos="2694"/>
-        </w:tabs>
-        <w:rPr>
-          <w:sz w:val="22"/>
-          <w:szCs w:val="22"/>
-        </w:rPr>
-      </w:pPr>
-    </w:p>
-    <w:p>
-      <w:pPr>
-        <w:jc w:val="both"/>
-      </w:pPr>
-      <w:r>
-        <w:t>Проведена проверка знаний по программе: - «</w:t>
-      </w:r>
-      <w:r>
-        <w:t>{</w:t>
-      </w:r>
-      <w:r>
-        <w:rPr>
-          <w:lang w:val="en-US"/>
-        </w:rPr>
-        <w:t>course</w:t>
-      </w:r>
-      <w:r>
-        <w:t>_</w:t>
-      </w:r>
-      <w:r>
-        <w:rPr>
-          <w:lang w:val="en-US"/>
-        </w:rPr>
-        <w:t>name</w:t>
-      </w:r>
-      <w:r>
-        <w:t>}</w:t>
-      </w:r>
-      <w:r>
-        <w:t xml:space="preserve">» в объеме </w:t>
-      </w:r>
-      <w:r>
-        <w:t>{</w:t>
-      </w:r>
-      <w:r>
-        <w:rPr>
-          <w:lang w:val="en-US"/>
-        </w:rPr>
-        <w:t>hours</w:t>
-      </w:r>
-      <w:r>
-        <w:t>}</w:t>
-      </w:r>
-      <w:r>
-        <w:t xml:space="preserve"> часов;</w:t>
-      </w:r>
-    </w:p>
-    <w:p>
-      <w:pPr>
-        <w:jc w:val="both"/>
-        <w:rPr>
-          <w:sz w:val="22"/>
-          <w:szCs w:val="22"/>
-        </w:rPr>
-      </w:pPr>
-      <w:r>
-        <w:rPr>
-          <w:sz w:val="22"/>
-          <w:szCs w:val="22"/>
-        </w:rPr>
-        <w:t>- - «</w:t>
-      </w:r>
-      <w:r>
-        <w:rPr>
-          <w:sz w:val="22"/>
-          <w:szCs w:val="22"/>
-        </w:rPr>
-        <w:t>{</w:t>
-      </w:r>
-      <w:r>
-        <w:rPr>
-          <w:sz w:val="22"/>
-          <w:szCs w:val="22"/>
-          <w:lang w:val="en-US"/>
-        </w:rPr>
-        <w:t>course</w:t>
-      </w:r>
-      <w:r>
-        <w:rPr>
-          <w:sz w:val="22"/>
-          <w:szCs w:val="22"/>
-        </w:rPr>
-        <w:t>_</w:t>
-      </w:r>
-      <w:r>
-        <w:rPr>
-          <w:sz w:val="22"/>
-          <w:szCs w:val="22"/>
-          <w:lang w:val="en-US"/>
-        </w:rPr>
-        <w:t>name</w:t>
-      </w:r>
-      <w:r>
-        <w:rPr>
-          <w:sz w:val="22"/>
-          <w:szCs w:val="22"/>
-        </w:rPr>
-        <w:t>}</w:t>
-      </w:r>
-      <w:r>
-        <w:rPr>
-          <w:sz w:val="22"/>
-          <w:szCs w:val="22"/>
-        </w:rPr>
-        <w:t xml:space="preserve">» в объеме </w:t>
-      </w:r>
-      <w:r>
-        <w:rPr>
-          <w:sz w:val="22"/>
-          <w:szCs w:val="22"/>
-        </w:rPr>
-        <w:t>{</w:t>
-      </w:r>
-      <w:r>
-        <w:rPr>
-          <w:sz w:val="22"/>
-          <w:szCs w:val="22"/>
-          <w:lang w:val="en-US"/>
-        </w:rPr>
-        <w:t>hours</w:t>
-      </w:r>
-      <w:r>
-        <w:rPr>
-          <w:sz w:val="22"/>
-          <w:szCs w:val="22"/>
-        </w:rPr>
-        <w:t>}</w:t>
-      </w:r>
-      <w:r>
-        <w:rPr>
-          <w:sz w:val="22"/>
-          <w:szCs w:val="22"/>
-        </w:rPr>
-        <w:t xml:space="preserve"> часов:</w:t>
-      </w:r>
-    </w:p>
-    <w:tbl>
-      <w:tblPr>
-        <w:tblStyle w:val="TableNormal"/>
-        <w:tblW w:w="15603" w:type="dxa"/>
-        <w:tblInd w:w="-289" w:type="dxa"/>
-        <w:tblBorders>
-          <w:top w:val="single" w:sz="8" w:space="0" w:color="FFFFFF"/>
-          <w:left w:val="single" w:sz="8" w:space="0" w:color="FFFFFF"/>
-          <w:bottom w:val="single" w:sz="8" w:space="0" w:color="FFFFFF"/>
-          <w:right w:val="single" w:sz="8" w:space="0" w:color="FFFFFF"/>
-          <w:insideH w:val="single" w:sz="8" w:space="0" w:color="FFFFFF"/>
-          <w:insideV w:val="single" w:sz="8" w:space="0" w:color="FFFFFF"/>
-        </w:tblBorders>
-        <w:shd w:val="clear" w:color="auto" w:fill="CED7E7"/>
-        <w:tblLayout w:type="fixed"/>
-        <w:tblLook w:val="04A0" w:firstRow="1" w:lastRow="0" w:firstColumn="1" w:lastColumn="0" w:noHBand="0" w:noVBand="1"/>
-      </w:tblPr>
-      <w:tblGrid>
-        <w:gridCol w:w="923"/>
-        <w:gridCol w:w="2918"/>
-        <w:gridCol w:w="2379"/>
-        <w:gridCol w:w="3136"/>
-        <w:gridCol w:w="842"/>
-        <w:gridCol w:w="1621"/>
-        <w:gridCol w:w="1406"/>
-        <w:gridCol w:w="951"/>
-        <w:gridCol w:w="1427"/>
-      </w:tblGrid>
-      <w:tr>
-        <w:trPr>
-          <w:trHeight w:val="1046"/>
-        </w:trPr>
-        <w:tc>
-          <w:tcPr>
-            <w:tcW w:w="923" w:type="dxa"/>
-            <w:tcBorders>
-              <w:top w:val="single" w:sz="4" w:space="0" w:color="000000"/>
-              <w:left w:val="single" w:sz="4" w:space="0" w:color="000000"/>
-              <w:bottom w:val="single" w:sz="4" w:space="0" w:color="000000"/>
-              <w:right w:val="single" w:sz="4" w:space="0" w:color="000000"/>
-            </w:tcBorders>
-            <w:shd w:val="clear" w:color="auto" w:fill="auto"/>
-            <w:tcMar>
-              <w:top w:w="80" w:type="dxa"/>
-              <w:left w:w="80" w:type="dxa"/>
-              <w:bottom w:w="80" w:type="dxa"/>
-              <w:right w:w="80" w:type="dxa"/>
-            </w:tcMar>
-            <w:vAlign w:val="center"/>
-          </w:tcPr>
-          <w:p>
-            <w:pPr>
-              <w:jc w:val="center"/>
-            </w:pPr>
-            <w:r>
-              <w:rPr>
-                <w:sz w:val="22"/>
-                <w:szCs w:val="22"/>
-              </w:rPr>
-              <w:t>№</w:t>
-            </w:r>
-          </w:p>
-        </w:tc>
-        <w:tc>
-          <w:tcPr>
-            <w:tcW w:w="2918" w:type="dxa"/>
-            <w:tcBorders>
-              <w:top w:val="single" w:sz="4" w:space="0" w:color="000000"/>
-              <w:left w:val="single" w:sz="4" w:space="0" w:color="000000"/>
-              <w:bottom w:val="single" w:sz="4" w:space="0" w:color="000000"/>
-              <w:right w:val="single" w:sz="4" w:space="0" w:color="000000"/>
-            </w:tcBorders>
-            <w:shd w:val="clear" w:color="auto" w:fill="auto"/>
-            <w:tcMar>
-              <w:top w:w="80" w:type="dxa"/>
-              <w:left w:w="80" w:type="dxa"/>
-              <w:bottom w:w="80" w:type="dxa"/>
-              <w:right w:w="80" w:type="dxa"/>
-            </w:tcMar>
-            <w:vAlign w:val="center"/>
-          </w:tcPr>
-          <w:p>
-            <w:pPr>
-              <w:jc w:val="center"/>
-            </w:pPr>
-            <w:r>
-              <w:rPr>
-                <w:sz w:val="22"/>
-                <w:szCs w:val="22"/>
-              </w:rPr>
-              <w:t>Ф.И.О.</w:t>
-            </w:r>
-          </w:p>
-        </w:tc>
-        <w:tc>
-          <w:tcPr>
-            <w:tcW w:w="2379" w:type="dxa"/>
-            <w:tcBorders>
-              <w:top w:val="single" w:sz="4" w:space="0" w:color="000000"/>
-              <w:left w:val="single" w:sz="4" w:space="0" w:color="000000"/>
-              <w:bottom w:val="single" w:sz="4" w:space="0" w:color="000000"/>
-              <w:right w:val="single" w:sz="4" w:space="0" w:color="000000"/>
-            </w:tcBorders>
-            <w:shd w:val="clear" w:color="auto" w:fill="auto"/>
-            <w:tcMar>
-              <w:top w:w="80" w:type="dxa"/>
-              <w:left w:w="80" w:type="dxa"/>
-              <w:bottom w:w="80" w:type="dxa"/>
-              <w:right w:w="80" w:type="dxa"/>
-            </w:tcMar>
-            <w:vAlign w:val="center"/>
-          </w:tcPr>
-          <w:p>
-            <w:pPr>
-              <w:jc w:val="center"/>
-            </w:pPr>
-            <w:r>
-              <w:rPr>
-                <w:sz w:val="22"/>
-                <w:szCs w:val="22"/>
-              </w:rPr>
-              <w:t>Наименование предприятия</w:t>
-            </w:r>
-          </w:p>
-        </w:tc>
-        <w:tc>
-          <w:tcPr>
-            <w:tcW w:w="3136" w:type="dxa"/>
-            <w:tcBorders>
-              <w:top w:val="single" w:sz="4" w:space="0" w:color="000000"/>
-              <w:left w:val="single" w:sz="4" w:space="0" w:color="000000"/>
-              <w:bottom w:val="single" w:sz="4" w:space="0" w:color="000000"/>
-              <w:right w:val="single" w:sz="4" w:space="0" w:color="000000"/>
-            </w:tcBorders>
-            <w:shd w:val="clear" w:color="auto" w:fill="auto"/>
-            <w:tcMar>
-              <w:top w:w="80" w:type="dxa"/>
-              <w:left w:w="80" w:type="dxa"/>
-              <w:bottom w:w="80" w:type="dxa"/>
-              <w:right w:w="80" w:type="dxa"/>
-            </w:tcMar>
-            <w:vAlign w:val="center"/>
-          </w:tcPr>
-          <w:p>
-            <w:pPr>
-              <w:jc w:val="center"/>
-            </w:pPr>
-            <w:r>
-              <w:rPr>
-                <w:sz w:val="22"/>
-                <w:szCs w:val="22"/>
-              </w:rPr>
-              <w:t>Занимаемая должность</w:t>
-            </w:r>
-          </w:p>
-        </w:tc>
-        <w:tc>
-          <w:tcPr>
-            <w:tcW w:w="842" w:type="dxa"/>
-            <w:tcBorders>
-              <w:top w:val="single" w:sz="4" w:space="0" w:color="000000"/>
-              <w:left w:val="single" w:sz="4" w:space="0" w:color="000000"/>
-              <w:bottom w:val="single" w:sz="4" w:space="0" w:color="000000"/>
-              <w:right w:val="single" w:sz="4" w:space="0" w:color="000000"/>
-            </w:tcBorders>
-          </w:tcPr>
-          <w:p>
-            <w:pPr>
-              <w:jc w:val="center"/>
-              <w:rPr>
-                <w:sz w:val="22"/>
-                <w:szCs w:val="22"/>
-              </w:rPr>
-            </w:pPr>
-          </w:p>
-          <w:p>
-            <w:pPr>
-              <w:jc w:val="center"/>
-              <w:rPr>
-                <w:sz w:val="22"/>
-                <w:szCs w:val="22"/>
-              </w:rPr>
-            </w:pPr>
-          </w:p>
-          <w:p>
-            <w:pPr>
-              <w:jc w:val="center"/>
-              <w:rPr>
-                <w:sz w:val="22"/>
-                <w:szCs w:val="22"/>
-              </w:rPr>
-            </w:pPr>
-          </w:p>
-          <w:p>
-            <w:pPr>
-              <w:jc w:val="center"/>
-              <w:rPr>
-                <w:sz w:val="22"/>
-                <w:szCs w:val="22"/>
-              </w:rPr>
-            </w:pPr>
-            <w:r>
-              <w:rPr>
-                <w:sz w:val="22"/>
-                <w:szCs w:val="22"/>
-              </w:rPr>
-              <w:t>Номер билета</w:t>
-            </w:r>
-          </w:p>
-        </w:tc>
-        <w:tc>
-          <w:tcPr>
-            <w:tcW w:w="1621" w:type="dxa"/>
-            <w:tcBorders>
-              <w:top w:val="single" w:sz="4" w:space="0" w:color="000000"/>
-              <w:left w:val="single" w:sz="4" w:space="0" w:color="000000"/>
-              <w:bottom w:val="single" w:sz="4" w:space="0" w:color="000000"/>
-              <w:right w:val="single" w:sz="4" w:space="0" w:color="000000"/>
-            </w:tcBorders>
-            <w:shd w:val="clear" w:color="auto" w:fill="auto"/>
-            <w:tcMar>
-              <w:top w:w="80" w:type="dxa"/>
-              <w:left w:w="80" w:type="dxa"/>
-              <w:bottom w:w="80" w:type="dxa"/>
-              <w:right w:w="80" w:type="dxa"/>
-            </w:tcMar>
-            <w:vAlign w:val="center"/>
-          </w:tcPr>
-          <w:p>
-            <w:pPr>
-              <w:jc w:val="center"/>
-            </w:pPr>
-            <w:r>
-              <w:rPr>
-                <w:sz w:val="22"/>
-                <w:szCs w:val="22"/>
-              </w:rPr>
-              <w:t>Результат проверки знаний</w:t>
-            </w:r>
-          </w:p>
-        </w:tc>
-        <w:tc>
-          <w:tcPr>
-            <w:tcW w:w="1406" w:type="dxa"/>
-            <w:tcBorders>
-              <w:top w:val="single" w:sz="4" w:space="0" w:color="000000"/>
-              <w:left w:val="single" w:sz="4" w:space="0" w:color="000000"/>
-              <w:bottom w:val="single" w:sz="4" w:space="0" w:color="000000"/>
-              <w:right w:val="single" w:sz="4" w:space="0" w:color="000000"/>
-            </w:tcBorders>
-            <w:shd w:val="clear" w:color="auto" w:fill="auto"/>
-            <w:tcMar>
-              <w:top w:w="80" w:type="dxa"/>
-              <w:left w:w="80" w:type="dxa"/>
-              <w:bottom w:w="80" w:type="dxa"/>
-              <w:right w:w="80" w:type="dxa"/>
-            </w:tcMar>
-            <w:vAlign w:val="center"/>
-          </w:tcPr>
-          <w:p>
-            <w:pPr>
-              <w:jc w:val="center"/>
-            </w:pPr>
-            <w:r>
-              <w:rPr>
-                <w:sz w:val="22"/>
-                <w:szCs w:val="22"/>
-              </w:rPr>
-              <w:t>Регистрационный номер записи о проверке знаний в реестре обученных лиц</w:t>
-            </w:r>
-          </w:p>
-        </w:tc>
-        <w:tc>
-          <w:tcPr>
-            <w:tcW w:w="951" w:type="dxa"/>
-            <w:tcBorders>
-              <w:top w:val="single" w:sz="4" w:space="0" w:color="000000"/>
-              <w:left w:val="single" w:sz="4" w:space="0" w:color="000000"/>
-              <w:bottom w:val="single" w:sz="4" w:space="0" w:color="000000"/>
-              <w:right w:val="single" w:sz="4" w:space="0" w:color="000000"/>
-            </w:tcBorders>
-            <w:shd w:val="clear" w:color="auto" w:fill="auto"/>
-            <w:tcMar>
-              <w:top w:w="80" w:type="dxa"/>
-              <w:left w:w="80" w:type="dxa"/>
-              <w:bottom w:w="80" w:type="dxa"/>
-              <w:right w:w="80" w:type="dxa"/>
-            </w:tcMar>
-            <w:vAlign w:val="center"/>
-          </w:tcPr>
-          <w:p>
-            <w:pPr>
-              <w:jc w:val="center"/>
-            </w:pPr>
-            <w:r>
-              <w:rPr>
-                <w:sz w:val="22"/>
-                <w:szCs w:val="22"/>
-              </w:rPr>
-              <w:t>Подпись проверяемого</w:t>
-            </w:r>
-          </w:p>
-        </w:tc>
-        <w:tc>
-          <w:tcPr>
-            <w:tcW w:w="1427" w:type="dxa"/>
-            <w:tcBorders>
-              <w:top w:val="single" w:sz="4" w:space="0" w:color="000000"/>
-              <w:left w:val="single" w:sz="4" w:space="0" w:color="000000"/>
-              <w:bottom w:val="single" w:sz="4" w:space="0" w:color="000000"/>
-              <w:right w:val="single" w:sz="4" w:space="0" w:color="000000"/>
-            </w:tcBorders>
-          </w:tcPr>
-          <w:p>
-            <w:pPr>
-              <w:jc w:val="center"/>
-              <w:rPr>
-                <w:sz w:val="22"/>
-                <w:szCs w:val="22"/>
-              </w:rPr>
-            </w:pPr>
-          </w:p>
-          <w:p>
-            <w:pPr>
-              <w:jc w:val="center"/>
-              <w:rPr>
-                <w:sz w:val="22"/>
-                <w:szCs w:val="22"/>
-              </w:rPr>
-            </w:pPr>
-          </w:p>
-          <w:p>
-            <w:pPr>
-              <w:jc w:val="center"/>
-              <w:rPr>
-                <w:sz w:val="22"/>
-                <w:szCs w:val="22"/>
-              </w:rPr>
-            </w:pPr>
-            <w:r>
-              <w:rPr>
-                <w:sz w:val="22"/>
-                <w:szCs w:val="22"/>
-              </w:rPr>
-              <w:t>Заключение экзаменационной</w:t>
-            </w:r>
-          </w:p>
-          <w:p>
-            <w:pPr>
-              <w:jc w:val="center"/>
-              <w:rPr>
-                <w:sz w:val="22"/>
-                <w:szCs w:val="22"/>
-              </w:rPr>
-            </w:pPr>
-            <w:r>
-              <w:rPr>
-                <w:sz w:val="22"/>
-                <w:szCs w:val="22"/>
-              </w:rPr>
-              <w:t>комиссии</w:t>
-            </w:r>
-          </w:p>
-          <w:p>
-            <w:pPr>
-              <w:rPr>
-                <w:sz w:val="22"/>
-                <w:szCs w:val="22"/>
-              </w:rPr>
-            </w:pPr>
-          </w:p>
-        </w:tc>
-      </w:tr>
-      <w:tr>
-        <w:trPr>
-          <w:trHeight w:val="230"/>
-        </w:trPr>
-        <w:tc>
-          <w:tcPr>
-            <w:tcW w:w="923" w:type="dxa"/>
-            <w:tcBorders>
-              <w:top w:val="single" w:sz="4" w:space="0" w:color="000000"/>
-              <w:left w:val="single" w:sz="4" w:space="0" w:color="000000"/>
-              <w:bottom w:val="single" w:sz="4" w:space="0" w:color="000000"/>
-              <w:right w:val="single" w:sz="4" w:space="0" w:color="000000"/>
-            </w:tcBorders>
-            <w:shd w:val="clear" w:color="auto" w:fill="auto"/>
-            <w:tcMar>
-              <w:top w:w="80" w:type="dxa"/>
-              <w:left w:w="80" w:type="dxa"/>
-              <w:bottom w:w="80" w:type="dxa"/>
-              <w:right w:w="80" w:type="dxa"/>
-            </w:tcMar>
-            <w:vAlign w:val="center"/>
-          </w:tcPr>
-          <w:p>
-            <w:pPr>
-              <w:jc w:val="center"/>
-            </w:pPr>
-            <w:r>
-              <w:rPr>
-                <w:sz w:val="22"/>
-                <w:szCs w:val="22"/>
-              </w:rPr>
-              <w:t>1</w:t>
-            </w:r>
-          </w:p>
-        </w:tc>
-        <w:tc>
-          <w:tcPr>
-            <w:tcW w:w="2918" w:type="dxa"/>
-            <w:tcBorders>
-              <w:top w:val="single" w:sz="4" w:space="0" w:color="000000"/>
-              <w:left w:val="single" w:sz="4" w:space="0" w:color="000000"/>
-              <w:bottom w:val="single" w:sz="4" w:space="0" w:color="000000"/>
-              <w:right w:val="single" w:sz="4" w:space="0" w:color="000000"/>
-            </w:tcBorders>
-            <w:shd w:val="clear" w:color="auto" w:fill="auto"/>
-            <w:tcMar>
-              <w:top w:w="80" w:type="dxa"/>
-              <w:left w:w="80" w:type="dxa"/>
-              <w:bottom w:w="80" w:type="dxa"/>
-              <w:right w:w="80" w:type="dxa"/>
-            </w:tcMar>
-            <w:vAlign w:val="center"/>
-          </w:tcPr>
-          <w:p>
-            <w:pPr>
-              <w:jc w:val="center"/>
-            </w:pPr>
-            <w:r>
-              <w:rPr>
-                <w:sz w:val="22"/>
-                <w:szCs w:val="22"/>
-              </w:rPr>
-              <w:t>2</w:t>
-            </w:r>
-          </w:p>
-        </w:tc>
-        <w:tc>
-          <w:tcPr>
-            <w:tcW w:w="2379" w:type="dxa"/>
-            <w:tcBorders>
-              <w:top w:val="single" w:sz="4" w:space="0" w:color="000000"/>
-              <w:left w:val="single" w:sz="4" w:space="0" w:color="000000"/>
-              <w:bottom w:val="single" w:sz="4" w:space="0" w:color="auto"/>
-              <w:right w:val="single" w:sz="4" w:space="0" w:color="000000"/>
-            </w:tcBorders>
-            <w:shd w:val="clear" w:color="auto" w:fill="auto"/>
-            <w:tcMar>
-              <w:top w:w="80" w:type="dxa"/>
-              <w:left w:w="80" w:type="dxa"/>
-              <w:bottom w:w="80" w:type="dxa"/>
-              <w:right w:w="80" w:type="dxa"/>
-            </w:tcMar>
-            <w:vAlign w:val="center"/>
-          </w:tcPr>
-          <w:p>
-            <w:pPr>
-              <w:jc w:val="center"/>
-            </w:pPr>
-            <w:r>
-              <w:rPr>
-                <w:sz w:val="22"/>
-                <w:szCs w:val="22"/>
-              </w:rPr>
-              <w:t>3</w:t>
-            </w:r>
-          </w:p>
-        </w:tc>
-        <w:tc>
-          <w:tcPr>
-            <w:tcW w:w="3136" w:type="dxa"/>
-            <w:tcBorders>
-              <w:top w:val="single" w:sz="4" w:space="0" w:color="000000"/>
-              <w:left w:val="single" w:sz="4" w:space="0" w:color="000000"/>
-              <w:bottom w:val="single" w:sz="4" w:space="0" w:color="auto"/>
-              <w:right w:val="single" w:sz="4" w:space="0" w:color="000000"/>
-            </w:tcBorders>
-            <w:shd w:val="clear" w:color="auto" w:fill="auto"/>
-            <w:tcMar>
-              <w:top w:w="80" w:type="dxa"/>
-              <w:left w:w="80" w:type="dxa"/>
-              <w:bottom w:w="80" w:type="dxa"/>
-              <w:right w:w="80" w:type="dxa"/>
-            </w:tcMar>
-            <w:vAlign w:val="center"/>
-          </w:tcPr>
-          <w:p>
-            <w:pPr>
-              <w:jc w:val="center"/>
-            </w:pPr>
-            <w:r>
-              <w:rPr>
-                <w:sz w:val="22"/>
-                <w:szCs w:val="22"/>
-              </w:rPr>
-              <w:t>4</w:t>
-            </w:r>
-          </w:p>
-        </w:tc>
-        <w:tc>
-          <w:tcPr>
-            <w:tcW w:w="842" w:type="dxa"/>
-            <w:tcBorders>
-              <w:top w:val="single" w:sz="4" w:space="0" w:color="000000"/>
-              <w:left w:val="single" w:sz="4" w:space="0" w:color="000000"/>
-              <w:bottom w:val="single" w:sz="4" w:space="0" w:color="000000"/>
-              <w:right w:val="single" w:sz="4" w:space="0" w:color="000000"/>
-            </w:tcBorders>
-          </w:tcPr>
-          <w:p>
-            <w:pPr>
-              <w:jc w:val="center"/>
-              <w:rPr>
-                <w:sz w:val="22"/>
-                <w:szCs w:val="22"/>
-              </w:rPr>
-            </w:pPr>
-            <w:r>
-              <w:rPr>
-                <w:sz w:val="22"/>
-                <w:szCs w:val="22"/>
-              </w:rPr>
-              <w:t>5</w:t>
-            </w:r>
-          </w:p>
-        </w:tc>
-        <w:tc>
-          <w:tcPr>
-            <w:tcW w:w="1621" w:type="dxa"/>
-            <w:tcBorders>
-              <w:top w:val="single" w:sz="4" w:space="0" w:color="000000"/>
-              <w:left w:val="single" w:sz="4" w:space="0" w:color="000000"/>
-              <w:bottom w:val="single" w:sz="4" w:space="0" w:color="000000"/>
-              <w:right w:val="single" w:sz="4" w:space="0" w:color="000000"/>
-            </w:tcBorders>
-            <w:shd w:val="clear" w:color="auto" w:fill="auto"/>
-            <w:tcMar>
-              <w:top w:w="80" w:type="dxa"/>
-              <w:left w:w="80" w:type="dxa"/>
-              <w:bottom w:w="80" w:type="dxa"/>
-              <w:right w:w="80" w:type="dxa"/>
-            </w:tcMar>
-            <w:vAlign w:val="center"/>
-          </w:tcPr>
-          <w:p>
-            <w:pPr>
-              <w:jc w:val="center"/>
-            </w:pPr>
-            <w:r>
-              <w:rPr>
-                <w:sz w:val="22"/>
-                <w:szCs w:val="22"/>
-              </w:rPr>
-              <w:t>6</w:t>
-            </w:r>
-          </w:p>
-        </w:tc>
-        <w:tc>
-          <w:tcPr>
-            <w:tcW w:w="1406" w:type="dxa"/>
-            <w:tcBorders>
-              <w:top w:val="single" w:sz="4" w:space="0" w:color="000000"/>
-              <w:left w:val="single" w:sz="4" w:space="0" w:color="000000"/>
-              <w:bottom w:val="single" w:sz="4" w:space="0" w:color="000000"/>
-              <w:right w:val="single" w:sz="4" w:space="0" w:color="000000"/>
-            </w:tcBorders>
-            <w:shd w:val="clear" w:color="auto" w:fill="auto"/>
-            <w:tcMar>
-              <w:top w:w="80" w:type="dxa"/>
-              <w:left w:w="80" w:type="dxa"/>
-              <w:bottom w:w="80" w:type="dxa"/>
-              <w:right w:w="80" w:type="dxa"/>
-            </w:tcMar>
-            <w:vAlign w:val="center"/>
-          </w:tcPr>
-          <w:p>
-            <w:pPr>
-              <w:jc w:val="center"/>
-            </w:pPr>
-            <w:r>
-              <w:rPr>
-                <w:sz w:val="22"/>
-                <w:szCs w:val="22"/>
-              </w:rPr>
-              <w:t>7</w:t>
-            </w:r>
-          </w:p>
-        </w:tc>
-        <w:tc>
-          <w:tcPr>
-            <w:tcW w:w="951" w:type="dxa"/>
-            <w:tcBorders>
-              <w:top w:val="single" w:sz="4" w:space="0" w:color="000000"/>
-              <w:left w:val="single" w:sz="4" w:space="0" w:color="000000"/>
-              <w:bottom w:val="single" w:sz="4" w:space="0" w:color="000000"/>
-              <w:right w:val="single" w:sz="4" w:space="0" w:color="000000"/>
-            </w:tcBorders>
-            <w:shd w:val="clear" w:color="auto" w:fill="auto"/>
-            <w:tcMar>
-              <w:top w:w="80" w:type="dxa"/>
-              <w:left w:w="80" w:type="dxa"/>
-              <w:bottom w:w="80" w:type="dxa"/>
-              <w:right w:w="80" w:type="dxa"/>
-            </w:tcMar>
-            <w:vAlign w:val="center"/>
-          </w:tcPr>
-          <w:p>
-            <w:pPr>
-              <w:jc w:val="center"/>
-              <w:rPr>
-                <w:lang w:val="en-US"/>
-              </w:rPr>
-            </w:pPr>
-            <w:r>
-              <w:rPr>
-                <w:sz w:val="22"/>
-                <w:szCs w:val="22"/>
-                <w:lang w:val="en-US"/>
-              </w:rPr>
-              <w:t>8</w:t>
-            </w:r>
-          </w:p>
-        </w:tc>
-        <w:tc>
-          <w:tcPr>
-            <w:tcW w:w="1427" w:type="dxa"/>
-            <w:tcBorders>
-              <w:top w:val="single" w:sz="4" w:space="0" w:color="000000"/>
-              <w:left w:val="single" w:sz="4" w:space="0" w:color="000000"/>
-              <w:bottom w:val="single" w:sz="4" w:space="0" w:color="000000"/>
-              <w:right w:val="single" w:sz="4" w:space="0" w:color="000000"/>
-            </w:tcBorders>
-          </w:tcPr>
-          <w:p>
-            <w:pPr>
-              <w:jc w:val="center"/>
-              <w:rPr>
-                <w:sz w:val="22"/>
-                <w:szCs w:val="22"/>
-              </w:rPr>
-            </w:pPr>
-            <w:r>
-              <w:rPr>
-                <w:sz w:val="22"/>
-                <w:szCs w:val="22"/>
-              </w:rPr>
-              <w:t>9</w:t>
-            </w:r>
-          </w:p>
-        </w:tc>
-      </w:tr>
-      <w:tr>
-        <w:trPr>
-          <w:trHeight w:val="1862"/>
-        </w:trPr>
-        <w:tc>
-          <w:tcPr>
-            <w:tcW w:w="923" w:type="dxa"/>
-            <w:tcBorders>
-              <w:top w:val="single" w:sz="4" w:space="0" w:color="000000"/>
-              <w:left w:val="single" w:sz="4" w:space="0" w:color="000000"/>
-              <w:bottom w:val="single" w:sz="4" w:space="0" w:color="000000"/>
-              <w:right w:val="single" w:sz="4" w:space="0" w:color="000000"/>
-            </w:tcBorders>
-            <w:shd w:val="clear" w:color="auto" w:fill="auto"/>
-            <w:tcMar>
-              <w:top w:w="80" w:type="dxa"/>
-              <w:left w:w="80" w:type="dxa"/>
-              <w:bottom w:w="80" w:type="dxa"/>
-              <w:right w:w="80" w:type="dxa"/>
-            </w:tcMar>
-            <w:vAlign w:val="center"/>
-          </w:tcPr>
-          <w:p>
-            <w:pPr>
-              <w:pStyle w:val="a5"/>
-              <w:numPr>
-                <w:ilvl w:val="0"/>
-                <w:numId w:val="1"/>
-              </w:numPr>
-            </w:pPr>
-            <w:r>
-              <w:rPr>
-                <w:sz w:val="22"/>
-                <w:szCs w:val="22"/>
-                <w:lang w:val="en-US"/>
-              </w:rPr>
-              <w:t>{#employee}</w:t>
-            </w:r>
-          </w:p>
-        </w:tc>
-        <w:tc>
-          <w:tcPr>
-            <w:tcW w:w="2918" w:type="dxa"/>
-            <w:tcBorders>
-              <w:top w:val="single" w:sz="4" w:space="0" w:color="000000"/>
-              <w:left w:val="single" w:sz="4" w:space="0" w:color="000000"/>
-              <w:bottom w:val="single" w:sz="4" w:space="0" w:color="000000"/>
-              <w:right w:val="single" w:sz="4" w:space="0" w:color="auto"/>
-            </w:tcBorders>
-            <w:shd w:val="clear" w:color="auto" w:fill="auto"/>
-            <w:tcMar>
-              <w:top w:w="80" w:type="dxa"/>
-              <w:left w:w="80" w:type="dxa"/>
-              <w:bottom w:w="80" w:type="dxa"/>
-              <w:right w:w="80" w:type="dxa"/>
-            </w:tcMar>
-            <w:vAlign w:val="center"/>
-          </w:tcPr>
-          <w:p>
-            <w:pPr>
-              <w:rPr>
-                <w:lang w:val="en-US"/>
-              </w:rPr>
-            </w:pPr>
-            <w:r>
-              <w:rPr>
-                <w:sz w:val="22"/>
-                <w:szCs w:val="22"/>
-                <w:lang w:val="en-US"/>
-              </w:rPr>
-              <w:t>{</w:t>
-            </w:r>
-            <w:proofErr w:type="spellStart"/>
-            <w:r>
-              <w:rPr>
-                <w:sz w:val="22"/>
-                <w:szCs w:val="22"/>
-                <w:lang w:val="en-US"/>
-              </w:rPr>
-              <w:t>last_</w:t>
-            </w:r>
-            <w:r>
-              <w:rPr>
-                <w:sz w:val="22"/>
-                <w:szCs w:val="22"/>
-                <w:lang w:val="en-US"/>
-              </w:rPr>
-              <w:t>name</w:t>
-            </w:r>
-            <w:proofErr w:type="spellEnd"/>
-            <w:r>
-              <w:rPr>
-                <w:sz w:val="22"/>
-                <w:szCs w:val="22"/>
-                <w:lang w:val="en-US"/>
-              </w:rPr>
-              <w:t>} {name} {</w:t>
-            </w:r>
-            <w:proofErr w:type="spellStart"/>
-            <w:r>
-              <w:rPr>
-                <w:sz w:val="22"/>
-                <w:szCs w:val="22"/>
-                <w:lang w:val="en-US"/>
-              </w:rPr>
-              <w:t>middle_name</w:t>
-            </w:r>
-            <w:proofErr w:type="spellEnd"/>
-            <w:r>
-              <w:rPr>
-                <w:sz w:val="22"/>
-                <w:szCs w:val="22"/>
-                <w:lang w:val="en-US"/>
-              </w:rPr>
-              <w:t>}</w:t>
-            </w:r>
-          </w:p>
-        </w:tc>
-        <w:tc>
-          <w:tcPr>
-            <w:tcW w:w="2379" w:type="dxa"/>
-            <w:tcBorders>
-              <w:top w:val="single" w:sz="4" w:space="0" w:color="auto"/>
-              <w:left w:val="single" w:sz="4" w:space="0" w:color="auto"/>
-              <w:bottom w:val="single" w:sz="4" w:space="0" w:color="auto"/>
-              <w:right w:val="single" w:sz="4" w:space="0" w:color="auto"/>
-            </w:tcBorders>
-            <w:shd w:val="clear" w:color="auto" w:fill="auto"/>
-            <w:tcMar>
-              <w:top w:w="80" w:type="dxa"/>
-              <w:left w:w="80" w:type="dxa"/>
-              <w:bottom w:w="80" w:type="dxa"/>
-              <w:right w:w="80" w:type="dxa"/>
-            </w:tcMar>
-            <w:vAlign w:val="center"/>
-          </w:tcPr>
-          <w:p>
-            <w:pPr>
-              <w:jc w:val="center"/>
-            </w:pPr>
-            <w:r>
-              <w:rPr>
-                <w:sz w:val="22"/>
-                <w:szCs w:val="22"/>
-                <w:lang w:val="en-US"/>
-              </w:rPr>
-              <w:t>{</w:t>
-            </w:r>
-            <w:proofErr w:type="spellStart"/>
-            <w:r>
-              <w:rPr>
-                <w:sz w:val="22"/>
-                <w:szCs w:val="22"/>
-                <w:lang w:val="en-US"/>
-              </w:rPr>
-              <w:t>organization_name</w:t>
-            </w:r>
-            <w:proofErr w:type="spellEnd"/>
-            <w:r>
-              <w:rPr>
-                <w:sz w:val="22"/>
-                <w:szCs w:val="22"/>
-                <w:lang w:val="en-US"/>
-              </w:rPr>
-              <w:t>}</w:t>
-            </w:r>
-          </w:p>
-        </w:tc>
-        <w:tc>
-          <w:tcPr>
-            <w:tcW w:w="3136" w:type="dxa"/>
-            <w:tcBorders>
-              <w:top w:val="single" w:sz="4" w:space="0" w:color="auto"/>
-              <w:left w:val="single" w:sz="4" w:space="0" w:color="auto"/>
-              <w:bottom w:val="single" w:sz="4" w:space="0" w:color="auto"/>
-              <w:right w:val="single" w:sz="4" w:space="0" w:color="auto"/>
-            </w:tcBorders>
-            <w:shd w:val="clear" w:color="auto" w:fill="auto"/>
-            <w:tcMar>
-              <w:top w:w="80" w:type="dxa"/>
-              <w:left w:w="80" w:type="dxa"/>
-              <w:bottom w:w="80" w:type="dxa"/>
-              <w:right w:w="80" w:type="dxa"/>
-            </w:tcMar>
-            <w:vAlign w:val="center"/>
-          </w:tcPr>
-          <w:p>
-            <w:pPr>
-              <w:jc w:val="center"/>
-            </w:pPr>
-            <w:r>
-              <w:rPr>
-                <w:sz w:val="22"/>
-                <w:szCs w:val="22"/>
-                <w:lang w:val="en-US"/>
-              </w:rPr>
-              <w:t>{grade}</w:t>
-            </w:r>
-          </w:p>
-        </w:tc>
-        <w:tc>
-          <w:tcPr>
-            <w:tcW w:w="842" w:type="dxa"/>
-            <w:tcBorders>
-              <w:top w:val="single" w:sz="4" w:space="0" w:color="000000"/>
-              <w:left w:val="single" w:sz="4" w:space="0" w:color="auto"/>
-              <w:bottom w:val="single" w:sz="4" w:space="0" w:color="000000"/>
-              <w:right w:val="single" w:sz="4" w:space="0" w:color="auto"/>
-            </w:tcBorders>
-          </w:tcPr>
-          <w:p>
-            <w:pPr>
-              <w:jc w:val="center"/>
-              <w:rPr>
-                <w:i/>
-                <w:iCs/>
-                <w:sz w:val="22"/>
-                <w:szCs w:val="22"/>
-                <w:lang w:val="en-US"/>
-              </w:rPr>
-            </w:pPr>
-          </w:p>
-          <w:p>
-            <w:pPr>
-              <w:jc w:val="center"/>
-              <w:rPr>
-                <w:i/>
-                <w:iCs/>
-                <w:sz w:val="22"/>
-                <w:szCs w:val="22"/>
-                <w:lang w:val="en-US"/>
-              </w:rPr>
-            </w:pPr>
-          </w:p>
-          <w:p>
-            <w:pPr>
-              <w:jc w:val="center"/>
-              <w:rPr>
-                <w:i/>
-                <w:iCs/>
-                <w:sz w:val="22"/>
-                <w:szCs w:val="22"/>
-                <w:lang w:val="en-US"/>
-              </w:rPr>
-            </w:pPr>
-          </w:p>
-          <w:p>
-            <w:pPr>
-              <w:jc w:val="center"/>
-              <w:rPr>
-                <w:i/>
-                <w:iCs/>
-                <w:sz w:val="22"/>
-                <w:szCs w:val="22"/>
-                <w:lang w:val="en-US"/>
-              </w:rPr>
-            </w:pPr>
-          </w:p>
-          <w:p>
-            <w:pPr>
-              <w:jc w:val="center"/>
-              <w:rPr>
-                <w:i/>
-                <w:iCs/>
-                <w:sz w:val="22"/>
-                <w:szCs w:val="22"/>
-                <w:lang w:val="en-US"/>
-              </w:rPr>
-            </w:pPr>
-          </w:p>
-          <w:p>
-            <w:pPr>
-              <w:jc w:val="center"/>
-              <w:rPr>
-                <w:i/>
-                <w:iCs/>
-                <w:sz w:val="22"/>
-                <w:szCs w:val="22"/>
-                <w:lang w:val="en-US"/>
-              </w:rPr>
-            </w:pPr>
-            <w:r>
-              <w:rPr>
-                <w:i/>
-                <w:iCs/>
-                <w:sz w:val="22"/>
-                <w:szCs w:val="22"/>
-                <w:lang w:val="en-US"/>
-              </w:rPr>
-              <w:t>{</w:t>
-            </w:r>
-            <w:proofErr w:type="spellStart"/>
-            <w:r>
-              <w:rPr>
-                <w:i/>
-                <w:iCs/>
-                <w:sz w:val="22"/>
-                <w:szCs w:val="22"/>
-                <w:lang w:val="en-US"/>
-              </w:rPr>
-              <w:t>random_number</w:t>
-            </w:r>
-            <w:proofErr w:type="spellEnd"/>
-            <w:r>
-              <w:rPr>
-                <w:i/>
-                <w:iCs/>
-                <w:sz w:val="22"/>
-                <w:szCs w:val="22"/>
-                <w:lang w:val="en-US"/>
-              </w:rPr>
-              <w:t>}</w:t>
-            </w:r>
-          </w:p>
-        </w:tc>
-        <w:tc>
-          <w:tcPr>
-            <w:tcW w:w="1621" w:type="dxa"/>
-            <w:tcBorders>
-              <w:top w:val="single" w:sz="4" w:space="0" w:color="000000"/>
-              <w:left w:val="single" w:sz="4" w:space="0" w:color="auto"/>
-              <w:bottom w:val="single" w:sz="4" w:space="0" w:color="000000"/>
-              <w:right w:val="single" w:sz="4" w:space="0" w:color="000000"/>
-            </w:tcBorders>
-            <w:shd w:val="clear" w:color="auto" w:fill="auto"/>
-            <w:tcMar>
-              <w:top w:w="80" w:type="dxa"/>
-              <w:left w:w="80" w:type="dxa"/>
-              <w:bottom w:w="80" w:type="dxa"/>
-              <w:right w:w="80" w:type="dxa"/>
-            </w:tcMar>
-            <w:vAlign w:val="center"/>
-          </w:tcPr>
-          <w:p>
-            <w:pPr>
-              <w:jc w:val="center"/>
-              <w:rPr>
-                <w:lang w:val="en-US"/>
-              </w:rPr>
-            </w:pPr>
-            <w:r>
-              <w:rPr>
-                <w:i/>
-                <w:iCs/>
-                <w:sz w:val="22"/>
-                <w:szCs w:val="22"/>
-                <w:lang w:val="en-US"/>
-              </w:rPr>
-              <w:t>{</w:t>
-            </w:r>
-            <w:r>
-              <w:rPr>
-                <w:i/>
-                <w:iCs/>
-                <w:sz w:val="22"/>
-                <w:szCs w:val="22"/>
-              </w:rPr>
-              <w:t>c</w:t>
-            </w:r>
-            <w:proofErr w:type="spellStart"/>
-            <w:r>
-              <w:rPr>
-                <w:i/>
-                <w:iCs/>
-                <w:sz w:val="22"/>
-                <w:szCs w:val="22"/>
-                <w:lang w:val="en-US"/>
-              </w:rPr>
-              <w:t>ourses_mark</w:t>
-            </w:r>
-            <w:proofErr w:type="spellEnd"/>
-            <w:r>
-              <w:rPr>
-                <w:i/>
-                <w:iCs/>
-                <w:sz w:val="22"/>
-                <w:szCs w:val="22"/>
-              </w:rPr>
-              <w:t>}</w:t>
-            </w:r>
-          </w:p>
-        </w:tc>
-        <w:tc>
-          <w:tcPr>
-            <w:tcW w:w="1406" w:type="dxa"/>
-            <w:tcBorders>
-              <w:top w:val="single" w:sz="4" w:space="0" w:color="000000"/>
-              <w:left w:val="single" w:sz="4" w:space="0" w:color="000000"/>
-              <w:bottom w:val="single" w:sz="4" w:space="0" w:color="000000"/>
-              <w:right w:val="single" w:sz="4" w:space="0" w:color="000000"/>
-            </w:tcBorders>
-            <w:shd w:val="clear" w:color="auto" w:fill="auto"/>
-            <w:tcMar>
-              <w:top w:w="80" w:type="dxa"/>
-              <w:left w:w="80" w:type="dxa"/>
-              <w:bottom w:w="80" w:type="dxa"/>
-              <w:right w:w="80" w:type="dxa"/>
-            </w:tcMar>
-            <w:vAlign w:val="center"/>
-          </w:tcPr>
-          <w:p/>
-        </w:tc>
-        <w:tc>
-          <w:tcPr>
-            <w:tcW w:w="951" w:type="dxa"/>
-            <w:tcBorders>
-              <w:top w:val="single" w:sz="4" w:space="0" w:color="000000"/>
-              <w:left w:val="single" w:sz="4" w:space="0" w:color="000000"/>
-              <w:bottom w:val="single" w:sz="4" w:space="0" w:color="000000"/>
-              <w:right w:val="single" w:sz="4" w:space="0" w:color="000000"/>
-            </w:tcBorders>
-            <w:shd w:val="clear" w:color="auto" w:fill="auto"/>
-            <w:tcMar>
-              <w:top w:w="80" w:type="dxa"/>
-              <w:left w:w="80" w:type="dxa"/>
-              <w:bottom w:w="80" w:type="dxa"/>
-              <w:right w:w="80" w:type="dxa"/>
-            </w:tcMar>
-            <w:vAlign w:val="center"/>
-          </w:tcPr>
-          <w:p/>
-        </w:tc>
-        <w:tc>
-          <w:tcPr>
-            <w:tcW w:w="1427" w:type="dxa"/>
-            <w:vMerge/>
-            <w:tcBorders>
-              <w:top w:val="single" w:sz="4" w:space="0" w:color="000000"/>
-              <w:left w:val="single" w:sz="4" w:space="0" w:color="000000"/>
-              <w:bottom w:val="single" w:sz="4" w:space="0" w:color="000000"/>
-              <w:right w:val="single" w:sz="4" w:space="0" w:color="000000"/>
-            </w:tcBorders>
-          </w:tcPr>
-          <w:p>
-            <w:pPr>
-              <w:rPr>
-                <w:sz w:val="22"/>
-                <w:szCs w:val="22"/>
-              </w:rPr>
-            </w:pPr>
-          </w:p>
-          <w:p>
-            <w:pPr>
-              <w:rPr>
-                <w:sz w:val="22"/>
-                <w:szCs w:val="22"/>
-              </w:rPr>
-            </w:pPr>
-          </w:p>
-          <w:p>
-            <w:pPr>
-              <w:rPr>
-                <w:sz w:val="22"/>
-                <w:szCs w:val="22"/>
-              </w:rPr>
-            </w:pPr>
-          </w:p>
-          <w:p>
-            <w:pPr>
-              <w:rPr>
-                <w:sz w:val="22"/>
-                <w:szCs w:val="22"/>
-              </w:rPr>
-            </w:pPr>
-          </w:p>
-          <w:p>
-            <w:pPr>
-              <w:rPr>
-                <w:sz w:val="22"/>
-                <w:szCs w:val="22"/>
-                <w:lang w:val="en-US"/>
-              </w:rPr>
-            </w:pPr>
-            <w:r>
-              <w:rPr>
-                <w:sz w:val="22"/>
-                <w:szCs w:val="22"/>
-                <w:lang w:val="en-US"/>
-              </w:rPr>
-              <w:t xml:space="preserve"> </w:t>
-            </w:r>
-            <w:r>
-              <w:rPr>
-                <w:sz w:val="22"/>
-                <w:szCs w:val="22"/>
-              </w:rPr>
-              <w:t>{</w:t>
-            </w:r>
-            <w:proofErr w:type="spellStart"/>
-            <w:r>
-              <w:rPr>
-                <w:sz w:val="22"/>
-                <w:szCs w:val="22"/>
-              </w:rPr>
-              <w:t>conclusion</w:t>
-            </w:r>
-            <w:proofErr w:type="spellEnd"/>
-            <w:r>
-              <w:rPr>
-                <w:sz w:val="22"/>
-                <w:szCs w:val="22"/>
-                <w:lang w:val="en-US"/>
-              </w:rPr>
-              <w:t>}</w:t>
-            </w:r>
-            <w:r>
-              <w:rPr>
-                <w:i/>
-                <w:iCs/>
-                <w:sz w:val="22"/>
-                <w:szCs w:val="22"/>
-                <w:lang w:val="en-US"/>
-              </w:rPr>
-              <w:t>{/employee}</w:t>
-            </w:r>
-          </w:p>
-        </w:tc>
-      </w:tr>
-    </w:tbl>
-    <w:p>
-      <w:pPr>
-        <w:widowControl w:val="0"/>
-        <w:ind w:left="324" w:hanging="324"/>
-        <w:rPr>
-          <w:sz w:val="22"/>
-          <w:szCs w:val="22"/>
-        </w:rPr>
-      </w:pPr>
-    </w:p>
-    <w:p>
-      <w:pPr>
-        <w:widowControl w:val="0"/>
-        <w:ind w:left="216" w:hanging="216"/>
-        <w:rPr>
-          <w:sz w:val="22"/>
-          <w:szCs w:val="22"/>
-        </w:rPr>
-      </w:pPr>
-    </w:p>
-    <w:p>
-      <w:pPr>
-        <w:widowControl w:val="0"/>
-        <w:ind w:left="108" w:hanging="108"/>
-        <w:rPr>
-          <w:sz w:val="22"/>
-          <w:szCs w:val="22"/>
-        </w:rPr>
-      </w:pPr>
-    </w:p>
-    <w:p>
-      <w:pPr>
-        <w:widowControl w:val="0"/>
-        <w:jc w:val="both"/>
-        <w:rPr>
-          <w:sz w:val="22"/>
-          <w:szCs w:val="22"/>
-        </w:rPr>
-      </w:pPr>
-    </w:p>
-    <w:p>
-      <w:pPr>
-        <w:tabs>
-          <w:tab w:val="left" w:pos="2220"/>
-        </w:tabs>
-        <w:rPr>
-          <w:sz w:val="18"/>
-          <w:szCs w:val="18"/>
-        </w:rPr>
-      </w:pPr>
-      <w:r>
-        <w:rPr>
-          <w:sz w:val="28"/>
-          <w:szCs w:val="28"/>
-        </w:rPr>
-        <w:tab/>
-      </w:r>
-    </w:p>
-    <w:p>
-      <w:pPr>
-        <w:ind w:left="3828"/>
-      </w:pPr>
-      <w:r>
-        <w:t>Председатель комиссии:</w:t>
-      </w:r>
-      <w:r>
-        <w:tab/>
-      </w:r>
-      <w:r>
-        <w:tab/>
-      </w:r>
-      <w:r>
-        <w:tab/>
-      </w:r>
-      <w:r>
-        <w:tab/>
-        <w:t xml:space="preserve">/ В.М. </w:t>
-      </w:r>
-      <w:proofErr w:type="spellStart"/>
-      <w:r>
-        <w:t>Шекшуев</w:t>
-      </w:r>
-      <w:proofErr w:type="spellEnd"/>
-      <w:r>
-        <w:t xml:space="preserve"> /</w:t>
-      </w:r>
-    </w:p>
-    <w:p>
-      <w:pPr>
-        <w:ind w:left="3828"/>
-        <w:rPr>
-          <w:sz w:val="12"/>
-          <w:szCs w:val="12"/>
-        </w:rPr>
-      </w:pPr>
-    </w:p>
-    <w:p>
-      <w:pPr>
-        <w:ind w:left="3828"/>
-      </w:pPr>
-      <w:r>
-        <w:t>Члены комиссии:</w:t>
-      </w:r>
-      <w:r>
-        <w:tab/>
-      </w:r>
-      <w:r>
-        <w:tab/>
-      </w:r>
-      <w:r>
-        <w:tab/>
-      </w:r>
-      <w:r>
-        <w:tab/>
-      </w:r>
-      <w:r>
-        <w:tab/>
-        <w:t>/ Е.С. Воробьева /</w:t>
-      </w:r>
-    </w:p>
-    <w:p>
-      <w:pPr>
-        <w:ind w:left="3828"/>
-        <w:rPr>
-          <w:sz w:val="12"/>
-          <w:szCs w:val="12"/>
-        </w:rPr>
-      </w:pPr>
-    </w:p>
-    <w:p>
-      <w:pPr>
-        <w:ind w:left="3828"/>
-      </w:pPr>
-      <w:r>
-        <w:tab/>
-      </w:r>
-      <w:r>
-        <w:tab/>
-      </w:r>
-      <w:r>
-        <w:tab/>
-      </w:r>
-      <w:r>
-        <w:tab/>
-      </w:r>
-      <w:r>
-        <w:tab/>
-      </w:r>
-      <w:r>
-        <w:tab/>
-      </w:r>
-      <w:r>
-        <w:tab/>
-        <w:t xml:space="preserve">/ И.Ю. </w:t>
-      </w:r>
-      <w:proofErr w:type="spellStart"/>
-      <w:r>
-        <w:t>Шекшуева</w:t>
-      </w:r>
-      <w:proofErr w:type="spellEnd"/>
-      <w:r>
-        <w:t xml:space="preserve"> /</w:t>
-      </w:r>
-    </w:p>
-    <w:sectPr>
-      <w:headerReference w:type="default" r:id="rId7"/>
-      <w:footerReference w:type="default" r:id="rId8"/>
-      <w:pgSz w:w="16840" w:h="11900" w:orient="landscape"/>
-      <w:pgMar w:top="142" w:right="536" w:bottom="0" w:left="1134" w:header="709" w:footer="709" w:gutter="0"/>
-      <w:cols w:space="720"/>
-    </w:sectPr>
-  </w:body>
-</w:document>
 </file>
</xml_diff>

<commit_message>
Revert "Fix commission DOCX generation and template integrity"
This reverts commit 5630f39f9a28dfce9cd3bea3dfc2e1bcb4ee9076.
</commit_message>
<xml_diff>
--- a/backend/Protocol-comission-template.docx
+++ b/backend/Protocol-comission-template.docx
@@ -3550,4 +3550,3585 @@
   </a:objectDefaults>
   <a:extraClrSchemeLst/>
 </a:theme>
+</file>
+
+<file path=doc.patched.xml><?xml version="1.0" encoding="utf-8"?>
+<w:document xmlns:wpc="http://schemas.microsoft.com/office/word/2010/wordprocessingCanvas" xmlns:cx="http://schemas.microsoft.com/office/drawing/2014/chartex" xmlns:cx1="http://schemas.microsoft.com/office/drawing/2015/9/8/chartex" xmlns:cx2="http://schemas.microsoft.com/office/drawing/2015/10/21/chartex" xmlns:cx3="http://schemas.microsoft.com/office/drawing/2016/5/9/chartex" xmlns:cx4="http://schemas.microsoft.com/office/drawing/2016/5/10/chartex" xmlns:cx5="http://schemas.microsoft.com/office/drawing/2016/5/11/chartex" xmlns:cx6="http://schemas.microsoft.com/office/drawing/2016/5/12/chartex" xmlns:cx7="http://schemas.microsoft.com/office/drawing/2016/5/13/chartex" xmlns:cx8="http://schemas.microsoft.com/office/drawing/2016/5/14/chartex" xmlns:mc="http://schemas.openxmlformats.org/markup-compatibility/2006" xmlns:aink="http://schemas.microsoft.com/office/drawing/2016/ink" xmlns:am3d="http://schemas.microsoft.com/office/drawing/2017/model3d" xmlns:o="urn:schemas-microsoft-com:office:office" xmlns:oel="http://schemas.microsoft.com/office/2019/extlst" xmlns:r="http://schemas.openxmlformats.org/officeDocument/2006/relationships" xmlns:m="http://schemas.openxmlformats.org/officeDocument/2006/math" xmlns:v="urn:schemas-microsoft-com:vml" xmlns:wp14="http://schemas.microsoft.com/office/word/2010/wordprocessingDrawing" xmlns:wp="http://schemas.openxmlformats.org/drawingml/2006/wordprocessingDrawing" xmlns:w10="urn:schemas-microsoft-com:office:word" xmlns:w="http://schemas.openxmlformats.org/wordprocessingml/2006/main" xmlns:w14="http://schemas.microsoft.com/office/word/2010/wordml" xmlns:w15="http://schemas.microsoft.com/office/word/2012/wordml" xmlns:w16cex="http://schemas.microsoft.com/office/word/2018/wordml/cex" xmlns:w16cid="http://schemas.microsoft.com/office/word/2016/wordml/cid" xmlns:w16="http://schemas.microsoft.com/office/word/2018/wordml" xmlns:w16sdtdh="http://schemas.microsoft.com/office/word/2020/wordml/sdtdatahash" xmlns:w16se="http://schemas.microsoft.com/office/word/2015/wordml/symex" xmlns:wpg="http://schemas.microsoft.com/office/word/2010/wordprocessingGroup" xmlns:wpi="http://schemas.microsoft.com/office/word/2010/wordprocessingInk" xmlns:wne="http://schemas.microsoft.com/office/word/2006/wordml" xmlns:wps="http://schemas.microsoft.com/office/word/2010/wordprocessingShape" mc:Ignorable="w14 w15 w16se w16cid w16 w16cex w16sdtdh wp14">
+  <w:body>
+    <w:p>
+      <w:pPr>
+        <w:jc w:val="center"/>
+        <w:rPr>
+          <w:b/>
+          <w:bCs/>
+          <w:sz w:val="28"/>
+          <w:szCs w:val="28"/>
+          <w:lang w:val="en-US"/>
+        </w:rPr>
+      </w:pPr>
+      <w:r>
+        <w:rPr>
+          <w:b/>
+          <w:bCs/>
+          <w:sz w:val="28"/>
+          <w:szCs w:val="28"/>
+          <w:lang w:val="en-US"/>
+        </w:rPr>
+        <w:t>{</w:t>
+      </w:r>
+      <w:proofErr w:type="spellStart"/>
+      <w:r>
+        <w:rPr>
+          <w:b/>
+          <w:bCs/>
+          <w:sz w:val="28"/>
+          <w:szCs w:val="28"/>
+          <w:lang w:val="en-US"/>
+        </w:rPr>
+        <w:t>moisei_name</w:t>
+      </w:r>
+      <w:proofErr w:type="spellEnd"/>
+      <w:r>
+        <w:rPr>
+          <w:b/>
+          <w:bCs/>
+          <w:sz w:val="28"/>
+          <w:szCs w:val="28"/>
+          <w:lang w:val="en-US"/>
+        </w:rPr>
+        <w:t>}</w:t>
+      </w:r>
+    </w:p>
+    <w:p>
+      <w:pPr>
+        <w:jc w:val="center"/>
+        <w:rPr>
+          <w:b/>
+          <w:bCs/>
+          <w:sz w:val="22"/>
+          <w:szCs w:val="22"/>
+        </w:rPr>
+      </w:pPr>
+    </w:p>
+    <w:p>
+      <w:pPr>
+        <w:jc w:val="center"/>
+        <w:rPr>
+          <w:b/>
+          <w:bCs/>
+          <w:sz w:val="28"/>
+          <w:szCs w:val="28"/>
+        </w:rPr>
+      </w:pPr>
+      <w:r>
+        <w:rPr>
+          <w:b/>
+          <w:bCs/>
+          <w:sz w:val="28"/>
+          <w:szCs w:val="28"/>
+        </w:rPr>
+        <w:t xml:space="preserve">П Р О Т О К О Л    </w:t>
+      </w:r>
+      <w:proofErr w:type="gramStart"/>
+      <w:r>
+        <w:rPr>
+          <w:b/>
+          <w:bCs/>
+          <w:sz w:val="28"/>
+          <w:szCs w:val="28"/>
+        </w:rPr>
+        <w:t xml:space="preserve">№  </w:t>
+      </w:r>
+      <w:r>
+        <w:rPr>
+          <w:b/>
+          <w:bCs/>
+          <w:sz w:val="28"/>
+          <w:szCs w:val="28"/>
+        </w:rPr>
+        <w:t>{</w:t>
+      </w:r>
+      <w:proofErr w:type="gramEnd"/>
+      <w:r>
+        <w:rPr>
+          <w:b/>
+          <w:bCs/>
+          <w:sz w:val="28"/>
+          <w:szCs w:val="28"/>
+          <w:lang w:val="en-US"/>
+        </w:rPr>
+        <w:t>group</w:t>
+      </w:r>
+      <w:r>
+        <w:rPr>
+          <w:b/>
+          <w:bCs/>
+          <w:sz w:val="28"/>
+          <w:szCs w:val="28"/>
+        </w:rPr>
+        <w:t>_</w:t>
+      </w:r>
+      <w:r>
+        <w:rPr>
+          <w:b/>
+          <w:bCs/>
+          <w:sz w:val="28"/>
+          <w:szCs w:val="28"/>
+          <w:lang w:val="en-US"/>
+        </w:rPr>
+        <w:t>id</w:t>
+      </w:r>
+      <w:r>
+        <w:rPr>
+          <w:b/>
+          <w:bCs/>
+          <w:sz w:val="28"/>
+          <w:szCs w:val="28"/>
+        </w:rPr>
+        <w:t>}</w:t>
+      </w:r>
+      <w:r>
+        <w:rPr>
+          <w:b/>
+          <w:bCs/>
+          <w:sz w:val="28"/>
+          <w:szCs w:val="28"/>
+        </w:rPr>
+        <w:t xml:space="preserve">  от  </w:t>
+      </w:r>
+      <w:r>
+        <w:rPr>
+          <w:b/>
+          <w:bCs/>
+          <w:sz w:val="28"/>
+          <w:szCs w:val="28"/>
+        </w:rPr>
+        <w:t>{</w:t>
+      </w:r>
+      <w:r>
+        <w:rPr>
+          <w:b/>
+          <w:bCs/>
+          <w:sz w:val="28"/>
+          <w:szCs w:val="28"/>
+          <w:lang w:val="en-US"/>
+        </w:rPr>
+        <w:t>end</w:t>
+      </w:r>
+      <w:r>
+        <w:rPr>
+          <w:b/>
+          <w:bCs/>
+          <w:sz w:val="28"/>
+          <w:szCs w:val="28"/>
+        </w:rPr>
+        <w:t>_</w:t>
+      </w:r>
+      <w:r>
+        <w:rPr>
+          <w:b/>
+          <w:bCs/>
+          <w:sz w:val="28"/>
+          <w:szCs w:val="28"/>
+          <w:lang w:val="en-US"/>
+        </w:rPr>
+        <w:t>date</w:t>
+      </w:r>
+      <w:r>
+        <w:rPr>
+          <w:b/>
+          <w:bCs/>
+          <w:sz w:val="28"/>
+          <w:szCs w:val="28"/>
+        </w:rPr>
+        <w:t>}</w:t>
+      </w:r>
+    </w:p>
+    <w:p>
+      <w:pPr>
+        <w:jc w:val="center"/>
+        <w:rPr>
+          <w:b/>
+          <w:bCs/>
+          <w:sz w:val="28"/>
+          <w:szCs w:val="28"/>
+        </w:rPr>
+      </w:pPr>
+      <w:r>
+        <w:rPr>
+          <w:b/>
+          <w:bCs/>
+          <w:sz w:val="28"/>
+          <w:szCs w:val="28"/>
+        </w:rPr>
+        <w:t>заседания комиссии по проверке знаний</w:t>
+      </w:r>
+    </w:p>
+    <w:p>
+      <w:pPr>
+        <w:rPr>
+          <w:sz w:val="18"/>
+          <w:szCs w:val="18"/>
+        </w:rPr>
+      </w:pPr>
+    </w:p>
+    <w:p>
+      <w:r>
+        <w:t>В соответствии с приказом директора от «01» сентября 2022 г. № 10 комиссия в составе:</w:t>
+      </w:r>
+    </w:p>
+    <w:p>
+      <w:pPr>
+        <w:rPr>
+          <w:sz w:val="22"/>
+          <w:szCs w:val="22"/>
+        </w:rPr>
+      </w:pPr>
+    </w:p>
+    <w:p>
+      <w:r>
+        <w:rPr>
+          <w:b/>
+          <w:bCs/>
+        </w:rPr>
+        <w:t>Председатель комиссии:</w:t>
+      </w:r>
+      <w:r>
+        <w:tab/>
+      </w:r>
+      <w:proofErr w:type="spellStart"/>
+      <w:r>
+        <w:t>Шекшуев</w:t>
+      </w:r>
+      <w:proofErr w:type="spellEnd"/>
+      <w:r>
+        <w:t xml:space="preserve"> В.М.. - директор</w:t>
+      </w:r>
+    </w:p>
+    <w:p>
+      <w:r>
+        <w:rPr>
+          <w:b/>
+          <w:bCs/>
+        </w:rPr>
+        <w:t>Члены комиссии:</w:t>
+      </w:r>
+      <w:r>
+        <w:rPr>
+          <w:b/>
+          <w:bCs/>
+        </w:rPr>
+        <w:tab/>
+      </w:r>
+      <w:r>
+        <w:tab/>
+        <w:t>Воробьева Е.С. – заместитель директора</w:t>
+      </w:r>
+    </w:p>
+    <w:p>
+      <w:r>
+        <w:tab/>
+      </w:r>
+      <w:r>
+        <w:tab/>
+      </w:r>
+      <w:r>
+        <w:tab/>
+      </w:r>
+      <w:r>
+        <w:tab/>
+      </w:r>
+      <w:proofErr w:type="spellStart"/>
+      <w:r>
+        <w:t>Шекшуева</w:t>
+      </w:r>
+      <w:proofErr w:type="spellEnd"/>
+      <w:r>
+        <w:t xml:space="preserve"> И.Ю. – специалист учебного центра</w:t>
+      </w:r>
+    </w:p>
+    <w:p>
+      <w:pPr>
+        <w:pStyle w:val="a4"/>
+        <w:tabs>
+          <w:tab w:val="left" w:pos="2694"/>
+        </w:tabs>
+        <w:rPr>
+          <w:sz w:val="22"/>
+          <w:szCs w:val="22"/>
+        </w:rPr>
+      </w:pPr>
+    </w:p>
+    <w:p>
+      <w:pPr>
+        <w:jc w:val="both"/>
+      </w:pPr>
+      <w:r>
+        <w:t>Проведена проверка знаний по программе: - «</w:t>
+      </w:r>
+      <w:r>
+        <w:t>{</w:t>
+      </w:r>
+      <w:r>
+        <w:rPr>
+          <w:lang w:val="en-US"/>
+        </w:rPr>
+        <w:t>course</w:t>
+      </w:r>
+      <w:r>
+        <w:t>_</w:t>
+      </w:r>
+      <w:r>
+        <w:rPr>
+          <w:lang w:val="en-US"/>
+        </w:rPr>
+        <w:t>name</w:t>
+      </w:r>
+      <w:r>
+        <w:t>}</w:t>
+      </w:r>
+      <w:r>
+        <w:t xml:space="preserve">» в объеме </w:t>
+      </w:r>
+      <w:r>
+        <w:t>{</w:t>
+      </w:r>
+      <w:r>
+        <w:rPr>
+          <w:lang w:val="en-US"/>
+        </w:rPr>
+        <w:t>hours</w:t>
+      </w:r>
+      <w:r>
+        <w:t>}</w:t>
+      </w:r>
+      <w:r>
+        <w:t xml:space="preserve"> часов;</w:t>
+      </w:r>
+    </w:p>
+    <w:p>
+      <w:pPr>
+        <w:jc w:val="both"/>
+        <w:rPr>
+          <w:sz w:val="22"/>
+          <w:szCs w:val="22"/>
+        </w:rPr>
+      </w:pPr>
+      <w:r>
+        <w:rPr>
+          <w:sz w:val="22"/>
+          <w:szCs w:val="22"/>
+        </w:rPr>
+        <w:t>- - «</w:t>
+      </w:r>
+      <w:r>
+        <w:rPr>
+          <w:sz w:val="22"/>
+          <w:szCs w:val="22"/>
+        </w:rPr>
+        <w:t>{</w:t>
+      </w:r>
+      <w:r>
+        <w:rPr>
+          <w:sz w:val="22"/>
+          <w:szCs w:val="22"/>
+          <w:lang w:val="en-US"/>
+        </w:rPr>
+        <w:t>course</w:t>
+      </w:r>
+      <w:r>
+        <w:rPr>
+          <w:sz w:val="22"/>
+          <w:szCs w:val="22"/>
+        </w:rPr>
+        <w:t>_</w:t>
+      </w:r>
+      <w:r>
+        <w:rPr>
+          <w:sz w:val="22"/>
+          <w:szCs w:val="22"/>
+          <w:lang w:val="en-US"/>
+        </w:rPr>
+        <w:t>name</w:t>
+      </w:r>
+      <w:r>
+        <w:rPr>
+          <w:sz w:val="22"/>
+          <w:szCs w:val="22"/>
+        </w:rPr>
+        <w:t>}</w:t>
+      </w:r>
+      <w:r>
+        <w:rPr>
+          <w:sz w:val="22"/>
+          <w:szCs w:val="22"/>
+        </w:rPr>
+        <w:t xml:space="preserve">» в объеме </w:t>
+      </w:r>
+      <w:r>
+        <w:rPr>
+          <w:sz w:val="22"/>
+          <w:szCs w:val="22"/>
+        </w:rPr>
+        <w:t>{</w:t>
+      </w:r>
+      <w:r>
+        <w:rPr>
+          <w:sz w:val="22"/>
+          <w:szCs w:val="22"/>
+          <w:lang w:val="en-US"/>
+        </w:rPr>
+        <w:t>hours</w:t>
+      </w:r>
+      <w:r>
+        <w:rPr>
+          <w:sz w:val="22"/>
+          <w:szCs w:val="22"/>
+        </w:rPr>
+        <w:t>}</w:t>
+      </w:r>
+      <w:r>
+        <w:rPr>
+          <w:sz w:val="22"/>
+          <w:szCs w:val="22"/>
+        </w:rPr>
+        <w:t xml:space="preserve"> часов:</w:t>
+      </w:r>
+    </w:p>
+    <w:tbl>
+      <w:tblPr>
+        <w:tblStyle w:val="TableNormal"/>
+        <w:tblW w:w="15603" w:type="dxa"/>
+        <w:tblInd w:w="-289" w:type="dxa"/>
+        <w:tblBorders>
+          <w:top w:val="single" w:sz="8" w:space="0" w:color="FFFFFF"/>
+          <w:left w:val="single" w:sz="8" w:space="0" w:color="FFFFFF"/>
+          <w:bottom w:val="single" w:sz="8" w:space="0" w:color="FFFFFF"/>
+          <w:right w:val="single" w:sz="8" w:space="0" w:color="FFFFFF"/>
+          <w:insideH w:val="single" w:sz="8" w:space="0" w:color="FFFFFF"/>
+          <w:insideV w:val="single" w:sz="8" w:space="0" w:color="FFFFFF"/>
+        </w:tblBorders>
+        <w:shd w:val="clear" w:color="auto" w:fill="CED7E7"/>
+        <w:tblLayout w:type="fixed"/>
+        <w:tblLook w:val="04A0" w:firstRow="1" w:lastRow="0" w:firstColumn="1" w:lastColumn="0" w:noHBand="0" w:noVBand="1"/>
+      </w:tblPr>
+      <w:tblGrid>
+        <w:gridCol w:w="923"/>
+        <w:gridCol w:w="2918"/>
+        <w:gridCol w:w="2379"/>
+        <w:gridCol w:w="3136"/>
+        <w:gridCol w:w="842"/>
+        <w:gridCol w:w="1621"/>
+        <w:gridCol w:w="1406"/>
+        <w:gridCol w:w="951"/>
+        <w:gridCol w:w="1427"/>
+      </w:tblGrid>
+      <w:tr>
+        <w:trPr>
+          <w:trHeight w:val="1046"/>
+        </w:trPr>
+        <w:tc>
+          <w:tcPr>
+            <w:tcW w:w="923" w:type="dxa"/>
+            <w:tcBorders>
+              <w:top w:val="single" w:sz="4" w:space="0" w:color="000000"/>
+              <w:left w:val="single" w:sz="4" w:space="0" w:color="000000"/>
+              <w:bottom w:val="single" w:sz="4" w:space="0" w:color="000000"/>
+              <w:right w:val="single" w:sz="4" w:space="0" w:color="000000"/>
+            </w:tcBorders>
+            <w:shd w:val="clear" w:color="auto" w:fill="auto"/>
+            <w:tcMar>
+              <w:top w:w="80" w:type="dxa"/>
+              <w:left w:w="80" w:type="dxa"/>
+              <w:bottom w:w="80" w:type="dxa"/>
+              <w:right w:w="80" w:type="dxa"/>
+            </w:tcMar>
+            <w:vAlign w:val="center"/>
+          </w:tcPr>
+          <w:p>
+            <w:pPr>
+              <w:jc w:val="center"/>
+            </w:pPr>
+            <w:r>
+              <w:rPr>
+                <w:sz w:val="22"/>
+                <w:szCs w:val="22"/>
+              </w:rPr>
+              <w:t>№</w:t>
+            </w:r>
+          </w:p>
+        </w:tc>
+        <w:tc>
+          <w:tcPr>
+            <w:tcW w:w="2918" w:type="dxa"/>
+            <w:tcBorders>
+              <w:top w:val="single" w:sz="4" w:space="0" w:color="000000"/>
+              <w:left w:val="single" w:sz="4" w:space="0" w:color="000000"/>
+              <w:bottom w:val="single" w:sz="4" w:space="0" w:color="000000"/>
+              <w:right w:val="single" w:sz="4" w:space="0" w:color="000000"/>
+            </w:tcBorders>
+            <w:shd w:val="clear" w:color="auto" w:fill="auto"/>
+            <w:tcMar>
+              <w:top w:w="80" w:type="dxa"/>
+              <w:left w:w="80" w:type="dxa"/>
+              <w:bottom w:w="80" w:type="dxa"/>
+              <w:right w:w="80" w:type="dxa"/>
+            </w:tcMar>
+            <w:vAlign w:val="center"/>
+          </w:tcPr>
+          <w:p>
+            <w:pPr>
+              <w:jc w:val="center"/>
+            </w:pPr>
+            <w:r>
+              <w:rPr>
+                <w:sz w:val="22"/>
+                <w:szCs w:val="22"/>
+              </w:rPr>
+              <w:t>Ф.И.О.</w:t>
+            </w:r>
+          </w:p>
+        </w:tc>
+        <w:tc>
+          <w:tcPr>
+            <w:tcW w:w="2379" w:type="dxa"/>
+            <w:tcBorders>
+              <w:top w:val="single" w:sz="4" w:space="0" w:color="000000"/>
+              <w:left w:val="single" w:sz="4" w:space="0" w:color="000000"/>
+              <w:bottom w:val="single" w:sz="4" w:space="0" w:color="000000"/>
+              <w:right w:val="single" w:sz="4" w:space="0" w:color="000000"/>
+            </w:tcBorders>
+            <w:shd w:val="clear" w:color="auto" w:fill="auto"/>
+            <w:tcMar>
+              <w:top w:w="80" w:type="dxa"/>
+              <w:left w:w="80" w:type="dxa"/>
+              <w:bottom w:w="80" w:type="dxa"/>
+              <w:right w:w="80" w:type="dxa"/>
+            </w:tcMar>
+            <w:vAlign w:val="center"/>
+          </w:tcPr>
+          <w:p>
+            <w:pPr>
+              <w:jc w:val="center"/>
+            </w:pPr>
+            <w:r>
+              <w:rPr>
+                <w:sz w:val="22"/>
+                <w:szCs w:val="22"/>
+              </w:rPr>
+              <w:t>Наименование предприятия</w:t>
+            </w:r>
+          </w:p>
+        </w:tc>
+        <w:tc>
+          <w:tcPr>
+            <w:tcW w:w="3136" w:type="dxa"/>
+            <w:tcBorders>
+              <w:top w:val="single" w:sz="4" w:space="0" w:color="000000"/>
+              <w:left w:val="single" w:sz="4" w:space="0" w:color="000000"/>
+              <w:bottom w:val="single" w:sz="4" w:space="0" w:color="000000"/>
+              <w:right w:val="single" w:sz="4" w:space="0" w:color="000000"/>
+            </w:tcBorders>
+            <w:shd w:val="clear" w:color="auto" w:fill="auto"/>
+            <w:tcMar>
+              <w:top w:w="80" w:type="dxa"/>
+              <w:left w:w="80" w:type="dxa"/>
+              <w:bottom w:w="80" w:type="dxa"/>
+              <w:right w:w="80" w:type="dxa"/>
+            </w:tcMar>
+            <w:vAlign w:val="center"/>
+          </w:tcPr>
+          <w:p>
+            <w:pPr>
+              <w:jc w:val="center"/>
+            </w:pPr>
+            <w:r>
+              <w:rPr>
+                <w:sz w:val="22"/>
+                <w:szCs w:val="22"/>
+              </w:rPr>
+              <w:t>Занимаемая должность</w:t>
+            </w:r>
+          </w:p>
+        </w:tc>
+        <w:tc>
+          <w:tcPr>
+            <w:tcW w:w="842" w:type="dxa"/>
+            <w:tcBorders>
+              <w:top w:val="single" w:sz="4" w:space="0" w:color="000000"/>
+              <w:left w:val="single" w:sz="4" w:space="0" w:color="000000"/>
+              <w:bottom w:val="single" w:sz="4" w:space="0" w:color="000000"/>
+              <w:right w:val="single" w:sz="4" w:space="0" w:color="000000"/>
+            </w:tcBorders>
+          </w:tcPr>
+          <w:p>
+            <w:pPr>
+              <w:jc w:val="center"/>
+              <w:rPr>
+                <w:sz w:val="22"/>
+                <w:szCs w:val="22"/>
+              </w:rPr>
+            </w:pPr>
+          </w:p>
+          <w:p>
+            <w:pPr>
+              <w:jc w:val="center"/>
+              <w:rPr>
+                <w:sz w:val="22"/>
+                <w:szCs w:val="22"/>
+              </w:rPr>
+            </w:pPr>
+          </w:p>
+          <w:p>
+            <w:pPr>
+              <w:jc w:val="center"/>
+              <w:rPr>
+                <w:sz w:val="22"/>
+                <w:szCs w:val="22"/>
+              </w:rPr>
+            </w:pPr>
+          </w:p>
+          <w:p>
+            <w:pPr>
+              <w:jc w:val="center"/>
+              <w:rPr>
+                <w:sz w:val="22"/>
+                <w:szCs w:val="22"/>
+              </w:rPr>
+            </w:pPr>
+            <w:r>
+              <w:rPr>
+                <w:sz w:val="22"/>
+                <w:szCs w:val="22"/>
+              </w:rPr>
+              <w:t>Номер билета</w:t>
+            </w:r>
+          </w:p>
+        </w:tc>
+        <w:tc>
+          <w:tcPr>
+            <w:tcW w:w="1621" w:type="dxa"/>
+            <w:tcBorders>
+              <w:top w:val="single" w:sz="4" w:space="0" w:color="000000"/>
+              <w:left w:val="single" w:sz="4" w:space="0" w:color="000000"/>
+              <w:bottom w:val="single" w:sz="4" w:space="0" w:color="000000"/>
+              <w:right w:val="single" w:sz="4" w:space="0" w:color="000000"/>
+            </w:tcBorders>
+            <w:shd w:val="clear" w:color="auto" w:fill="auto"/>
+            <w:tcMar>
+              <w:top w:w="80" w:type="dxa"/>
+              <w:left w:w="80" w:type="dxa"/>
+              <w:bottom w:w="80" w:type="dxa"/>
+              <w:right w:w="80" w:type="dxa"/>
+            </w:tcMar>
+            <w:vAlign w:val="center"/>
+          </w:tcPr>
+          <w:p>
+            <w:pPr>
+              <w:jc w:val="center"/>
+            </w:pPr>
+            <w:r>
+              <w:rPr>
+                <w:sz w:val="22"/>
+                <w:szCs w:val="22"/>
+              </w:rPr>
+              <w:t>Результат проверки знаний</w:t>
+            </w:r>
+          </w:p>
+        </w:tc>
+        <w:tc>
+          <w:tcPr>
+            <w:tcW w:w="1406" w:type="dxa"/>
+            <w:tcBorders>
+              <w:top w:val="single" w:sz="4" w:space="0" w:color="000000"/>
+              <w:left w:val="single" w:sz="4" w:space="0" w:color="000000"/>
+              <w:bottom w:val="single" w:sz="4" w:space="0" w:color="000000"/>
+              <w:right w:val="single" w:sz="4" w:space="0" w:color="000000"/>
+            </w:tcBorders>
+            <w:shd w:val="clear" w:color="auto" w:fill="auto"/>
+            <w:tcMar>
+              <w:top w:w="80" w:type="dxa"/>
+              <w:left w:w="80" w:type="dxa"/>
+              <w:bottom w:w="80" w:type="dxa"/>
+              <w:right w:w="80" w:type="dxa"/>
+            </w:tcMar>
+            <w:vAlign w:val="center"/>
+          </w:tcPr>
+          <w:p>
+            <w:pPr>
+              <w:jc w:val="center"/>
+            </w:pPr>
+            <w:r>
+              <w:rPr>
+                <w:sz w:val="22"/>
+                <w:szCs w:val="22"/>
+              </w:rPr>
+              <w:t>Регистрационный номер записи о проверке знаний в реестре обученных лиц</w:t>
+            </w:r>
+          </w:p>
+        </w:tc>
+        <w:tc>
+          <w:tcPr>
+            <w:tcW w:w="951" w:type="dxa"/>
+            <w:tcBorders>
+              <w:top w:val="single" w:sz="4" w:space="0" w:color="000000"/>
+              <w:left w:val="single" w:sz="4" w:space="0" w:color="000000"/>
+              <w:bottom w:val="single" w:sz="4" w:space="0" w:color="000000"/>
+              <w:right w:val="single" w:sz="4" w:space="0" w:color="000000"/>
+            </w:tcBorders>
+            <w:shd w:val="clear" w:color="auto" w:fill="auto"/>
+            <w:tcMar>
+              <w:top w:w="80" w:type="dxa"/>
+              <w:left w:w="80" w:type="dxa"/>
+              <w:bottom w:w="80" w:type="dxa"/>
+              <w:right w:w="80" w:type="dxa"/>
+            </w:tcMar>
+            <w:vAlign w:val="center"/>
+          </w:tcPr>
+          <w:p>
+            <w:pPr>
+              <w:jc w:val="center"/>
+            </w:pPr>
+            <w:r>
+              <w:rPr>
+                <w:sz w:val="22"/>
+                <w:szCs w:val="22"/>
+              </w:rPr>
+              <w:t>Подпись проверяемого</w:t>
+            </w:r>
+          </w:p>
+        </w:tc>
+        <w:tc>
+          <w:tcPr>
+            <w:tcW w:w="1427" w:type="dxa"/>
+            <w:tcBorders>
+              <w:top w:val="single" w:sz="4" w:space="0" w:color="000000"/>
+              <w:left w:val="single" w:sz="4" w:space="0" w:color="000000"/>
+              <w:bottom w:val="single" w:sz="4" w:space="0" w:color="000000"/>
+              <w:right w:val="single" w:sz="4" w:space="0" w:color="000000"/>
+            </w:tcBorders>
+          </w:tcPr>
+          <w:p>
+            <w:pPr>
+              <w:jc w:val="center"/>
+              <w:rPr>
+                <w:sz w:val="22"/>
+                <w:szCs w:val="22"/>
+              </w:rPr>
+            </w:pPr>
+          </w:p>
+          <w:p>
+            <w:pPr>
+              <w:jc w:val="center"/>
+              <w:rPr>
+                <w:sz w:val="22"/>
+                <w:szCs w:val="22"/>
+              </w:rPr>
+            </w:pPr>
+          </w:p>
+          <w:p>
+            <w:pPr>
+              <w:jc w:val="center"/>
+              <w:rPr>
+                <w:sz w:val="22"/>
+                <w:szCs w:val="22"/>
+              </w:rPr>
+            </w:pPr>
+            <w:r>
+              <w:rPr>
+                <w:sz w:val="22"/>
+                <w:szCs w:val="22"/>
+              </w:rPr>
+              <w:t>Заключение экзаменационной</w:t>
+            </w:r>
+          </w:p>
+          <w:p>
+            <w:pPr>
+              <w:jc w:val="center"/>
+              <w:rPr>
+                <w:sz w:val="22"/>
+                <w:szCs w:val="22"/>
+              </w:rPr>
+            </w:pPr>
+            <w:r>
+              <w:rPr>
+                <w:sz w:val="22"/>
+                <w:szCs w:val="22"/>
+              </w:rPr>
+              <w:t>комиссии</w:t>
+            </w:r>
+          </w:p>
+          <w:p>
+            <w:pPr>
+              <w:rPr>
+                <w:sz w:val="22"/>
+                <w:szCs w:val="22"/>
+              </w:rPr>
+            </w:pPr>
+          </w:p>
+        </w:tc>
+      </w:tr>
+      <w:tr>
+        <w:trPr>
+          <w:trHeight w:val="230"/>
+        </w:trPr>
+        <w:tc>
+          <w:tcPr>
+            <w:tcW w:w="923" w:type="dxa"/>
+            <w:tcBorders>
+              <w:top w:val="single" w:sz="4" w:space="0" w:color="000000"/>
+              <w:left w:val="single" w:sz="4" w:space="0" w:color="000000"/>
+              <w:bottom w:val="single" w:sz="4" w:space="0" w:color="000000"/>
+              <w:right w:val="single" w:sz="4" w:space="0" w:color="000000"/>
+            </w:tcBorders>
+            <w:shd w:val="clear" w:color="auto" w:fill="auto"/>
+            <w:tcMar>
+              <w:top w:w="80" w:type="dxa"/>
+              <w:left w:w="80" w:type="dxa"/>
+              <w:bottom w:w="80" w:type="dxa"/>
+              <w:right w:w="80" w:type="dxa"/>
+            </w:tcMar>
+            <w:vAlign w:val="center"/>
+          </w:tcPr>
+          <w:p>
+            <w:pPr>
+              <w:jc w:val="center"/>
+            </w:pPr>
+            <w:r>
+              <w:rPr>
+                <w:sz w:val="22"/>
+                <w:szCs w:val="22"/>
+              </w:rPr>
+              <w:t>1</w:t>
+            </w:r>
+          </w:p>
+        </w:tc>
+        <w:tc>
+          <w:tcPr>
+            <w:tcW w:w="2918" w:type="dxa"/>
+            <w:tcBorders>
+              <w:top w:val="single" w:sz="4" w:space="0" w:color="000000"/>
+              <w:left w:val="single" w:sz="4" w:space="0" w:color="000000"/>
+              <w:bottom w:val="single" w:sz="4" w:space="0" w:color="000000"/>
+              <w:right w:val="single" w:sz="4" w:space="0" w:color="000000"/>
+            </w:tcBorders>
+            <w:shd w:val="clear" w:color="auto" w:fill="auto"/>
+            <w:tcMar>
+              <w:top w:w="80" w:type="dxa"/>
+              <w:left w:w="80" w:type="dxa"/>
+              <w:bottom w:w="80" w:type="dxa"/>
+              <w:right w:w="80" w:type="dxa"/>
+            </w:tcMar>
+            <w:vAlign w:val="center"/>
+          </w:tcPr>
+          <w:p>
+            <w:pPr>
+              <w:jc w:val="center"/>
+            </w:pPr>
+            <w:r>
+              <w:rPr>
+                <w:sz w:val="22"/>
+                <w:szCs w:val="22"/>
+              </w:rPr>
+              <w:t>2</w:t>
+            </w:r>
+          </w:p>
+        </w:tc>
+        <w:tc>
+          <w:tcPr>
+            <w:tcW w:w="2379" w:type="dxa"/>
+            <w:tcBorders>
+              <w:top w:val="single" w:sz="4" w:space="0" w:color="000000"/>
+              <w:left w:val="single" w:sz="4" w:space="0" w:color="000000"/>
+              <w:bottom w:val="single" w:sz="4" w:space="0" w:color="auto"/>
+              <w:right w:val="single" w:sz="4" w:space="0" w:color="000000"/>
+            </w:tcBorders>
+            <w:shd w:val="clear" w:color="auto" w:fill="auto"/>
+            <w:tcMar>
+              <w:top w:w="80" w:type="dxa"/>
+              <w:left w:w="80" w:type="dxa"/>
+              <w:bottom w:w="80" w:type="dxa"/>
+              <w:right w:w="80" w:type="dxa"/>
+            </w:tcMar>
+            <w:vAlign w:val="center"/>
+          </w:tcPr>
+          <w:p>
+            <w:pPr>
+              <w:jc w:val="center"/>
+            </w:pPr>
+            <w:r>
+              <w:rPr>
+                <w:sz w:val="22"/>
+                <w:szCs w:val="22"/>
+              </w:rPr>
+              <w:t>3</w:t>
+            </w:r>
+          </w:p>
+        </w:tc>
+        <w:tc>
+          <w:tcPr>
+            <w:tcW w:w="3136" w:type="dxa"/>
+            <w:tcBorders>
+              <w:top w:val="single" w:sz="4" w:space="0" w:color="000000"/>
+              <w:left w:val="single" w:sz="4" w:space="0" w:color="000000"/>
+              <w:bottom w:val="single" w:sz="4" w:space="0" w:color="auto"/>
+              <w:right w:val="single" w:sz="4" w:space="0" w:color="000000"/>
+            </w:tcBorders>
+            <w:shd w:val="clear" w:color="auto" w:fill="auto"/>
+            <w:tcMar>
+              <w:top w:w="80" w:type="dxa"/>
+              <w:left w:w="80" w:type="dxa"/>
+              <w:bottom w:w="80" w:type="dxa"/>
+              <w:right w:w="80" w:type="dxa"/>
+            </w:tcMar>
+            <w:vAlign w:val="center"/>
+          </w:tcPr>
+          <w:p>
+            <w:pPr>
+              <w:jc w:val="center"/>
+            </w:pPr>
+            <w:r>
+              <w:rPr>
+                <w:sz w:val="22"/>
+                <w:szCs w:val="22"/>
+              </w:rPr>
+              <w:t>4</w:t>
+            </w:r>
+          </w:p>
+        </w:tc>
+        <w:tc>
+          <w:tcPr>
+            <w:tcW w:w="842" w:type="dxa"/>
+            <w:tcBorders>
+              <w:top w:val="single" w:sz="4" w:space="0" w:color="000000"/>
+              <w:left w:val="single" w:sz="4" w:space="0" w:color="000000"/>
+              <w:bottom w:val="single" w:sz="4" w:space="0" w:color="000000"/>
+              <w:right w:val="single" w:sz="4" w:space="0" w:color="000000"/>
+            </w:tcBorders>
+          </w:tcPr>
+          <w:p>
+            <w:pPr>
+              <w:jc w:val="center"/>
+              <w:rPr>
+                <w:sz w:val="22"/>
+                <w:szCs w:val="22"/>
+              </w:rPr>
+            </w:pPr>
+            <w:r>
+              <w:rPr>
+                <w:sz w:val="22"/>
+                <w:szCs w:val="22"/>
+              </w:rPr>
+              <w:t>5</w:t>
+            </w:r>
+          </w:p>
+        </w:tc>
+        <w:tc>
+          <w:tcPr>
+            <w:tcW w:w="1621" w:type="dxa"/>
+            <w:tcBorders>
+              <w:top w:val="single" w:sz="4" w:space="0" w:color="000000"/>
+              <w:left w:val="single" w:sz="4" w:space="0" w:color="000000"/>
+              <w:bottom w:val="single" w:sz="4" w:space="0" w:color="000000"/>
+              <w:right w:val="single" w:sz="4" w:space="0" w:color="000000"/>
+            </w:tcBorders>
+            <w:shd w:val="clear" w:color="auto" w:fill="auto"/>
+            <w:tcMar>
+              <w:top w:w="80" w:type="dxa"/>
+              <w:left w:w="80" w:type="dxa"/>
+              <w:bottom w:w="80" w:type="dxa"/>
+              <w:right w:w="80" w:type="dxa"/>
+            </w:tcMar>
+            <w:vAlign w:val="center"/>
+          </w:tcPr>
+          <w:p>
+            <w:pPr>
+              <w:jc w:val="center"/>
+            </w:pPr>
+            <w:r>
+              <w:rPr>
+                <w:sz w:val="22"/>
+                <w:szCs w:val="22"/>
+              </w:rPr>
+              <w:t>6</w:t>
+            </w:r>
+          </w:p>
+        </w:tc>
+        <w:tc>
+          <w:tcPr>
+            <w:tcW w:w="1406" w:type="dxa"/>
+            <w:tcBorders>
+              <w:top w:val="single" w:sz="4" w:space="0" w:color="000000"/>
+              <w:left w:val="single" w:sz="4" w:space="0" w:color="000000"/>
+              <w:bottom w:val="single" w:sz="4" w:space="0" w:color="000000"/>
+              <w:right w:val="single" w:sz="4" w:space="0" w:color="000000"/>
+            </w:tcBorders>
+            <w:shd w:val="clear" w:color="auto" w:fill="auto"/>
+            <w:tcMar>
+              <w:top w:w="80" w:type="dxa"/>
+              <w:left w:w="80" w:type="dxa"/>
+              <w:bottom w:w="80" w:type="dxa"/>
+              <w:right w:w="80" w:type="dxa"/>
+            </w:tcMar>
+            <w:vAlign w:val="center"/>
+          </w:tcPr>
+          <w:p>
+            <w:pPr>
+              <w:jc w:val="center"/>
+            </w:pPr>
+            <w:r>
+              <w:rPr>
+                <w:sz w:val="22"/>
+                <w:szCs w:val="22"/>
+              </w:rPr>
+              <w:t>7</w:t>
+            </w:r>
+          </w:p>
+        </w:tc>
+        <w:tc>
+          <w:tcPr>
+            <w:tcW w:w="951" w:type="dxa"/>
+            <w:tcBorders>
+              <w:top w:val="single" w:sz="4" w:space="0" w:color="000000"/>
+              <w:left w:val="single" w:sz="4" w:space="0" w:color="000000"/>
+              <w:bottom w:val="single" w:sz="4" w:space="0" w:color="000000"/>
+              <w:right w:val="single" w:sz="4" w:space="0" w:color="000000"/>
+            </w:tcBorders>
+            <w:shd w:val="clear" w:color="auto" w:fill="auto"/>
+            <w:tcMar>
+              <w:top w:w="80" w:type="dxa"/>
+              <w:left w:w="80" w:type="dxa"/>
+              <w:bottom w:w="80" w:type="dxa"/>
+              <w:right w:w="80" w:type="dxa"/>
+            </w:tcMar>
+            <w:vAlign w:val="center"/>
+          </w:tcPr>
+          <w:p>
+            <w:pPr>
+              <w:jc w:val="center"/>
+              <w:rPr>
+                <w:lang w:val="en-US"/>
+              </w:rPr>
+            </w:pPr>
+            <w:r>
+              <w:rPr>
+                <w:sz w:val="22"/>
+                <w:szCs w:val="22"/>
+                <w:lang w:val="en-US"/>
+              </w:rPr>
+              <w:t>8</w:t>
+            </w:r>
+          </w:p>
+        </w:tc>
+        <w:tc>
+          <w:tcPr>
+            <w:tcW w:w="1427" w:type="dxa"/>
+            <w:tcBorders>
+              <w:top w:val="single" w:sz="4" w:space="0" w:color="000000"/>
+              <w:left w:val="single" w:sz="4" w:space="0" w:color="000000"/>
+              <w:bottom w:val="single" w:sz="4" w:space="0" w:color="000000"/>
+              <w:right w:val="single" w:sz="4" w:space="0" w:color="000000"/>
+            </w:tcBorders>
+          </w:tcPr>
+          <w:p>
+            <w:pPr>
+              <w:jc w:val="center"/>
+              <w:rPr>
+                <w:sz w:val="22"/>
+                <w:szCs w:val="22"/>
+              </w:rPr>
+            </w:pPr>
+            <w:r>
+              <w:rPr>
+                <w:sz w:val="22"/>
+                <w:szCs w:val="22"/>
+              </w:rPr>
+              <w:t>9</w:t>
+            </w:r>
+          </w:p>
+        </w:tc>
+      </w:tr>
+      <w:tr>
+        <w:trPr>
+          <w:trHeight w:val="1862"/>
+        </w:trPr>
+        <w:tc>
+          <w:tcPr>
+            <w:tcW w:w="923" w:type="dxa"/>
+            <w:tcBorders>
+              <w:top w:val="single" w:sz="4" w:space="0" w:color="000000"/>
+              <w:left w:val="single" w:sz="4" w:space="0" w:color="000000"/>
+              <w:bottom w:val="single" w:sz="4" w:space="0" w:color="000000"/>
+              <w:right w:val="single" w:sz="4" w:space="0" w:color="000000"/>
+            </w:tcBorders>
+            <w:shd w:val="clear" w:color="auto" w:fill="auto"/>
+            <w:tcMar>
+              <w:top w:w="80" w:type="dxa"/>
+              <w:left w:w="80" w:type="dxa"/>
+              <w:bottom w:w="80" w:type="dxa"/>
+              <w:right w:w="80" w:type="dxa"/>
+            </w:tcMar>
+            <w:vAlign w:val="center"/>
+          </w:tcPr>
+          <w:p>
+            <w:pPr>
+              <w:pStyle w:val="a5"/>
+              <w:numPr>
+                <w:ilvl w:val="0"/>
+                <w:numId w:val="1"/>
+              </w:numPr>
+            </w:pPr>
+            <w:r>
+              <w:rPr>
+                <w:sz w:val="22"/>
+                <w:szCs w:val="22"/>
+                <w:lang w:val="en-US"/>
+              </w:rPr>
+              <w:t>{#employee}</w:t>
+            </w:r>
+          </w:p>
+        </w:tc>
+        <w:tc>
+          <w:tcPr>
+            <w:tcW w:w="2918" w:type="dxa"/>
+            <w:tcBorders>
+              <w:top w:val="single" w:sz="4" w:space="0" w:color="000000"/>
+              <w:left w:val="single" w:sz="4" w:space="0" w:color="000000"/>
+              <w:bottom w:val="single" w:sz="4" w:space="0" w:color="000000"/>
+              <w:right w:val="single" w:sz="4" w:space="0" w:color="auto"/>
+            </w:tcBorders>
+            <w:shd w:val="clear" w:color="auto" w:fill="auto"/>
+            <w:tcMar>
+              <w:top w:w="80" w:type="dxa"/>
+              <w:left w:w="80" w:type="dxa"/>
+              <w:bottom w:w="80" w:type="dxa"/>
+              <w:right w:w="80" w:type="dxa"/>
+            </w:tcMar>
+            <w:vAlign w:val="center"/>
+          </w:tcPr>
+          <w:p>
+            <w:pPr>
+              <w:rPr>
+                <w:lang w:val="en-US"/>
+              </w:rPr>
+            </w:pPr>
+            <w:r>
+              <w:rPr>
+                <w:sz w:val="22"/>
+                <w:szCs w:val="22"/>
+                <w:lang w:val="en-US"/>
+              </w:rPr>
+              <w:t>{</w:t>
+            </w:r>
+            <w:proofErr w:type="spellStart"/>
+            <w:r>
+              <w:rPr>
+                <w:sz w:val="22"/>
+                <w:szCs w:val="22"/>
+                <w:lang w:val="en-US"/>
+              </w:rPr>
+              <w:t>last_</w:t>
+            </w:r>
+            <w:r>
+              <w:rPr>
+                <w:sz w:val="22"/>
+                <w:szCs w:val="22"/>
+                <w:lang w:val="en-US"/>
+              </w:rPr>
+              <w:t>name</w:t>
+            </w:r>
+            <w:proofErr w:type="spellEnd"/>
+            <w:r>
+              <w:rPr>
+                <w:sz w:val="22"/>
+                <w:szCs w:val="22"/>
+                <w:lang w:val="en-US"/>
+              </w:rPr>
+              <w:t>} {name} {</w:t>
+            </w:r>
+            <w:proofErr w:type="spellStart"/>
+            <w:r>
+              <w:rPr>
+                <w:sz w:val="22"/>
+                <w:szCs w:val="22"/>
+                <w:lang w:val="en-US"/>
+              </w:rPr>
+              <w:t>middle_name</w:t>
+            </w:r>
+            <w:proofErr w:type="spellEnd"/>
+            <w:r>
+              <w:rPr>
+                <w:sz w:val="22"/>
+                <w:szCs w:val="22"/>
+                <w:lang w:val="en-US"/>
+              </w:rPr>
+              <w:t>}</w:t>
+            </w:r>
+          </w:p>
+        </w:tc>
+        <w:tc>
+          <w:tcPr>
+            <w:tcW w:w="2379" w:type="dxa"/>
+            <w:tcBorders>
+              <w:top w:val="single" w:sz="4" w:space="0" w:color="auto"/>
+              <w:left w:val="single" w:sz="4" w:space="0" w:color="auto"/>
+              <w:bottom w:val="single" w:sz="4" w:space="0" w:color="auto"/>
+              <w:right w:val="single" w:sz="4" w:space="0" w:color="auto"/>
+            </w:tcBorders>
+            <w:shd w:val="clear" w:color="auto" w:fill="auto"/>
+            <w:tcMar>
+              <w:top w:w="80" w:type="dxa"/>
+              <w:left w:w="80" w:type="dxa"/>
+              <w:bottom w:w="80" w:type="dxa"/>
+              <w:right w:w="80" w:type="dxa"/>
+            </w:tcMar>
+            <w:vAlign w:val="center"/>
+          </w:tcPr>
+          <w:p>
+            <w:pPr>
+              <w:jc w:val="center"/>
+            </w:pPr>
+            <w:r>
+              <w:rPr>
+                <w:sz w:val="22"/>
+                <w:szCs w:val="22"/>
+                <w:lang w:val="en-US"/>
+              </w:rPr>
+              <w:t>{</w:t>
+            </w:r>
+            <w:proofErr w:type="spellStart"/>
+            <w:r>
+              <w:rPr>
+                <w:sz w:val="22"/>
+                <w:szCs w:val="22"/>
+                <w:lang w:val="en-US"/>
+              </w:rPr>
+              <w:t>organization_name</w:t>
+            </w:r>
+            <w:proofErr w:type="spellEnd"/>
+            <w:r>
+              <w:rPr>
+                <w:sz w:val="22"/>
+                <w:szCs w:val="22"/>
+                <w:lang w:val="en-US"/>
+              </w:rPr>
+              <w:t>}</w:t>
+            </w:r>
+          </w:p>
+        </w:tc>
+        <w:tc>
+          <w:tcPr>
+            <w:tcW w:w="3136" w:type="dxa"/>
+            <w:tcBorders>
+              <w:top w:val="single" w:sz="4" w:space="0" w:color="auto"/>
+              <w:left w:val="single" w:sz="4" w:space="0" w:color="auto"/>
+              <w:bottom w:val="single" w:sz="4" w:space="0" w:color="auto"/>
+              <w:right w:val="single" w:sz="4" w:space="0" w:color="auto"/>
+            </w:tcBorders>
+            <w:shd w:val="clear" w:color="auto" w:fill="auto"/>
+            <w:tcMar>
+              <w:top w:w="80" w:type="dxa"/>
+              <w:left w:w="80" w:type="dxa"/>
+              <w:bottom w:w="80" w:type="dxa"/>
+              <w:right w:w="80" w:type="dxa"/>
+            </w:tcMar>
+            <w:vAlign w:val="center"/>
+          </w:tcPr>
+          <w:p>
+            <w:pPr>
+              <w:jc w:val="center"/>
+            </w:pPr>
+            <w:r>
+              <w:rPr>
+                <w:sz w:val="22"/>
+                <w:szCs w:val="22"/>
+                <w:lang w:val="en-US"/>
+              </w:rPr>
+              <w:t>{grade}</w:t>
+            </w:r>
+          </w:p>
+        </w:tc>
+        <w:tc>
+          <w:tcPr>
+            <w:tcW w:w="842" w:type="dxa"/>
+            <w:tcBorders>
+              <w:top w:val="single" w:sz="4" w:space="0" w:color="000000"/>
+              <w:left w:val="single" w:sz="4" w:space="0" w:color="auto"/>
+              <w:bottom w:val="single" w:sz="4" w:space="0" w:color="000000"/>
+              <w:right w:val="single" w:sz="4" w:space="0" w:color="auto"/>
+            </w:tcBorders>
+          </w:tcPr>
+          <w:p>
+            <w:pPr>
+              <w:jc w:val="center"/>
+              <w:rPr>
+                <w:i/>
+                <w:iCs/>
+                <w:sz w:val="22"/>
+                <w:szCs w:val="22"/>
+                <w:lang w:val="en-US"/>
+              </w:rPr>
+            </w:pPr>
+          </w:p>
+          <w:p>
+            <w:pPr>
+              <w:jc w:val="center"/>
+              <w:rPr>
+                <w:i/>
+                <w:iCs/>
+                <w:sz w:val="22"/>
+                <w:szCs w:val="22"/>
+                <w:lang w:val="en-US"/>
+              </w:rPr>
+            </w:pPr>
+          </w:p>
+          <w:p>
+            <w:pPr>
+              <w:jc w:val="center"/>
+              <w:rPr>
+                <w:i/>
+                <w:iCs/>
+                <w:sz w:val="22"/>
+                <w:szCs w:val="22"/>
+                <w:lang w:val="en-US"/>
+              </w:rPr>
+            </w:pPr>
+          </w:p>
+          <w:p>
+            <w:pPr>
+              <w:jc w:val="center"/>
+              <w:rPr>
+                <w:i/>
+                <w:iCs/>
+                <w:sz w:val="22"/>
+                <w:szCs w:val="22"/>
+                <w:lang w:val="en-US"/>
+              </w:rPr>
+            </w:pPr>
+          </w:p>
+          <w:p>
+            <w:pPr>
+              <w:jc w:val="center"/>
+              <w:rPr>
+                <w:i/>
+                <w:iCs/>
+                <w:sz w:val="22"/>
+                <w:szCs w:val="22"/>
+                <w:lang w:val="en-US"/>
+              </w:rPr>
+            </w:pPr>
+          </w:p>
+          <w:p>
+            <w:pPr>
+              <w:jc w:val="center"/>
+              <w:rPr>
+                <w:i/>
+                <w:iCs/>
+                <w:sz w:val="22"/>
+                <w:szCs w:val="22"/>
+                <w:lang w:val="en-US"/>
+              </w:rPr>
+            </w:pPr>
+            <w:r>
+              <w:rPr>
+                <w:i/>
+                <w:iCs/>
+                <w:sz w:val="22"/>
+                <w:szCs w:val="22"/>
+                <w:lang w:val="en-US"/>
+              </w:rPr>
+              <w:t>{</w:t>
+            </w:r>
+            <w:proofErr w:type="spellStart"/>
+            <w:r>
+              <w:rPr>
+                <w:i/>
+                <w:iCs/>
+                <w:sz w:val="22"/>
+                <w:szCs w:val="22"/>
+                <w:lang w:val="en-US"/>
+              </w:rPr>
+              <w:t>random_number</w:t>
+            </w:r>
+            <w:proofErr w:type="spellEnd"/>
+            <w:r>
+              <w:rPr>
+                <w:i/>
+                <w:iCs/>
+                <w:sz w:val="22"/>
+                <w:szCs w:val="22"/>
+                <w:lang w:val="en-US"/>
+              </w:rPr>
+              <w:t>}</w:t>
+            </w:r>
+          </w:p>
+        </w:tc>
+        <w:tc>
+          <w:tcPr>
+            <w:tcW w:w="1621" w:type="dxa"/>
+            <w:tcBorders>
+              <w:top w:val="single" w:sz="4" w:space="0" w:color="000000"/>
+              <w:left w:val="single" w:sz="4" w:space="0" w:color="auto"/>
+              <w:bottom w:val="single" w:sz="4" w:space="0" w:color="000000"/>
+              <w:right w:val="single" w:sz="4" w:space="0" w:color="000000"/>
+            </w:tcBorders>
+            <w:shd w:val="clear" w:color="auto" w:fill="auto"/>
+            <w:tcMar>
+              <w:top w:w="80" w:type="dxa"/>
+              <w:left w:w="80" w:type="dxa"/>
+              <w:bottom w:w="80" w:type="dxa"/>
+              <w:right w:w="80" w:type="dxa"/>
+            </w:tcMar>
+            <w:vAlign w:val="center"/>
+          </w:tcPr>
+          <w:p>
+            <w:pPr>
+              <w:jc w:val="center"/>
+              <w:rPr>
+                <w:lang w:val="en-US"/>
+              </w:rPr>
+            </w:pPr>
+            <w:r>
+              <w:rPr>
+                <w:i/>
+                <w:iCs/>
+                <w:sz w:val="22"/>
+                <w:szCs w:val="22"/>
+                <w:lang w:val="en-US"/>
+              </w:rPr>
+              <w:t>{</w:t>
+            </w:r>
+            <w:r>
+              <w:rPr>
+                <w:i/>
+                <w:iCs/>
+                <w:sz w:val="22"/>
+                <w:szCs w:val="22"/>
+              </w:rPr>
+              <w:t>c</w:t>
+            </w:r>
+            <w:proofErr w:type="spellStart"/>
+            <w:r>
+              <w:rPr>
+                <w:i/>
+                <w:iCs/>
+                <w:sz w:val="22"/>
+                <w:szCs w:val="22"/>
+                <w:lang w:val="en-US"/>
+              </w:rPr>
+              <w:t>ourses_mark</w:t>
+            </w:r>
+            <w:proofErr w:type="spellEnd"/>
+            <w:r>
+              <w:rPr>
+                <w:i/>
+                <w:iCs/>
+                <w:sz w:val="22"/>
+                <w:szCs w:val="22"/>
+              </w:rPr>
+              <w:t>}</w:t>
+            </w:r>
+          </w:p>
+        </w:tc>
+        <w:tc>
+          <w:tcPr>
+            <w:tcW w:w="1406" w:type="dxa"/>
+            <w:tcBorders>
+              <w:top w:val="single" w:sz="4" w:space="0" w:color="000000"/>
+              <w:left w:val="single" w:sz="4" w:space="0" w:color="000000"/>
+              <w:bottom w:val="single" w:sz="4" w:space="0" w:color="000000"/>
+              <w:right w:val="single" w:sz="4" w:space="0" w:color="000000"/>
+            </w:tcBorders>
+            <w:shd w:val="clear" w:color="auto" w:fill="auto"/>
+            <w:tcMar>
+              <w:top w:w="80" w:type="dxa"/>
+              <w:left w:w="80" w:type="dxa"/>
+              <w:bottom w:w="80" w:type="dxa"/>
+              <w:right w:w="80" w:type="dxa"/>
+            </w:tcMar>
+            <w:vAlign w:val="center"/>
+          </w:tcPr>
+          <w:p/>
+        </w:tc>
+        <w:tc>
+          <w:tcPr>
+            <w:tcW w:w="951" w:type="dxa"/>
+            <w:tcBorders>
+              <w:top w:val="single" w:sz="4" w:space="0" w:color="000000"/>
+              <w:left w:val="single" w:sz="4" w:space="0" w:color="000000"/>
+              <w:bottom w:val="single" w:sz="4" w:space="0" w:color="000000"/>
+              <w:right w:val="single" w:sz="4" w:space="0" w:color="000000"/>
+            </w:tcBorders>
+            <w:shd w:val="clear" w:color="auto" w:fill="auto"/>
+            <w:tcMar>
+              <w:top w:w="80" w:type="dxa"/>
+              <w:left w:w="80" w:type="dxa"/>
+              <w:bottom w:w="80" w:type="dxa"/>
+              <w:right w:w="80" w:type="dxa"/>
+            </w:tcMar>
+            <w:vAlign w:val="center"/>
+          </w:tcPr>
+          <w:p/>
+        </w:tc>
+        <w:tc>
+          <w:tcPr>
+            <w:tcW w:w="1427" w:type="dxa"/>
+            <w:vMerge/>
+            <w:tcBorders>
+              <w:top w:val="single" w:sz="4" w:space="0" w:color="000000"/>
+              <w:left w:val="single" w:sz="4" w:space="0" w:color="000000"/>
+              <w:bottom w:val="single" w:sz="4" w:space="0" w:color="000000"/>
+              <w:right w:val="single" w:sz="4" w:space="0" w:color="000000"/>
+            </w:tcBorders>
+          </w:tcPr>
+          <w:p>
+            <w:pPr>
+              <w:rPr>
+                <w:sz w:val="22"/>
+                <w:szCs w:val="22"/>
+              </w:rPr>
+            </w:pPr>
+          </w:p>
+          <w:p>
+            <w:pPr>
+              <w:rPr>
+                <w:sz w:val="22"/>
+                <w:szCs w:val="22"/>
+              </w:rPr>
+            </w:pPr>
+          </w:p>
+          <w:p>
+            <w:pPr>
+              <w:rPr>
+                <w:sz w:val="22"/>
+                <w:szCs w:val="22"/>
+              </w:rPr>
+            </w:pPr>
+          </w:p>
+          <w:p>
+            <w:pPr>
+              <w:rPr>
+                <w:sz w:val="22"/>
+                <w:szCs w:val="22"/>
+              </w:rPr>
+            </w:pPr>
+          </w:p>
+          <w:p>
+            <w:pPr>
+              <w:rPr>
+                <w:sz w:val="22"/>
+                <w:szCs w:val="22"/>
+                <w:lang w:val="en-US"/>
+              </w:rPr>
+            </w:pPr>
+            <w:r>
+              <w:rPr>
+                <w:sz w:val="22"/>
+                <w:szCs w:val="22"/>
+                <w:lang w:val="en-US"/>
+              </w:rPr>
+              <w:t xml:space="preserve"> </w:t>
+            </w:r>
+            <w:r>
+              <w:rPr>
+                <w:sz w:val="22"/>
+                <w:szCs w:val="22"/>
+              </w:rPr>
+              <w:t>{</w:t>
+            </w:r>
+            <w:proofErr w:type="spellStart"/>
+            <w:r>
+              <w:rPr>
+                <w:sz w:val="22"/>
+                <w:szCs w:val="22"/>
+              </w:rPr>
+              <w:t>conclusion</w:t>
+            </w:r>
+            <w:proofErr w:type="spellEnd"/>
+            <w:r>
+              <w:rPr>
+                <w:sz w:val="22"/>
+                <w:szCs w:val="22"/>
+                <w:lang w:val="en-US"/>
+              </w:rPr>
+              <w:t>}</w:t>
+            </w:r>
+            <w:r>
+              <w:rPr>
+                <w:i/>
+                <w:iCs/>
+                <w:sz w:val="22"/>
+                <w:szCs w:val="22"/>
+                <w:lang w:val="en-US"/>
+              </w:rPr>
+              <w:t>{/employee}</w:t>
+            </w:r>
+          </w:p>
+        </w:tc>
+      </w:tr>
+    </w:tbl>
+    <w:p>
+      <w:pPr>
+        <w:widowControl w:val="0"/>
+        <w:ind w:left="324" w:hanging="324"/>
+        <w:rPr>
+          <w:sz w:val="22"/>
+          <w:szCs w:val="22"/>
+        </w:rPr>
+      </w:pPr>
+    </w:p>
+    <w:p>
+      <w:pPr>
+        <w:widowControl w:val="0"/>
+        <w:ind w:left="216" w:hanging="216"/>
+        <w:rPr>
+          <w:sz w:val="22"/>
+          <w:szCs w:val="22"/>
+        </w:rPr>
+      </w:pPr>
+    </w:p>
+    <w:p>
+      <w:pPr>
+        <w:widowControl w:val="0"/>
+        <w:ind w:left="108" w:hanging="108"/>
+        <w:rPr>
+          <w:sz w:val="22"/>
+          <w:szCs w:val="22"/>
+        </w:rPr>
+      </w:pPr>
+    </w:p>
+    <w:p>
+      <w:pPr>
+        <w:widowControl w:val="0"/>
+        <w:jc w:val="both"/>
+        <w:rPr>
+          <w:sz w:val="22"/>
+          <w:szCs w:val="22"/>
+        </w:rPr>
+      </w:pPr>
+    </w:p>
+    <w:p>
+      <w:pPr>
+        <w:tabs>
+          <w:tab w:val="left" w:pos="2220"/>
+        </w:tabs>
+        <w:rPr>
+          <w:sz w:val="18"/>
+          <w:szCs w:val="18"/>
+        </w:rPr>
+      </w:pPr>
+      <w:r>
+        <w:rPr>
+          <w:sz w:val="28"/>
+          <w:szCs w:val="28"/>
+        </w:rPr>
+        <w:tab/>
+      </w:r>
+    </w:p>
+    <w:p>
+      <w:pPr>
+        <w:ind w:left="3828"/>
+      </w:pPr>
+      <w:r>
+        <w:t>Председатель комиссии:</w:t>
+      </w:r>
+      <w:r>
+        <w:tab/>
+      </w:r>
+      <w:r>
+        <w:tab/>
+      </w:r>
+      <w:r>
+        <w:tab/>
+      </w:r>
+      <w:r>
+        <w:tab/>
+        <w:t xml:space="preserve">/ В.М. </w:t>
+      </w:r>
+      <w:proofErr w:type="spellStart"/>
+      <w:r>
+        <w:t>Шекшуев</w:t>
+      </w:r>
+      <w:proofErr w:type="spellEnd"/>
+      <w:r>
+        <w:t xml:space="preserve"> /</w:t>
+      </w:r>
+    </w:p>
+    <w:p>
+      <w:pPr>
+        <w:ind w:left="3828"/>
+        <w:rPr>
+          <w:sz w:val="12"/>
+          <w:szCs w:val="12"/>
+        </w:rPr>
+      </w:pPr>
+    </w:p>
+    <w:p>
+      <w:pPr>
+        <w:ind w:left="3828"/>
+      </w:pPr>
+      <w:r>
+        <w:t>Члены комиссии:</w:t>
+      </w:r>
+      <w:r>
+        <w:tab/>
+      </w:r>
+      <w:r>
+        <w:tab/>
+      </w:r>
+      <w:r>
+        <w:tab/>
+      </w:r>
+      <w:r>
+        <w:tab/>
+      </w:r>
+      <w:r>
+        <w:tab/>
+        <w:t>/ Е.С. Воробьева /</w:t>
+      </w:r>
+    </w:p>
+    <w:p>
+      <w:pPr>
+        <w:ind w:left="3828"/>
+        <w:rPr>
+          <w:sz w:val="12"/>
+          <w:szCs w:val="12"/>
+        </w:rPr>
+      </w:pPr>
+    </w:p>
+    <w:p>
+      <w:pPr>
+        <w:ind w:left="3828"/>
+      </w:pPr>
+      <w:r>
+        <w:tab/>
+      </w:r>
+      <w:r>
+        <w:tab/>
+      </w:r>
+      <w:r>
+        <w:tab/>
+      </w:r>
+      <w:r>
+        <w:tab/>
+      </w:r>
+      <w:r>
+        <w:tab/>
+      </w:r>
+      <w:r>
+        <w:tab/>
+      </w:r>
+      <w:r>
+        <w:tab/>
+        <w:t xml:space="preserve">/ И.Ю. </w:t>
+      </w:r>
+      <w:proofErr w:type="spellStart"/>
+      <w:r>
+        <w:t>Шекшуева</w:t>
+      </w:r>
+      <w:proofErr w:type="spellEnd"/>
+      <w:r>
+        <w:t xml:space="preserve"> /</w:t>
+      </w:r>
+    </w:p>
+    <w:sectPr>
+      <w:headerReference w:type="default" r:id="rId7"/>
+      <w:footerReference w:type="default" r:id="rId8"/>
+      <w:pgSz w:w="16840" w:h="11900" w:orient="landscape"/>
+      <w:pgMar w:top="142" w:right="536" w:bottom="0" w:left="1134" w:header="709" w:footer="709" w:gutter="0"/>
+      <w:cols w:space="720"/>
+    </w:sectPr>
+  </w:body>
+</w:document>
+</file>
+
+<file path=doc.xml><?xml version="1.0" encoding="utf-8"?>
+<w:document xmlns:wpc="http://schemas.microsoft.com/office/word/2010/wordprocessingCanvas" xmlns:cx="http://schemas.microsoft.com/office/drawing/2014/chartex" xmlns:cx1="http://schemas.microsoft.com/office/drawing/2015/9/8/chartex" xmlns:cx2="http://schemas.microsoft.com/office/drawing/2015/10/21/chartex" xmlns:cx3="http://schemas.microsoft.com/office/drawing/2016/5/9/chartex" xmlns:cx4="http://schemas.microsoft.com/office/drawing/2016/5/10/chartex" xmlns:cx5="http://schemas.microsoft.com/office/drawing/2016/5/11/chartex" xmlns:cx6="http://schemas.microsoft.com/office/drawing/2016/5/12/chartex" xmlns:cx7="http://schemas.microsoft.com/office/drawing/2016/5/13/chartex" xmlns:cx8="http://schemas.microsoft.com/office/drawing/2016/5/14/chartex" xmlns:mc="http://schemas.openxmlformats.org/markup-compatibility/2006" xmlns:aink="http://schemas.microsoft.com/office/drawing/2016/ink" xmlns:am3d="http://schemas.microsoft.com/office/drawing/2017/model3d" xmlns:o="urn:schemas-microsoft-com:office:office" xmlns:oel="http://schemas.microsoft.com/office/2019/extlst" xmlns:r="http://schemas.openxmlformats.org/officeDocument/2006/relationships" xmlns:m="http://schemas.openxmlformats.org/officeDocument/2006/math" xmlns:v="urn:schemas-microsoft-com:vml" xmlns:wp14="http://schemas.microsoft.com/office/word/2010/wordprocessingDrawing" xmlns:wp="http://schemas.openxmlformats.org/drawingml/2006/wordprocessingDrawing" xmlns:w10="urn:schemas-microsoft-com:office:word" xmlns:w="http://schemas.openxmlformats.org/wordprocessingml/2006/main" xmlns:w14="http://schemas.microsoft.com/office/word/2010/wordml" xmlns:w15="http://schemas.microsoft.com/office/word/2012/wordml" xmlns:w16cex="http://schemas.microsoft.com/office/word/2018/wordml/cex" xmlns:w16cid="http://schemas.microsoft.com/office/word/2016/wordml/cid" xmlns:w16="http://schemas.microsoft.com/office/word/2018/wordml" xmlns:w16sdtdh="http://schemas.microsoft.com/office/word/2020/wordml/sdtdatahash" xmlns:w16se="http://schemas.microsoft.com/office/word/2015/wordml/symex" xmlns:wpg="http://schemas.microsoft.com/office/word/2010/wordprocessingGroup" xmlns:wpi="http://schemas.microsoft.com/office/word/2010/wordprocessingInk" xmlns:wne="http://schemas.microsoft.com/office/word/2006/wordml" xmlns:wps="http://schemas.microsoft.com/office/word/2010/wordprocessingShape" mc:Ignorable="w14 w15 w16se w16cid w16 w16cex w16sdtdh wp14">
+  <w:body>
+    <w:p>
+      <w:pPr>
+        <w:jc w:val="center"/>
+        <w:rPr>
+          <w:b/>
+          <w:bCs/>
+          <w:sz w:val="28"/>
+          <w:szCs w:val="28"/>
+          <w:lang w:val="en-US"/>
+        </w:rPr>
+      </w:pPr>
+      <w:r>
+        <w:rPr>
+          <w:b/>
+          <w:bCs/>
+          <w:sz w:val="28"/>
+          <w:szCs w:val="28"/>
+          <w:lang w:val="en-US"/>
+        </w:rPr>
+        <w:t>{</w:t>
+      </w:r>
+      <w:proofErr w:type="spellStart"/>
+      <w:r>
+        <w:rPr>
+          <w:b/>
+          <w:bCs/>
+          <w:sz w:val="28"/>
+          <w:szCs w:val="28"/>
+          <w:lang w:val="en-US"/>
+        </w:rPr>
+        <w:t>moisei_name</w:t>
+      </w:r>
+      <w:proofErr w:type="spellEnd"/>
+      <w:r>
+        <w:rPr>
+          <w:b/>
+          <w:bCs/>
+          <w:sz w:val="28"/>
+          <w:szCs w:val="28"/>
+          <w:lang w:val="en-US"/>
+        </w:rPr>
+        <w:t>}</w:t>
+      </w:r>
+    </w:p>
+    <w:p>
+      <w:pPr>
+        <w:jc w:val="center"/>
+        <w:rPr>
+          <w:b/>
+          <w:bCs/>
+          <w:sz w:val="22"/>
+          <w:szCs w:val="22"/>
+        </w:rPr>
+      </w:pPr>
+    </w:p>
+    <w:p>
+      <w:pPr>
+        <w:jc w:val="center"/>
+        <w:rPr>
+          <w:b/>
+          <w:bCs/>
+          <w:sz w:val="28"/>
+          <w:szCs w:val="28"/>
+        </w:rPr>
+      </w:pPr>
+      <w:r>
+        <w:rPr>
+          <w:b/>
+          <w:bCs/>
+          <w:sz w:val="28"/>
+          <w:szCs w:val="28"/>
+        </w:rPr>
+        <w:t xml:space="preserve">П Р О Т О К О Л    </w:t>
+      </w:r>
+      <w:proofErr w:type="gramStart"/>
+      <w:r>
+        <w:rPr>
+          <w:b/>
+          <w:bCs/>
+          <w:sz w:val="28"/>
+          <w:szCs w:val="28"/>
+        </w:rPr>
+        <w:t xml:space="preserve">№  </w:t>
+      </w:r>
+      <w:r>
+        <w:rPr>
+          <w:b/>
+          <w:bCs/>
+          <w:sz w:val="28"/>
+          <w:szCs w:val="28"/>
+        </w:rPr>
+        <w:t>{</w:t>
+      </w:r>
+      <w:proofErr w:type="gramEnd"/>
+      <w:r>
+        <w:rPr>
+          <w:b/>
+          <w:bCs/>
+          <w:sz w:val="28"/>
+          <w:szCs w:val="28"/>
+          <w:lang w:val="en-US"/>
+        </w:rPr>
+        <w:t>group</w:t>
+      </w:r>
+      <w:r>
+        <w:rPr>
+          <w:b/>
+          <w:bCs/>
+          <w:sz w:val="28"/>
+          <w:szCs w:val="28"/>
+        </w:rPr>
+        <w:t>_</w:t>
+      </w:r>
+      <w:r>
+        <w:rPr>
+          <w:b/>
+          <w:bCs/>
+          <w:sz w:val="28"/>
+          <w:szCs w:val="28"/>
+          <w:lang w:val="en-US"/>
+        </w:rPr>
+        <w:t>id</w:t>
+      </w:r>
+      <w:r>
+        <w:rPr>
+          <w:b/>
+          <w:bCs/>
+          <w:sz w:val="28"/>
+          <w:szCs w:val="28"/>
+        </w:rPr>
+        <w:t>}</w:t>
+      </w:r>
+      <w:r>
+        <w:rPr>
+          <w:b/>
+          <w:bCs/>
+          <w:sz w:val="28"/>
+          <w:szCs w:val="28"/>
+        </w:rPr>
+        <w:t xml:space="preserve">  от  </w:t>
+      </w:r>
+      <w:r>
+        <w:rPr>
+          <w:b/>
+          <w:bCs/>
+          <w:sz w:val="28"/>
+          <w:szCs w:val="28"/>
+        </w:rPr>
+        <w:t>{</w:t>
+      </w:r>
+      <w:r>
+        <w:rPr>
+          <w:b/>
+          <w:bCs/>
+          <w:sz w:val="28"/>
+          <w:szCs w:val="28"/>
+          <w:lang w:val="en-US"/>
+        </w:rPr>
+        <w:t>end</w:t>
+      </w:r>
+      <w:r>
+        <w:rPr>
+          <w:b/>
+          <w:bCs/>
+          <w:sz w:val="28"/>
+          <w:szCs w:val="28"/>
+        </w:rPr>
+        <w:t>_</w:t>
+      </w:r>
+      <w:r>
+        <w:rPr>
+          <w:b/>
+          <w:bCs/>
+          <w:sz w:val="28"/>
+          <w:szCs w:val="28"/>
+          <w:lang w:val="en-US"/>
+        </w:rPr>
+        <w:t>date</w:t>
+      </w:r>
+      <w:r>
+        <w:rPr>
+          <w:b/>
+          <w:bCs/>
+          <w:sz w:val="28"/>
+          <w:szCs w:val="28"/>
+        </w:rPr>
+        <w:t>}</w:t>
+      </w:r>
+    </w:p>
+    <w:p>
+      <w:pPr>
+        <w:jc w:val="center"/>
+        <w:rPr>
+          <w:b/>
+          <w:bCs/>
+          <w:sz w:val="28"/>
+          <w:szCs w:val="28"/>
+        </w:rPr>
+      </w:pPr>
+      <w:r>
+        <w:rPr>
+          <w:b/>
+          <w:bCs/>
+          <w:sz w:val="28"/>
+          <w:szCs w:val="28"/>
+        </w:rPr>
+        <w:t>заседания комиссии по проверке знаний</w:t>
+      </w:r>
+    </w:p>
+    <w:p>
+      <w:pPr>
+        <w:rPr>
+          <w:sz w:val="18"/>
+          <w:szCs w:val="18"/>
+        </w:rPr>
+      </w:pPr>
+    </w:p>
+    <w:p>
+      <w:r>
+        <w:t>В соответствии с приказом директора от «01» сентября 2022 г. № 10 комиссия в составе:</w:t>
+      </w:r>
+    </w:p>
+    <w:p>
+      <w:pPr>
+        <w:rPr>
+          <w:sz w:val="22"/>
+          <w:szCs w:val="22"/>
+        </w:rPr>
+      </w:pPr>
+    </w:p>
+    <w:p>
+      <w:r>
+        <w:rPr>
+          <w:b/>
+          <w:bCs/>
+        </w:rPr>
+        <w:t>Председатель комиссии:</w:t>
+      </w:r>
+      <w:r>
+        <w:tab/>
+      </w:r>
+      <w:proofErr w:type="spellStart"/>
+      <w:r>
+        <w:t>Шекшуев</w:t>
+      </w:r>
+      <w:proofErr w:type="spellEnd"/>
+      <w:r>
+        <w:t xml:space="preserve"> В.М.. - директор</w:t>
+      </w:r>
+    </w:p>
+    <w:p>
+      <w:r>
+        <w:rPr>
+          <w:b/>
+          <w:bCs/>
+        </w:rPr>
+        <w:t>Члены комиссии:</w:t>
+      </w:r>
+      <w:r>
+        <w:rPr>
+          <w:b/>
+          <w:bCs/>
+        </w:rPr>
+        <w:tab/>
+      </w:r>
+      <w:r>
+        <w:tab/>
+        <w:t>Воробьева Е.С. – заместитель директора</w:t>
+      </w:r>
+    </w:p>
+    <w:p>
+      <w:r>
+        <w:tab/>
+      </w:r>
+      <w:r>
+        <w:tab/>
+      </w:r>
+      <w:r>
+        <w:tab/>
+      </w:r>
+      <w:r>
+        <w:tab/>
+      </w:r>
+      <w:proofErr w:type="spellStart"/>
+      <w:r>
+        <w:t>Шекшуева</w:t>
+      </w:r>
+      <w:proofErr w:type="spellEnd"/>
+      <w:r>
+        <w:t xml:space="preserve"> И.Ю. – специалист учебного центра</w:t>
+      </w:r>
+    </w:p>
+    <w:p>
+      <w:pPr>
+        <w:pStyle w:val="a4"/>
+        <w:tabs>
+          <w:tab w:val="left" w:pos="2694"/>
+        </w:tabs>
+        <w:rPr>
+          <w:sz w:val="22"/>
+          <w:szCs w:val="22"/>
+        </w:rPr>
+      </w:pPr>
+    </w:p>
+    <w:p>
+      <w:pPr>
+        <w:jc w:val="both"/>
+      </w:pPr>
+      <w:r>
+        <w:t>Проведена проверка знаний по программе: - «</w:t>
+      </w:r>
+      <w:r>
+        <w:t>{</w:t>
+      </w:r>
+      <w:r>
+        <w:rPr>
+          <w:lang w:val="en-US"/>
+        </w:rPr>
+        <w:t>course</w:t>
+      </w:r>
+      <w:r>
+        <w:t>_</w:t>
+      </w:r>
+      <w:r>
+        <w:rPr>
+          <w:lang w:val="en-US"/>
+        </w:rPr>
+        <w:t>name</w:t>
+      </w:r>
+      <w:r>
+        <w:t>}</w:t>
+      </w:r>
+      <w:r>
+        <w:t xml:space="preserve">» в объеме </w:t>
+      </w:r>
+      <w:r>
+        <w:t>{</w:t>
+      </w:r>
+      <w:r>
+        <w:rPr>
+          <w:lang w:val="en-US"/>
+        </w:rPr>
+        <w:t>hours</w:t>
+      </w:r>
+      <w:r>
+        <w:t>}</w:t>
+      </w:r>
+      <w:r>
+        <w:t xml:space="preserve"> часов;</w:t>
+      </w:r>
+    </w:p>
+    <w:p>
+      <w:pPr>
+        <w:jc w:val="both"/>
+        <w:rPr>
+          <w:sz w:val="22"/>
+          <w:szCs w:val="22"/>
+        </w:rPr>
+      </w:pPr>
+      <w:r>
+        <w:rPr>
+          <w:sz w:val="22"/>
+          <w:szCs w:val="22"/>
+        </w:rPr>
+        <w:t>- - «</w:t>
+      </w:r>
+      <w:r>
+        <w:rPr>
+          <w:sz w:val="22"/>
+          <w:szCs w:val="22"/>
+        </w:rPr>
+        <w:t>{</w:t>
+      </w:r>
+      <w:r>
+        <w:rPr>
+          <w:sz w:val="22"/>
+          <w:szCs w:val="22"/>
+          <w:lang w:val="en-US"/>
+        </w:rPr>
+        <w:t>course</w:t>
+      </w:r>
+      <w:r>
+        <w:rPr>
+          <w:sz w:val="22"/>
+          <w:szCs w:val="22"/>
+        </w:rPr>
+        <w:t>_</w:t>
+      </w:r>
+      <w:r>
+        <w:rPr>
+          <w:sz w:val="22"/>
+          <w:szCs w:val="22"/>
+          <w:lang w:val="en-US"/>
+        </w:rPr>
+        <w:t>name</w:t>
+      </w:r>
+      <w:r>
+        <w:rPr>
+          <w:sz w:val="22"/>
+          <w:szCs w:val="22"/>
+        </w:rPr>
+        <w:t>}</w:t>
+      </w:r>
+      <w:r>
+        <w:rPr>
+          <w:sz w:val="22"/>
+          <w:szCs w:val="22"/>
+        </w:rPr>
+        <w:t xml:space="preserve">» в объеме </w:t>
+      </w:r>
+      <w:r>
+        <w:rPr>
+          <w:sz w:val="22"/>
+          <w:szCs w:val="22"/>
+        </w:rPr>
+        <w:t>{</w:t>
+      </w:r>
+      <w:r>
+        <w:rPr>
+          <w:sz w:val="22"/>
+          <w:szCs w:val="22"/>
+          <w:lang w:val="en-US"/>
+        </w:rPr>
+        <w:t>hours</w:t>
+      </w:r>
+      <w:r>
+        <w:rPr>
+          <w:sz w:val="22"/>
+          <w:szCs w:val="22"/>
+        </w:rPr>
+        <w:t>}</w:t>
+      </w:r>
+      <w:r>
+        <w:rPr>
+          <w:sz w:val="22"/>
+          <w:szCs w:val="22"/>
+        </w:rPr>
+        <w:t xml:space="preserve"> часов:</w:t>
+      </w:r>
+    </w:p>
+    <w:tbl>
+      <w:tblPr>
+        <w:tblStyle w:val="TableNormal"/>
+        <w:tblW w:w="15603" w:type="dxa"/>
+        <w:tblInd w:w="-289" w:type="dxa"/>
+        <w:tblBorders>
+          <w:top w:val="single" w:sz="8" w:space="0" w:color="FFFFFF"/>
+          <w:left w:val="single" w:sz="8" w:space="0" w:color="FFFFFF"/>
+          <w:bottom w:val="single" w:sz="8" w:space="0" w:color="FFFFFF"/>
+          <w:right w:val="single" w:sz="8" w:space="0" w:color="FFFFFF"/>
+          <w:insideH w:val="single" w:sz="8" w:space="0" w:color="FFFFFF"/>
+          <w:insideV w:val="single" w:sz="8" w:space="0" w:color="FFFFFF"/>
+        </w:tblBorders>
+        <w:shd w:val="clear" w:color="auto" w:fill="CED7E7"/>
+        <w:tblLayout w:type="fixed"/>
+        <w:tblLook w:val="04A0" w:firstRow="1" w:lastRow="0" w:firstColumn="1" w:lastColumn="0" w:noHBand="0" w:noVBand="1"/>
+      </w:tblPr>
+      <w:tblGrid>
+        <w:gridCol w:w="923"/>
+        <w:gridCol w:w="2918"/>
+        <w:gridCol w:w="2379"/>
+        <w:gridCol w:w="3136"/>
+        <w:gridCol w:w="842"/>
+        <w:gridCol w:w="1621"/>
+        <w:gridCol w:w="1406"/>
+        <w:gridCol w:w="951"/>
+        <w:gridCol w:w="1427"/>
+      </w:tblGrid>
+      <w:tr>
+        <w:trPr>
+          <w:trHeight w:val="1046"/>
+        </w:trPr>
+        <w:tc>
+          <w:tcPr>
+            <w:tcW w:w="923" w:type="dxa"/>
+            <w:tcBorders>
+              <w:top w:val="single" w:sz="4" w:space="0" w:color="000000"/>
+              <w:left w:val="single" w:sz="4" w:space="0" w:color="000000"/>
+              <w:bottom w:val="single" w:sz="4" w:space="0" w:color="000000"/>
+              <w:right w:val="single" w:sz="4" w:space="0" w:color="000000"/>
+            </w:tcBorders>
+            <w:shd w:val="clear" w:color="auto" w:fill="auto"/>
+            <w:tcMar>
+              <w:top w:w="80" w:type="dxa"/>
+              <w:left w:w="80" w:type="dxa"/>
+              <w:bottom w:w="80" w:type="dxa"/>
+              <w:right w:w="80" w:type="dxa"/>
+            </w:tcMar>
+            <w:vAlign w:val="center"/>
+          </w:tcPr>
+          <w:p>
+            <w:pPr>
+              <w:jc w:val="center"/>
+            </w:pPr>
+            <w:r>
+              <w:rPr>
+                <w:sz w:val="22"/>
+                <w:szCs w:val="22"/>
+              </w:rPr>
+              <w:t>№</w:t>
+            </w:r>
+          </w:p>
+        </w:tc>
+        <w:tc>
+          <w:tcPr>
+            <w:tcW w:w="2918" w:type="dxa"/>
+            <w:tcBorders>
+              <w:top w:val="single" w:sz="4" w:space="0" w:color="000000"/>
+              <w:left w:val="single" w:sz="4" w:space="0" w:color="000000"/>
+              <w:bottom w:val="single" w:sz="4" w:space="0" w:color="000000"/>
+              <w:right w:val="single" w:sz="4" w:space="0" w:color="000000"/>
+            </w:tcBorders>
+            <w:shd w:val="clear" w:color="auto" w:fill="auto"/>
+            <w:tcMar>
+              <w:top w:w="80" w:type="dxa"/>
+              <w:left w:w="80" w:type="dxa"/>
+              <w:bottom w:w="80" w:type="dxa"/>
+              <w:right w:w="80" w:type="dxa"/>
+            </w:tcMar>
+            <w:vAlign w:val="center"/>
+          </w:tcPr>
+          <w:p>
+            <w:pPr>
+              <w:jc w:val="center"/>
+            </w:pPr>
+            <w:r>
+              <w:rPr>
+                <w:sz w:val="22"/>
+                <w:szCs w:val="22"/>
+              </w:rPr>
+              <w:t>Ф.И.О.</w:t>
+            </w:r>
+          </w:p>
+        </w:tc>
+        <w:tc>
+          <w:tcPr>
+            <w:tcW w:w="2379" w:type="dxa"/>
+            <w:tcBorders>
+              <w:top w:val="single" w:sz="4" w:space="0" w:color="000000"/>
+              <w:left w:val="single" w:sz="4" w:space="0" w:color="000000"/>
+              <w:bottom w:val="single" w:sz="4" w:space="0" w:color="000000"/>
+              <w:right w:val="single" w:sz="4" w:space="0" w:color="000000"/>
+            </w:tcBorders>
+            <w:shd w:val="clear" w:color="auto" w:fill="auto"/>
+            <w:tcMar>
+              <w:top w:w="80" w:type="dxa"/>
+              <w:left w:w="80" w:type="dxa"/>
+              <w:bottom w:w="80" w:type="dxa"/>
+              <w:right w:w="80" w:type="dxa"/>
+            </w:tcMar>
+            <w:vAlign w:val="center"/>
+          </w:tcPr>
+          <w:p>
+            <w:pPr>
+              <w:jc w:val="center"/>
+            </w:pPr>
+            <w:r>
+              <w:rPr>
+                <w:sz w:val="22"/>
+                <w:szCs w:val="22"/>
+              </w:rPr>
+              <w:t>Наименование предприятия</w:t>
+            </w:r>
+          </w:p>
+        </w:tc>
+        <w:tc>
+          <w:tcPr>
+            <w:tcW w:w="3136" w:type="dxa"/>
+            <w:tcBorders>
+              <w:top w:val="single" w:sz="4" w:space="0" w:color="000000"/>
+              <w:left w:val="single" w:sz="4" w:space="0" w:color="000000"/>
+              <w:bottom w:val="single" w:sz="4" w:space="0" w:color="000000"/>
+              <w:right w:val="single" w:sz="4" w:space="0" w:color="000000"/>
+            </w:tcBorders>
+            <w:shd w:val="clear" w:color="auto" w:fill="auto"/>
+            <w:tcMar>
+              <w:top w:w="80" w:type="dxa"/>
+              <w:left w:w="80" w:type="dxa"/>
+              <w:bottom w:w="80" w:type="dxa"/>
+              <w:right w:w="80" w:type="dxa"/>
+            </w:tcMar>
+            <w:vAlign w:val="center"/>
+          </w:tcPr>
+          <w:p>
+            <w:pPr>
+              <w:jc w:val="center"/>
+            </w:pPr>
+            <w:r>
+              <w:rPr>
+                <w:sz w:val="22"/>
+                <w:szCs w:val="22"/>
+              </w:rPr>
+              <w:t>Занимаемая должность</w:t>
+            </w:r>
+          </w:p>
+        </w:tc>
+        <w:tc>
+          <w:tcPr>
+            <w:tcW w:w="842" w:type="dxa"/>
+            <w:tcBorders>
+              <w:top w:val="single" w:sz="4" w:space="0" w:color="000000"/>
+              <w:left w:val="single" w:sz="4" w:space="0" w:color="000000"/>
+              <w:bottom w:val="single" w:sz="4" w:space="0" w:color="000000"/>
+              <w:right w:val="single" w:sz="4" w:space="0" w:color="000000"/>
+            </w:tcBorders>
+          </w:tcPr>
+          <w:p>
+            <w:pPr>
+              <w:jc w:val="center"/>
+              <w:rPr>
+                <w:sz w:val="22"/>
+                <w:szCs w:val="22"/>
+              </w:rPr>
+            </w:pPr>
+          </w:p>
+          <w:p>
+            <w:pPr>
+              <w:jc w:val="center"/>
+              <w:rPr>
+                <w:sz w:val="22"/>
+                <w:szCs w:val="22"/>
+              </w:rPr>
+            </w:pPr>
+          </w:p>
+          <w:p>
+            <w:pPr>
+              <w:jc w:val="center"/>
+              <w:rPr>
+                <w:sz w:val="22"/>
+                <w:szCs w:val="22"/>
+              </w:rPr>
+            </w:pPr>
+          </w:p>
+          <w:p>
+            <w:pPr>
+              <w:jc w:val="center"/>
+              <w:rPr>
+                <w:sz w:val="22"/>
+                <w:szCs w:val="22"/>
+              </w:rPr>
+            </w:pPr>
+            <w:r>
+              <w:rPr>
+                <w:sz w:val="22"/>
+                <w:szCs w:val="22"/>
+              </w:rPr>
+              <w:t>Номер билета</w:t>
+            </w:r>
+          </w:p>
+        </w:tc>
+        <w:tc>
+          <w:tcPr>
+            <w:tcW w:w="1621" w:type="dxa"/>
+            <w:tcBorders>
+              <w:top w:val="single" w:sz="4" w:space="0" w:color="000000"/>
+              <w:left w:val="single" w:sz="4" w:space="0" w:color="000000"/>
+              <w:bottom w:val="single" w:sz="4" w:space="0" w:color="000000"/>
+              <w:right w:val="single" w:sz="4" w:space="0" w:color="000000"/>
+            </w:tcBorders>
+            <w:shd w:val="clear" w:color="auto" w:fill="auto"/>
+            <w:tcMar>
+              <w:top w:w="80" w:type="dxa"/>
+              <w:left w:w="80" w:type="dxa"/>
+              <w:bottom w:w="80" w:type="dxa"/>
+              <w:right w:w="80" w:type="dxa"/>
+            </w:tcMar>
+            <w:vAlign w:val="center"/>
+          </w:tcPr>
+          <w:p>
+            <w:pPr>
+              <w:jc w:val="center"/>
+            </w:pPr>
+            <w:r>
+              <w:rPr>
+                <w:sz w:val="22"/>
+                <w:szCs w:val="22"/>
+              </w:rPr>
+              <w:t>Результат проверки знаний</w:t>
+            </w:r>
+          </w:p>
+        </w:tc>
+        <w:tc>
+          <w:tcPr>
+            <w:tcW w:w="1406" w:type="dxa"/>
+            <w:tcBorders>
+              <w:top w:val="single" w:sz="4" w:space="0" w:color="000000"/>
+              <w:left w:val="single" w:sz="4" w:space="0" w:color="000000"/>
+              <w:bottom w:val="single" w:sz="4" w:space="0" w:color="000000"/>
+              <w:right w:val="single" w:sz="4" w:space="0" w:color="000000"/>
+            </w:tcBorders>
+            <w:shd w:val="clear" w:color="auto" w:fill="auto"/>
+            <w:tcMar>
+              <w:top w:w="80" w:type="dxa"/>
+              <w:left w:w="80" w:type="dxa"/>
+              <w:bottom w:w="80" w:type="dxa"/>
+              <w:right w:w="80" w:type="dxa"/>
+            </w:tcMar>
+            <w:vAlign w:val="center"/>
+          </w:tcPr>
+          <w:p>
+            <w:pPr>
+              <w:jc w:val="center"/>
+            </w:pPr>
+            <w:r>
+              <w:rPr>
+                <w:sz w:val="22"/>
+                <w:szCs w:val="22"/>
+              </w:rPr>
+              <w:t>Регистрационный номер записи о проверке знаний в реестре обученных лиц</w:t>
+            </w:r>
+          </w:p>
+        </w:tc>
+        <w:tc>
+          <w:tcPr>
+            <w:tcW w:w="951" w:type="dxa"/>
+            <w:tcBorders>
+              <w:top w:val="single" w:sz="4" w:space="0" w:color="000000"/>
+              <w:left w:val="single" w:sz="4" w:space="0" w:color="000000"/>
+              <w:bottom w:val="single" w:sz="4" w:space="0" w:color="000000"/>
+              <w:right w:val="single" w:sz="4" w:space="0" w:color="000000"/>
+            </w:tcBorders>
+            <w:shd w:val="clear" w:color="auto" w:fill="auto"/>
+            <w:tcMar>
+              <w:top w:w="80" w:type="dxa"/>
+              <w:left w:w="80" w:type="dxa"/>
+              <w:bottom w:w="80" w:type="dxa"/>
+              <w:right w:w="80" w:type="dxa"/>
+            </w:tcMar>
+            <w:vAlign w:val="center"/>
+          </w:tcPr>
+          <w:p>
+            <w:pPr>
+              <w:jc w:val="center"/>
+            </w:pPr>
+            <w:r>
+              <w:rPr>
+                <w:sz w:val="22"/>
+                <w:szCs w:val="22"/>
+              </w:rPr>
+              <w:t>Подпись проверяемого</w:t>
+            </w:r>
+          </w:p>
+        </w:tc>
+        <w:tc>
+          <w:tcPr>
+            <w:tcW w:w="1427" w:type="dxa"/>
+            <w:tcBorders>
+              <w:top w:val="single" w:sz="4" w:space="0" w:color="000000"/>
+              <w:left w:val="single" w:sz="4" w:space="0" w:color="000000"/>
+              <w:bottom w:val="single" w:sz="4" w:space="0" w:color="000000"/>
+              <w:right w:val="single" w:sz="4" w:space="0" w:color="000000"/>
+            </w:tcBorders>
+          </w:tcPr>
+          <w:p>
+            <w:pPr>
+              <w:jc w:val="center"/>
+              <w:rPr>
+                <w:sz w:val="22"/>
+                <w:szCs w:val="22"/>
+              </w:rPr>
+            </w:pPr>
+          </w:p>
+          <w:p>
+            <w:pPr>
+              <w:jc w:val="center"/>
+              <w:rPr>
+                <w:sz w:val="22"/>
+                <w:szCs w:val="22"/>
+              </w:rPr>
+            </w:pPr>
+          </w:p>
+          <w:p>
+            <w:pPr>
+              <w:jc w:val="center"/>
+              <w:rPr>
+                <w:sz w:val="22"/>
+                <w:szCs w:val="22"/>
+              </w:rPr>
+            </w:pPr>
+            <w:r>
+              <w:rPr>
+                <w:sz w:val="22"/>
+                <w:szCs w:val="22"/>
+              </w:rPr>
+              <w:t>Заключение экзаменационной</w:t>
+            </w:r>
+          </w:p>
+          <w:p>
+            <w:pPr>
+              <w:jc w:val="center"/>
+              <w:rPr>
+                <w:sz w:val="22"/>
+                <w:szCs w:val="22"/>
+              </w:rPr>
+            </w:pPr>
+            <w:r>
+              <w:rPr>
+                <w:sz w:val="22"/>
+                <w:szCs w:val="22"/>
+              </w:rPr>
+              <w:t>комиссии</w:t>
+            </w:r>
+          </w:p>
+          <w:p>
+            <w:pPr>
+              <w:rPr>
+                <w:sz w:val="22"/>
+                <w:szCs w:val="22"/>
+              </w:rPr>
+            </w:pPr>
+          </w:p>
+        </w:tc>
+      </w:tr>
+      <w:tr>
+        <w:trPr>
+          <w:trHeight w:val="230"/>
+        </w:trPr>
+        <w:tc>
+          <w:tcPr>
+            <w:tcW w:w="923" w:type="dxa"/>
+            <w:tcBorders>
+              <w:top w:val="single" w:sz="4" w:space="0" w:color="000000"/>
+              <w:left w:val="single" w:sz="4" w:space="0" w:color="000000"/>
+              <w:bottom w:val="single" w:sz="4" w:space="0" w:color="000000"/>
+              <w:right w:val="single" w:sz="4" w:space="0" w:color="000000"/>
+            </w:tcBorders>
+            <w:shd w:val="clear" w:color="auto" w:fill="auto"/>
+            <w:tcMar>
+              <w:top w:w="80" w:type="dxa"/>
+              <w:left w:w="80" w:type="dxa"/>
+              <w:bottom w:w="80" w:type="dxa"/>
+              <w:right w:w="80" w:type="dxa"/>
+            </w:tcMar>
+            <w:vAlign w:val="center"/>
+          </w:tcPr>
+          <w:p>
+            <w:pPr>
+              <w:jc w:val="center"/>
+            </w:pPr>
+            <w:r>
+              <w:rPr>
+                <w:sz w:val="22"/>
+                <w:szCs w:val="22"/>
+              </w:rPr>
+              <w:t>1</w:t>
+            </w:r>
+          </w:p>
+        </w:tc>
+        <w:tc>
+          <w:tcPr>
+            <w:tcW w:w="2918" w:type="dxa"/>
+            <w:tcBorders>
+              <w:top w:val="single" w:sz="4" w:space="0" w:color="000000"/>
+              <w:left w:val="single" w:sz="4" w:space="0" w:color="000000"/>
+              <w:bottom w:val="single" w:sz="4" w:space="0" w:color="000000"/>
+              <w:right w:val="single" w:sz="4" w:space="0" w:color="000000"/>
+            </w:tcBorders>
+            <w:shd w:val="clear" w:color="auto" w:fill="auto"/>
+            <w:tcMar>
+              <w:top w:w="80" w:type="dxa"/>
+              <w:left w:w="80" w:type="dxa"/>
+              <w:bottom w:w="80" w:type="dxa"/>
+              <w:right w:w="80" w:type="dxa"/>
+            </w:tcMar>
+            <w:vAlign w:val="center"/>
+          </w:tcPr>
+          <w:p>
+            <w:pPr>
+              <w:jc w:val="center"/>
+            </w:pPr>
+            <w:r>
+              <w:rPr>
+                <w:sz w:val="22"/>
+                <w:szCs w:val="22"/>
+              </w:rPr>
+              <w:t>2</w:t>
+            </w:r>
+          </w:p>
+        </w:tc>
+        <w:tc>
+          <w:tcPr>
+            <w:tcW w:w="2379" w:type="dxa"/>
+            <w:tcBorders>
+              <w:top w:val="single" w:sz="4" w:space="0" w:color="000000"/>
+              <w:left w:val="single" w:sz="4" w:space="0" w:color="000000"/>
+              <w:bottom w:val="single" w:sz="4" w:space="0" w:color="auto"/>
+              <w:right w:val="single" w:sz="4" w:space="0" w:color="000000"/>
+            </w:tcBorders>
+            <w:shd w:val="clear" w:color="auto" w:fill="auto"/>
+            <w:tcMar>
+              <w:top w:w="80" w:type="dxa"/>
+              <w:left w:w="80" w:type="dxa"/>
+              <w:bottom w:w="80" w:type="dxa"/>
+              <w:right w:w="80" w:type="dxa"/>
+            </w:tcMar>
+            <w:vAlign w:val="center"/>
+          </w:tcPr>
+          <w:p>
+            <w:pPr>
+              <w:jc w:val="center"/>
+            </w:pPr>
+            <w:r>
+              <w:rPr>
+                <w:sz w:val="22"/>
+                <w:szCs w:val="22"/>
+              </w:rPr>
+              <w:t>3</w:t>
+            </w:r>
+          </w:p>
+        </w:tc>
+        <w:tc>
+          <w:tcPr>
+            <w:tcW w:w="3136" w:type="dxa"/>
+            <w:tcBorders>
+              <w:top w:val="single" w:sz="4" w:space="0" w:color="000000"/>
+              <w:left w:val="single" w:sz="4" w:space="0" w:color="000000"/>
+              <w:bottom w:val="single" w:sz="4" w:space="0" w:color="auto"/>
+              <w:right w:val="single" w:sz="4" w:space="0" w:color="000000"/>
+            </w:tcBorders>
+            <w:shd w:val="clear" w:color="auto" w:fill="auto"/>
+            <w:tcMar>
+              <w:top w:w="80" w:type="dxa"/>
+              <w:left w:w="80" w:type="dxa"/>
+              <w:bottom w:w="80" w:type="dxa"/>
+              <w:right w:w="80" w:type="dxa"/>
+            </w:tcMar>
+            <w:vAlign w:val="center"/>
+          </w:tcPr>
+          <w:p>
+            <w:pPr>
+              <w:jc w:val="center"/>
+            </w:pPr>
+            <w:r>
+              <w:rPr>
+                <w:sz w:val="22"/>
+                <w:szCs w:val="22"/>
+              </w:rPr>
+              <w:t>4</w:t>
+            </w:r>
+          </w:p>
+        </w:tc>
+        <w:tc>
+          <w:tcPr>
+            <w:tcW w:w="842" w:type="dxa"/>
+            <w:tcBorders>
+              <w:top w:val="single" w:sz="4" w:space="0" w:color="000000"/>
+              <w:left w:val="single" w:sz="4" w:space="0" w:color="000000"/>
+              <w:bottom w:val="single" w:sz="4" w:space="0" w:color="000000"/>
+              <w:right w:val="single" w:sz="4" w:space="0" w:color="000000"/>
+            </w:tcBorders>
+          </w:tcPr>
+          <w:p>
+            <w:pPr>
+              <w:jc w:val="center"/>
+              <w:rPr>
+                <w:sz w:val="22"/>
+                <w:szCs w:val="22"/>
+              </w:rPr>
+            </w:pPr>
+            <w:r>
+              <w:rPr>
+                <w:sz w:val="22"/>
+                <w:szCs w:val="22"/>
+              </w:rPr>
+              <w:t>5</w:t>
+            </w:r>
+          </w:p>
+        </w:tc>
+        <w:tc>
+          <w:tcPr>
+            <w:tcW w:w="1621" w:type="dxa"/>
+            <w:tcBorders>
+              <w:top w:val="single" w:sz="4" w:space="0" w:color="000000"/>
+              <w:left w:val="single" w:sz="4" w:space="0" w:color="000000"/>
+              <w:bottom w:val="single" w:sz="4" w:space="0" w:color="000000"/>
+              <w:right w:val="single" w:sz="4" w:space="0" w:color="000000"/>
+            </w:tcBorders>
+            <w:shd w:val="clear" w:color="auto" w:fill="auto"/>
+            <w:tcMar>
+              <w:top w:w="80" w:type="dxa"/>
+              <w:left w:w="80" w:type="dxa"/>
+              <w:bottom w:w="80" w:type="dxa"/>
+              <w:right w:w="80" w:type="dxa"/>
+            </w:tcMar>
+            <w:vAlign w:val="center"/>
+          </w:tcPr>
+          <w:p>
+            <w:pPr>
+              <w:jc w:val="center"/>
+            </w:pPr>
+            <w:r>
+              <w:rPr>
+                <w:sz w:val="22"/>
+                <w:szCs w:val="22"/>
+              </w:rPr>
+              <w:t>6</w:t>
+            </w:r>
+          </w:p>
+        </w:tc>
+        <w:tc>
+          <w:tcPr>
+            <w:tcW w:w="1406" w:type="dxa"/>
+            <w:tcBorders>
+              <w:top w:val="single" w:sz="4" w:space="0" w:color="000000"/>
+              <w:left w:val="single" w:sz="4" w:space="0" w:color="000000"/>
+              <w:bottom w:val="single" w:sz="4" w:space="0" w:color="000000"/>
+              <w:right w:val="single" w:sz="4" w:space="0" w:color="000000"/>
+            </w:tcBorders>
+            <w:shd w:val="clear" w:color="auto" w:fill="auto"/>
+            <w:tcMar>
+              <w:top w:w="80" w:type="dxa"/>
+              <w:left w:w="80" w:type="dxa"/>
+              <w:bottom w:w="80" w:type="dxa"/>
+              <w:right w:w="80" w:type="dxa"/>
+            </w:tcMar>
+            <w:vAlign w:val="center"/>
+          </w:tcPr>
+          <w:p>
+            <w:pPr>
+              <w:jc w:val="center"/>
+            </w:pPr>
+            <w:r>
+              <w:rPr>
+                <w:sz w:val="22"/>
+                <w:szCs w:val="22"/>
+              </w:rPr>
+              <w:t>7</w:t>
+            </w:r>
+          </w:p>
+        </w:tc>
+        <w:tc>
+          <w:tcPr>
+            <w:tcW w:w="951" w:type="dxa"/>
+            <w:tcBorders>
+              <w:top w:val="single" w:sz="4" w:space="0" w:color="000000"/>
+              <w:left w:val="single" w:sz="4" w:space="0" w:color="000000"/>
+              <w:bottom w:val="single" w:sz="4" w:space="0" w:color="000000"/>
+              <w:right w:val="single" w:sz="4" w:space="0" w:color="000000"/>
+            </w:tcBorders>
+            <w:shd w:val="clear" w:color="auto" w:fill="auto"/>
+            <w:tcMar>
+              <w:top w:w="80" w:type="dxa"/>
+              <w:left w:w="80" w:type="dxa"/>
+              <w:bottom w:w="80" w:type="dxa"/>
+              <w:right w:w="80" w:type="dxa"/>
+            </w:tcMar>
+            <w:vAlign w:val="center"/>
+          </w:tcPr>
+          <w:p>
+            <w:pPr>
+              <w:jc w:val="center"/>
+              <w:rPr>
+                <w:lang w:val="en-US"/>
+              </w:rPr>
+            </w:pPr>
+            <w:r>
+              <w:rPr>
+                <w:sz w:val="22"/>
+                <w:szCs w:val="22"/>
+                <w:lang w:val="en-US"/>
+              </w:rPr>
+              <w:t>8</w:t>
+            </w:r>
+          </w:p>
+        </w:tc>
+        <w:tc>
+          <w:tcPr>
+            <w:tcW w:w="1427" w:type="dxa"/>
+            <w:tcBorders>
+              <w:top w:val="single" w:sz="4" w:space="0" w:color="000000"/>
+              <w:left w:val="single" w:sz="4" w:space="0" w:color="000000"/>
+              <w:bottom w:val="single" w:sz="4" w:space="0" w:color="000000"/>
+              <w:right w:val="single" w:sz="4" w:space="0" w:color="000000"/>
+            </w:tcBorders>
+          </w:tcPr>
+          <w:p>
+            <w:pPr>
+              <w:jc w:val="center"/>
+              <w:rPr>
+                <w:sz w:val="22"/>
+                <w:szCs w:val="22"/>
+              </w:rPr>
+            </w:pPr>
+            <w:r>
+              <w:rPr>
+                <w:sz w:val="22"/>
+                <w:szCs w:val="22"/>
+              </w:rPr>
+              <w:t>9</w:t>
+            </w:r>
+          </w:p>
+        </w:tc>
+      </w:tr>
+      <w:tr>
+        <w:trPr>
+          <w:trHeight w:val="1862"/>
+        </w:trPr>
+        <w:tc>
+          <w:tcPr>
+            <w:tcW w:w="923" w:type="dxa"/>
+            <w:tcBorders>
+              <w:top w:val="single" w:sz="4" w:space="0" w:color="000000"/>
+              <w:left w:val="single" w:sz="4" w:space="0" w:color="000000"/>
+              <w:bottom w:val="single" w:sz="4" w:space="0" w:color="000000"/>
+              <w:right w:val="single" w:sz="4" w:space="0" w:color="000000"/>
+            </w:tcBorders>
+            <w:shd w:val="clear" w:color="auto" w:fill="auto"/>
+            <w:tcMar>
+              <w:top w:w="80" w:type="dxa"/>
+              <w:left w:w="80" w:type="dxa"/>
+              <w:bottom w:w="80" w:type="dxa"/>
+              <w:right w:w="80" w:type="dxa"/>
+            </w:tcMar>
+            <w:vAlign w:val="center"/>
+          </w:tcPr>
+          <w:p>
+            <w:pPr>
+              <w:pStyle w:val="a5"/>
+              <w:numPr>
+                <w:ilvl w:val="0"/>
+                <w:numId w:val="1"/>
+              </w:numPr>
+            </w:pPr>
+            <w:r>
+              <w:rPr>
+                <w:sz w:val="22"/>
+                <w:szCs w:val="22"/>
+                <w:lang w:val="en-US"/>
+              </w:rPr>
+              <w:t>{#employee}</w:t>
+            </w:r>
+          </w:p>
+        </w:tc>
+        <w:tc>
+          <w:tcPr>
+            <w:tcW w:w="2918" w:type="dxa"/>
+            <w:tcBorders>
+              <w:top w:val="single" w:sz="4" w:space="0" w:color="000000"/>
+              <w:left w:val="single" w:sz="4" w:space="0" w:color="000000"/>
+              <w:bottom w:val="single" w:sz="4" w:space="0" w:color="000000"/>
+              <w:right w:val="single" w:sz="4" w:space="0" w:color="auto"/>
+            </w:tcBorders>
+            <w:shd w:val="clear" w:color="auto" w:fill="auto"/>
+            <w:tcMar>
+              <w:top w:w="80" w:type="dxa"/>
+              <w:left w:w="80" w:type="dxa"/>
+              <w:bottom w:w="80" w:type="dxa"/>
+              <w:right w:w="80" w:type="dxa"/>
+            </w:tcMar>
+            <w:vAlign w:val="center"/>
+          </w:tcPr>
+          <w:p>
+            <w:pPr>
+              <w:rPr>
+                <w:lang w:val="en-US"/>
+              </w:rPr>
+            </w:pPr>
+            <w:r>
+              <w:rPr>
+                <w:sz w:val="22"/>
+                <w:szCs w:val="22"/>
+                <w:lang w:val="en-US"/>
+              </w:rPr>
+              <w:t>{</w:t>
+            </w:r>
+            <w:proofErr w:type="spellStart"/>
+            <w:r>
+              <w:rPr>
+                <w:sz w:val="22"/>
+                <w:szCs w:val="22"/>
+                <w:lang w:val="en-US"/>
+              </w:rPr>
+              <w:t>last_</w:t>
+            </w:r>
+            <w:r>
+              <w:rPr>
+                <w:sz w:val="22"/>
+                <w:szCs w:val="22"/>
+                <w:lang w:val="en-US"/>
+              </w:rPr>
+              <w:t>name</w:t>
+            </w:r>
+            <w:proofErr w:type="spellEnd"/>
+            <w:r>
+              <w:rPr>
+                <w:sz w:val="22"/>
+                <w:szCs w:val="22"/>
+                <w:lang w:val="en-US"/>
+              </w:rPr>
+              <w:t>} {name} {</w:t>
+            </w:r>
+            <w:proofErr w:type="spellStart"/>
+            <w:r>
+              <w:rPr>
+                <w:sz w:val="22"/>
+                <w:szCs w:val="22"/>
+                <w:lang w:val="en-US"/>
+              </w:rPr>
+              <w:t>middle_name</w:t>
+            </w:r>
+            <w:proofErr w:type="spellEnd"/>
+            <w:r>
+              <w:rPr>
+                <w:sz w:val="22"/>
+                <w:szCs w:val="22"/>
+                <w:lang w:val="en-US"/>
+              </w:rPr>
+              <w:t>}</w:t>
+            </w:r>
+          </w:p>
+        </w:tc>
+        <w:tc>
+          <w:tcPr>
+            <w:tcW w:w="2379" w:type="dxa"/>
+            <w:tcBorders>
+              <w:top w:val="single" w:sz="4" w:space="0" w:color="auto"/>
+              <w:left w:val="single" w:sz="4" w:space="0" w:color="auto"/>
+              <w:bottom w:val="single" w:sz="4" w:space="0" w:color="auto"/>
+              <w:right w:val="single" w:sz="4" w:space="0" w:color="auto"/>
+            </w:tcBorders>
+            <w:shd w:val="clear" w:color="auto" w:fill="auto"/>
+            <w:tcMar>
+              <w:top w:w="80" w:type="dxa"/>
+              <w:left w:w="80" w:type="dxa"/>
+              <w:bottom w:w="80" w:type="dxa"/>
+              <w:right w:w="80" w:type="dxa"/>
+            </w:tcMar>
+            <w:vAlign w:val="center"/>
+            <w:vMerge/>
+          </w:tcPr>
+          <w:p>
+            <w:pPr>
+              <w:jc w:val="center"/>
+            </w:pPr>
+            <w:r>
+              <w:rPr>
+                <w:sz w:val="22"/>
+                <w:szCs w:val="22"/>
+                <w:lang w:val="en-US"/>
+              </w:rPr>
+              <w:t>{</w:t>
+            </w:r>
+            <w:proofErr w:type="spellStart"/>
+            <w:r>
+              <w:rPr>
+                <w:sz w:val="22"/>
+                <w:szCs w:val="22"/>
+                <w:lang w:val="en-US"/>
+              </w:rPr>
+              <w:t>organization_name</w:t>
+            </w:r>
+            <w:proofErr w:type="spellEnd"/>
+            <w:r>
+              <w:rPr>
+                <w:sz w:val="22"/>
+                <w:szCs w:val="22"/>
+                <w:lang w:val="en-US"/>
+              </w:rPr>
+              <w:t>}</w:t>
+            </w:r>
+          </w:p>
+        </w:tc>
+        <w:tc>
+          <w:tcPr>
+            <w:tcW w:w="3136" w:type="dxa"/>
+            <w:tcBorders>
+              <w:top w:val="single" w:sz="4" w:space="0" w:color="auto"/>
+              <w:left w:val="single" w:sz="4" w:space="0" w:color="auto"/>
+              <w:bottom w:val="single" w:sz="4" w:space="0" w:color="auto"/>
+              <w:right w:val="single" w:sz="4" w:space="0" w:color="auto"/>
+            </w:tcBorders>
+            <w:shd w:val="clear" w:color="auto" w:fill="auto"/>
+            <w:tcMar>
+              <w:top w:w="80" w:type="dxa"/>
+              <w:left w:w="80" w:type="dxa"/>
+              <w:bottom w:w="80" w:type="dxa"/>
+              <w:right w:w="80" w:type="dxa"/>
+            </w:tcMar>
+            <w:vAlign w:val="center"/>
+          </w:tcPr>
+          <w:p>
+            <w:pPr>
+              <w:jc w:val="center"/>
+            </w:pPr>
+            <w:r>
+              <w:rPr>
+                <w:sz w:val="22"/>
+                <w:szCs w:val="22"/>
+                <w:lang w:val="en-US"/>
+              </w:rPr>
+              <w:t>{grade}</w:t>
+            </w:r>
+          </w:p>
+        </w:tc>
+        <w:tc>
+          <w:tcPr>
+            <w:tcW w:w="842" w:type="dxa"/>
+            <w:tcBorders>
+              <w:top w:val="single" w:sz="4" w:space="0" w:color="000000"/>
+              <w:left w:val="single" w:sz="4" w:space="0" w:color="auto"/>
+              <w:bottom w:val="single" w:sz="4" w:space="0" w:color="000000"/>
+              <w:right w:val="single" w:sz="4" w:space="0" w:color="auto"/>
+            </w:tcBorders>
+          </w:tcPr>
+          <w:p>
+            <w:pPr>
+              <w:jc w:val="center"/>
+              <w:rPr>
+                <w:i/>
+                <w:iCs/>
+                <w:sz w:val="22"/>
+                <w:szCs w:val="22"/>
+                <w:lang w:val="en-US"/>
+              </w:rPr>
+            </w:pPr>
+          </w:p>
+          <w:p>
+            <w:pPr>
+              <w:jc w:val="center"/>
+              <w:rPr>
+                <w:i/>
+                <w:iCs/>
+                <w:sz w:val="22"/>
+                <w:szCs w:val="22"/>
+                <w:lang w:val="en-US"/>
+              </w:rPr>
+            </w:pPr>
+          </w:p>
+          <w:p>
+            <w:pPr>
+              <w:jc w:val="center"/>
+              <w:rPr>
+                <w:i/>
+                <w:iCs/>
+                <w:sz w:val="22"/>
+                <w:szCs w:val="22"/>
+                <w:lang w:val="en-US"/>
+              </w:rPr>
+            </w:pPr>
+          </w:p>
+          <w:p>
+            <w:pPr>
+              <w:jc w:val="center"/>
+              <w:rPr>
+                <w:i/>
+                <w:iCs/>
+                <w:sz w:val="22"/>
+                <w:szCs w:val="22"/>
+                <w:lang w:val="en-US"/>
+              </w:rPr>
+            </w:pPr>
+          </w:p>
+          <w:p>
+            <w:pPr>
+              <w:jc w:val="center"/>
+              <w:rPr>
+                <w:i/>
+                <w:iCs/>
+                <w:sz w:val="22"/>
+                <w:szCs w:val="22"/>
+                <w:lang w:val="en-US"/>
+              </w:rPr>
+            </w:pPr>
+          </w:p>
+          <w:p>
+            <w:pPr>
+              <w:jc w:val="center"/>
+              <w:rPr>
+                <w:i/>
+                <w:iCs/>
+                <w:sz w:val="22"/>
+                <w:szCs w:val="22"/>
+                <w:lang w:val="en-US"/>
+              </w:rPr>
+            </w:pPr>
+            <w:r>
+              <w:rPr>
+                <w:i/>
+                <w:iCs/>
+                <w:sz w:val="22"/>
+                <w:szCs w:val="22"/>
+                <w:lang w:val="en-US"/>
+              </w:rPr>
+              <w:t>{</w:t>
+            </w:r>
+            <w:proofErr w:type="spellStart"/>
+            <w:r>
+              <w:rPr>
+                <w:i/>
+                <w:iCs/>
+                <w:sz w:val="22"/>
+                <w:szCs w:val="22"/>
+                <w:lang w:val="en-US"/>
+              </w:rPr>
+              <w:t>random_number</w:t>
+            </w:r>
+            <w:proofErr w:type="spellEnd"/>
+            <w:r>
+              <w:rPr>
+                <w:i/>
+                <w:iCs/>
+                <w:sz w:val="22"/>
+                <w:szCs w:val="22"/>
+                <w:lang w:val="en-US"/>
+              </w:rPr>
+              <w:t>}</w:t>
+            </w:r>
+          </w:p>
+        </w:tc>
+        <w:tc>
+          <w:tcPr>
+            <w:tcW w:w="1621" w:type="dxa"/>
+            <w:tcBorders>
+              <w:top w:val="single" w:sz="4" w:space="0" w:color="000000"/>
+              <w:left w:val="single" w:sz="4" w:space="0" w:color="auto"/>
+              <w:bottom w:val="single" w:sz="4" w:space="0" w:color="000000"/>
+              <w:right w:val="single" w:sz="4" w:space="0" w:color="000000"/>
+            </w:tcBorders>
+            <w:shd w:val="clear" w:color="auto" w:fill="auto"/>
+            <w:tcMar>
+              <w:top w:w="80" w:type="dxa"/>
+              <w:left w:w="80" w:type="dxa"/>
+              <w:bottom w:w="80" w:type="dxa"/>
+              <w:right w:w="80" w:type="dxa"/>
+            </w:tcMar>
+            <w:vAlign w:val="center"/>
+          </w:tcPr>
+          <w:p>
+            <w:pPr>
+              <w:jc w:val="center"/>
+              <w:rPr>
+                <w:lang w:val="en-US"/>
+              </w:rPr>
+            </w:pPr>
+            <w:r>
+              <w:rPr>
+                <w:i/>
+                <w:iCs/>
+                <w:sz w:val="22"/>
+                <w:szCs w:val="22"/>
+                <w:lang w:val="en-US"/>
+              </w:rPr>
+              <w:t>{</w:t>
+            </w:r>
+            <w:r>
+              <w:rPr>
+                <w:i/>
+                <w:iCs/>
+                <w:sz w:val="22"/>
+                <w:szCs w:val="22"/>
+              </w:rPr>
+              <w:t>c</w:t>
+            </w:r>
+            <w:proofErr w:type="spellStart"/>
+            <w:r>
+              <w:rPr>
+                <w:i/>
+                <w:iCs/>
+                <w:sz w:val="22"/>
+                <w:szCs w:val="22"/>
+                <w:lang w:val="en-US"/>
+              </w:rPr>
+              <w:t>ourses_mark</w:t>
+            </w:r>
+            <w:proofErr w:type="spellEnd"/>
+            <w:r>
+              <w:rPr>
+                <w:i/>
+                <w:iCs/>
+                <w:sz w:val="22"/>
+                <w:szCs w:val="22"/>
+              </w:rPr>
+              <w:t>}</w:t>
+            </w:r>
+          </w:p>
+        </w:tc>
+        <w:tc>
+          <w:tcPr>
+            <w:tcW w:w="1406" w:type="dxa"/>
+            <w:tcBorders>
+              <w:top w:val="single" w:sz="4" w:space="0" w:color="000000"/>
+              <w:left w:val="single" w:sz="4" w:space="0" w:color="000000"/>
+              <w:bottom w:val="single" w:sz="4" w:space="0" w:color="000000"/>
+              <w:right w:val="single" w:sz="4" w:space="0" w:color="000000"/>
+            </w:tcBorders>
+            <w:shd w:val="clear" w:color="auto" w:fill="auto"/>
+            <w:tcMar>
+              <w:top w:w="80" w:type="dxa"/>
+              <w:left w:w="80" w:type="dxa"/>
+              <w:bottom w:w="80" w:type="dxa"/>
+              <w:right w:w="80" w:type="dxa"/>
+            </w:tcMar>
+            <w:vAlign w:val="center"/>
+          </w:tcPr>
+          <w:p/>
+        </w:tc>
+        <w:tc>
+          <w:tcPr>
+            <w:tcW w:w="951" w:type="dxa"/>
+            <w:tcBorders>
+              <w:top w:val="single" w:sz="4" w:space="0" w:color="000000"/>
+              <w:left w:val="single" w:sz="4" w:space="0" w:color="000000"/>
+              <w:bottom w:val="single" w:sz="4" w:space="0" w:color="000000"/>
+              <w:right w:val="single" w:sz="4" w:space="0" w:color="000000"/>
+            </w:tcBorders>
+            <w:shd w:val="clear" w:color="auto" w:fill="auto"/>
+            <w:tcMar>
+              <w:top w:w="80" w:type="dxa"/>
+              <w:left w:w="80" w:type="dxa"/>
+              <w:bottom w:w="80" w:type="dxa"/>
+              <w:right w:w="80" w:type="dxa"/>
+            </w:tcMar>
+            <w:vAlign w:val="center"/>
+          </w:tcPr>
+          <w:p/>
+        </w:tc>
+        <w:tc>
+          <w:tcPr>
+            <w:tcW w:w="1427" w:type="dxa"/>
+            <w:vMerge/>
+            <w:tcBorders>
+              <w:top w:val="single" w:sz="4" w:space="0" w:color="000000"/>
+              <w:left w:val="single" w:sz="4" w:space="0" w:color="000000"/>
+              <w:bottom w:val="single" w:sz="4" w:space="0" w:color="000000"/>
+              <w:right w:val="single" w:sz="4" w:space="0" w:color="000000"/>
+            </w:tcBorders>
+          </w:tcPr>
+          <w:p>
+            <w:pPr>
+              <w:rPr>
+                <w:sz w:val="22"/>
+                <w:szCs w:val="22"/>
+              </w:rPr>
+            </w:pPr>
+          </w:p>
+          <w:p>
+            <w:pPr>
+              <w:rPr>
+                <w:sz w:val="22"/>
+                <w:szCs w:val="22"/>
+              </w:rPr>
+            </w:pPr>
+          </w:p>
+          <w:p>
+            <w:pPr>
+              <w:rPr>
+                <w:sz w:val="22"/>
+                <w:szCs w:val="22"/>
+              </w:rPr>
+            </w:pPr>
+          </w:p>
+          <w:p>
+            <w:pPr>
+              <w:rPr>
+                <w:sz w:val="22"/>
+                <w:szCs w:val="22"/>
+              </w:rPr>
+            </w:pPr>
+          </w:p>
+          <w:p>
+            <w:pPr>
+              <w:rPr>
+                <w:sz w:val="22"/>
+                <w:szCs w:val="22"/>
+                <w:lang w:val="en-US"/>
+              </w:rPr>
+            </w:pPr>
+            <w:r>
+              <w:rPr>
+                <w:sz w:val="22"/>
+                <w:szCs w:val="22"/>
+                <w:lang w:val="en-US"/>
+              </w:rPr>
+              <w:t xml:space="preserve"> </w:t>
+            </w:r>
+            <w:r>
+              <w:rPr>
+                <w:sz w:val="22"/>
+                <w:szCs w:val="22"/>
+              </w:rPr>
+              <w:t>{</w:t>
+            </w:r>
+            <w:proofErr w:type="spellStart"/>
+            <w:r>
+              <w:rPr>
+                <w:sz w:val="22"/>
+                <w:szCs w:val="22"/>
+              </w:rPr>
+              <w:t>conclusion</w:t>
+            </w:r>
+            <w:proofErr w:type="spellEnd"/>
+            <w:r>
+              <w:rPr>
+                <w:sz w:val="22"/>
+                <w:szCs w:val="22"/>
+                <w:lang w:val="en-US"/>
+              </w:rPr>
+              <w:t>}</w:t>
+            </w:r>
+            <w:r>
+              <w:rPr>
+                <w:i/>
+                <w:iCs/>
+                <w:sz w:val="22"/>
+                <w:szCs w:val="22"/>
+                <w:lang w:val="en-US"/>
+              </w:rPr>
+              <w:t>{/employee}</w:t>
+            </w:r>
+          </w:p>
+        </w:tc>
+      </w:tr>
+    </w:tbl>
+    <w:p>
+      <w:pPr>
+        <w:widowControl w:val="0"/>
+        <w:ind w:left="324" w:hanging="324"/>
+        <w:rPr>
+          <w:sz w:val="22"/>
+          <w:szCs w:val="22"/>
+        </w:rPr>
+      </w:pPr>
+    </w:p>
+    <w:p>
+      <w:pPr>
+        <w:widowControl w:val="0"/>
+        <w:ind w:left="216" w:hanging="216"/>
+        <w:rPr>
+          <w:sz w:val="22"/>
+          <w:szCs w:val="22"/>
+        </w:rPr>
+      </w:pPr>
+    </w:p>
+    <w:p>
+      <w:pPr>
+        <w:widowControl w:val="0"/>
+        <w:ind w:left="108" w:hanging="108"/>
+        <w:rPr>
+          <w:sz w:val="22"/>
+          <w:szCs w:val="22"/>
+        </w:rPr>
+      </w:pPr>
+    </w:p>
+    <w:p>
+      <w:pPr>
+        <w:widowControl w:val="0"/>
+        <w:jc w:val="both"/>
+        <w:rPr>
+          <w:sz w:val="22"/>
+          <w:szCs w:val="22"/>
+        </w:rPr>
+      </w:pPr>
+    </w:p>
+    <w:p>
+      <w:pPr>
+        <w:tabs>
+          <w:tab w:val="left" w:pos="2220"/>
+        </w:tabs>
+        <w:rPr>
+          <w:sz w:val="18"/>
+          <w:szCs w:val="18"/>
+        </w:rPr>
+      </w:pPr>
+      <w:r>
+        <w:rPr>
+          <w:sz w:val="28"/>
+          <w:szCs w:val="28"/>
+        </w:rPr>
+        <w:tab/>
+      </w:r>
+    </w:p>
+    <w:p>
+      <w:pPr>
+        <w:ind w:left="3828"/>
+      </w:pPr>
+      <w:r>
+        <w:t>Председатель комиссии:</w:t>
+      </w:r>
+      <w:r>
+        <w:tab/>
+      </w:r>
+      <w:r>
+        <w:tab/>
+      </w:r>
+      <w:r>
+        <w:tab/>
+      </w:r>
+      <w:r>
+        <w:tab/>
+        <w:t xml:space="preserve">/ В.М. </w:t>
+      </w:r>
+      <w:proofErr w:type="spellStart"/>
+      <w:r>
+        <w:t>Шекшуев</w:t>
+      </w:r>
+      <w:proofErr w:type="spellEnd"/>
+      <w:r>
+        <w:t xml:space="preserve"> /</w:t>
+      </w:r>
+    </w:p>
+    <w:p>
+      <w:pPr>
+        <w:ind w:left="3828"/>
+        <w:rPr>
+          <w:sz w:val="12"/>
+          <w:szCs w:val="12"/>
+        </w:rPr>
+      </w:pPr>
+    </w:p>
+    <w:p>
+      <w:pPr>
+        <w:ind w:left="3828"/>
+      </w:pPr>
+      <w:r>
+        <w:t>Члены комиссии:</w:t>
+      </w:r>
+      <w:r>
+        <w:tab/>
+      </w:r>
+      <w:r>
+        <w:tab/>
+      </w:r>
+      <w:r>
+        <w:tab/>
+      </w:r>
+      <w:r>
+        <w:tab/>
+      </w:r>
+      <w:r>
+        <w:tab/>
+        <w:t>/ Е.С. Воробьева /</w:t>
+      </w:r>
+    </w:p>
+    <w:p>
+      <w:pPr>
+        <w:ind w:left="3828"/>
+        <w:rPr>
+          <w:sz w:val="12"/>
+          <w:szCs w:val="12"/>
+        </w:rPr>
+      </w:pPr>
+    </w:p>
+    <w:p>
+      <w:pPr>
+        <w:ind w:left="3828"/>
+      </w:pPr>
+      <w:r>
+        <w:tab/>
+      </w:r>
+      <w:r>
+        <w:tab/>
+      </w:r>
+      <w:r>
+        <w:tab/>
+      </w:r>
+      <w:r>
+        <w:tab/>
+      </w:r>
+      <w:r>
+        <w:tab/>
+      </w:r>
+      <w:r>
+        <w:tab/>
+      </w:r>
+      <w:r>
+        <w:tab/>
+        <w:t xml:space="preserve">/ И.Ю. </w:t>
+      </w:r>
+      <w:proofErr w:type="spellStart"/>
+      <w:r>
+        <w:t>Шекшуева</w:t>
+      </w:r>
+      <w:proofErr w:type="spellEnd"/>
+      <w:r>
+        <w:t xml:space="preserve"> /</w:t>
+      </w:r>
+    </w:p>
+    <w:sectPr>
+      <w:headerReference w:type="default" r:id="rId7"/>
+      <w:footerReference w:type="default" r:id="rId8"/>
+      <w:pgSz w:w="16840" w:h="11900" w:orient="landscape"/>
+      <w:pgMar w:top="142" w:right="536" w:bottom="0" w:left="1134" w:header="709" w:footer="709" w:gutter="0"/>
+      <w:cols w:space="720"/>
+    </w:sectPr>
+  </w:body>
+</w:document>
 </file>
</xml_diff>